<commit_message>
Extend model with endogenous exploitation (Appendix E) and verification script
Co-Authored-By: Claude Sonnet 5.5 <noreply@anthropic.com>
Claude-Session: https://claude.ai/code/session_019zpN7r7iyrxAGMFgJVxuCB
</commit_message>
<xml_diff>
--- a/ISR_Staging_Commitment.docx
+++ b/ISR_Staging_Commitment.docx
@@ -218,7 +218,7 @@
           <w:sz w:val="24"/>
           <w:szCs w:val="24"/>
         </w:rPr>
-        <w:t>The paper makes three contributions to the IS literature. First, it moves real options from the discrete funding of projects to the continuous maintenance of a generative system, a class of digital object that is updated weekly rather than funded annually. Second, it introduces judge drift as a jump in the ruler within the observation equation, and it argues that pinning and recalibrating the judge constitutes an option in its own right rather than a matter of hygiene. Third, it specifies an inspection option, namely canaries on which a high judge score is itself suspicious, which is easily overlooked when evaluation is conceived only as a mean over a holdout sample.</w:t>
+        <w:t>The paper makes four contributions to the IS literature. First, it moves real options from the discrete funding of projects to the continuous maintenance of a generative system, a class of digital object that is updated weekly rather than funded annually. Second, it introduces judge drift as a jump in the ruler within the observation equation, and it argues that pinning and recalibrating the judge constitutes an option in its own right rather than a matter of hygiene. Third, it specifies an inspection option, namely canaries on which a high judge score is itself suspicious, which is easily overlooked when evaluation is conceived only as a mean over a holdout sample. Fourth, a stylized extension shows that when the team that searches is paid on the judge score, inspection works through deterrence as well as detection, and that the deterrence strengthens with search depth.</w:t>
       </w:r>
     </w:p>
     <w:p>
@@ -9252,7 +9252,7 @@
           <w:sz w:val="24"/>
           <w:szCs w:val="24"/>
         </w:rPr>
-        <w:t>The propositions also bear on the literature on organizational control. A control that is cheap and used as an objective is a Goodhart instrument. Real options theory supplies the decision rule that control theory alone does not: when the instrument is compromised, the organization should raise F rather than automate harder.</w:t>
+        <w:t>The propositions also bear on the literature on organizational control. A control that is cheap and used as an objective is a Goodhart instrument. Real options theory supplies the decision rule that control theory alone does not: when the instrument is compromised, the organization should raise F rather than automate harder. The extension in Appendix E adds that inspection is more than a statistical check: by lowering the payoff to gaming, it also deters gaming.</w:t>
       </w:r>
     </w:p>
     <w:p>
@@ -10301,7 +10301,7 @@
           <w:sz w:val="24"/>
           <w:szCs w:val="24"/>
         </w:rPr>
-        <w:t>The model also treats the optimizer as a single agent. In firms, search is distributed across prompt engineers, vendor updates, and fine-tunes. Multi-agent contamination of G is an open governance problem, because holdout sets deteriorate when too many teams can see them.</w:t>
+        <w:t>The model also treats the optimizer as a single agent. In firms, search is distributed across prompt engineers, vendor updates, and fine-tunes. Multi-agent contamination of G is an open governance problem, because holdout sets deteriorate when too many teams can see them. Appendix E relaxes this in a stylized way by letting one team choose how much to invest in exploits, but the multi-agent case remains open.</w:t>
       </w:r>
     </w:p>
     <w:p>
@@ -10636,6 +10636,44 @@
           <w:szCs w:val="24"/>
         </w:rPr>
         <w:t>. PMLR 202.</w:t>
+      </w:r>
+    </w:p>
+    <w:p>
+      <w:pPr>
+        <w:spacing w:after="160" w:before="0" w:line="276" w:lineRule="auto"/>
+        <w:ind w:left="720" w:hanging="720"/>
+        <w:jc w:val="left"/>
+      </w:pPr>
+      <w:r>
+        <w:rPr>
+          <w:rFonts w:ascii="Times New Roman" w:cs="Times New Roman" w:eastAsia="Times New Roman" w:hAnsi="Times New Roman"/>
+          <w:bCs w:val="false"/>
+          <w:iCs w:val="false"/>
+          <w:sz w:val="24"/>
+          <w:szCs w:val="24"/>
+        </w:rPr>
+        <w:t xml:space="preserve">Holmström B and Milgrom P (1991) Multitask principal–agent analyses: Incentive contracts, asset ownership, and job design. </w:t>
+      </w:r>
+      <w:r>
+        <w:rPr>
+          <w:rFonts w:ascii="Times New Roman" w:cs="Times New Roman" w:eastAsia="Times New Roman" w:hAnsi="Times New Roman"/>
+          <w:bCs w:val="false"/>
+          <w:i/>
+          <w:iCs w:val="false"/>
+          <w:sz w:val="24"/>
+          <w:szCs w:val="24"/>
+        </w:rPr>
+        <w:t>Journal of Law, Economics, and Organization</w:t>
+      </w:r>
+      <w:r>
+        <w:rPr>
+          <w:rFonts w:ascii="Times New Roman" w:cs="Times New Roman" w:eastAsia="Times New Roman" w:hAnsi="Times New Roman"/>
+          <w:bCs w:val="false"/>
+          <w:iCs w:val="false"/>
+          <w:sz w:val="24"/>
+          <w:szCs w:val="24"/>
+        </w:rPr>
+        <w:t xml:space="preserve"> 7(special issue):24–52.</w:t>
       </w:r>
     </w:p>
     <w:p>
@@ -16288,7 +16326,28 @@
           <w:sz w:val="24"/>
           <w:szCs w:val="24"/>
         </w:rPr>
-        <w:t>Without inspection, the shipped candidate is an exploit with probability 1 − (1 − π)^N, so expected net value is</w:t>
+        <w:t>Without inspection, the shipped candidate is an exploit with probability 1 − (1 − π)</w:t>
+      </w:r>
+      <w:r>
+        <w:rPr>
+          <w:rFonts w:ascii="Times New Roman" w:cs="Times New Roman" w:eastAsia="Times New Roman" w:hAnsi="Times New Roman"/>
+          <w:bCs w:val="false"/>
+          <w:iCs w:val="false"/>
+          <w:sz w:val="24"/>
+          <w:szCs w:val="24"/>
+          <w:vertAlign w:val="superscript"/>
+        </w:rPr>
+        <w:t>N</w:t>
+      </w:r>
+      <w:r>
+        <w:rPr>
+          <w:rFonts w:ascii="Times New Roman" w:cs="Times New Roman" w:eastAsia="Times New Roman" w:hAnsi="Times New Roman"/>
+          <w:bCs w:val="false"/>
+          <w:iCs w:val="false"/>
+          <w:sz w:val="24"/>
+          <w:szCs w:val="24"/>
+        </w:rPr>
+        <w:t>, so expected net value is</w:t>
       </w:r>
     </w:p>
     <w:p>
@@ -16339,7 +16398,28 @@
           <w:sz w:val="24"/>
           <w:szCs w:val="24"/>
         </w:rPr>
-        <w:t>)  =  (1 − π)^N ρ</w:t>
+        <w:t>)  =  (1 − π)</w:t>
+      </w:r>
+      <w:r>
+        <w:rPr>
+          <w:rFonts w:ascii="Times New Roman" w:cs="Times New Roman" w:eastAsia="Times New Roman" w:hAnsi="Times New Roman"/>
+          <w:bCs w:val="false"/>
+          <w:iCs/>
+          <w:sz w:val="24"/>
+          <w:szCs w:val="24"/>
+          <w:vertAlign w:val="superscript"/>
+        </w:rPr>
+        <w:t>N</w:t>
+      </w:r>
+      <w:r>
+        <w:rPr>
+          <w:rFonts w:ascii="Times New Roman" w:cs="Times New Roman" w:eastAsia="Times New Roman" w:hAnsi="Times New Roman"/>
+          <w:bCs w:val="false"/>
+          <w:iCs/>
+          <w:sz w:val="24"/>
+          <w:szCs w:val="24"/>
+        </w:rPr>
+        <w:t xml:space="preserve"> ρ</w:t>
       </w:r>
       <w:r>
         <w:rPr>
@@ -16393,7 +16473,28 @@
           <w:sz w:val="24"/>
           <w:szCs w:val="24"/>
         </w:rPr>
-        <w:t xml:space="preserve">  −  [1 − (1 − π)^N] </w:t>
+        <w:t xml:space="preserve">  −  [1 − (1 − π)</w:t>
+      </w:r>
+      <w:r>
+        <w:rPr>
+          <w:rFonts w:ascii="Times New Roman" w:cs="Times New Roman" w:eastAsia="Times New Roman" w:hAnsi="Times New Roman"/>
+          <w:bCs w:val="false"/>
+          <w:iCs/>
+          <w:sz w:val="24"/>
+          <w:szCs w:val="24"/>
+          <w:vertAlign w:val="superscript"/>
+        </w:rPr>
+        <w:t>N</w:t>
+      </w:r>
+      <w:r>
+        <w:rPr>
+          <w:rFonts w:ascii="Times New Roman" w:cs="Times New Roman" w:eastAsia="Times New Roman" w:hAnsi="Times New Roman"/>
+          <w:bCs w:val="false"/>
+          <w:iCs/>
+          <w:sz w:val="24"/>
+          <w:szCs w:val="24"/>
+        </w:rPr>
+        <w:t xml:space="preserve">] </w:t>
       </w:r>
       <w:r>
         <w:rPr>
@@ -16813,24 +16914,1638 @@
           <w:sz w:val="24"/>
           <w:szCs w:val="24"/>
         </w:rPr>
-        <w:t xml:space="preserve">so that judge-only shipping is optimal at low search depth and inspection becomes optimal beyond it. When π is close to zero, as the experiments of Section 4 suggest for a strong judge on verifiable problems, </w:t>
-      </w:r>
-      <w:r>
-        <w:rPr>
-          <w:rFonts w:ascii="Times New Roman" w:cs="Times New Roman" w:eastAsia="Times New Roman" w:hAnsi="Times New Roman"/>
-          <w:bCs w:val="false"/>
-          <w:i/>
-          <w:iCs w:val="false"/>
-          <w:sz w:val="24"/>
-          <w:szCs w:val="24"/>
-        </w:rPr>
-        <w:t>U</w:t>
-      </w:r>
-      <w:r>
-        <w:rPr>
-          <w:rFonts w:ascii="Times New Roman" w:cs="Times New Roman" w:eastAsia="Times New Roman" w:hAnsi="Times New Roman"/>
-          <w:bCs w:val="false"/>
-          <w:iCs w:val="false"/>
+        <w:t>so that judge-only shipping is optimal at low search depth and inspection becomes optimal beyond it. When π is close to zero, as the experiments of Section 4 suggest for a strong judge on verifiable problems, U(N) has no interior maximum within the range explored, and deeper search is limited only by its cost. The expected-value expression and the single-root property were checked numerically. The model assumes that exploits always receive the top score and that π and d are exogenous, assumptions that Appendix E relaxes.</w:t>
+      </w:r>
+    </w:p>
+    <w:p>
+      <w:pPr>
+        <w:pStyle w:val="Heading1"/>
+        <w:spacing w:after="240" w:before="360" w:line="480" w:lineRule="auto"/>
+        <w:jc w:val="center"/>
+      </w:pPr>
+      <w:r>
+        <w:rPr>
+          <w:rFonts w:ascii="Times New Roman" w:cs="Times New Roman" w:eastAsia="Times New Roman" w:hAnsi="Times New Roman"/>
+          <w:bCs/>
+          <w:iCs w:val="false"/>
+          <w:sz w:val="24"/>
+          <w:szCs w:val="24"/>
+        </w:rPr>
+        <w:t>APPENDIX E: ENDOGENOUS EXPLOITATION AND THE DETERRENCE ROLE OF INSPECTION</w:t>
+      </w:r>
+    </w:p>
+    <w:p>
+      <w:pPr>
+        <w:spacing w:after="0" w:before="0" w:line="480" w:lineRule="auto"/>
+        <w:ind w:firstLine="720"/>
+        <w:jc w:val="left"/>
+      </w:pPr>
+      <w:r>
+        <w:rPr>
+          <w:rFonts w:ascii="Times New Roman" w:cs="Times New Roman" w:eastAsia="Times New Roman" w:hAnsi="Times New Roman"/>
+          <w:bCs w:val="false"/>
+          <w:iCs w:val="false"/>
+          <w:sz w:val="24"/>
+          <w:szCs w:val="24"/>
+        </w:rPr>
+        <w:t>Appendix D treats the share of exploits as exogenous. This appendix lets the team that searches choose it. The aim is to show how the incentive to game depends on search depth, on inspection, and on the gameability of the judge. The model is deliberately stylized, and its assumptions are stated where they matter.</w:t>
+      </w:r>
+    </w:p>
+    <w:p>
+      <w:pPr>
+        <w:spacing w:after="0" w:before="0" w:line="480" w:lineRule="auto"/>
+        <w:ind w:firstLine="720"/>
+        <w:jc w:val="left"/>
+      </w:pPr>
+      <w:r>
+        <w:rPr>
+          <w:rFonts w:ascii="Times New Roman" w:cs="Times New Roman" w:eastAsia="Times New Roman" w:hAnsi="Times New Roman"/>
+          <w:bCs w:val="false"/>
+          <w:i/>
+          <w:iCs w:val="false"/>
+          <w:sz w:val="24"/>
+          <w:szCs w:val="24"/>
+        </w:rPr>
+        <w:t>Setup.</w:t>
+      </w:r>
+      <w:r>
+        <w:rPr>
+          <w:rFonts w:ascii="Times New Roman" w:cs="Times New Roman" w:eastAsia="Times New Roman" w:hAnsi="Times New Roman"/>
+          <w:bCs w:val="false"/>
+          <w:iCs w:val="false"/>
+          <w:sz w:val="24"/>
+          <w:szCs w:val="24"/>
+        </w:rPr>
+        <w:t xml:space="preserve"> At each of </w:t>
+      </w:r>
+      <w:r>
+        <w:rPr>
+          <w:rFonts w:ascii="Times New Roman" w:cs="Times New Roman" w:eastAsia="Times New Roman" w:hAnsi="Times New Roman"/>
+          <w:bCs w:val="false"/>
+          <w:i/>
+          <w:iCs w:val="false"/>
+          <w:sz w:val="24"/>
+          <w:szCs w:val="24"/>
+        </w:rPr>
+        <w:t>N</w:t>
+      </w:r>
+      <w:r>
+        <w:rPr>
+          <w:rFonts w:ascii="Times New Roman" w:cs="Times New Roman" w:eastAsia="Times New Roman" w:hAnsi="Times New Roman"/>
+          <w:bCs w:val="false"/>
+          <w:iCs w:val="false"/>
+          <w:sz w:val="24"/>
+          <w:szCs w:val="24"/>
+        </w:rPr>
+        <w:t xml:space="preserve"> search steps the team produces an honest candidate whose judge score is σ</w:t>
+      </w:r>
+      <w:r>
+        <w:rPr>
+          <w:rFonts w:ascii="Times New Roman" w:cs="Times New Roman" w:eastAsia="Times New Roman" w:hAnsi="Times New Roman"/>
+          <w:bCs w:val="false"/>
+          <w:iCs w:val="false"/>
+          <w:sz w:val="24"/>
+          <w:szCs w:val="24"/>
+          <w:vertAlign w:val="subscript"/>
+        </w:rPr>
+        <w:t>J</w:t>
+      </w:r>
+      <w:r>
+        <w:rPr>
+          <w:rFonts w:ascii="Times New Roman" w:cs="Times New Roman" w:eastAsia="Times New Roman" w:hAnsi="Times New Roman"/>
+          <w:bCs w:val="false"/>
+          <w:iCs w:val="false"/>
+          <w:sz w:val="24"/>
+          <w:szCs w:val="24"/>
+        </w:rPr>
+        <w:t xml:space="preserve"> times a standard normal draw. At the same step it can also produce an exploit candidate with probability </w:t>
+      </w:r>
+      <w:r>
+        <w:rPr>
+          <w:rFonts w:ascii="Times New Roman" w:cs="Times New Roman" w:eastAsia="Times New Roman" w:hAnsi="Times New Roman"/>
+          <w:bCs w:val="false"/>
+          <w:i/>
+          <w:iCs w:val="false"/>
+          <w:sz w:val="24"/>
+          <w:szCs w:val="24"/>
+        </w:rPr>
+        <w:t>e</w:t>
+      </w:r>
+      <w:r>
+        <w:rPr>
+          <w:rFonts w:ascii="Times New Roman" w:cs="Times New Roman" w:eastAsia="Times New Roman" w:hAnsi="Times New Roman"/>
+          <w:bCs w:val="false"/>
+          <w:iCs w:val="false"/>
+          <w:sz w:val="24"/>
+          <w:szCs w:val="24"/>
+        </w:rPr>
+        <w:t>, at cost (κ/2)</w:t>
+      </w:r>
+      <w:r>
+        <w:rPr>
+          <w:rFonts w:ascii="Times New Roman" w:cs="Times New Roman" w:eastAsia="Times New Roman" w:hAnsi="Times New Roman"/>
+          <w:bCs w:val="false"/>
+          <w:i/>
+          <w:iCs w:val="false"/>
+          <w:sz w:val="24"/>
+          <w:szCs w:val="24"/>
+        </w:rPr>
+        <w:t>e</w:t>
+      </w:r>
+      <w:r>
+        <w:rPr>
+          <w:rFonts w:ascii="Times New Roman" w:cs="Times New Roman" w:eastAsia="Times New Roman" w:hAnsi="Times New Roman"/>
+          <w:bCs w:val="false"/>
+          <w:iCs w:val="false"/>
+          <w:sz w:val="24"/>
+          <w:szCs w:val="24"/>
+        </w:rPr>
+        <w:t xml:space="preserve">² per step, so that the probability that at least one exploit exists is </w:t>
+      </w:r>
+      <w:r>
+        <w:rPr>
+          <w:rFonts w:ascii="Times New Roman" w:cs="Times New Roman" w:eastAsia="Times New Roman" w:hAnsi="Times New Roman"/>
+          <w:bCs w:val="false"/>
+          <w:i/>
+          <w:iCs w:val="false"/>
+          <w:sz w:val="24"/>
+          <w:szCs w:val="24"/>
+        </w:rPr>
+        <w:t>Q</w:t>
+      </w:r>
+      <w:r>
+        <w:rPr>
+          <w:rFonts w:ascii="Times New Roman" w:cs="Times New Roman" w:eastAsia="Times New Roman" w:hAnsi="Times New Roman"/>
+          <w:bCs w:val="false"/>
+          <w:iCs w:val="false"/>
+          <w:sz w:val="24"/>
+          <w:szCs w:val="24"/>
+        </w:rPr>
+        <w:t xml:space="preserve"> = 1 − (1 − </w:t>
+      </w:r>
+      <w:r>
+        <w:rPr>
+          <w:rFonts w:ascii="Times New Roman" w:cs="Times New Roman" w:eastAsia="Times New Roman" w:hAnsi="Times New Roman"/>
+          <w:bCs w:val="false"/>
+          <w:i/>
+          <w:iCs w:val="false"/>
+          <w:sz w:val="24"/>
+          <w:szCs w:val="24"/>
+        </w:rPr>
+        <w:t>e</w:t>
+      </w:r>
+      <w:r>
+        <w:rPr>
+          <w:rFonts w:ascii="Times New Roman" w:cs="Times New Roman" w:eastAsia="Times New Roman" w:hAnsi="Times New Roman"/>
+          <w:bCs w:val="false"/>
+          <w:iCs w:val="false"/>
+          <w:sz w:val="24"/>
+          <w:szCs w:val="24"/>
+        </w:rPr>
+        <w:t>)</w:t>
+      </w:r>
+      <w:r>
+        <w:rPr>
+          <w:rFonts w:ascii="Times New Roman" w:cs="Times New Roman" w:eastAsia="Times New Roman" w:hAnsi="Times New Roman"/>
+          <w:bCs w:val="false"/>
+          <w:iCs w:val="false"/>
+          <w:sz w:val="24"/>
+          <w:szCs w:val="24"/>
+          <w:vertAlign w:val="superscript"/>
+        </w:rPr>
+        <w:t>N</w:t>
+      </w:r>
+      <w:r>
+        <w:rPr>
+          <w:rFonts w:ascii="Times New Roman" w:cs="Times New Roman" w:eastAsia="Times New Roman" w:hAnsi="Times New Roman"/>
+          <w:bCs w:val="false"/>
+          <w:iCs w:val="false"/>
+          <w:sz w:val="24"/>
+          <w:szCs w:val="24"/>
+        </w:rPr>
+        <w:t xml:space="preserve">. An exploit outscores the best honest candidate by Δ &gt; 0. An inspection of the shipped candidate flags an exploit with probability φ, and a flagged release is blocked, so that the incumbent, whose judge score and gold value are zero, remains in place. The team is paid β times the judge score of the candidate that ships. Let </w:t>
+      </w:r>
+      <w:r>
+        <w:rPr>
+          <w:rFonts w:ascii="Times New Roman" w:cs="Times New Roman" w:eastAsia="Times New Roman" w:hAnsi="Times New Roman"/>
+          <w:bCs w:val="false"/>
+          <w:i/>
+          <w:iCs w:val="false"/>
+          <w:sz w:val="24"/>
+          <w:szCs w:val="24"/>
+        </w:rPr>
+        <w:t>m</w:t>
+      </w:r>
+      <w:r>
+        <w:rPr>
+          <w:rFonts w:ascii="Times New Roman" w:cs="Times New Roman" w:eastAsia="Times New Roman" w:hAnsi="Times New Roman"/>
+          <w:bCs w:val="false"/>
+          <w:i/>
+          <w:iCs w:val="false"/>
+          <w:sz w:val="24"/>
+          <w:szCs w:val="24"/>
+          <w:vertAlign w:val="subscript"/>
+        </w:rPr>
+        <w:t>N</w:t>
+      </w:r>
+      <w:r>
+        <w:rPr>
+          <w:rFonts w:ascii="Times New Roman" w:cs="Times New Roman" w:eastAsia="Times New Roman" w:hAnsi="Times New Roman"/>
+          <w:bCs w:val="false"/>
+          <w:iCs w:val="false"/>
+          <w:sz w:val="24"/>
+          <w:szCs w:val="24"/>
+        </w:rPr>
+        <w:t xml:space="preserve"> denote the expected maximum of </w:t>
+      </w:r>
+      <w:r>
+        <w:rPr>
+          <w:rFonts w:ascii="Times New Roman" w:cs="Times New Roman" w:eastAsia="Times New Roman" w:hAnsi="Times New Roman"/>
+          <w:bCs w:val="false"/>
+          <w:i/>
+          <w:iCs w:val="false"/>
+          <w:sz w:val="24"/>
+          <w:szCs w:val="24"/>
+        </w:rPr>
+        <w:t>N</w:t>
+      </w:r>
+      <w:r>
+        <w:rPr>
+          <w:rFonts w:ascii="Times New Roman" w:cs="Times New Roman" w:eastAsia="Times New Roman" w:hAnsi="Times New Roman"/>
+          <w:bCs w:val="false"/>
+          <w:iCs w:val="false"/>
+          <w:sz w:val="24"/>
+          <w:szCs w:val="24"/>
+        </w:rPr>
+        <w:t xml:space="preserve"> standard normal draws. The organization values the best honest candidate at ρ</w:t>
+      </w:r>
+      <w:r>
+        <w:rPr>
+          <w:rFonts w:ascii="Times New Roman" w:cs="Times New Roman" w:eastAsia="Times New Roman" w:hAnsi="Times New Roman"/>
+          <w:bCs w:val="false"/>
+          <w:i/>
+          <w:iCs w:val="false"/>
+          <w:sz w:val="24"/>
+          <w:szCs w:val="24"/>
+        </w:rPr>
+        <w:t>s</w:t>
+      </w:r>
+      <w:r>
+        <w:rPr>
+          <w:rFonts w:ascii="Times New Roman" w:cs="Times New Roman" w:eastAsia="Times New Roman" w:hAnsi="Times New Roman"/>
+          <w:bCs w:val="false"/>
+          <w:iCs w:val="false"/>
+          <w:sz w:val="24"/>
+          <w:szCs w:val="24"/>
+        </w:rPr>
+        <w:t xml:space="preserve"> </w:t>
+      </w:r>
+      <w:r>
+        <w:rPr>
+          <w:rFonts w:ascii="Times New Roman" w:cs="Times New Roman" w:eastAsia="Times New Roman" w:hAnsi="Times New Roman"/>
+          <w:bCs w:val="false"/>
+          <w:i/>
+          <w:iCs w:val="false"/>
+          <w:sz w:val="24"/>
+          <w:szCs w:val="24"/>
+        </w:rPr>
+        <w:t>m</w:t>
+      </w:r>
+      <w:r>
+        <w:rPr>
+          <w:rFonts w:ascii="Times New Roman" w:cs="Times New Roman" w:eastAsia="Times New Roman" w:hAnsi="Times New Roman"/>
+          <w:bCs w:val="false"/>
+          <w:i/>
+          <w:iCs w:val="false"/>
+          <w:sz w:val="24"/>
+          <w:szCs w:val="24"/>
+          <w:vertAlign w:val="subscript"/>
+        </w:rPr>
+        <w:t>N</w:t>
+      </w:r>
+      <w:r>
+        <w:rPr>
+          <w:rFonts w:ascii="Times New Roman" w:cs="Times New Roman" w:eastAsia="Times New Roman" w:hAnsi="Times New Roman"/>
+          <w:bCs w:val="false"/>
+          <w:iCs w:val="false"/>
+          <w:sz w:val="24"/>
+          <w:szCs w:val="24"/>
+        </w:rPr>
+        <w:t xml:space="preserve"> in gold, an undetected exploit at −</w:t>
+      </w:r>
+      <w:r>
+        <w:rPr>
+          <w:rFonts w:ascii="Times New Roman" w:cs="Times New Roman" w:eastAsia="Times New Roman" w:hAnsi="Times New Roman"/>
+          <w:bCs w:val="false"/>
+          <w:i/>
+          <w:iCs w:val="false"/>
+          <w:sz w:val="24"/>
+          <w:szCs w:val="24"/>
+        </w:rPr>
+        <w:t>d</w:t>
+      </w:r>
+      <w:r>
+        <w:rPr>
+          <w:rFonts w:ascii="Times New Roman" w:cs="Times New Roman" w:eastAsia="Times New Roman" w:hAnsi="Times New Roman"/>
+          <w:bCs w:val="false"/>
+          <w:iCs w:val="false"/>
+          <w:sz w:val="24"/>
+          <w:szCs w:val="24"/>
+        </w:rPr>
+        <w:t xml:space="preserve">, and a blocked release at zero. It chooses </w:t>
+      </w:r>
+      <w:r>
+        <w:rPr>
+          <w:rFonts w:ascii="Times New Roman" w:cs="Times New Roman" w:eastAsia="Times New Roman" w:hAnsi="Times New Roman"/>
+          <w:bCs w:val="false"/>
+          <w:i/>
+          <w:iCs w:val="false"/>
+          <w:sz w:val="24"/>
+          <w:szCs w:val="24"/>
+        </w:rPr>
+        <w:t>N</w:t>
+      </w:r>
+      <w:r>
+        <w:rPr>
+          <w:rFonts w:ascii="Times New Roman" w:cs="Times New Roman" w:eastAsia="Times New Roman" w:hAnsi="Times New Roman"/>
+          <w:bCs w:val="false"/>
+          <w:iCs w:val="false"/>
+          <w:sz w:val="24"/>
+          <w:szCs w:val="24"/>
+        </w:rPr>
+        <w:t xml:space="preserve"> and φ, and the team then chooses </w:t>
+      </w:r>
+      <w:r>
+        <w:rPr>
+          <w:rFonts w:ascii="Times New Roman" w:cs="Times New Roman" w:eastAsia="Times New Roman" w:hAnsi="Times New Roman"/>
+          <w:bCs w:val="false"/>
+          <w:i/>
+          <w:iCs w:val="false"/>
+          <w:sz w:val="24"/>
+          <w:szCs w:val="24"/>
+        </w:rPr>
+        <w:t>e</w:t>
+      </w:r>
+      <w:r>
+        <w:rPr>
+          <w:rFonts w:ascii="Times New Roman" w:cs="Times New Roman" w:eastAsia="Times New Roman" w:hAnsi="Times New Roman"/>
+          <w:bCs w:val="false"/>
+          <w:iCs w:val="false"/>
+          <w:sz w:val="24"/>
+          <w:szCs w:val="24"/>
+        </w:rPr>
+        <w:t>. We assume κ &gt; βΔ.</w:t>
+      </w:r>
+    </w:p>
+    <w:p>
+      <w:pPr>
+        <w:spacing w:after="0" w:before="0" w:line="480" w:lineRule="auto"/>
+        <w:ind w:firstLine="720"/>
+        <w:jc w:val="left"/>
+      </w:pPr>
+      <w:r>
+        <w:rPr>
+          <w:rFonts w:ascii="Times New Roman" w:cs="Times New Roman" w:eastAsia="Times New Roman" w:hAnsi="Times New Roman"/>
+          <w:bCs w:val="false"/>
+          <w:i/>
+          <w:iCs w:val="false"/>
+          <w:sz w:val="24"/>
+          <w:szCs w:val="24"/>
+        </w:rPr>
+        <w:t>Step 1: the team’s best response.</w:t>
+      </w:r>
+      <w:r>
+        <w:rPr>
+          <w:rFonts w:ascii="Times New Roman" w:cs="Times New Roman" w:eastAsia="Times New Roman" w:hAnsi="Times New Roman"/>
+          <w:bCs w:val="false"/>
+          <w:iCs w:val="false"/>
+          <w:sz w:val="24"/>
+          <w:szCs w:val="24"/>
+        </w:rPr>
+        <w:t xml:space="preserve"> A successful exploit raises the team’s expected reward by (1 − φ)(σ</w:t>
+      </w:r>
+      <w:r>
+        <w:rPr>
+          <w:rFonts w:ascii="Times New Roman" w:cs="Times New Roman" w:eastAsia="Times New Roman" w:hAnsi="Times New Roman"/>
+          <w:bCs w:val="false"/>
+          <w:iCs w:val="false"/>
+          <w:sz w:val="24"/>
+          <w:szCs w:val="24"/>
+          <w:vertAlign w:val="subscript"/>
+        </w:rPr>
+        <w:t>J</w:t>
+      </w:r>
+      <w:r>
+        <w:rPr>
+          <w:rFonts w:ascii="Times New Roman" w:cs="Times New Roman" w:eastAsia="Times New Roman" w:hAnsi="Times New Roman"/>
+          <w:bCs w:val="false"/>
+          <w:i/>
+          <w:iCs w:val="false"/>
+          <w:sz w:val="24"/>
+          <w:szCs w:val="24"/>
+        </w:rPr>
+        <w:t>m</w:t>
+      </w:r>
+      <w:r>
+        <w:rPr>
+          <w:rFonts w:ascii="Times New Roman" w:cs="Times New Roman" w:eastAsia="Times New Roman" w:hAnsi="Times New Roman"/>
+          <w:bCs w:val="false"/>
+          <w:i/>
+          <w:iCs w:val="false"/>
+          <w:sz w:val="24"/>
+          <w:szCs w:val="24"/>
+          <w:vertAlign w:val="subscript"/>
+        </w:rPr>
+        <w:t>N</w:t>
+      </w:r>
+      <w:r>
+        <w:rPr>
+          <w:rFonts w:ascii="Times New Roman" w:cs="Times New Roman" w:eastAsia="Times New Roman" w:hAnsi="Times New Roman"/>
+          <w:bCs w:val="false"/>
+          <w:iCs w:val="false"/>
+          <w:sz w:val="24"/>
+          <w:szCs w:val="24"/>
+        </w:rPr>
+        <w:t xml:space="preserve"> + Δ) when undetected and forfeits the honest score σ</w:t>
+      </w:r>
+      <w:r>
+        <w:rPr>
+          <w:rFonts w:ascii="Times New Roman" w:cs="Times New Roman" w:eastAsia="Times New Roman" w:hAnsi="Times New Roman"/>
+          <w:bCs w:val="false"/>
+          <w:iCs w:val="false"/>
+          <w:sz w:val="24"/>
+          <w:szCs w:val="24"/>
+          <w:vertAlign w:val="subscript"/>
+        </w:rPr>
+        <w:t>J</w:t>
+      </w:r>
+      <w:r>
+        <w:rPr>
+          <w:rFonts w:ascii="Times New Roman" w:cs="Times New Roman" w:eastAsia="Times New Roman" w:hAnsi="Times New Roman"/>
+          <w:bCs w:val="false"/>
+          <w:i/>
+          <w:iCs w:val="false"/>
+          <w:sz w:val="24"/>
+          <w:szCs w:val="24"/>
+        </w:rPr>
+        <w:t>m</w:t>
+      </w:r>
+      <w:r>
+        <w:rPr>
+          <w:rFonts w:ascii="Times New Roman" w:cs="Times New Roman" w:eastAsia="Times New Roman" w:hAnsi="Times New Roman"/>
+          <w:bCs w:val="false"/>
+          <w:i/>
+          <w:iCs w:val="false"/>
+          <w:sz w:val="24"/>
+          <w:szCs w:val="24"/>
+          <w:vertAlign w:val="subscript"/>
+        </w:rPr>
+        <w:t>N</w:t>
+      </w:r>
+      <w:r>
+        <w:rPr>
+          <w:rFonts w:ascii="Times New Roman" w:cs="Times New Roman" w:eastAsia="Times New Roman" w:hAnsi="Times New Roman"/>
+          <w:bCs w:val="false"/>
+          <w:iCs w:val="false"/>
+          <w:sz w:val="24"/>
+          <w:szCs w:val="24"/>
+        </w:rPr>
+        <w:t xml:space="preserve"> when flagged. Its net gain per unit of β is</w:t>
+      </w:r>
+    </w:p>
+    <w:p>
+      <w:pPr>
+        <w:tabs>
+          <w:tab w:val="right" w:pos="9360"/>
+        </w:tabs>
+        <w:spacing w:after="160" w:before="160" w:line="480" w:lineRule="auto"/>
+        <w:jc w:val="center"/>
+      </w:pPr>
+      <w:r>
+        <w:rPr>
+          <w:rFonts w:ascii="Times New Roman" w:cs="Times New Roman" w:eastAsia="Times New Roman" w:hAnsi="Times New Roman"/>
+          <w:bCs w:val="false"/>
+          <w:i/>
+          <w:iCs/>
+          <w:sz w:val="24"/>
+          <w:szCs w:val="24"/>
+        </w:rPr>
+        <w:t>G</w:t>
+      </w:r>
+      <w:r>
+        <w:rPr>
+          <w:rFonts w:ascii="Times New Roman" w:cs="Times New Roman" w:eastAsia="Times New Roman" w:hAnsi="Times New Roman"/>
+          <w:bCs w:val="false"/>
+          <w:i/>
+          <w:iCs/>
+          <w:sz w:val="24"/>
+          <w:szCs w:val="24"/>
+          <w:vertAlign w:val="subscript"/>
+        </w:rPr>
+        <w:t>N</w:t>
+      </w:r>
+      <w:r>
+        <w:rPr>
+          <w:rFonts w:ascii="Times New Roman" w:cs="Times New Roman" w:eastAsia="Times New Roman" w:hAnsi="Times New Roman"/>
+          <w:bCs w:val="false"/>
+          <w:iCs/>
+          <w:sz w:val="24"/>
+          <w:szCs w:val="24"/>
+        </w:rPr>
+        <w:t xml:space="preserve">  =  (1 − φ)Δ  −  φσ</w:t>
+      </w:r>
+      <w:r>
+        <w:rPr>
+          <w:rFonts w:ascii="Times New Roman" w:cs="Times New Roman" w:eastAsia="Times New Roman" w:hAnsi="Times New Roman"/>
+          <w:bCs w:val="false"/>
+          <w:iCs/>
+          <w:sz w:val="24"/>
+          <w:szCs w:val="24"/>
+          <w:vertAlign w:val="subscript"/>
+        </w:rPr>
+        <w:t>J</w:t>
+      </w:r>
+      <w:r>
+        <w:rPr>
+          <w:rFonts w:ascii="Times New Roman" w:cs="Times New Roman" w:eastAsia="Times New Roman" w:hAnsi="Times New Roman"/>
+          <w:bCs w:val="false"/>
+          <w:iCs/>
+          <w:sz w:val="24"/>
+          <w:szCs w:val="24"/>
+        </w:rPr>
+        <w:t xml:space="preserve"> </w:t>
+      </w:r>
+      <w:r>
+        <w:rPr>
+          <w:rFonts w:ascii="Times New Roman" w:cs="Times New Roman" w:eastAsia="Times New Roman" w:hAnsi="Times New Roman"/>
+          <w:bCs w:val="false"/>
+          <w:i/>
+          <w:iCs/>
+          <w:sz w:val="24"/>
+          <w:szCs w:val="24"/>
+        </w:rPr>
+        <w:t>m</w:t>
+      </w:r>
+      <w:r>
+        <w:rPr>
+          <w:rFonts w:ascii="Times New Roman" w:cs="Times New Roman" w:eastAsia="Times New Roman" w:hAnsi="Times New Roman"/>
+          <w:bCs w:val="false"/>
+          <w:i/>
+          <w:iCs/>
+          <w:sz w:val="24"/>
+          <w:szCs w:val="24"/>
+          <w:vertAlign w:val="subscript"/>
+        </w:rPr>
+        <w:t>N</w:t>
+      </w:r>
+      <w:r>
+        <w:rPr>
+          <w:rFonts w:ascii="Times New Roman" w:cs="Times New Roman" w:eastAsia="Times New Roman" w:hAnsi="Times New Roman"/>
+          <w:bCs w:val="false"/>
+          <w:iCs/>
+          <w:sz w:val="24"/>
+          <w:szCs w:val="24"/>
+        </w:rPr>
+        <w:tab/>
+        <w:t>(E1)</w:t>
+      </w:r>
+    </w:p>
+    <w:p>
+      <w:pPr>
+        <w:spacing w:after="0" w:before="0" w:line="480" w:lineRule="auto"/>
+        <w:ind w:firstLine="720"/>
+        <w:jc w:val="left"/>
+      </w:pPr>
+      <w:r>
+        <w:rPr>
+          <w:rFonts w:ascii="Times New Roman" w:cs="Times New Roman" w:eastAsia="Times New Roman" w:hAnsi="Times New Roman"/>
+          <w:bCs w:val="false"/>
+          <w:iCs w:val="false"/>
+          <w:sz w:val="24"/>
+          <w:szCs w:val="24"/>
+        </w:rPr>
+        <w:t xml:space="preserve">The team’s expected utility is strictly concave in </w:t>
+      </w:r>
+      <w:r>
+        <w:rPr>
+          <w:rFonts w:ascii="Times New Roman" w:cs="Times New Roman" w:eastAsia="Times New Roman" w:hAnsi="Times New Roman"/>
+          <w:bCs w:val="false"/>
+          <w:i/>
+          <w:iCs w:val="false"/>
+          <w:sz w:val="24"/>
+          <w:szCs w:val="24"/>
+        </w:rPr>
+        <w:t>e</w:t>
+      </w:r>
+      <w:r>
+        <w:rPr>
+          <w:rFonts w:ascii="Times New Roman" w:cs="Times New Roman" w:eastAsia="Times New Roman" w:hAnsi="Times New Roman"/>
+          <w:bCs w:val="false"/>
+          <w:iCs w:val="false"/>
+          <w:sz w:val="24"/>
+          <w:szCs w:val="24"/>
+        </w:rPr>
+        <w:t xml:space="preserve">, so the first-order condition is sufficient. If </w:t>
+      </w:r>
+      <w:r>
+        <w:rPr>
+          <w:rFonts w:ascii="Times New Roman" w:cs="Times New Roman" w:eastAsia="Times New Roman" w:hAnsi="Times New Roman"/>
+          <w:bCs w:val="false"/>
+          <w:i/>
+          <w:iCs w:val="false"/>
+          <w:sz w:val="24"/>
+          <w:szCs w:val="24"/>
+        </w:rPr>
+        <w:t>G</w:t>
+      </w:r>
+      <w:r>
+        <w:rPr>
+          <w:rFonts w:ascii="Times New Roman" w:cs="Times New Roman" w:eastAsia="Times New Roman" w:hAnsi="Times New Roman"/>
+          <w:bCs w:val="false"/>
+          <w:i/>
+          <w:iCs w:val="false"/>
+          <w:sz w:val="24"/>
+          <w:szCs w:val="24"/>
+          <w:vertAlign w:val="subscript"/>
+        </w:rPr>
+        <w:t>N</w:t>
+      </w:r>
+      <w:r>
+        <w:rPr>
+          <w:rFonts w:ascii="Times New Roman" w:cs="Times New Roman" w:eastAsia="Times New Roman" w:hAnsi="Times New Roman"/>
+          <w:bCs w:val="false"/>
+          <w:iCs w:val="false"/>
+          <w:sz w:val="24"/>
+          <w:szCs w:val="24"/>
+        </w:rPr>
+        <w:t xml:space="preserve"> ≤ 0, the team sets </w:t>
+      </w:r>
+      <w:r>
+        <w:rPr>
+          <w:rFonts w:ascii="Times New Roman" w:cs="Times New Roman" w:eastAsia="Times New Roman" w:hAnsi="Times New Roman"/>
+          <w:bCs w:val="false"/>
+          <w:i/>
+          <w:iCs w:val="false"/>
+          <w:sz w:val="24"/>
+          <w:szCs w:val="24"/>
+        </w:rPr>
+        <w:t>e</w:t>
+      </w:r>
+      <w:r>
+        <w:rPr>
+          <w:rFonts w:ascii="Times New Roman" w:cs="Times New Roman" w:eastAsia="Times New Roman" w:hAnsi="Times New Roman"/>
+          <w:bCs w:val="false"/>
+          <w:iCs w:val="false"/>
+          <w:sz w:val="24"/>
+          <w:szCs w:val="24"/>
+        </w:rPr>
+        <w:t xml:space="preserve"> = 0. If </w:t>
+      </w:r>
+      <w:r>
+        <w:rPr>
+          <w:rFonts w:ascii="Times New Roman" w:cs="Times New Roman" w:eastAsia="Times New Roman" w:hAnsi="Times New Roman"/>
+          <w:bCs w:val="false"/>
+          <w:i/>
+          <w:iCs w:val="false"/>
+          <w:sz w:val="24"/>
+          <w:szCs w:val="24"/>
+        </w:rPr>
+        <w:t>G</w:t>
+      </w:r>
+      <w:r>
+        <w:rPr>
+          <w:rFonts w:ascii="Times New Roman" w:cs="Times New Roman" w:eastAsia="Times New Roman" w:hAnsi="Times New Roman"/>
+          <w:bCs w:val="false"/>
+          <w:i/>
+          <w:iCs w:val="false"/>
+          <w:sz w:val="24"/>
+          <w:szCs w:val="24"/>
+          <w:vertAlign w:val="subscript"/>
+        </w:rPr>
+        <w:t>N</w:t>
+      </w:r>
+      <w:r>
+        <w:rPr>
+          <w:rFonts w:ascii="Times New Roman" w:cs="Times New Roman" w:eastAsia="Times New Roman" w:hAnsi="Times New Roman"/>
+          <w:bCs w:val="false"/>
+          <w:iCs w:val="false"/>
+          <w:sz w:val="24"/>
+          <w:szCs w:val="24"/>
+        </w:rPr>
+        <w:t xml:space="preserve"> &gt; 0, its best response is the unique root in (0, 1) of</w:t>
+      </w:r>
+    </w:p>
+    <w:p>
+      <w:pPr>
+        <w:tabs>
+          <w:tab w:val="right" w:pos="9360"/>
+        </w:tabs>
+        <w:spacing w:after="160" w:before="160" w:line="480" w:lineRule="auto"/>
+        <w:jc w:val="center"/>
+      </w:pPr>
+      <w:r>
+        <w:rPr>
+          <w:rFonts w:ascii="Times New Roman" w:cs="Times New Roman" w:eastAsia="Times New Roman" w:hAnsi="Times New Roman"/>
+          <w:bCs w:val="false"/>
+          <w:iCs/>
+          <w:sz w:val="24"/>
+          <w:szCs w:val="24"/>
+        </w:rPr>
+        <w:t>κ</w:t>
+      </w:r>
+      <w:r>
+        <w:rPr>
+          <w:rFonts w:ascii="Times New Roman" w:cs="Times New Roman" w:eastAsia="Times New Roman" w:hAnsi="Times New Roman"/>
+          <w:bCs w:val="false"/>
+          <w:i/>
+          <w:iCs/>
+          <w:sz w:val="24"/>
+          <w:szCs w:val="24"/>
+        </w:rPr>
+        <w:t>e</w:t>
+      </w:r>
+      <w:r>
+        <w:rPr>
+          <w:rFonts w:ascii="Times New Roman" w:cs="Times New Roman" w:eastAsia="Times New Roman" w:hAnsi="Times New Roman"/>
+          <w:bCs w:val="false"/>
+          <w:iCs/>
+          <w:sz w:val="24"/>
+          <w:szCs w:val="24"/>
+        </w:rPr>
+        <w:t xml:space="preserve">  =  β</w:t>
+      </w:r>
+      <w:r>
+        <w:rPr>
+          <w:rFonts w:ascii="Times New Roman" w:cs="Times New Roman" w:eastAsia="Times New Roman" w:hAnsi="Times New Roman"/>
+          <w:bCs w:val="false"/>
+          <w:i/>
+          <w:iCs/>
+          <w:sz w:val="24"/>
+          <w:szCs w:val="24"/>
+        </w:rPr>
+        <w:t>G</w:t>
+      </w:r>
+      <w:r>
+        <w:rPr>
+          <w:rFonts w:ascii="Times New Roman" w:cs="Times New Roman" w:eastAsia="Times New Roman" w:hAnsi="Times New Roman"/>
+          <w:bCs w:val="false"/>
+          <w:i/>
+          <w:iCs/>
+          <w:sz w:val="24"/>
+          <w:szCs w:val="24"/>
+          <w:vertAlign w:val="subscript"/>
+        </w:rPr>
+        <w:t>N</w:t>
+      </w:r>
+      <w:r>
+        <w:rPr>
+          <w:rFonts w:ascii="Times New Roman" w:cs="Times New Roman" w:eastAsia="Times New Roman" w:hAnsi="Times New Roman"/>
+          <w:bCs w:val="false"/>
+          <w:iCs/>
+          <w:sz w:val="24"/>
+          <w:szCs w:val="24"/>
+        </w:rPr>
+        <w:t xml:space="preserve"> (1 − </w:t>
+      </w:r>
+      <w:r>
+        <w:rPr>
+          <w:rFonts w:ascii="Times New Roman" w:cs="Times New Roman" w:eastAsia="Times New Roman" w:hAnsi="Times New Roman"/>
+          <w:bCs w:val="false"/>
+          <w:i/>
+          <w:iCs/>
+          <w:sz w:val="24"/>
+          <w:szCs w:val="24"/>
+        </w:rPr>
+        <w:t>e</w:t>
+      </w:r>
+      <w:r>
+        <w:rPr>
+          <w:rFonts w:ascii="Times New Roman" w:cs="Times New Roman" w:eastAsia="Times New Roman" w:hAnsi="Times New Roman"/>
+          <w:bCs w:val="false"/>
+          <w:iCs/>
+          <w:sz w:val="24"/>
+          <w:szCs w:val="24"/>
+        </w:rPr>
+        <w:t>)</w:t>
+      </w:r>
+      <w:r>
+        <w:rPr>
+          <w:rFonts w:ascii="Times New Roman" w:cs="Times New Roman" w:eastAsia="Times New Roman" w:hAnsi="Times New Roman"/>
+          <w:bCs w:val="false"/>
+          <w:iCs/>
+          <w:sz w:val="24"/>
+          <w:szCs w:val="24"/>
+          <w:vertAlign w:val="superscript"/>
+        </w:rPr>
+        <w:t>N−1</w:t>
+      </w:r>
+      <w:r>
+        <w:rPr>
+          <w:rFonts w:ascii="Times New Roman" w:cs="Times New Roman" w:eastAsia="Times New Roman" w:hAnsi="Times New Roman"/>
+          <w:bCs w:val="false"/>
+          <w:iCs/>
+          <w:sz w:val="24"/>
+          <w:szCs w:val="24"/>
+        </w:rPr>
+        <w:tab/>
+        <w:t>(E2)</w:t>
+      </w:r>
+    </w:p>
+    <w:p>
+      <w:pPr>
+        <w:spacing w:after="0" w:before="0" w:line="480" w:lineRule="auto"/>
+        <w:ind w:firstLine="720"/>
+        <w:jc w:val="left"/>
+      </w:pPr>
+      <w:r>
+        <w:rPr>
+          <w:rFonts w:ascii="Times New Roman" w:cs="Times New Roman" w:eastAsia="Times New Roman" w:hAnsi="Times New Roman"/>
+          <w:bCs w:val="false"/>
+          <w:i/>
+          <w:iCs w:val="false"/>
+          <w:sz w:val="24"/>
+          <w:szCs w:val="24"/>
+        </w:rPr>
+        <w:t>Step 2: comparative statics.</w:t>
+      </w:r>
+      <w:r>
+        <w:rPr>
+          <w:rFonts w:ascii="Times New Roman" w:cs="Times New Roman" w:eastAsia="Times New Roman" w:hAnsi="Times New Roman"/>
+          <w:bCs w:val="false"/>
+          <w:iCs w:val="false"/>
+          <w:sz w:val="24"/>
+          <w:szCs w:val="24"/>
+        </w:rPr>
+        <w:t xml:space="preserve"> The left side of (E2) increases in </w:t>
+      </w:r>
+      <w:r>
+        <w:rPr>
+          <w:rFonts w:ascii="Times New Roman" w:cs="Times New Roman" w:eastAsia="Times New Roman" w:hAnsi="Times New Roman"/>
+          <w:bCs w:val="false"/>
+          <w:i/>
+          <w:iCs w:val="false"/>
+          <w:sz w:val="24"/>
+          <w:szCs w:val="24"/>
+        </w:rPr>
+        <w:t>e</w:t>
+      </w:r>
+      <w:r>
+        <w:rPr>
+          <w:rFonts w:ascii="Times New Roman" w:cs="Times New Roman" w:eastAsia="Times New Roman" w:hAnsi="Times New Roman"/>
+          <w:bCs w:val="false"/>
+          <w:iCs w:val="false"/>
+          <w:sz w:val="24"/>
+          <w:szCs w:val="24"/>
+        </w:rPr>
+        <w:t xml:space="preserve"> and the right side decreases, which gives uniqueness. Applying the implicit function theorem, and treating </w:t>
+      </w:r>
+      <w:r>
+        <w:rPr>
+          <w:rFonts w:ascii="Times New Roman" w:cs="Times New Roman" w:eastAsia="Times New Roman" w:hAnsi="Times New Roman"/>
+          <w:bCs w:val="false"/>
+          <w:i/>
+          <w:iCs w:val="false"/>
+          <w:sz w:val="24"/>
+          <w:szCs w:val="24"/>
+        </w:rPr>
+        <w:t>N</w:t>
+      </w:r>
+      <w:r>
+        <w:rPr>
+          <w:rFonts w:ascii="Times New Roman" w:cs="Times New Roman" w:eastAsia="Times New Roman" w:hAnsi="Times New Roman"/>
+          <w:bCs w:val="false"/>
+          <w:iCs w:val="false"/>
+          <w:sz w:val="24"/>
+          <w:szCs w:val="24"/>
+        </w:rPr>
+        <w:t xml:space="preserve"> as continuous, shows that the root </w:t>
+      </w:r>
+      <w:r>
+        <w:rPr>
+          <w:rFonts w:ascii="Times New Roman" w:cs="Times New Roman" w:eastAsia="Times New Roman" w:hAnsi="Times New Roman"/>
+          <w:bCs w:val="false"/>
+          <w:i/>
+          <w:iCs w:val="false"/>
+          <w:sz w:val="24"/>
+          <w:szCs w:val="24"/>
+        </w:rPr>
+        <w:t>e</w:t>
+      </w:r>
+      <w:r>
+        <w:rPr>
+          <w:rFonts w:ascii="Times New Roman" w:cs="Times New Roman" w:eastAsia="Times New Roman" w:hAnsi="Times New Roman"/>
+          <w:bCs w:val="false"/>
+          <w:iCs w:val="false"/>
+          <w:sz w:val="24"/>
+          <w:szCs w:val="24"/>
+        </w:rPr>
+        <w:t xml:space="preserve">* decreases in </w:t>
+      </w:r>
+      <w:r>
+        <w:rPr>
+          <w:rFonts w:ascii="Times New Roman" w:cs="Times New Roman" w:eastAsia="Times New Roman" w:hAnsi="Times New Roman"/>
+          <w:bCs w:val="false"/>
+          <w:i/>
+          <w:iCs w:val="false"/>
+          <w:sz w:val="24"/>
+          <w:szCs w:val="24"/>
+        </w:rPr>
+        <w:t>N</w:t>
+      </w:r>
+      <w:r>
+        <w:rPr>
+          <w:rFonts w:ascii="Times New Roman" w:cs="Times New Roman" w:eastAsia="Times New Roman" w:hAnsi="Times New Roman"/>
+          <w:bCs w:val="false"/>
+          <w:iCs w:val="false"/>
+          <w:sz w:val="24"/>
+          <w:szCs w:val="24"/>
+        </w:rPr>
+        <w:t xml:space="preserve">, φ, and κ and increases in β and Δ. The decline in </w:t>
+      </w:r>
+      <w:r>
+        <w:rPr>
+          <w:rFonts w:ascii="Times New Roman" w:cs="Times New Roman" w:eastAsia="Times New Roman" w:hAnsi="Times New Roman"/>
+          <w:bCs w:val="false"/>
+          <w:i/>
+          <w:iCs w:val="false"/>
+          <w:sz w:val="24"/>
+          <w:szCs w:val="24"/>
+        </w:rPr>
+        <w:t>N</w:t>
+      </w:r>
+      <w:r>
+        <w:rPr>
+          <w:rFonts w:ascii="Times New Roman" w:cs="Times New Roman" w:eastAsia="Times New Roman" w:hAnsi="Times New Roman"/>
+          <w:bCs w:val="false"/>
+          <w:iCs w:val="false"/>
+          <w:sz w:val="24"/>
+          <w:szCs w:val="24"/>
+        </w:rPr>
+        <w:t xml:space="preserve"> has two sources: each additional step enlarges the honest score at stake, and an exploit becomes more likely to exist already. Substituting (E2) into the definition of </w:t>
+      </w:r>
+      <w:r>
+        <w:rPr>
+          <w:rFonts w:ascii="Times New Roman" w:cs="Times New Roman" w:eastAsia="Times New Roman" w:hAnsi="Times New Roman"/>
+          <w:bCs w:val="false"/>
+          <w:i/>
+          <w:iCs w:val="false"/>
+          <w:sz w:val="24"/>
+          <w:szCs w:val="24"/>
+        </w:rPr>
+        <w:t>Q</w:t>
+      </w:r>
+      <w:r>
+        <w:rPr>
+          <w:rFonts w:ascii="Times New Roman" w:cs="Times New Roman" w:eastAsia="Times New Roman" w:hAnsi="Times New Roman"/>
+          <w:bCs w:val="false"/>
+          <w:iCs w:val="false"/>
+          <w:sz w:val="24"/>
+          <w:szCs w:val="24"/>
+        </w:rPr>
+        <w:t xml:space="preserve"> gives an exact identity,</w:t>
+      </w:r>
+    </w:p>
+    <w:p>
+      <w:pPr>
+        <w:tabs>
+          <w:tab w:val="right" w:pos="9360"/>
+        </w:tabs>
+        <w:spacing w:after="160" w:before="160" w:line="480" w:lineRule="auto"/>
+        <w:jc w:val="center"/>
+      </w:pPr>
+      <w:r>
+        <w:rPr>
+          <w:rFonts w:ascii="Times New Roman" w:cs="Times New Roman" w:eastAsia="Times New Roman" w:hAnsi="Times New Roman"/>
+          <w:bCs w:val="false"/>
+          <w:iCs/>
+          <w:sz w:val="24"/>
+          <w:szCs w:val="24"/>
+        </w:rPr>
+        <w:t xml:space="preserve">1 − </w:t>
+      </w:r>
+      <w:r>
+        <w:rPr>
+          <w:rFonts w:ascii="Times New Roman" w:cs="Times New Roman" w:eastAsia="Times New Roman" w:hAnsi="Times New Roman"/>
+          <w:bCs w:val="false"/>
+          <w:i/>
+          <w:iCs/>
+          <w:sz w:val="24"/>
+          <w:szCs w:val="24"/>
+        </w:rPr>
+        <w:t>Q</w:t>
+      </w:r>
+      <w:r>
+        <w:rPr>
+          <w:rFonts w:ascii="Times New Roman" w:cs="Times New Roman" w:eastAsia="Times New Roman" w:hAnsi="Times New Roman"/>
+          <w:bCs w:val="false"/>
+          <w:iCs/>
+          <w:sz w:val="24"/>
+          <w:szCs w:val="24"/>
+        </w:rPr>
+        <w:t xml:space="preserve">  =  κ</w:t>
+      </w:r>
+      <w:r>
+        <w:rPr>
+          <w:rFonts w:ascii="Times New Roman" w:cs="Times New Roman" w:eastAsia="Times New Roman" w:hAnsi="Times New Roman"/>
+          <w:bCs w:val="false"/>
+          <w:i/>
+          <w:iCs/>
+          <w:sz w:val="24"/>
+          <w:szCs w:val="24"/>
+        </w:rPr>
+        <w:t>e</w:t>
+      </w:r>
+      <w:r>
+        <w:rPr>
+          <w:rFonts w:ascii="Times New Roman" w:cs="Times New Roman" w:eastAsia="Times New Roman" w:hAnsi="Times New Roman"/>
+          <w:bCs w:val="false"/>
+          <w:iCs/>
+          <w:sz w:val="24"/>
+          <w:szCs w:val="24"/>
+        </w:rPr>
+        <w:t xml:space="preserve">*(1 − </w:t>
+      </w:r>
+      <w:r>
+        <w:rPr>
+          <w:rFonts w:ascii="Times New Roman" w:cs="Times New Roman" w:eastAsia="Times New Roman" w:hAnsi="Times New Roman"/>
+          <w:bCs w:val="false"/>
+          <w:i/>
+          <w:iCs/>
+          <w:sz w:val="24"/>
+          <w:szCs w:val="24"/>
+        </w:rPr>
+        <w:t>e</w:t>
+      </w:r>
+      <w:r>
+        <w:rPr>
+          <w:rFonts w:ascii="Times New Roman" w:cs="Times New Roman" w:eastAsia="Times New Roman" w:hAnsi="Times New Roman"/>
+          <w:bCs w:val="false"/>
+          <w:iCs/>
+          <w:sz w:val="24"/>
+          <w:szCs w:val="24"/>
+        </w:rPr>
+        <w:t>*) / (β</w:t>
+      </w:r>
+      <w:r>
+        <w:rPr>
+          <w:rFonts w:ascii="Times New Roman" w:cs="Times New Roman" w:eastAsia="Times New Roman" w:hAnsi="Times New Roman"/>
+          <w:bCs w:val="false"/>
+          <w:i/>
+          <w:iCs/>
+          <w:sz w:val="24"/>
+          <w:szCs w:val="24"/>
+        </w:rPr>
+        <w:t>G</w:t>
+      </w:r>
+      <w:r>
+        <w:rPr>
+          <w:rFonts w:ascii="Times New Roman" w:cs="Times New Roman" w:eastAsia="Times New Roman" w:hAnsi="Times New Roman"/>
+          <w:bCs w:val="false"/>
+          <w:i/>
+          <w:iCs/>
+          <w:sz w:val="24"/>
+          <w:szCs w:val="24"/>
+          <w:vertAlign w:val="subscript"/>
+        </w:rPr>
+        <w:t>N</w:t>
+      </w:r>
+      <w:r>
+        <w:rPr>
+          <w:rFonts w:ascii="Times New Roman" w:cs="Times New Roman" w:eastAsia="Times New Roman" w:hAnsi="Times New Roman"/>
+          <w:bCs w:val="false"/>
+          <w:iCs/>
+          <w:sz w:val="24"/>
+          <w:szCs w:val="24"/>
+        </w:rPr>
+        <w:t>)</w:t>
+        <w:tab/>
+        <w:t>(E3)</w:t>
+      </w:r>
+    </w:p>
+    <w:p>
+      <w:pPr>
+        <w:spacing w:after="0" w:before="0" w:line="480" w:lineRule="auto"/>
+        <w:ind w:firstLine="720"/>
+        <w:jc w:val="left"/>
+      </w:pPr>
+      <w:r>
+        <w:rPr>
+          <w:rFonts w:ascii="Times New Roman" w:cs="Times New Roman" w:eastAsia="Times New Roman" w:hAnsi="Times New Roman"/>
+          <w:bCs w:val="false"/>
+          <w:iCs w:val="false"/>
+          <w:sz w:val="24"/>
+          <w:szCs w:val="24"/>
+        </w:rPr>
+        <w:t xml:space="preserve">so that </w:t>
+      </w:r>
+      <w:r>
+        <w:rPr>
+          <w:rFonts w:ascii="Times New Roman" w:cs="Times New Roman" w:eastAsia="Times New Roman" w:hAnsi="Times New Roman"/>
+          <w:bCs w:val="false"/>
+          <w:i/>
+          <w:iCs w:val="false"/>
+          <w:sz w:val="24"/>
+          <w:szCs w:val="24"/>
+        </w:rPr>
+        <w:t>Q</w:t>
+      </w:r>
+      <w:r>
+        <w:rPr>
+          <w:rFonts w:ascii="Times New Roman" w:cs="Times New Roman" w:eastAsia="Times New Roman" w:hAnsi="Times New Roman"/>
+          <w:bCs w:val="false"/>
+          <w:iCs w:val="false"/>
+          <w:sz w:val="24"/>
+          <w:szCs w:val="24"/>
+        </w:rPr>
+        <w:t xml:space="preserve"> approaches one as </w:t>
+      </w:r>
+      <w:r>
+        <w:rPr>
+          <w:rFonts w:ascii="Times New Roman" w:cs="Times New Roman" w:eastAsia="Times New Roman" w:hAnsi="Times New Roman"/>
+          <w:bCs w:val="false"/>
+          <w:i/>
+          <w:iCs w:val="false"/>
+          <w:sz w:val="24"/>
+          <w:szCs w:val="24"/>
+        </w:rPr>
+        <w:t>N</w:t>
+      </w:r>
+      <w:r>
+        <w:rPr>
+          <w:rFonts w:ascii="Times New Roman" w:cs="Times New Roman" w:eastAsia="Times New Roman" w:hAnsi="Times New Roman"/>
+          <w:bCs w:val="false"/>
+          <w:iCs w:val="false"/>
+          <w:sz w:val="24"/>
+          <w:szCs w:val="24"/>
+        </w:rPr>
+        <w:t xml:space="preserve"> grows whenever </w:t>
+      </w:r>
+      <w:r>
+        <w:rPr>
+          <w:rFonts w:ascii="Times New Roman" w:cs="Times New Roman" w:eastAsia="Times New Roman" w:hAnsi="Times New Roman"/>
+          <w:bCs w:val="false"/>
+          <w:i/>
+          <w:iCs w:val="false"/>
+          <w:sz w:val="24"/>
+          <w:szCs w:val="24"/>
+        </w:rPr>
+        <w:t>G</w:t>
+      </w:r>
+      <w:r>
+        <w:rPr>
+          <w:rFonts w:ascii="Times New Roman" w:cs="Times New Roman" w:eastAsia="Times New Roman" w:hAnsi="Times New Roman"/>
+          <w:bCs w:val="false"/>
+          <w:i/>
+          <w:iCs w:val="false"/>
+          <w:sz w:val="24"/>
+          <w:szCs w:val="24"/>
+          <w:vertAlign w:val="subscript"/>
+        </w:rPr>
+        <w:t>N</w:t>
+      </w:r>
+      <w:r>
+        <w:rPr>
+          <w:rFonts w:ascii="Times New Roman" w:cs="Times New Roman" w:eastAsia="Times New Roman" w:hAnsi="Times New Roman"/>
+          <w:bCs w:val="false"/>
+          <w:iCs w:val="false"/>
+          <w:sz w:val="24"/>
+          <w:szCs w:val="24"/>
+        </w:rPr>
+        <w:t xml:space="preserve"> stays positive, because </w:t>
+      </w:r>
+      <w:r>
+        <w:rPr>
+          <w:rFonts w:ascii="Times New Roman" w:cs="Times New Roman" w:eastAsia="Times New Roman" w:hAnsi="Times New Roman"/>
+          <w:bCs w:val="false"/>
+          <w:i/>
+          <w:iCs w:val="false"/>
+          <w:sz w:val="24"/>
+          <w:szCs w:val="24"/>
+        </w:rPr>
+        <w:t>e</w:t>
+      </w:r>
+      <w:r>
+        <w:rPr>
+          <w:rFonts w:ascii="Times New Roman" w:cs="Times New Roman" w:eastAsia="Times New Roman" w:hAnsi="Times New Roman"/>
+          <w:bCs w:val="false"/>
+          <w:iCs w:val="false"/>
+          <w:sz w:val="24"/>
+          <w:szCs w:val="24"/>
+        </w:rPr>
+        <w:t xml:space="preserve">* falls to zero and the right side vanishes. Without inspection (φ = 0), </w:t>
+      </w:r>
+      <w:r>
+        <w:rPr>
+          <w:rFonts w:ascii="Times New Roman" w:cs="Times New Roman" w:eastAsia="Times New Roman" w:hAnsi="Times New Roman"/>
+          <w:bCs w:val="false"/>
+          <w:i/>
+          <w:iCs w:val="false"/>
+          <w:sz w:val="24"/>
+          <w:szCs w:val="24"/>
+        </w:rPr>
+        <w:t>G</w:t>
+      </w:r>
+      <w:r>
+        <w:rPr>
+          <w:rFonts w:ascii="Times New Roman" w:cs="Times New Roman" w:eastAsia="Times New Roman" w:hAnsi="Times New Roman"/>
+          <w:bCs w:val="false"/>
+          <w:i/>
+          <w:iCs w:val="false"/>
+          <w:sz w:val="24"/>
+          <w:szCs w:val="24"/>
+          <w:vertAlign w:val="subscript"/>
+        </w:rPr>
+        <w:t>N</w:t>
+      </w:r>
+      <w:r>
+        <w:rPr>
+          <w:rFonts w:ascii="Times New Roman" w:cs="Times New Roman" w:eastAsia="Times New Roman" w:hAnsi="Times New Roman"/>
+          <w:bCs w:val="false"/>
+          <w:iCs w:val="false"/>
+          <w:sz w:val="24"/>
+          <w:szCs w:val="24"/>
+        </w:rPr>
+        <w:t xml:space="preserve"> = Δ at every depth, and exploitation becomes certain as search deepens.</w:t>
+      </w:r>
+    </w:p>
+    <w:p>
+      <w:pPr>
+        <w:spacing w:after="0" w:before="0" w:line="480" w:lineRule="auto"/>
+        <w:ind w:firstLine="720"/>
+        <w:jc w:val="left"/>
+      </w:pPr>
+      <w:r>
+        <w:rPr>
+          <w:rFonts w:ascii="Times New Roman" w:cs="Times New Roman" w:eastAsia="Times New Roman" w:hAnsi="Times New Roman"/>
+          <w:bCs w:val="false"/>
+          <w:i/>
+          <w:iCs w:val="false"/>
+          <w:sz w:val="24"/>
+          <w:szCs w:val="24"/>
+        </w:rPr>
+        <w:t>Step 3: deterrence.</w:t>
+      </w:r>
+      <w:r>
+        <w:rPr>
+          <w:rFonts w:ascii="Times New Roman" w:cs="Times New Roman" w:eastAsia="Times New Roman" w:hAnsi="Times New Roman"/>
+          <w:bCs w:val="false"/>
+          <w:iCs w:val="false"/>
+          <w:sz w:val="24"/>
+          <w:szCs w:val="24"/>
+        </w:rPr>
+        <w:t xml:space="preserve"> Because </w:t>
+      </w:r>
+      <w:r>
+        <w:rPr>
+          <w:rFonts w:ascii="Times New Roman" w:cs="Times New Roman" w:eastAsia="Times New Roman" w:hAnsi="Times New Roman"/>
+          <w:bCs w:val="false"/>
+          <w:i/>
+          <w:iCs w:val="false"/>
+          <w:sz w:val="24"/>
+          <w:szCs w:val="24"/>
+        </w:rPr>
+        <w:t>m</w:t>
+      </w:r>
+      <w:r>
+        <w:rPr>
+          <w:rFonts w:ascii="Times New Roman" w:cs="Times New Roman" w:eastAsia="Times New Roman" w:hAnsi="Times New Roman"/>
+          <w:bCs w:val="false"/>
+          <w:i/>
+          <w:iCs w:val="false"/>
+          <w:sz w:val="24"/>
+          <w:szCs w:val="24"/>
+          <w:vertAlign w:val="subscript"/>
+        </w:rPr>
+        <w:t>N</w:t>
+      </w:r>
+      <w:r>
+        <w:rPr>
+          <w:rFonts w:ascii="Times New Roman" w:cs="Times New Roman" w:eastAsia="Times New Roman" w:hAnsi="Times New Roman"/>
+          <w:bCs w:val="false"/>
+          <w:iCs w:val="false"/>
+          <w:sz w:val="24"/>
+          <w:szCs w:val="24"/>
+        </w:rPr>
+        <w:t xml:space="preserve"> grows without bound, </w:t>
+      </w:r>
+      <w:r>
+        <w:rPr>
+          <w:rFonts w:ascii="Times New Roman" w:cs="Times New Roman" w:eastAsia="Times New Roman" w:hAnsi="Times New Roman"/>
+          <w:bCs w:val="false"/>
+          <w:i/>
+          <w:iCs w:val="false"/>
+          <w:sz w:val="24"/>
+          <w:szCs w:val="24"/>
+        </w:rPr>
+        <w:t>G</w:t>
+      </w:r>
+      <w:r>
+        <w:rPr>
+          <w:rFonts w:ascii="Times New Roman" w:cs="Times New Roman" w:eastAsia="Times New Roman" w:hAnsi="Times New Roman"/>
+          <w:bCs w:val="false"/>
+          <w:i/>
+          <w:iCs w:val="false"/>
+          <w:sz w:val="24"/>
+          <w:szCs w:val="24"/>
+          <w:vertAlign w:val="subscript"/>
+        </w:rPr>
+        <w:t>N</w:t>
+      </w:r>
+      <w:r>
+        <w:rPr>
+          <w:rFonts w:ascii="Times New Roman" w:cs="Times New Roman" w:eastAsia="Times New Roman" w:hAnsi="Times New Roman"/>
+          <w:bCs w:val="false"/>
+          <w:iCs w:val="false"/>
+          <w:sz w:val="24"/>
+          <w:szCs w:val="24"/>
+        </w:rPr>
+        <w:t xml:space="preserve"> turns negative for any φ &gt; 0 once </w:t>
+      </w:r>
+      <w:r>
+        <w:rPr>
+          <w:rFonts w:ascii="Times New Roman" w:cs="Times New Roman" w:eastAsia="Times New Roman" w:hAnsi="Times New Roman"/>
+          <w:bCs w:val="false"/>
+          <w:i/>
+          <w:iCs w:val="false"/>
+          <w:sz w:val="24"/>
+          <w:szCs w:val="24"/>
+        </w:rPr>
+        <w:t>N</w:t>
+      </w:r>
+      <w:r>
+        <w:rPr>
+          <w:rFonts w:ascii="Times New Roman" w:cs="Times New Roman" w:eastAsia="Times New Roman" w:hAnsi="Times New Roman"/>
+          <w:bCs w:val="false"/>
+          <w:iCs w:val="false"/>
+          <w:sz w:val="24"/>
+          <w:szCs w:val="24"/>
+        </w:rPr>
+        <w:t xml:space="preserve"> reaches</w:t>
+      </w:r>
+    </w:p>
+    <w:p>
+      <w:pPr>
+        <w:tabs>
+          <w:tab w:val="right" w:pos="9360"/>
+        </w:tabs>
+        <w:spacing w:after="160" w:before="160" w:line="480" w:lineRule="auto"/>
+        <w:jc w:val="center"/>
+      </w:pPr>
+      <w:r>
+        <w:rPr>
+          <w:rFonts w:ascii="Times New Roman" w:cs="Times New Roman" w:eastAsia="Times New Roman" w:hAnsi="Times New Roman"/>
+          <w:bCs w:val="false"/>
+          <w:i/>
+          <w:iCs/>
+          <w:sz w:val="24"/>
+          <w:szCs w:val="24"/>
+        </w:rPr>
+        <w:t>N</w:t>
+      </w:r>
+      <w:r>
+        <w:rPr>
+          <w:rFonts w:ascii="Times New Roman" w:cs="Times New Roman" w:eastAsia="Times New Roman" w:hAnsi="Times New Roman"/>
+          <w:bCs w:val="false"/>
+          <w:i/>
+          <w:iCs/>
+          <w:sz w:val="24"/>
+          <w:szCs w:val="24"/>
+          <w:vertAlign w:val="subscript"/>
+        </w:rPr>
+        <w:t>d</w:t>
+      </w:r>
+      <w:r>
+        <w:rPr>
+          <w:rFonts w:ascii="Times New Roman" w:cs="Times New Roman" w:eastAsia="Times New Roman" w:hAnsi="Times New Roman"/>
+          <w:bCs w:val="false"/>
+          <w:iCs/>
+          <w:sz w:val="24"/>
+          <w:szCs w:val="24"/>
+        </w:rPr>
+        <w:t xml:space="preserve">(φ)  =  min{ </w:t>
+      </w:r>
+      <w:r>
+        <w:rPr>
+          <w:rFonts w:ascii="Times New Roman" w:cs="Times New Roman" w:eastAsia="Times New Roman" w:hAnsi="Times New Roman"/>
+          <w:bCs w:val="false"/>
+          <w:i/>
+          <w:iCs/>
+          <w:sz w:val="24"/>
+          <w:szCs w:val="24"/>
+        </w:rPr>
+        <w:t>N</w:t>
+      </w:r>
+      <w:r>
+        <w:rPr>
+          <w:rFonts w:ascii="Times New Roman" w:cs="Times New Roman" w:eastAsia="Times New Roman" w:hAnsi="Times New Roman"/>
+          <w:bCs w:val="false"/>
+          <w:iCs/>
+          <w:sz w:val="24"/>
+          <w:szCs w:val="24"/>
+        </w:rPr>
+        <w:t xml:space="preserve"> : σ</w:t>
+      </w:r>
+      <w:r>
+        <w:rPr>
+          <w:rFonts w:ascii="Times New Roman" w:cs="Times New Roman" w:eastAsia="Times New Roman" w:hAnsi="Times New Roman"/>
+          <w:bCs w:val="false"/>
+          <w:iCs/>
+          <w:sz w:val="24"/>
+          <w:szCs w:val="24"/>
+          <w:vertAlign w:val="subscript"/>
+        </w:rPr>
+        <w:t>J</w:t>
+      </w:r>
+      <w:r>
+        <w:rPr>
+          <w:rFonts w:ascii="Times New Roman" w:cs="Times New Roman" w:eastAsia="Times New Roman" w:hAnsi="Times New Roman"/>
+          <w:bCs w:val="false"/>
+          <w:iCs/>
+          <w:sz w:val="24"/>
+          <w:szCs w:val="24"/>
+        </w:rPr>
+        <w:t xml:space="preserve"> </w:t>
+      </w:r>
+      <w:r>
+        <w:rPr>
+          <w:rFonts w:ascii="Times New Roman" w:cs="Times New Roman" w:eastAsia="Times New Roman" w:hAnsi="Times New Roman"/>
+          <w:bCs w:val="false"/>
+          <w:i/>
+          <w:iCs/>
+          <w:sz w:val="24"/>
+          <w:szCs w:val="24"/>
+        </w:rPr>
+        <w:t>m</w:t>
+      </w:r>
+      <w:r>
+        <w:rPr>
+          <w:rFonts w:ascii="Times New Roman" w:cs="Times New Roman" w:eastAsia="Times New Roman" w:hAnsi="Times New Roman"/>
+          <w:bCs w:val="false"/>
+          <w:i/>
+          <w:iCs/>
+          <w:sz w:val="24"/>
+          <w:szCs w:val="24"/>
+          <w:vertAlign w:val="subscript"/>
+        </w:rPr>
+        <w:t>N</w:t>
+      </w:r>
+      <w:r>
+        <w:rPr>
+          <w:rFonts w:ascii="Times New Roman" w:cs="Times New Roman" w:eastAsia="Times New Roman" w:hAnsi="Times New Roman"/>
+          <w:bCs w:val="false"/>
+          <w:iCs/>
+          <w:sz w:val="24"/>
+          <w:szCs w:val="24"/>
+        </w:rPr>
+        <w:t xml:space="preserve"> ≥ (1 − φ)Δ/φ }</w:t>
+        <w:tab/>
+        <w:t>(E4)</w:t>
+      </w:r>
+    </w:p>
+    <w:p>
+      <w:pPr>
+        <w:spacing w:after="0" w:before="0" w:line="480" w:lineRule="auto"/>
+        <w:ind w:firstLine="720"/>
+        <w:jc w:val="left"/>
+      </w:pPr>
+      <w:r>
+        <w:rPr>
+          <w:rFonts w:ascii="Times New Roman" w:cs="Times New Roman" w:eastAsia="Times New Roman" w:hAnsi="Times New Roman"/>
+          <w:bCs w:val="false"/>
+          <w:iCs w:val="false"/>
+          <w:sz w:val="24"/>
+          <w:szCs w:val="24"/>
+        </w:rPr>
+        <w:t xml:space="preserve">Beyond </w:t>
+      </w:r>
+      <w:r>
+        <w:rPr>
+          <w:rFonts w:ascii="Times New Roman" w:cs="Times New Roman" w:eastAsia="Times New Roman" w:hAnsi="Times New Roman"/>
+          <w:bCs w:val="false"/>
+          <w:i/>
+          <w:iCs w:val="false"/>
+          <w:sz w:val="24"/>
+          <w:szCs w:val="24"/>
+        </w:rPr>
+        <w:t>N</w:t>
+      </w:r>
+      <w:r>
+        <w:rPr>
+          <w:rFonts w:ascii="Times New Roman" w:cs="Times New Roman" w:eastAsia="Times New Roman" w:hAnsi="Times New Roman"/>
+          <w:bCs w:val="false"/>
+          <w:i/>
+          <w:iCs w:val="false"/>
+          <w:sz w:val="24"/>
+          <w:szCs w:val="24"/>
+          <w:vertAlign w:val="subscript"/>
+        </w:rPr>
+        <w:t>d</w:t>
+      </w:r>
+      <w:r>
+        <w:rPr>
+          <w:rFonts w:ascii="Times New Roman" w:cs="Times New Roman" w:eastAsia="Times New Roman" w:hAnsi="Times New Roman"/>
+          <w:bCs w:val="false"/>
+          <w:iCs w:val="false"/>
+          <w:sz w:val="24"/>
+          <w:szCs w:val="24"/>
+        </w:rPr>
+        <w:t xml:space="preserve"> the team invests nothing in exploits and </w:t>
+      </w:r>
+      <w:r>
+        <w:rPr>
+          <w:rFonts w:ascii="Times New Roman" w:cs="Times New Roman" w:eastAsia="Times New Roman" w:hAnsi="Times New Roman"/>
+          <w:bCs w:val="false"/>
+          <w:i/>
+          <w:iCs w:val="false"/>
+          <w:sz w:val="24"/>
+          <w:szCs w:val="24"/>
+        </w:rPr>
+        <w:t>Q</w:t>
+      </w:r>
+      <w:r>
+        <w:rPr>
+          <w:rFonts w:ascii="Times New Roman" w:cs="Times New Roman" w:eastAsia="Times New Roman" w:hAnsi="Times New Roman"/>
+          <w:bCs w:val="false"/>
+          <w:iCs w:val="false"/>
+          <w:sz w:val="24"/>
+          <w:szCs w:val="24"/>
+        </w:rPr>
+        <w:t xml:space="preserve"> = 0. Inspection therefore works in two ways. It detects exploits that are made, and it deters exploits from being made, and the deterrence strengthens with search depth because a deeper search raises the honest score that a blocked release would forfeit.</w:t>
+      </w:r>
+    </w:p>
+    <w:p>
+      <w:pPr>
+        <w:spacing w:after="0" w:before="0" w:line="480" w:lineRule="auto"/>
+        <w:ind w:firstLine="720"/>
+        <w:jc w:val="left"/>
+      </w:pPr>
+      <w:r>
+        <w:rPr>
+          <w:rFonts w:ascii="Times New Roman" w:cs="Times New Roman" w:eastAsia="Times New Roman" w:hAnsi="Times New Roman"/>
+          <w:bCs w:val="false"/>
+          <w:i/>
+          <w:iCs w:val="false"/>
+          <w:sz w:val="24"/>
+          <w:szCs w:val="24"/>
+        </w:rPr>
+        <w:t>Step 4: the organization’s problem.</w:t>
+      </w:r>
+      <w:r>
+        <w:rPr>
+          <w:rFonts w:ascii="Times New Roman" w:cs="Times New Roman" w:eastAsia="Times New Roman" w:hAnsi="Times New Roman"/>
+          <w:bCs w:val="false"/>
+          <w:iCs w:val="false"/>
+          <w:sz w:val="24"/>
+          <w:szCs w:val="24"/>
+        </w:rPr>
+        <w:t xml:space="preserve"> Its expected gold value, with </w:t>
+      </w:r>
+      <w:r>
+        <w:rPr>
+          <w:rFonts w:ascii="Times New Roman" w:cs="Times New Roman" w:eastAsia="Times New Roman" w:hAnsi="Times New Roman"/>
+          <w:bCs w:val="false"/>
+          <w:i/>
+          <w:iCs w:val="false"/>
+          <w:sz w:val="24"/>
+          <w:szCs w:val="24"/>
+        </w:rPr>
+        <w:t>Q</w:t>
+      </w:r>
+      <w:r>
+        <w:rPr>
+          <w:rFonts w:ascii="Times New Roman" w:cs="Times New Roman" w:eastAsia="Times New Roman" w:hAnsi="Times New Roman"/>
+          <w:bCs w:val="false"/>
+          <w:iCs w:val="false"/>
+          <w:sz w:val="24"/>
+          <w:szCs w:val="24"/>
+        </w:rPr>
+        <w:t xml:space="preserve"> evaluated at the team’s best response, is</w:t>
+      </w:r>
+    </w:p>
+    <w:p>
+      <w:pPr>
+        <w:tabs>
+          <w:tab w:val="right" w:pos="9360"/>
+        </w:tabs>
+        <w:spacing w:after="160" w:before="160" w:line="480" w:lineRule="auto"/>
+        <w:jc w:val="center"/>
+      </w:pPr>
+      <w:r>
+        <w:rPr>
+          <w:rFonts w:ascii="Times New Roman" w:cs="Times New Roman" w:eastAsia="Times New Roman" w:hAnsi="Times New Roman"/>
+          <w:bCs w:val="false"/>
+          <w:i/>
+          <w:iCs/>
+          <w:sz w:val="24"/>
+          <w:szCs w:val="24"/>
+        </w:rPr>
+        <w:t>W</w:t>
+      </w:r>
+      <w:r>
+        <w:rPr>
+          <w:rFonts w:ascii="Times New Roman" w:cs="Times New Roman" w:eastAsia="Times New Roman" w:hAnsi="Times New Roman"/>
+          <w:bCs w:val="false"/>
+          <w:iCs/>
           <w:sz w:val="24"/>
           <w:szCs w:val="24"/>
         </w:rPr>
@@ -16841,7 +18556,7 @@
           <w:rFonts w:ascii="Times New Roman" w:cs="Times New Roman" w:eastAsia="Times New Roman" w:hAnsi="Times New Roman"/>
           <w:bCs w:val="false"/>
           <w:i/>
-          <w:iCs w:val="false"/>
+          <w:iCs/>
           <w:sz w:val="24"/>
           <w:szCs w:val="24"/>
         </w:rPr>
@@ -16851,18 +18566,114 @@
         <w:rPr>
           <w:rFonts w:ascii="Times New Roman" w:cs="Times New Roman" w:eastAsia="Times New Roman" w:hAnsi="Times New Roman"/>
           <w:bCs w:val="false"/>
-          <w:iCs w:val="false"/>
-          <w:sz w:val="24"/>
-          <w:szCs w:val="24"/>
-        </w:rPr>
-        <w:t xml:space="preserve">) has no interior maximum within the range explored, and deeper search is limited only by its cost. The expected-value expression and the single-root property were checked numerically. The model assumes that exploits always receive the top score and that π and </w:t>
-      </w:r>
-      <w:r>
-        <w:rPr>
-          <w:rFonts w:ascii="Times New Roman" w:cs="Times New Roman" w:eastAsia="Times New Roman" w:hAnsi="Times New Roman"/>
-          <w:bCs w:val="false"/>
-          <w:i/>
-          <w:iCs w:val="false"/>
+          <w:iCs/>
+          <w:sz w:val="24"/>
+          <w:szCs w:val="24"/>
+        </w:rPr>
+        <w:t xml:space="preserve">, φ)  =  (1 − </w:t>
+      </w:r>
+      <w:r>
+        <w:rPr>
+          <w:rFonts w:ascii="Times New Roman" w:cs="Times New Roman" w:eastAsia="Times New Roman" w:hAnsi="Times New Roman"/>
+          <w:bCs w:val="false"/>
+          <w:i/>
+          <w:iCs/>
+          <w:sz w:val="24"/>
+          <w:szCs w:val="24"/>
+        </w:rPr>
+        <w:t>Q</w:t>
+      </w:r>
+      <w:r>
+        <w:rPr>
+          <w:rFonts w:ascii="Times New Roman" w:cs="Times New Roman" w:eastAsia="Times New Roman" w:hAnsi="Times New Roman"/>
+          <w:bCs w:val="false"/>
+          <w:iCs/>
+          <w:sz w:val="24"/>
+          <w:szCs w:val="24"/>
+        </w:rPr>
+        <w:t>)ρ</w:t>
+      </w:r>
+      <w:r>
+        <w:rPr>
+          <w:rFonts w:ascii="Times New Roman" w:cs="Times New Roman" w:eastAsia="Times New Roman" w:hAnsi="Times New Roman"/>
+          <w:bCs w:val="false"/>
+          <w:i/>
+          <w:iCs/>
+          <w:sz w:val="24"/>
+          <w:szCs w:val="24"/>
+        </w:rPr>
+        <w:t>s</w:t>
+      </w:r>
+      <w:r>
+        <w:rPr>
+          <w:rFonts w:ascii="Times New Roman" w:cs="Times New Roman" w:eastAsia="Times New Roman" w:hAnsi="Times New Roman"/>
+          <w:bCs w:val="false"/>
+          <w:iCs/>
+          <w:sz w:val="24"/>
+          <w:szCs w:val="24"/>
+        </w:rPr>
+        <w:t xml:space="preserve"> </w:t>
+      </w:r>
+      <w:r>
+        <w:rPr>
+          <w:rFonts w:ascii="Times New Roman" w:cs="Times New Roman" w:eastAsia="Times New Roman" w:hAnsi="Times New Roman"/>
+          <w:bCs w:val="false"/>
+          <w:i/>
+          <w:iCs/>
+          <w:sz w:val="24"/>
+          <w:szCs w:val="24"/>
+        </w:rPr>
+        <w:t>m</w:t>
+      </w:r>
+      <w:r>
+        <w:rPr>
+          <w:rFonts w:ascii="Times New Roman" w:cs="Times New Roman" w:eastAsia="Times New Roman" w:hAnsi="Times New Roman"/>
+          <w:bCs w:val="false"/>
+          <w:i/>
+          <w:iCs/>
+          <w:sz w:val="24"/>
+          <w:szCs w:val="24"/>
+          <w:vertAlign w:val="subscript"/>
+        </w:rPr>
+        <w:t>N</w:t>
+      </w:r>
+      <w:r>
+        <w:rPr>
+          <w:rFonts w:ascii="Times New Roman" w:cs="Times New Roman" w:eastAsia="Times New Roman" w:hAnsi="Times New Roman"/>
+          <w:bCs w:val="false"/>
+          <w:iCs/>
+          <w:sz w:val="24"/>
+          <w:szCs w:val="24"/>
+        </w:rPr>
+        <w:t xml:space="preserve">  −  </w:t>
+      </w:r>
+      <w:r>
+        <w:rPr>
+          <w:rFonts w:ascii="Times New Roman" w:cs="Times New Roman" w:eastAsia="Times New Roman" w:hAnsi="Times New Roman"/>
+          <w:bCs w:val="false"/>
+          <w:i/>
+          <w:iCs/>
+          <w:sz w:val="24"/>
+          <w:szCs w:val="24"/>
+        </w:rPr>
+        <w:t>Q</w:t>
+      </w:r>
+      <w:r>
+        <w:rPr>
+          <w:rFonts w:ascii="Times New Roman" w:cs="Times New Roman" w:eastAsia="Times New Roman" w:hAnsi="Times New Roman"/>
+          <w:bCs w:val="false"/>
+          <w:iCs/>
+          <w:sz w:val="24"/>
+          <w:szCs w:val="24"/>
+        </w:rPr>
+        <w:t>(1 − φ)</w:t>
+      </w:r>
+      <w:r>
+        <w:rPr>
+          <w:rFonts w:ascii="Times New Roman" w:cs="Times New Roman" w:eastAsia="Times New Roman" w:hAnsi="Times New Roman"/>
+          <w:bCs w:val="false"/>
+          <w:i/>
+          <w:iCs/>
           <w:sz w:val="24"/>
           <w:szCs w:val="24"/>
         </w:rPr>
@@ -16872,11 +18683,960 @@
         <w:rPr>
           <w:rFonts w:ascii="Times New Roman" w:cs="Times New Roman" w:eastAsia="Times New Roman" w:hAnsi="Times New Roman"/>
           <w:bCs w:val="false"/>
-          <w:iCs w:val="false"/>
-          <w:sz w:val="24"/>
-          <w:szCs w:val="24"/>
-        </w:rPr>
-        <w:t xml:space="preserve"> are exogenous, assumptions that a fuller treatment would relax.</w:t>
+          <w:iCs/>
+          <w:sz w:val="24"/>
+          <w:szCs w:val="24"/>
+        </w:rPr>
+        <w:t xml:space="preserve">  −  </w:t>
+      </w:r>
+      <w:r>
+        <w:rPr>
+          <w:rFonts w:ascii="Times New Roman" w:cs="Times New Roman" w:eastAsia="Times New Roman" w:hAnsi="Times New Roman"/>
+          <w:bCs w:val="false"/>
+          <w:i/>
+          <w:iCs/>
+          <w:sz w:val="24"/>
+          <w:szCs w:val="24"/>
+        </w:rPr>
+        <w:t>c</w:t>
+      </w:r>
+      <w:r>
+        <w:rPr>
+          <w:rFonts w:ascii="Times New Roman" w:cs="Times New Roman" w:eastAsia="Times New Roman" w:hAnsi="Times New Roman"/>
+          <w:bCs w:val="false"/>
+          <w:i/>
+          <w:iCs/>
+          <w:sz w:val="24"/>
+          <w:szCs w:val="24"/>
+          <w:vertAlign w:val="subscript"/>
+        </w:rPr>
+        <w:t>s</w:t>
+      </w:r>
+      <w:r>
+        <w:rPr>
+          <w:rFonts w:ascii="Times New Roman" w:cs="Times New Roman" w:eastAsia="Times New Roman" w:hAnsi="Times New Roman"/>
+          <w:bCs w:val="false"/>
+          <w:i/>
+          <w:iCs/>
+          <w:sz w:val="24"/>
+          <w:szCs w:val="24"/>
+        </w:rPr>
+        <w:t>N</w:t>
+      </w:r>
+      <w:r>
+        <w:rPr>
+          <w:rFonts w:ascii="Times New Roman" w:cs="Times New Roman" w:eastAsia="Times New Roman" w:hAnsi="Times New Roman"/>
+          <w:bCs w:val="false"/>
+          <w:iCs/>
+          <w:sz w:val="24"/>
+          <w:szCs w:val="24"/>
+        </w:rPr>
+        <w:t xml:space="preserve">  −  </w:t>
+      </w:r>
+      <w:r>
+        <w:rPr>
+          <w:rFonts w:ascii="Times New Roman" w:cs="Times New Roman" w:eastAsia="Times New Roman" w:hAnsi="Times New Roman"/>
+          <w:bCs w:val="false"/>
+          <w:i/>
+          <w:iCs/>
+          <w:sz w:val="24"/>
+          <w:szCs w:val="24"/>
+        </w:rPr>
+        <w:t>c</w:t>
+      </w:r>
+      <w:r>
+        <w:rPr>
+          <w:rFonts w:ascii="Times New Roman" w:cs="Times New Roman" w:eastAsia="Times New Roman" w:hAnsi="Times New Roman"/>
+          <w:bCs w:val="false"/>
+          <w:i/>
+          <w:iCs/>
+          <w:sz w:val="24"/>
+          <w:szCs w:val="24"/>
+          <w:vertAlign w:val="subscript"/>
+        </w:rPr>
+        <w:t>G</w:t>
+      </w:r>
+      <w:r>
+        <w:rPr>
+          <w:rFonts w:ascii="Times New Roman" w:cs="Times New Roman" w:eastAsia="Times New Roman" w:hAnsi="Times New Roman"/>
+          <w:bCs w:val="false"/>
+          <w:iCs/>
+          <w:sz w:val="24"/>
+          <w:szCs w:val="24"/>
+        </w:rPr>
+        <w:t>·1[φ &gt; 0]</w:t>
+        <w:tab/>
+        <w:t>(E5)</w:t>
+      </w:r>
+    </w:p>
+    <w:p>
+      <w:pPr>
+        <w:spacing w:after="0" w:before="0" w:line="480" w:lineRule="auto"/>
+        <w:ind w:firstLine="720"/>
+        <w:jc w:val="left"/>
+      </w:pPr>
+      <w:r>
+        <w:rPr>
+          <w:rFonts w:ascii="Times New Roman" w:cs="Times New Roman" w:eastAsia="Times New Roman" w:hAnsi="Times New Roman"/>
+          <w:bCs w:val="false"/>
+          <w:iCs w:val="false"/>
+          <w:sz w:val="24"/>
+          <w:szCs w:val="24"/>
+        </w:rPr>
+        <w:t xml:space="preserve">For </w:t>
+      </w:r>
+      <w:r>
+        <w:rPr>
+          <w:rFonts w:ascii="Times New Roman" w:cs="Times New Roman" w:eastAsia="Times New Roman" w:hAnsi="Times New Roman"/>
+          <w:bCs w:val="false"/>
+          <w:i/>
+          <w:iCs w:val="false"/>
+          <w:sz w:val="24"/>
+          <w:szCs w:val="24"/>
+        </w:rPr>
+        <w:t>N</w:t>
+      </w:r>
+      <w:r>
+        <w:rPr>
+          <w:rFonts w:ascii="Times New Roman" w:cs="Times New Roman" w:eastAsia="Times New Roman" w:hAnsi="Times New Roman"/>
+          <w:bCs w:val="false"/>
+          <w:iCs w:val="false"/>
+          <w:sz w:val="24"/>
+          <w:szCs w:val="24"/>
+        </w:rPr>
+        <w:t xml:space="preserve"> ≥ </w:t>
+      </w:r>
+      <w:r>
+        <w:rPr>
+          <w:rFonts w:ascii="Times New Roman" w:cs="Times New Roman" w:eastAsia="Times New Roman" w:hAnsi="Times New Roman"/>
+          <w:bCs w:val="false"/>
+          <w:i/>
+          <w:iCs w:val="false"/>
+          <w:sz w:val="24"/>
+          <w:szCs w:val="24"/>
+        </w:rPr>
+        <w:t>N</w:t>
+      </w:r>
+      <w:r>
+        <w:rPr>
+          <w:rFonts w:ascii="Times New Roman" w:cs="Times New Roman" w:eastAsia="Times New Roman" w:hAnsi="Times New Roman"/>
+          <w:bCs w:val="false"/>
+          <w:i/>
+          <w:iCs w:val="false"/>
+          <w:sz w:val="24"/>
+          <w:szCs w:val="24"/>
+          <w:vertAlign w:val="subscript"/>
+        </w:rPr>
+        <w:t>d</w:t>
+      </w:r>
+      <w:r>
+        <w:rPr>
+          <w:rFonts w:ascii="Times New Roman" w:cs="Times New Roman" w:eastAsia="Times New Roman" w:hAnsi="Times New Roman"/>
+          <w:bCs w:val="false"/>
+          <w:iCs w:val="false"/>
+          <w:sz w:val="24"/>
+          <w:szCs w:val="24"/>
+        </w:rPr>
+        <w:t xml:space="preserve">(φ), </w:t>
+      </w:r>
+      <w:r>
+        <w:rPr>
+          <w:rFonts w:ascii="Times New Roman" w:cs="Times New Roman" w:eastAsia="Times New Roman" w:hAnsi="Times New Roman"/>
+          <w:bCs w:val="false"/>
+          <w:i/>
+          <w:iCs w:val="false"/>
+          <w:sz w:val="24"/>
+          <w:szCs w:val="24"/>
+        </w:rPr>
+        <w:t>W</w:t>
+      </w:r>
+      <w:r>
+        <w:rPr>
+          <w:rFonts w:ascii="Times New Roman" w:cs="Times New Roman" w:eastAsia="Times New Roman" w:hAnsi="Times New Roman"/>
+          <w:bCs w:val="false"/>
+          <w:iCs w:val="false"/>
+          <w:sz w:val="24"/>
+          <w:szCs w:val="24"/>
+        </w:rPr>
+        <w:t xml:space="preserve"> reduces to ρ</w:t>
+      </w:r>
+      <w:r>
+        <w:rPr>
+          <w:rFonts w:ascii="Times New Roman" w:cs="Times New Roman" w:eastAsia="Times New Roman" w:hAnsi="Times New Roman"/>
+          <w:bCs w:val="false"/>
+          <w:i/>
+          <w:iCs w:val="false"/>
+          <w:sz w:val="24"/>
+          <w:szCs w:val="24"/>
+        </w:rPr>
+        <w:t>s</w:t>
+      </w:r>
+      <w:r>
+        <w:rPr>
+          <w:rFonts w:ascii="Times New Roman" w:cs="Times New Roman" w:eastAsia="Times New Roman" w:hAnsi="Times New Roman"/>
+          <w:bCs w:val="false"/>
+          <w:iCs w:val="false"/>
+          <w:sz w:val="24"/>
+          <w:szCs w:val="24"/>
+        </w:rPr>
+        <w:t xml:space="preserve"> </w:t>
+      </w:r>
+      <w:r>
+        <w:rPr>
+          <w:rFonts w:ascii="Times New Roman" w:cs="Times New Roman" w:eastAsia="Times New Roman" w:hAnsi="Times New Roman"/>
+          <w:bCs w:val="false"/>
+          <w:i/>
+          <w:iCs w:val="false"/>
+          <w:sz w:val="24"/>
+          <w:szCs w:val="24"/>
+        </w:rPr>
+        <w:t>m</w:t>
+      </w:r>
+      <w:r>
+        <w:rPr>
+          <w:rFonts w:ascii="Times New Roman" w:cs="Times New Roman" w:eastAsia="Times New Roman" w:hAnsi="Times New Roman"/>
+          <w:bCs w:val="false"/>
+          <w:i/>
+          <w:iCs w:val="false"/>
+          <w:sz w:val="24"/>
+          <w:szCs w:val="24"/>
+          <w:vertAlign w:val="subscript"/>
+        </w:rPr>
+        <w:t>N</w:t>
+      </w:r>
+      <w:r>
+        <w:rPr>
+          <w:rFonts w:ascii="Times New Roman" w:cs="Times New Roman" w:eastAsia="Times New Roman" w:hAnsi="Times New Roman"/>
+          <w:bCs w:val="false"/>
+          <w:iCs w:val="false"/>
+          <w:sz w:val="24"/>
+          <w:szCs w:val="24"/>
+        </w:rPr>
+        <w:t xml:space="preserve"> − </w:t>
+      </w:r>
+      <w:r>
+        <w:rPr>
+          <w:rFonts w:ascii="Times New Roman" w:cs="Times New Roman" w:eastAsia="Times New Roman" w:hAnsi="Times New Roman"/>
+          <w:bCs w:val="false"/>
+          <w:i/>
+          <w:iCs w:val="false"/>
+          <w:sz w:val="24"/>
+          <w:szCs w:val="24"/>
+        </w:rPr>
+        <w:t>c</w:t>
+      </w:r>
+      <w:r>
+        <w:rPr>
+          <w:rFonts w:ascii="Times New Roman" w:cs="Times New Roman" w:eastAsia="Times New Roman" w:hAnsi="Times New Roman"/>
+          <w:bCs w:val="false"/>
+          <w:i/>
+          <w:iCs w:val="false"/>
+          <w:sz w:val="24"/>
+          <w:szCs w:val="24"/>
+          <w:vertAlign w:val="subscript"/>
+        </w:rPr>
+        <w:t>s</w:t>
+      </w:r>
+      <w:r>
+        <w:rPr>
+          <w:rFonts w:ascii="Times New Roman" w:cs="Times New Roman" w:eastAsia="Times New Roman" w:hAnsi="Times New Roman"/>
+          <w:bCs w:val="false"/>
+          <w:i/>
+          <w:iCs w:val="false"/>
+          <w:sz w:val="24"/>
+          <w:szCs w:val="24"/>
+        </w:rPr>
+        <w:t>N</w:t>
+      </w:r>
+      <w:r>
+        <w:rPr>
+          <w:rFonts w:ascii="Times New Roman" w:cs="Times New Roman" w:eastAsia="Times New Roman" w:hAnsi="Times New Roman"/>
+          <w:bCs w:val="false"/>
+          <w:iCs w:val="false"/>
+          <w:sz w:val="24"/>
+          <w:szCs w:val="24"/>
+        </w:rPr>
+        <w:t xml:space="preserve"> − </w:t>
+      </w:r>
+      <w:r>
+        <w:rPr>
+          <w:rFonts w:ascii="Times New Roman" w:cs="Times New Roman" w:eastAsia="Times New Roman" w:hAnsi="Times New Roman"/>
+          <w:bCs w:val="false"/>
+          <w:i/>
+          <w:iCs w:val="false"/>
+          <w:sz w:val="24"/>
+          <w:szCs w:val="24"/>
+        </w:rPr>
+        <w:t>c</w:t>
+      </w:r>
+      <w:r>
+        <w:rPr>
+          <w:rFonts w:ascii="Times New Roman" w:cs="Times New Roman" w:eastAsia="Times New Roman" w:hAnsi="Times New Roman"/>
+          <w:bCs w:val="false"/>
+          <w:i/>
+          <w:iCs w:val="false"/>
+          <w:sz w:val="24"/>
+          <w:szCs w:val="24"/>
+          <w:vertAlign w:val="subscript"/>
+        </w:rPr>
+        <w:t>G</w:t>
+      </w:r>
+      <w:r>
+        <w:rPr>
+          <w:rFonts w:ascii="Times New Roman" w:cs="Times New Roman" w:eastAsia="Times New Roman" w:hAnsi="Times New Roman"/>
+          <w:bCs w:val="false"/>
+          <w:iCs w:val="false"/>
+          <w:sz w:val="24"/>
+          <w:szCs w:val="24"/>
+        </w:rPr>
+        <w:t xml:space="preserve">, so the organization can eliminate exploitation by combining inspection with depth. Without inspection, </w:t>
+      </w:r>
+      <w:r>
+        <w:rPr>
+          <w:rFonts w:ascii="Times New Roman" w:cs="Times New Roman" w:eastAsia="Times New Roman" w:hAnsi="Times New Roman"/>
+          <w:bCs w:val="false"/>
+          <w:i/>
+          <w:iCs w:val="false"/>
+          <w:sz w:val="24"/>
+          <w:szCs w:val="24"/>
+        </w:rPr>
+        <w:t>W</w:t>
+      </w:r>
+      <w:r>
+        <w:rPr>
+          <w:rFonts w:ascii="Times New Roman" w:cs="Times New Roman" w:eastAsia="Times New Roman" w:hAnsi="Times New Roman"/>
+          <w:bCs w:val="false"/>
+          <w:iCs w:val="false"/>
+          <w:sz w:val="24"/>
+          <w:szCs w:val="24"/>
+        </w:rPr>
+        <w:t>(</w:t>
+      </w:r>
+      <w:r>
+        <w:rPr>
+          <w:rFonts w:ascii="Times New Roman" w:cs="Times New Roman" w:eastAsia="Times New Roman" w:hAnsi="Times New Roman"/>
+          <w:bCs w:val="false"/>
+          <w:i/>
+          <w:iCs w:val="false"/>
+          <w:sz w:val="24"/>
+          <w:szCs w:val="24"/>
+        </w:rPr>
+        <w:t>N</w:t>
+      </w:r>
+      <w:r>
+        <w:rPr>
+          <w:rFonts w:ascii="Times New Roman" w:cs="Times New Roman" w:eastAsia="Times New Roman" w:hAnsi="Times New Roman"/>
+          <w:bCs w:val="false"/>
+          <w:iCs w:val="false"/>
+          <w:sz w:val="24"/>
+          <w:szCs w:val="24"/>
+        </w:rPr>
+        <w:t>, 0) falls toward −</w:t>
+      </w:r>
+      <w:r>
+        <w:rPr>
+          <w:rFonts w:ascii="Times New Roman" w:cs="Times New Roman" w:eastAsia="Times New Roman" w:hAnsi="Times New Roman"/>
+          <w:bCs w:val="false"/>
+          <w:i/>
+          <w:iCs w:val="false"/>
+          <w:sz w:val="24"/>
+          <w:szCs w:val="24"/>
+        </w:rPr>
+        <w:t>d</w:t>
+      </w:r>
+      <w:r>
+        <w:rPr>
+          <w:rFonts w:ascii="Times New Roman" w:cs="Times New Roman" w:eastAsia="Times New Roman" w:hAnsi="Times New Roman"/>
+          <w:bCs w:val="false"/>
+          <w:iCs w:val="false"/>
+          <w:sz w:val="24"/>
+          <w:szCs w:val="24"/>
+        </w:rPr>
+        <w:t xml:space="preserve"> − </w:t>
+      </w:r>
+      <w:r>
+        <w:rPr>
+          <w:rFonts w:ascii="Times New Roman" w:cs="Times New Roman" w:eastAsia="Times New Roman" w:hAnsi="Times New Roman"/>
+          <w:bCs w:val="false"/>
+          <w:i/>
+          <w:iCs w:val="false"/>
+          <w:sz w:val="24"/>
+          <w:szCs w:val="24"/>
+        </w:rPr>
+        <w:t>c</w:t>
+      </w:r>
+      <w:r>
+        <w:rPr>
+          <w:rFonts w:ascii="Times New Roman" w:cs="Times New Roman" w:eastAsia="Times New Roman" w:hAnsi="Times New Roman"/>
+          <w:bCs w:val="false"/>
+          <w:i/>
+          <w:iCs w:val="false"/>
+          <w:sz w:val="24"/>
+          <w:szCs w:val="24"/>
+          <w:vertAlign w:val="subscript"/>
+        </w:rPr>
+        <w:t>s</w:t>
+      </w:r>
+      <w:r>
+        <w:rPr>
+          <w:rFonts w:ascii="Times New Roman" w:cs="Times New Roman" w:eastAsia="Times New Roman" w:hAnsi="Times New Roman"/>
+          <w:bCs w:val="false"/>
+          <w:i/>
+          <w:iCs w:val="false"/>
+          <w:sz w:val="24"/>
+          <w:szCs w:val="24"/>
+        </w:rPr>
+        <w:t>N</w:t>
+      </w:r>
+      <w:r>
+        <w:rPr>
+          <w:rFonts w:ascii="Times New Roman" w:cs="Times New Roman" w:eastAsia="Times New Roman" w:hAnsi="Times New Roman"/>
+          <w:bCs w:val="false"/>
+          <w:iCs w:val="false"/>
+          <w:sz w:val="24"/>
+          <w:szCs w:val="24"/>
+        </w:rPr>
+        <w:t xml:space="preserve"> as </w:t>
+      </w:r>
+      <w:r>
+        <w:rPr>
+          <w:rFonts w:ascii="Times New Roman" w:cs="Times New Roman" w:eastAsia="Times New Roman" w:hAnsi="Times New Roman"/>
+          <w:bCs w:val="false"/>
+          <w:i/>
+          <w:iCs w:val="false"/>
+          <w:sz w:val="24"/>
+          <w:szCs w:val="24"/>
+        </w:rPr>
+        <w:t>N</w:t>
+      </w:r>
+      <w:r>
+        <w:rPr>
+          <w:rFonts w:ascii="Times New Roman" w:cs="Times New Roman" w:eastAsia="Times New Roman" w:hAnsi="Times New Roman"/>
+          <w:bCs w:val="false"/>
+          <w:iCs w:val="false"/>
+          <w:sz w:val="24"/>
+          <w:szCs w:val="24"/>
+        </w:rPr>
+        <w:t xml:space="preserve"> grows, so only shallow search is ever worth considering.</w:t>
+      </w:r>
+    </w:p>
+    <w:p>
+      <w:pPr>
+        <w:spacing w:after="0" w:before="0" w:line="480" w:lineRule="auto"/>
+        <w:ind w:firstLine="720"/>
+        <w:jc w:val="left"/>
+      </w:pPr>
+      <w:r>
+        <w:rPr>
+          <w:rFonts w:ascii="Times New Roman" w:cs="Times New Roman" w:eastAsia="Times New Roman" w:hAnsi="Times New Roman"/>
+          <w:bCs w:val="false"/>
+          <w:i/>
+          <w:iCs w:val="false"/>
+          <w:sz w:val="24"/>
+          <w:szCs w:val="24"/>
+        </w:rPr>
+        <w:t>Illustration.</w:t>
+      </w:r>
+      <w:r>
+        <w:rPr>
+          <w:rFonts w:ascii="Times New Roman" w:cs="Times New Roman" w:eastAsia="Times New Roman" w:hAnsi="Times New Roman"/>
+          <w:bCs w:val="false"/>
+          <w:iCs w:val="false"/>
+          <w:sz w:val="24"/>
+          <w:szCs w:val="24"/>
+        </w:rPr>
+        <w:t xml:space="preserve"> Take σ</w:t>
+      </w:r>
+      <w:r>
+        <w:rPr>
+          <w:rFonts w:ascii="Times New Roman" w:cs="Times New Roman" w:eastAsia="Times New Roman" w:hAnsi="Times New Roman"/>
+          <w:bCs w:val="false"/>
+          <w:iCs w:val="false"/>
+          <w:sz w:val="24"/>
+          <w:szCs w:val="24"/>
+          <w:vertAlign w:val="subscript"/>
+        </w:rPr>
+        <w:t>J</w:t>
+      </w:r>
+      <w:r>
+        <w:rPr>
+          <w:rFonts w:ascii="Times New Roman" w:cs="Times New Roman" w:eastAsia="Times New Roman" w:hAnsi="Times New Roman"/>
+          <w:bCs w:val="false"/>
+          <w:iCs w:val="false"/>
+          <w:sz w:val="24"/>
+          <w:szCs w:val="24"/>
+        </w:rPr>
+        <w:t xml:space="preserve"> = 1, ρ</w:t>
+      </w:r>
+      <w:r>
+        <w:rPr>
+          <w:rFonts w:ascii="Times New Roman" w:cs="Times New Roman" w:eastAsia="Times New Roman" w:hAnsi="Times New Roman"/>
+          <w:bCs w:val="false"/>
+          <w:i/>
+          <w:iCs w:val="false"/>
+          <w:sz w:val="24"/>
+          <w:szCs w:val="24"/>
+        </w:rPr>
+        <w:t>s</w:t>
+      </w:r>
+      <w:r>
+        <w:rPr>
+          <w:rFonts w:ascii="Times New Roman" w:cs="Times New Roman" w:eastAsia="Times New Roman" w:hAnsi="Times New Roman"/>
+          <w:bCs w:val="false"/>
+          <w:iCs w:val="false"/>
+          <w:sz w:val="24"/>
+          <w:szCs w:val="24"/>
+        </w:rPr>
+        <w:t xml:space="preserve"> = 0.6, Δ = 1, </w:t>
+      </w:r>
+      <w:r>
+        <w:rPr>
+          <w:rFonts w:ascii="Times New Roman" w:cs="Times New Roman" w:eastAsia="Times New Roman" w:hAnsi="Times New Roman"/>
+          <w:bCs w:val="false"/>
+          <w:i/>
+          <w:iCs w:val="false"/>
+          <w:sz w:val="24"/>
+          <w:szCs w:val="24"/>
+        </w:rPr>
+        <w:t>d</w:t>
+      </w:r>
+      <w:r>
+        <w:rPr>
+          <w:rFonts w:ascii="Times New Roman" w:cs="Times New Roman" w:eastAsia="Times New Roman" w:hAnsi="Times New Roman"/>
+          <w:bCs w:val="false"/>
+          <w:iCs w:val="false"/>
+          <w:sz w:val="24"/>
+          <w:szCs w:val="24"/>
+        </w:rPr>
+        <w:t xml:space="preserve"> = 2, β = 1, κ = 4, </w:t>
+      </w:r>
+      <w:r>
+        <w:rPr>
+          <w:rFonts w:ascii="Times New Roman" w:cs="Times New Roman" w:eastAsia="Times New Roman" w:hAnsi="Times New Roman"/>
+          <w:bCs w:val="false"/>
+          <w:i/>
+          <w:iCs w:val="false"/>
+          <w:sz w:val="24"/>
+          <w:szCs w:val="24"/>
+        </w:rPr>
+        <w:t>c</w:t>
+      </w:r>
+      <w:r>
+        <w:rPr>
+          <w:rFonts w:ascii="Times New Roman" w:cs="Times New Roman" w:eastAsia="Times New Roman" w:hAnsi="Times New Roman"/>
+          <w:bCs w:val="false"/>
+          <w:i/>
+          <w:iCs w:val="false"/>
+          <w:sz w:val="24"/>
+          <w:szCs w:val="24"/>
+          <w:vertAlign w:val="subscript"/>
+        </w:rPr>
+        <w:t>s</w:t>
+      </w:r>
+      <w:r>
+        <w:rPr>
+          <w:rFonts w:ascii="Times New Roman" w:cs="Times New Roman" w:eastAsia="Times New Roman" w:hAnsi="Times New Roman"/>
+          <w:bCs w:val="false"/>
+          <w:iCs w:val="false"/>
+          <w:sz w:val="24"/>
+          <w:szCs w:val="24"/>
+        </w:rPr>
+        <w:t xml:space="preserve"> = 0.01, </w:t>
+      </w:r>
+      <w:r>
+        <w:rPr>
+          <w:rFonts w:ascii="Times New Roman" w:cs="Times New Roman" w:eastAsia="Times New Roman" w:hAnsi="Times New Roman"/>
+          <w:bCs w:val="false"/>
+          <w:i/>
+          <w:iCs w:val="false"/>
+          <w:sz w:val="24"/>
+          <w:szCs w:val="24"/>
+        </w:rPr>
+        <w:t>c</w:t>
+      </w:r>
+      <w:r>
+        <w:rPr>
+          <w:rFonts w:ascii="Times New Roman" w:cs="Times New Roman" w:eastAsia="Times New Roman" w:hAnsi="Times New Roman"/>
+          <w:bCs w:val="false"/>
+          <w:i/>
+          <w:iCs w:val="false"/>
+          <w:sz w:val="24"/>
+          <w:szCs w:val="24"/>
+          <w:vertAlign w:val="subscript"/>
+        </w:rPr>
+        <w:t>G</w:t>
+      </w:r>
+      <w:r>
+        <w:rPr>
+          <w:rFonts w:ascii="Times New Roman" w:cs="Times New Roman" w:eastAsia="Times New Roman" w:hAnsi="Times New Roman"/>
+          <w:bCs w:val="false"/>
+          <w:iCs w:val="false"/>
+          <w:sz w:val="24"/>
+          <w:szCs w:val="24"/>
+        </w:rPr>
+        <w:t xml:space="preserve"> = 0.05, and φ = 0.4, which gives </w:t>
+      </w:r>
+      <w:r>
+        <w:rPr>
+          <w:rFonts w:ascii="Times New Roman" w:cs="Times New Roman" w:eastAsia="Times New Roman" w:hAnsi="Times New Roman"/>
+          <w:bCs w:val="false"/>
+          <w:i/>
+          <w:iCs w:val="false"/>
+          <w:sz w:val="24"/>
+          <w:szCs w:val="24"/>
+        </w:rPr>
+        <w:t>N</w:t>
+      </w:r>
+      <w:r>
+        <w:rPr>
+          <w:rFonts w:ascii="Times New Roman" w:cs="Times New Roman" w:eastAsia="Times New Roman" w:hAnsi="Times New Roman"/>
+          <w:bCs w:val="false"/>
+          <w:i/>
+          <w:iCs w:val="false"/>
+          <w:sz w:val="24"/>
+          <w:szCs w:val="24"/>
+          <w:vertAlign w:val="subscript"/>
+        </w:rPr>
+        <w:t>d</w:t>
+      </w:r>
+      <w:r>
+        <w:rPr>
+          <w:rFonts w:ascii="Times New Roman" w:cs="Times New Roman" w:eastAsia="Times New Roman" w:hAnsi="Times New Roman"/>
+          <w:bCs w:val="false"/>
+          <w:iCs w:val="false"/>
+          <w:sz w:val="24"/>
+          <w:szCs w:val="24"/>
+        </w:rPr>
+        <w:t xml:space="preserve"> = 10. Without inspection, the probability that an exploit exists rises from 0.25 at </w:t>
+      </w:r>
+      <w:r>
+        <w:rPr>
+          <w:rFonts w:ascii="Times New Roman" w:cs="Times New Roman" w:eastAsia="Times New Roman" w:hAnsi="Times New Roman"/>
+          <w:bCs w:val="false"/>
+          <w:i/>
+          <w:iCs w:val="false"/>
+          <w:sz w:val="24"/>
+          <w:szCs w:val="24"/>
+        </w:rPr>
+        <w:t>N</w:t>
+      </w:r>
+      <w:r>
+        <w:rPr>
+          <w:rFonts w:ascii="Times New Roman" w:cs="Times New Roman" w:eastAsia="Times New Roman" w:hAnsi="Times New Roman"/>
+          <w:bCs w:val="false"/>
+          <w:iCs w:val="false"/>
+          <w:sz w:val="24"/>
+          <w:szCs w:val="24"/>
+        </w:rPr>
+        <w:t xml:space="preserve"> = 1 to 0.65 at </w:t>
+      </w:r>
+      <w:r>
+        <w:rPr>
+          <w:rFonts w:ascii="Times New Roman" w:cs="Times New Roman" w:eastAsia="Times New Roman" w:hAnsi="Times New Roman"/>
+          <w:bCs w:val="false"/>
+          <w:i/>
+          <w:iCs w:val="false"/>
+          <w:sz w:val="24"/>
+          <w:szCs w:val="24"/>
+        </w:rPr>
+        <w:t>N</w:t>
+      </w:r>
+      <w:r>
+        <w:rPr>
+          <w:rFonts w:ascii="Times New Roman" w:cs="Times New Roman" w:eastAsia="Times New Roman" w:hAnsi="Times New Roman"/>
+          <w:bCs w:val="false"/>
+          <w:iCs w:val="false"/>
+          <w:sz w:val="24"/>
+          <w:szCs w:val="24"/>
+        </w:rPr>
+        <w:t xml:space="preserve"> = 10 and 0.81 at </w:t>
+      </w:r>
+      <w:r>
+        <w:rPr>
+          <w:rFonts w:ascii="Times New Roman" w:cs="Times New Roman" w:eastAsia="Times New Roman" w:hAnsi="Times New Roman"/>
+          <w:bCs w:val="false"/>
+          <w:i/>
+          <w:iCs w:val="false"/>
+          <w:sz w:val="24"/>
+          <w:szCs w:val="24"/>
+        </w:rPr>
+        <w:t>N</w:t>
+      </w:r>
+      <w:r>
+        <w:rPr>
+          <w:rFonts w:ascii="Times New Roman" w:cs="Times New Roman" w:eastAsia="Times New Roman" w:hAnsi="Times New Roman"/>
+          <w:bCs w:val="false"/>
+          <w:iCs w:val="false"/>
+          <w:sz w:val="24"/>
+          <w:szCs w:val="24"/>
+        </w:rPr>
+        <w:t xml:space="preserve"> = 32, and expected gold value is negative at every depth, with a maximum of −0.51 at </w:t>
+      </w:r>
+      <w:r>
+        <w:rPr>
+          <w:rFonts w:ascii="Times New Roman" w:cs="Times New Roman" w:eastAsia="Times New Roman" w:hAnsi="Times New Roman"/>
+          <w:bCs w:val="false"/>
+          <w:i/>
+          <w:iCs w:val="false"/>
+          <w:sz w:val="24"/>
+          <w:szCs w:val="24"/>
+        </w:rPr>
+        <w:t>N</w:t>
+      </w:r>
+      <w:r>
+        <w:rPr>
+          <w:rFonts w:ascii="Times New Roman" w:cs="Times New Roman" w:eastAsia="Times New Roman" w:hAnsi="Times New Roman"/>
+          <w:bCs w:val="false"/>
+          <w:iCs w:val="false"/>
+          <w:sz w:val="24"/>
+          <w:szCs w:val="24"/>
+        </w:rPr>
+        <w:t xml:space="preserve"> = 1. With inspection, the exploit probability is zero from </w:t>
+      </w:r>
+      <w:r>
+        <w:rPr>
+          <w:rFonts w:ascii="Times New Roman" w:cs="Times New Roman" w:eastAsia="Times New Roman" w:hAnsi="Times New Roman"/>
+          <w:bCs w:val="false"/>
+          <w:i/>
+          <w:iCs w:val="false"/>
+          <w:sz w:val="24"/>
+          <w:szCs w:val="24"/>
+        </w:rPr>
+        <w:t>N</w:t>
+      </w:r>
+      <w:r>
+        <w:rPr>
+          <w:rFonts w:ascii="Times New Roman" w:cs="Times New Roman" w:eastAsia="Times New Roman" w:hAnsi="Times New Roman"/>
+          <w:bCs w:val="false"/>
+          <w:iCs w:val="false"/>
+          <w:sz w:val="24"/>
+          <w:szCs w:val="24"/>
+        </w:rPr>
+        <w:t xml:space="preserve"> = 10, expected value is positive from </w:t>
+      </w:r>
+      <w:r>
+        <w:rPr>
+          <w:rFonts w:ascii="Times New Roman" w:cs="Times New Roman" w:eastAsia="Times New Roman" w:hAnsi="Times New Roman"/>
+          <w:bCs w:val="false"/>
+          <w:i/>
+          <w:iCs w:val="false"/>
+          <w:sz w:val="24"/>
+          <w:szCs w:val="24"/>
+        </w:rPr>
+        <w:t>N</w:t>
+      </w:r>
+      <w:r>
+        <w:rPr>
+          <w:rFonts w:ascii="Times New Roman" w:cs="Times New Roman" w:eastAsia="Times New Roman" w:hAnsi="Times New Roman"/>
+          <w:bCs w:val="false"/>
+          <w:iCs w:val="false"/>
+          <w:sz w:val="24"/>
+          <w:szCs w:val="24"/>
+        </w:rPr>
+        <w:t xml:space="preserve"> = 2, and it peaks at 0.88 at </w:t>
+      </w:r>
+      <w:r>
+        <w:rPr>
+          <w:rFonts w:ascii="Times New Roman" w:cs="Times New Roman" w:eastAsia="Times New Roman" w:hAnsi="Times New Roman"/>
+          <w:bCs w:val="false"/>
+          <w:i/>
+          <w:iCs w:val="false"/>
+          <w:sz w:val="24"/>
+          <w:szCs w:val="24"/>
+        </w:rPr>
+        <w:t>N</w:t>
+      </w:r>
+      <w:r>
+        <w:rPr>
+          <w:rFonts w:ascii="Times New Roman" w:cs="Times New Roman" w:eastAsia="Times New Roman" w:hAnsi="Times New Roman"/>
+          <w:bCs w:val="false"/>
+          <w:iCs w:val="false"/>
+          <w:sz w:val="24"/>
+          <w:szCs w:val="24"/>
+        </w:rPr>
+        <w:t xml:space="preserve"> = 26. The expected-value expressions were checked by Monte Carlo simulation (at </w:t>
+      </w:r>
+      <w:r>
+        <w:rPr>
+          <w:rFonts w:ascii="Times New Roman" w:cs="Times New Roman" w:eastAsia="Times New Roman" w:hAnsi="Times New Roman"/>
+          <w:bCs w:val="false"/>
+          <w:i/>
+          <w:iCs w:val="false"/>
+          <w:sz w:val="24"/>
+          <w:szCs w:val="24"/>
+        </w:rPr>
+        <w:t>N</w:t>
+      </w:r>
+      <w:r>
+        <w:rPr>
+          <w:rFonts w:ascii="Times New Roman" w:cs="Times New Roman" w:eastAsia="Times New Roman" w:hAnsi="Times New Roman"/>
+          <w:bCs w:val="false"/>
+          <w:iCs w:val="false"/>
+          <w:sz w:val="24"/>
+          <w:szCs w:val="24"/>
+        </w:rPr>
+        <w:t xml:space="preserve"> = 10, </w:t>
+      </w:r>
+      <w:r>
+        <w:rPr>
+          <w:rFonts w:ascii="Times New Roman" w:cs="Times New Roman" w:eastAsia="Times New Roman" w:hAnsi="Times New Roman"/>
+          <w:bCs w:val="false"/>
+          <w:i/>
+          <w:iCs w:val="false"/>
+          <w:sz w:val="24"/>
+          <w:szCs w:val="24"/>
+        </w:rPr>
+        <w:t>e</w:t>
+      </w:r>
+      <w:r>
+        <w:rPr>
+          <w:rFonts w:ascii="Times New Roman" w:cs="Times New Roman" w:eastAsia="Times New Roman" w:hAnsi="Times New Roman"/>
+          <w:bCs w:val="false"/>
+          <w:iCs w:val="false"/>
+          <w:sz w:val="24"/>
+          <w:szCs w:val="24"/>
+        </w:rPr>
+        <w:t xml:space="preserve"> = 0.05, and φ = 0.4, the gold value is 0.0713 by formula and 0.0712 by simulation), and identity (E3) was verified numerically.</w:t>
+      </w:r>
+    </w:p>
+    <w:p>
+      <w:pPr>
+        <w:spacing w:after="0" w:before="0" w:line="480" w:lineRule="auto"/>
+        <w:ind w:firstLine="720"/>
+        <w:jc w:val="left"/>
+      </w:pPr>
+      <w:r>
+        <w:rPr>
+          <w:rFonts w:ascii="Times New Roman" w:cs="Times New Roman" w:eastAsia="Times New Roman" w:hAnsi="Times New Roman"/>
+          <w:bCs w:val="false"/>
+          <w:i/>
+          <w:iCs w:val="false"/>
+          <w:sz w:val="24"/>
+          <w:szCs w:val="24"/>
+        </w:rPr>
+        <w:t>Judge quality.</w:t>
+      </w:r>
+      <w:r>
+        <w:rPr>
+          <w:rFonts w:ascii="Times New Roman" w:cs="Times New Roman" w:eastAsia="Times New Roman" w:hAnsi="Times New Roman"/>
+          <w:bCs w:val="false"/>
+          <w:iCs w:val="false"/>
+          <w:sz w:val="24"/>
+          <w:szCs w:val="24"/>
+        </w:rPr>
+        <w:t xml:space="preserve"> A weak judge differs from a strong one in this model by a lower ρ and a larger Δ. Setting ρ</w:t>
+      </w:r>
+      <w:r>
+        <w:rPr>
+          <w:rFonts w:ascii="Times New Roman" w:cs="Times New Roman" w:eastAsia="Times New Roman" w:hAnsi="Times New Roman"/>
+          <w:bCs w:val="false"/>
+          <w:i/>
+          <w:iCs w:val="false"/>
+          <w:sz w:val="24"/>
+          <w:szCs w:val="24"/>
+        </w:rPr>
+        <w:t>s</w:t>
+      </w:r>
+      <w:r>
+        <w:rPr>
+          <w:rFonts w:ascii="Times New Roman" w:cs="Times New Roman" w:eastAsia="Times New Roman" w:hAnsi="Times New Roman"/>
+          <w:bCs w:val="false"/>
+          <w:iCs w:val="false"/>
+          <w:sz w:val="24"/>
+          <w:szCs w:val="24"/>
+        </w:rPr>
+        <w:t xml:space="preserve"> = 0.2 and Δ = 1.8 raises exploit effort and lowers the value of search. Without inspection the optimal depth is again </w:t>
+      </w:r>
+      <w:r>
+        <w:rPr>
+          <w:rFonts w:ascii="Times New Roman" w:cs="Times New Roman" w:eastAsia="Times New Roman" w:hAnsi="Times New Roman"/>
+          <w:bCs w:val="false"/>
+          <w:i/>
+          <w:iCs w:val="false"/>
+          <w:sz w:val="24"/>
+          <w:szCs w:val="24"/>
+        </w:rPr>
+        <w:t>N</w:t>
+      </w:r>
+      <w:r>
+        <w:rPr>
+          <w:rFonts w:ascii="Times New Roman" w:cs="Times New Roman" w:eastAsia="Times New Roman" w:hAnsi="Times New Roman"/>
+          <w:bCs w:val="false"/>
+          <w:iCs w:val="false"/>
+          <w:sz w:val="24"/>
+          <w:szCs w:val="24"/>
+        </w:rPr>
+        <w:t xml:space="preserve"> = 1, but the exploit probability rises from 0.25 to 0.45 and expected value falls from −0.51 to −0.91. With inspection at φ = 0.4 the deterrence depth rises to 175, far beyond the range in which search is cheap, and the best expected value is −0.38 at </w:t>
+      </w:r>
+      <w:r>
+        <w:rPr>
+          <w:rFonts w:ascii="Times New Roman" w:cs="Times New Roman" w:eastAsia="Times New Roman" w:hAnsi="Times New Roman"/>
+          <w:bCs w:val="false"/>
+          <w:i/>
+          <w:iCs w:val="false"/>
+          <w:sz w:val="24"/>
+          <w:szCs w:val="24"/>
+        </w:rPr>
+        <w:t>N</w:t>
+      </w:r>
+      <w:r>
+        <w:rPr>
+          <w:rFonts w:ascii="Times New Roman" w:cs="Times New Roman" w:eastAsia="Times New Roman" w:hAnsi="Times New Roman"/>
+          <w:bCs w:val="false"/>
+          <w:iCs w:val="false"/>
+          <w:sz w:val="24"/>
+          <w:szCs w:val="24"/>
+        </w:rPr>
+        <w:t xml:space="preserve"> = 2. The ordering matches the direction of the experiments of Section 4, in which the weak judge produced no gain and more divergent cases. Those experiments did not observe exploits, however, so the mechanism itself remains untested.</w:t>
+      </w:r>
+    </w:p>
+    <w:p>
+      <w:pPr>
+        <w:spacing w:after="0" w:before="0" w:line="480" w:lineRule="auto"/>
+        <w:ind w:firstLine="720"/>
+        <w:jc w:val="left"/>
+      </w:pPr>
+      <w:r>
+        <w:rPr>
+          <w:rFonts w:ascii="Times New Roman" w:cs="Times New Roman" w:eastAsia="Times New Roman" w:hAnsi="Times New Roman"/>
+          <w:bCs w:val="false"/>
+          <w:i/>
+          <w:iCs w:val="false"/>
+          <w:sz w:val="24"/>
+          <w:szCs w:val="24"/>
+        </w:rPr>
+        <w:t>Scope.</w:t>
+      </w:r>
+      <w:r>
+        <w:rPr>
+          <w:rFonts w:ascii="Times New Roman" w:cs="Times New Roman" w:eastAsia="Times New Roman" w:hAnsi="Times New Roman"/>
+          <w:bCs w:val="false"/>
+          <w:iCs w:val="false"/>
+          <w:sz w:val="24"/>
+          <w:szCs w:val="24"/>
+        </w:rPr>
+        <w:t xml:space="preserve"> The extension assumes that an exploit always outscores the best honest candidate, that a flagged release is blocked rather than replaced by the runner-up, that the team is paid linearly on the judge score, and that Δ, </w:t>
+      </w:r>
+      <w:r>
+        <w:rPr>
+          <w:rFonts w:ascii="Times New Roman" w:cs="Times New Roman" w:eastAsia="Times New Roman" w:hAnsi="Times New Roman"/>
+          <w:bCs w:val="false"/>
+          <w:i/>
+          <w:iCs w:val="false"/>
+          <w:sz w:val="24"/>
+          <w:szCs w:val="24"/>
+        </w:rPr>
+        <w:t>d</w:t>
+      </w:r>
+      <w:r>
+        <w:rPr>
+          <w:rFonts w:ascii="Times New Roman" w:cs="Times New Roman" w:eastAsia="Times New Roman" w:hAnsi="Times New Roman"/>
+          <w:bCs w:val="false"/>
+          <w:iCs w:val="false"/>
+          <w:sz w:val="24"/>
+          <w:szCs w:val="24"/>
+        </w:rPr>
+        <w:t>, κ, and β are exogenous. The team also chooses no honest effort. Adding it would give a multitask problem in the spirit of Holmström and Milgrom (1991), in which a stronger incentive on the judge raises both honest effort and exploit effort and the organization chooses β. That extension is not derived here.</w:t>
       </w:r>
     </w:p>
     <w:sectPr>

</xml_diff>

<commit_message>
Add multitask extension (Appendix F) with verification scripts
Co-Authored-By: Claude Sonnet 5.5 <noreply@anthropic.com>
Claude-Session: https://claude.ai/code/session_019zpN7r7iyrxAGMFgJVxuCB
</commit_message>
<xml_diff>
--- a/ISR_Staging_Commitment.docx
+++ b/ISR_Staging_Commitment.docx
@@ -10301,7 +10301,7 @@
           <w:sz w:val="24"/>
           <w:szCs w:val="24"/>
         </w:rPr>
-        <w:t>The model also treats the optimizer as a single agent. In firms, search is distributed across prompt engineers, vendor updates, and fine-tunes. Multi-agent contamination of G is an open governance problem, because holdout sets deteriorate when too many teams can see them. Appendix E relaxes this in a stylized way by letting one team choose how much to invest in exploits, but the multi-agent case remains open.</w:t>
+        <w:t>The model also treats the optimizer as a single agent. In firms, search is distributed across prompt engineers, vendor updates, and fine-tunes. Multi-agent contamination of G is an open governance problem, because holdout sets deteriorate when too many teams can see them. Appendix E relaxes this in a stylized way by letting one team choose how much to invest in exploits, but the multi-agent case remains open. Appendix F adds honest effort to the team’s problem and leaves the optimal intensity of judge-linked pay open.</w:t>
       </w:r>
     </w:p>
     <w:p>
@@ -19636,7 +19636,1287 @@
           <w:sz w:val="24"/>
           <w:szCs w:val="24"/>
         </w:rPr>
-        <w:t>, κ, and β are exogenous. The team also chooses no honest effort. Adding it would give a multitask problem in the spirit of Holmström and Milgrom (1991), in which a stronger incentive on the judge raises both honest effort and exploit effort and the organization chooses β. That extension is not derived here.</w:t>
+        <w:t>, κ, and β are exogenous. The team also chooses no honest effort. Adding it would give a multitask problem in the spirit of Holmström and Milgrom (1991), in which a stronger incentive on the judge raises both honest effort and exploit effort and the organization chooses β. Appendix F takes a first step with this extension.</w:t>
+      </w:r>
+    </w:p>
+    <w:p>
+      <w:pPr>
+        <w:pStyle w:val="Heading1"/>
+        <w:spacing w:after="240" w:before="360" w:line="480" w:lineRule="auto"/>
+        <w:jc w:val="center"/>
+      </w:pPr>
+      <w:r>
+        <w:rPr>
+          <w:rFonts w:ascii="Times New Roman" w:cs="Times New Roman" w:eastAsia="Times New Roman" w:hAnsi="Times New Roman"/>
+          <w:bCs/>
+          <w:iCs w:val="false"/>
+          <w:sz w:val="24"/>
+          <w:szCs w:val="24"/>
+        </w:rPr>
+        <w:t>APPENDIX F: HONEST EFFORT AND THE INTENSITY OF JUDGE-LINKED PAY</w:t>
+      </w:r>
+    </w:p>
+    <w:p>
+      <w:pPr>
+        <w:spacing w:after="0" w:before="0" w:line="480" w:lineRule="auto"/>
+        <w:ind w:firstLine="720"/>
+        <w:jc w:val="left"/>
+      </w:pPr>
+      <w:r>
+        <w:rPr>
+          <w:rFonts w:ascii="Times New Roman" w:cs="Times New Roman" w:eastAsia="Times New Roman" w:hAnsi="Times New Roman"/>
+          <w:bCs w:val="false"/>
+          <w:iCs w:val="false"/>
+          <w:sz w:val="24"/>
+          <w:szCs w:val="24"/>
+        </w:rPr>
+        <w:t xml:space="preserve">This appendix adds honest effort to the team’s problem in Appendix E. The team now also chooses an honest effort </w:t>
+      </w:r>
+      <w:r>
+        <w:rPr>
+          <w:rFonts w:ascii="Times New Roman" w:cs="Times New Roman" w:eastAsia="Times New Roman" w:hAnsi="Times New Roman"/>
+          <w:bCs w:val="false"/>
+          <w:i/>
+          <w:iCs w:val="false"/>
+          <w:sz w:val="24"/>
+          <w:szCs w:val="24"/>
+        </w:rPr>
+        <w:t>a</w:t>
+      </w:r>
+      <w:r>
+        <w:rPr>
+          <w:rFonts w:ascii="Times New Roman" w:cs="Times New Roman" w:eastAsia="Times New Roman" w:hAnsi="Times New Roman"/>
+          <w:bCs w:val="false"/>
+          <w:iCs w:val="false"/>
+          <w:sz w:val="24"/>
+          <w:szCs w:val="24"/>
+        </w:rPr>
+        <w:t xml:space="preserve"> ≥ 0 at cost (ψ/2)</w:t>
+      </w:r>
+      <w:r>
+        <w:rPr>
+          <w:rFonts w:ascii="Times New Roman" w:cs="Times New Roman" w:eastAsia="Times New Roman" w:hAnsi="Times New Roman"/>
+          <w:bCs w:val="false"/>
+          <w:i/>
+          <w:iCs w:val="false"/>
+          <w:sz w:val="24"/>
+          <w:szCs w:val="24"/>
+        </w:rPr>
+        <w:t>a</w:t>
+      </w:r>
+      <w:r>
+        <w:rPr>
+          <w:rFonts w:ascii="Times New Roman" w:cs="Times New Roman" w:eastAsia="Times New Roman" w:hAnsi="Times New Roman"/>
+          <w:bCs w:val="false"/>
+          <w:iCs w:val="false"/>
+          <w:sz w:val="24"/>
+          <w:szCs w:val="24"/>
+        </w:rPr>
+        <w:t xml:space="preserve">², where </w:t>
+      </w:r>
+      <w:r>
+        <w:rPr>
+          <w:rFonts w:ascii="Times New Roman" w:cs="Times New Roman" w:eastAsia="Times New Roman" w:hAnsi="Times New Roman"/>
+          <w:bCs w:val="false"/>
+          <w:i/>
+          <w:iCs w:val="false"/>
+          <w:sz w:val="24"/>
+          <w:szCs w:val="24"/>
+        </w:rPr>
+        <w:t>a</w:t>
+      </w:r>
+      <w:r>
+        <w:rPr>
+          <w:rFonts w:ascii="Times New Roman" w:cs="Times New Roman" w:eastAsia="Times New Roman" w:hAnsi="Times New Roman"/>
+          <w:bCs w:val="false"/>
+          <w:iCs w:val="false"/>
+          <w:sz w:val="24"/>
+          <w:szCs w:val="24"/>
+        </w:rPr>
+        <w:t xml:space="preserve"> raises the gold value of every honest candidate by </w:t>
+      </w:r>
+      <w:r>
+        <w:rPr>
+          <w:rFonts w:ascii="Times New Roman" w:cs="Times New Roman" w:eastAsia="Times New Roman" w:hAnsi="Times New Roman"/>
+          <w:bCs w:val="false"/>
+          <w:i/>
+          <w:iCs w:val="false"/>
+          <w:sz w:val="24"/>
+          <w:szCs w:val="24"/>
+        </w:rPr>
+        <w:t>a</w:t>
+      </w:r>
+      <w:r>
+        <w:rPr>
+          <w:rFonts w:ascii="Times New Roman" w:cs="Times New Roman" w:eastAsia="Times New Roman" w:hAnsi="Times New Roman"/>
+          <w:bCs w:val="false"/>
+          <w:iCs w:val="false"/>
+          <w:sz w:val="24"/>
+          <w:szCs w:val="24"/>
+        </w:rPr>
+        <w:t xml:space="preserve"> and its judge score by θ</w:t>
+      </w:r>
+      <w:r>
+        <w:rPr>
+          <w:rFonts w:ascii="Times New Roman" w:cs="Times New Roman" w:eastAsia="Times New Roman" w:hAnsi="Times New Roman"/>
+          <w:bCs w:val="false"/>
+          <w:i/>
+          <w:iCs w:val="false"/>
+          <w:sz w:val="24"/>
+          <w:szCs w:val="24"/>
+        </w:rPr>
+        <w:t>a</w:t>
+      </w:r>
+      <w:r>
+        <w:rPr>
+          <w:rFonts w:ascii="Times New Roman" w:cs="Times New Roman" w:eastAsia="Times New Roman" w:hAnsi="Times New Roman"/>
+          <w:bCs w:val="false"/>
+          <w:iCs w:val="false"/>
+          <w:sz w:val="24"/>
+          <w:szCs w:val="24"/>
+        </w:rPr>
+        <w:t>, and θ ∈ (0, 1] measures how well the judge sees honest improvement. Everything else is as in Appendix E, and the team is paid β times the judge score of what ships.</w:t>
+      </w:r>
+    </w:p>
+    <w:p>
+      <w:pPr>
+        <w:spacing w:after="0" w:before="0" w:line="480" w:lineRule="auto"/>
+        <w:ind w:firstLine="720"/>
+        <w:jc w:val="left"/>
+      </w:pPr>
+      <w:r>
+        <w:rPr>
+          <w:rFonts w:ascii="Times New Roman" w:cs="Times New Roman" w:eastAsia="Times New Roman" w:hAnsi="Times New Roman"/>
+          <w:bCs w:val="false"/>
+          <w:i/>
+          <w:iCs w:val="false"/>
+          <w:sz w:val="24"/>
+          <w:szCs w:val="24"/>
+        </w:rPr>
+        <w:t>Step 1: best responses.</w:t>
+      </w:r>
+      <w:r>
+        <w:rPr>
+          <w:rFonts w:ascii="Times New Roman" w:cs="Times New Roman" w:eastAsia="Times New Roman" w:hAnsi="Times New Roman"/>
+          <w:bCs w:val="false"/>
+          <w:iCs w:val="false"/>
+          <w:sz w:val="24"/>
+          <w:szCs w:val="24"/>
+        </w:rPr>
+        <w:t xml:space="preserve"> The expected judge score of what ships is (θ</w:t>
+      </w:r>
+      <w:r>
+        <w:rPr>
+          <w:rFonts w:ascii="Times New Roman" w:cs="Times New Roman" w:eastAsia="Times New Roman" w:hAnsi="Times New Roman"/>
+          <w:bCs w:val="false"/>
+          <w:i/>
+          <w:iCs w:val="false"/>
+          <w:sz w:val="24"/>
+          <w:szCs w:val="24"/>
+        </w:rPr>
+        <w:t>a</w:t>
+      </w:r>
+      <w:r>
+        <w:rPr>
+          <w:rFonts w:ascii="Times New Roman" w:cs="Times New Roman" w:eastAsia="Times New Roman" w:hAnsi="Times New Roman"/>
+          <w:bCs w:val="false"/>
+          <w:iCs w:val="false"/>
+          <w:sz w:val="24"/>
+          <w:szCs w:val="24"/>
+        </w:rPr>
+        <w:t xml:space="preserve"> + σ</w:t>
+      </w:r>
+      <w:r>
+        <w:rPr>
+          <w:rFonts w:ascii="Times New Roman" w:cs="Times New Roman" w:eastAsia="Times New Roman" w:hAnsi="Times New Roman"/>
+          <w:bCs w:val="false"/>
+          <w:iCs w:val="false"/>
+          <w:sz w:val="24"/>
+          <w:szCs w:val="24"/>
+          <w:vertAlign w:val="subscript"/>
+        </w:rPr>
+        <w:t>J</w:t>
+      </w:r>
+      <w:r>
+        <w:rPr>
+          <w:rFonts w:ascii="Times New Roman" w:cs="Times New Roman" w:eastAsia="Times New Roman" w:hAnsi="Times New Roman"/>
+          <w:bCs w:val="false"/>
+          <w:i/>
+          <w:iCs w:val="false"/>
+          <w:sz w:val="24"/>
+          <w:szCs w:val="24"/>
+        </w:rPr>
+        <w:t>m</w:t>
+      </w:r>
+      <w:r>
+        <w:rPr>
+          <w:rFonts w:ascii="Times New Roman" w:cs="Times New Roman" w:eastAsia="Times New Roman" w:hAnsi="Times New Roman"/>
+          <w:bCs w:val="false"/>
+          <w:i/>
+          <w:iCs w:val="false"/>
+          <w:sz w:val="24"/>
+          <w:szCs w:val="24"/>
+          <w:vertAlign w:val="subscript"/>
+        </w:rPr>
+        <w:t>N</w:t>
+      </w:r>
+      <w:r>
+        <w:rPr>
+          <w:rFonts w:ascii="Times New Roman" w:cs="Times New Roman" w:eastAsia="Times New Roman" w:hAnsi="Times New Roman"/>
+          <w:bCs w:val="false"/>
+          <w:iCs w:val="false"/>
+          <w:sz w:val="24"/>
+          <w:szCs w:val="24"/>
+        </w:rPr>
+        <w:t xml:space="preserve">)(1 − </w:t>
+      </w:r>
+      <w:r>
+        <w:rPr>
+          <w:rFonts w:ascii="Times New Roman" w:cs="Times New Roman" w:eastAsia="Times New Roman" w:hAnsi="Times New Roman"/>
+          <w:bCs w:val="false"/>
+          <w:i/>
+          <w:iCs w:val="false"/>
+          <w:sz w:val="24"/>
+          <w:szCs w:val="24"/>
+        </w:rPr>
+        <w:t>Q</w:t>
+      </w:r>
+      <w:r>
+        <w:rPr>
+          <w:rFonts w:ascii="Times New Roman" w:cs="Times New Roman" w:eastAsia="Times New Roman" w:hAnsi="Times New Roman"/>
+          <w:bCs w:val="false"/>
+          <w:iCs w:val="false"/>
+          <w:sz w:val="24"/>
+          <w:szCs w:val="24"/>
+        </w:rPr>
+        <w:t xml:space="preserve">φ) + </w:t>
+      </w:r>
+      <w:r>
+        <w:rPr>
+          <w:rFonts w:ascii="Times New Roman" w:cs="Times New Roman" w:eastAsia="Times New Roman" w:hAnsi="Times New Roman"/>
+          <w:bCs w:val="false"/>
+          <w:i/>
+          <w:iCs w:val="false"/>
+          <w:sz w:val="24"/>
+          <w:szCs w:val="24"/>
+        </w:rPr>
+        <w:t>Q</w:t>
+      </w:r>
+      <w:r>
+        <w:rPr>
+          <w:rFonts w:ascii="Times New Roman" w:cs="Times New Roman" w:eastAsia="Times New Roman" w:hAnsi="Times New Roman"/>
+          <w:bCs w:val="false"/>
+          <w:iCs w:val="false"/>
+          <w:sz w:val="24"/>
+          <w:szCs w:val="24"/>
+        </w:rPr>
+        <w:t>(1 − φ)Δ. The team’s utility is β times this quantity less (ψ/2)</w:t>
+      </w:r>
+      <w:r>
+        <w:rPr>
+          <w:rFonts w:ascii="Times New Roman" w:cs="Times New Roman" w:eastAsia="Times New Roman" w:hAnsi="Times New Roman"/>
+          <w:bCs w:val="false"/>
+          <w:i/>
+          <w:iCs w:val="false"/>
+          <w:sz w:val="24"/>
+          <w:szCs w:val="24"/>
+        </w:rPr>
+        <w:t>a</w:t>
+      </w:r>
+      <w:r>
+        <w:rPr>
+          <w:rFonts w:ascii="Times New Roman" w:cs="Times New Roman" w:eastAsia="Times New Roman" w:hAnsi="Times New Roman"/>
+          <w:bCs w:val="false"/>
+          <w:iCs w:val="false"/>
+          <w:sz w:val="24"/>
+          <w:szCs w:val="24"/>
+        </w:rPr>
+        <w:t xml:space="preserve">² and </w:t>
+      </w:r>
+      <w:r>
+        <w:rPr>
+          <w:rFonts w:ascii="Times New Roman" w:cs="Times New Roman" w:eastAsia="Times New Roman" w:hAnsi="Times New Roman"/>
+          <w:bCs w:val="false"/>
+          <w:i/>
+          <w:iCs w:val="false"/>
+          <w:sz w:val="24"/>
+          <w:szCs w:val="24"/>
+        </w:rPr>
+        <w:t>N</w:t>
+      </w:r>
+      <w:r>
+        <w:rPr>
+          <w:rFonts w:ascii="Times New Roman" w:cs="Times New Roman" w:eastAsia="Times New Roman" w:hAnsi="Times New Roman"/>
+          <w:bCs w:val="false"/>
+          <w:iCs w:val="false"/>
+          <w:sz w:val="24"/>
+          <w:szCs w:val="24"/>
+        </w:rPr>
+        <w:t>(κ/2)</w:t>
+      </w:r>
+      <w:r>
+        <w:rPr>
+          <w:rFonts w:ascii="Times New Roman" w:cs="Times New Roman" w:eastAsia="Times New Roman" w:hAnsi="Times New Roman"/>
+          <w:bCs w:val="false"/>
+          <w:i/>
+          <w:iCs w:val="false"/>
+          <w:sz w:val="24"/>
+          <w:szCs w:val="24"/>
+        </w:rPr>
+        <w:t>e</w:t>
+      </w:r>
+      <w:r>
+        <w:rPr>
+          <w:rFonts w:ascii="Times New Roman" w:cs="Times New Roman" w:eastAsia="Times New Roman" w:hAnsi="Times New Roman"/>
+          <w:bCs w:val="false"/>
+          <w:iCs w:val="false"/>
+          <w:sz w:val="24"/>
+          <w:szCs w:val="24"/>
+        </w:rPr>
+        <w:t xml:space="preserve">². For a given </w:t>
+      </w:r>
+      <w:r>
+        <w:rPr>
+          <w:rFonts w:ascii="Times New Roman" w:cs="Times New Roman" w:eastAsia="Times New Roman" w:hAnsi="Times New Roman"/>
+          <w:bCs w:val="false"/>
+          <w:i/>
+          <w:iCs w:val="false"/>
+          <w:sz w:val="24"/>
+          <w:szCs w:val="24"/>
+        </w:rPr>
+        <w:t>e</w:t>
+      </w:r>
+      <w:r>
+        <w:rPr>
+          <w:rFonts w:ascii="Times New Roman" w:cs="Times New Roman" w:eastAsia="Times New Roman" w:hAnsi="Times New Roman"/>
+          <w:bCs w:val="false"/>
+          <w:iCs w:val="false"/>
+          <w:sz w:val="24"/>
+          <w:szCs w:val="24"/>
+        </w:rPr>
+        <w:t xml:space="preserve"> it is strictly concave in </w:t>
+      </w:r>
+      <w:r>
+        <w:rPr>
+          <w:rFonts w:ascii="Times New Roman" w:cs="Times New Roman" w:eastAsia="Times New Roman" w:hAnsi="Times New Roman"/>
+          <w:bCs w:val="false"/>
+          <w:i/>
+          <w:iCs w:val="false"/>
+          <w:sz w:val="24"/>
+          <w:szCs w:val="24"/>
+        </w:rPr>
+        <w:t>a</w:t>
+      </w:r>
+      <w:r>
+        <w:rPr>
+          <w:rFonts w:ascii="Times New Roman" w:cs="Times New Roman" w:eastAsia="Times New Roman" w:hAnsi="Times New Roman"/>
+          <w:bCs w:val="false"/>
+          <w:iCs w:val="false"/>
+          <w:sz w:val="24"/>
+          <w:szCs w:val="24"/>
+        </w:rPr>
+        <w:t>, with best response</w:t>
+      </w:r>
+    </w:p>
+    <w:p>
+      <w:pPr>
+        <w:tabs>
+          <w:tab w:val="right" w:pos="9360"/>
+        </w:tabs>
+        <w:spacing w:after="160" w:before="160" w:line="480" w:lineRule="auto"/>
+        <w:jc w:val="center"/>
+      </w:pPr>
+      <w:r>
+        <w:rPr>
+          <w:rFonts w:ascii="Times New Roman" w:cs="Times New Roman" w:eastAsia="Times New Roman" w:hAnsi="Times New Roman"/>
+          <w:bCs w:val="false"/>
+          <w:i/>
+          <w:iCs/>
+          <w:sz w:val="24"/>
+          <w:szCs w:val="24"/>
+        </w:rPr>
+        <w:t>a</w:t>
+      </w:r>
+      <w:r>
+        <w:rPr>
+          <w:rFonts w:ascii="Times New Roman" w:cs="Times New Roman" w:eastAsia="Times New Roman" w:hAnsi="Times New Roman"/>
+          <w:bCs w:val="false"/>
+          <w:iCs/>
+          <w:sz w:val="24"/>
+          <w:szCs w:val="24"/>
+        </w:rPr>
+        <w:t xml:space="preserve">  =  βθ(1 − </w:t>
+      </w:r>
+      <w:r>
+        <w:rPr>
+          <w:rFonts w:ascii="Times New Roman" w:cs="Times New Roman" w:eastAsia="Times New Roman" w:hAnsi="Times New Roman"/>
+          <w:bCs w:val="false"/>
+          <w:i/>
+          <w:iCs/>
+          <w:sz w:val="24"/>
+          <w:szCs w:val="24"/>
+        </w:rPr>
+        <w:t>Q</w:t>
+      </w:r>
+      <w:r>
+        <w:rPr>
+          <w:rFonts w:ascii="Times New Roman" w:cs="Times New Roman" w:eastAsia="Times New Roman" w:hAnsi="Times New Roman"/>
+          <w:bCs w:val="false"/>
+          <w:iCs/>
+          <w:sz w:val="24"/>
+          <w:szCs w:val="24"/>
+        </w:rPr>
+        <w:t>φ) / ψ</w:t>
+        <w:tab/>
+        <w:t>(F1)</w:t>
+      </w:r>
+    </w:p>
+    <w:p>
+      <w:pPr>
+        <w:spacing w:after="0" w:before="0" w:line="480" w:lineRule="auto"/>
+        <w:ind w:firstLine="720"/>
+        <w:jc w:val="left"/>
+      </w:pPr>
+      <w:r>
+        <w:rPr>
+          <w:rFonts w:ascii="Times New Roman" w:cs="Times New Roman" w:eastAsia="Times New Roman" w:hAnsi="Times New Roman"/>
+          <w:bCs w:val="false"/>
+          <w:iCs w:val="false"/>
+          <w:sz w:val="24"/>
+          <w:szCs w:val="24"/>
+        </w:rPr>
+        <w:t xml:space="preserve">Honest effort rises with β and θ and falls with φ and </w:t>
+      </w:r>
+      <w:r>
+        <w:rPr>
+          <w:rFonts w:ascii="Times New Roman" w:cs="Times New Roman" w:eastAsia="Times New Roman" w:hAnsi="Times New Roman"/>
+          <w:bCs w:val="false"/>
+          <w:i/>
+          <w:iCs w:val="false"/>
+          <w:sz w:val="24"/>
+          <w:szCs w:val="24"/>
+        </w:rPr>
+        <w:t>Q</w:t>
+      </w:r>
+      <w:r>
+        <w:rPr>
+          <w:rFonts w:ascii="Times New Roman" w:cs="Times New Roman" w:eastAsia="Times New Roman" w:hAnsi="Times New Roman"/>
+          <w:bCs w:val="false"/>
+          <w:iCs w:val="false"/>
+          <w:sz w:val="24"/>
+          <w:szCs w:val="24"/>
+        </w:rPr>
+        <w:t xml:space="preserve">, because a release blocked by an inspection forfeits the honest score. For a given </w:t>
+      </w:r>
+      <w:r>
+        <w:rPr>
+          <w:rFonts w:ascii="Times New Roman" w:cs="Times New Roman" w:eastAsia="Times New Roman" w:hAnsi="Times New Roman"/>
+          <w:bCs w:val="false"/>
+          <w:i/>
+          <w:iCs w:val="false"/>
+          <w:sz w:val="24"/>
+          <w:szCs w:val="24"/>
+        </w:rPr>
+        <w:t>a</w:t>
+      </w:r>
+      <w:r>
+        <w:rPr>
+          <w:rFonts w:ascii="Times New Roman" w:cs="Times New Roman" w:eastAsia="Times New Roman" w:hAnsi="Times New Roman"/>
+          <w:bCs w:val="false"/>
+          <w:iCs w:val="false"/>
+          <w:sz w:val="24"/>
+          <w:szCs w:val="24"/>
+        </w:rPr>
+        <w:t>, the exploit problem is that of Appendix E with the stake θ</w:t>
+      </w:r>
+      <w:r>
+        <w:rPr>
+          <w:rFonts w:ascii="Times New Roman" w:cs="Times New Roman" w:eastAsia="Times New Roman" w:hAnsi="Times New Roman"/>
+          <w:bCs w:val="false"/>
+          <w:i/>
+          <w:iCs w:val="false"/>
+          <w:sz w:val="24"/>
+          <w:szCs w:val="24"/>
+        </w:rPr>
+        <w:t>a</w:t>
+      </w:r>
+      <w:r>
+        <w:rPr>
+          <w:rFonts w:ascii="Times New Roman" w:cs="Times New Roman" w:eastAsia="Times New Roman" w:hAnsi="Times New Roman"/>
+          <w:bCs w:val="false"/>
+          <w:iCs w:val="false"/>
+          <w:sz w:val="24"/>
+          <w:szCs w:val="24"/>
+        </w:rPr>
+        <w:t xml:space="preserve"> + σ</w:t>
+      </w:r>
+      <w:r>
+        <w:rPr>
+          <w:rFonts w:ascii="Times New Roman" w:cs="Times New Roman" w:eastAsia="Times New Roman" w:hAnsi="Times New Roman"/>
+          <w:bCs w:val="false"/>
+          <w:iCs w:val="false"/>
+          <w:sz w:val="24"/>
+          <w:szCs w:val="24"/>
+          <w:vertAlign w:val="subscript"/>
+        </w:rPr>
+        <w:t>J</w:t>
+      </w:r>
+      <w:r>
+        <w:rPr>
+          <w:rFonts w:ascii="Times New Roman" w:cs="Times New Roman" w:eastAsia="Times New Roman" w:hAnsi="Times New Roman"/>
+          <w:bCs w:val="false"/>
+          <w:i/>
+          <w:iCs w:val="false"/>
+          <w:sz w:val="24"/>
+          <w:szCs w:val="24"/>
+        </w:rPr>
+        <w:t>m</w:t>
+      </w:r>
+      <w:r>
+        <w:rPr>
+          <w:rFonts w:ascii="Times New Roman" w:cs="Times New Roman" w:eastAsia="Times New Roman" w:hAnsi="Times New Roman"/>
+          <w:bCs w:val="false"/>
+          <w:i/>
+          <w:iCs w:val="false"/>
+          <w:sz w:val="24"/>
+          <w:szCs w:val="24"/>
+          <w:vertAlign w:val="subscript"/>
+        </w:rPr>
+        <w:t>N</w:t>
+      </w:r>
+      <w:r>
+        <w:rPr>
+          <w:rFonts w:ascii="Times New Roman" w:cs="Times New Roman" w:eastAsia="Times New Roman" w:hAnsi="Times New Roman"/>
+          <w:bCs w:val="false"/>
+          <w:iCs w:val="false"/>
+          <w:sz w:val="24"/>
+          <w:szCs w:val="24"/>
+        </w:rPr>
+        <w:t xml:space="preserve"> in place of σ</w:t>
+      </w:r>
+      <w:r>
+        <w:rPr>
+          <w:rFonts w:ascii="Times New Roman" w:cs="Times New Roman" w:eastAsia="Times New Roman" w:hAnsi="Times New Roman"/>
+          <w:bCs w:val="false"/>
+          <w:iCs w:val="false"/>
+          <w:sz w:val="24"/>
+          <w:szCs w:val="24"/>
+          <w:vertAlign w:val="subscript"/>
+        </w:rPr>
+        <w:t>J</w:t>
+      </w:r>
+      <w:r>
+        <w:rPr>
+          <w:rFonts w:ascii="Times New Roman" w:cs="Times New Roman" w:eastAsia="Times New Roman" w:hAnsi="Times New Roman"/>
+          <w:bCs w:val="false"/>
+          <w:i/>
+          <w:iCs w:val="false"/>
+          <w:sz w:val="24"/>
+          <w:szCs w:val="24"/>
+        </w:rPr>
+        <w:t>m</w:t>
+      </w:r>
+      <w:r>
+        <w:rPr>
+          <w:rFonts w:ascii="Times New Roman" w:cs="Times New Roman" w:eastAsia="Times New Roman" w:hAnsi="Times New Roman"/>
+          <w:bCs w:val="false"/>
+          <w:i/>
+          <w:iCs w:val="false"/>
+          <w:sz w:val="24"/>
+          <w:szCs w:val="24"/>
+          <w:vertAlign w:val="subscript"/>
+        </w:rPr>
+        <w:t>N</w:t>
+      </w:r>
+      <w:r>
+        <w:rPr>
+          <w:rFonts w:ascii="Times New Roman" w:cs="Times New Roman" w:eastAsia="Times New Roman" w:hAnsi="Times New Roman"/>
+          <w:bCs w:val="false"/>
+          <w:iCs w:val="false"/>
+          <w:sz w:val="24"/>
+          <w:szCs w:val="24"/>
+        </w:rPr>
+        <w:t>, so that the net gain from a successful exploit becomes</w:t>
+      </w:r>
+    </w:p>
+    <w:p>
+      <w:pPr>
+        <w:tabs>
+          <w:tab w:val="right" w:pos="9360"/>
+        </w:tabs>
+        <w:spacing w:after="160" w:before="160" w:line="480" w:lineRule="auto"/>
+        <w:jc w:val="center"/>
+      </w:pPr>
+      <w:r>
+        <w:rPr>
+          <w:rFonts w:ascii="Times New Roman" w:cs="Times New Roman" w:eastAsia="Times New Roman" w:hAnsi="Times New Roman"/>
+          <w:bCs w:val="false"/>
+          <w:i/>
+          <w:iCs/>
+          <w:sz w:val="24"/>
+          <w:szCs w:val="24"/>
+        </w:rPr>
+        <w:t>G</w:t>
+      </w:r>
+      <w:r>
+        <w:rPr>
+          <w:rFonts w:ascii="Times New Roman" w:cs="Times New Roman" w:eastAsia="Times New Roman" w:hAnsi="Times New Roman"/>
+          <w:bCs w:val="false"/>
+          <w:iCs/>
+          <w:sz w:val="24"/>
+          <w:szCs w:val="24"/>
+        </w:rPr>
+        <w:t xml:space="preserve">  =  (1 − φ)Δ  −  φ(θ</w:t>
+      </w:r>
+      <w:r>
+        <w:rPr>
+          <w:rFonts w:ascii="Times New Roman" w:cs="Times New Roman" w:eastAsia="Times New Roman" w:hAnsi="Times New Roman"/>
+          <w:bCs w:val="false"/>
+          <w:i/>
+          <w:iCs/>
+          <w:sz w:val="24"/>
+          <w:szCs w:val="24"/>
+        </w:rPr>
+        <w:t>a</w:t>
+      </w:r>
+      <w:r>
+        <w:rPr>
+          <w:rFonts w:ascii="Times New Roman" w:cs="Times New Roman" w:eastAsia="Times New Roman" w:hAnsi="Times New Roman"/>
+          <w:bCs w:val="false"/>
+          <w:iCs/>
+          <w:sz w:val="24"/>
+          <w:szCs w:val="24"/>
+        </w:rPr>
+        <w:t xml:space="preserve"> + σ</w:t>
+      </w:r>
+      <w:r>
+        <w:rPr>
+          <w:rFonts w:ascii="Times New Roman" w:cs="Times New Roman" w:eastAsia="Times New Roman" w:hAnsi="Times New Roman"/>
+          <w:bCs w:val="false"/>
+          <w:iCs/>
+          <w:sz w:val="24"/>
+          <w:szCs w:val="24"/>
+          <w:vertAlign w:val="subscript"/>
+        </w:rPr>
+        <w:t>J</w:t>
+      </w:r>
+      <w:r>
+        <w:rPr>
+          <w:rFonts w:ascii="Times New Roman" w:cs="Times New Roman" w:eastAsia="Times New Roman" w:hAnsi="Times New Roman"/>
+          <w:bCs w:val="false"/>
+          <w:i/>
+          <w:iCs/>
+          <w:sz w:val="24"/>
+          <w:szCs w:val="24"/>
+        </w:rPr>
+        <w:t>m</w:t>
+      </w:r>
+      <w:r>
+        <w:rPr>
+          <w:rFonts w:ascii="Times New Roman" w:cs="Times New Roman" w:eastAsia="Times New Roman" w:hAnsi="Times New Roman"/>
+          <w:bCs w:val="false"/>
+          <w:i/>
+          <w:iCs/>
+          <w:sz w:val="24"/>
+          <w:szCs w:val="24"/>
+          <w:vertAlign w:val="subscript"/>
+        </w:rPr>
+        <w:t>N</w:t>
+      </w:r>
+      <w:r>
+        <w:rPr>
+          <w:rFonts w:ascii="Times New Roman" w:cs="Times New Roman" w:eastAsia="Times New Roman" w:hAnsi="Times New Roman"/>
+          <w:bCs w:val="false"/>
+          <w:iCs/>
+          <w:sz w:val="24"/>
+          <w:szCs w:val="24"/>
+        </w:rPr>
+        <w:t>)</w:t>
+        <w:tab/>
+        <w:t>(F2)</w:t>
+      </w:r>
+    </w:p>
+    <w:p>
+      <w:pPr>
+        <w:spacing w:after="0" w:before="0" w:line="480" w:lineRule="auto"/>
+        <w:ind w:firstLine="720"/>
+        <w:jc w:val="left"/>
+      </w:pPr>
+      <w:r>
+        <w:rPr>
+          <w:rFonts w:ascii="Times New Roman" w:cs="Times New Roman" w:eastAsia="Times New Roman" w:hAnsi="Times New Roman"/>
+          <w:bCs w:val="false"/>
+          <w:iCs w:val="false"/>
+          <w:sz w:val="24"/>
+          <w:szCs w:val="24"/>
+        </w:rPr>
+        <w:t xml:space="preserve">Utility is strictly decreasing in </w:t>
+      </w:r>
+      <w:r>
+        <w:rPr>
+          <w:rFonts w:ascii="Times New Roman" w:cs="Times New Roman" w:eastAsia="Times New Roman" w:hAnsi="Times New Roman"/>
+          <w:bCs w:val="false"/>
+          <w:i/>
+          <w:iCs w:val="false"/>
+          <w:sz w:val="24"/>
+          <w:szCs w:val="24"/>
+        </w:rPr>
+        <w:t>e</w:t>
+      </w:r>
+      <w:r>
+        <w:rPr>
+          <w:rFonts w:ascii="Times New Roman" w:cs="Times New Roman" w:eastAsia="Times New Roman" w:hAnsi="Times New Roman"/>
+          <w:bCs w:val="false"/>
+          <w:iCs w:val="false"/>
+          <w:sz w:val="24"/>
+          <w:szCs w:val="24"/>
+        </w:rPr>
+        <w:t xml:space="preserve"> whenever </w:t>
+      </w:r>
+      <w:r>
+        <w:rPr>
+          <w:rFonts w:ascii="Times New Roman" w:cs="Times New Roman" w:eastAsia="Times New Roman" w:hAnsi="Times New Roman"/>
+          <w:bCs w:val="false"/>
+          <w:i/>
+          <w:iCs w:val="false"/>
+          <w:sz w:val="24"/>
+          <w:szCs w:val="24"/>
+        </w:rPr>
+        <w:t>G</w:t>
+      </w:r>
+      <w:r>
+        <w:rPr>
+          <w:rFonts w:ascii="Times New Roman" w:cs="Times New Roman" w:eastAsia="Times New Roman" w:hAnsi="Times New Roman"/>
+          <w:bCs w:val="false"/>
+          <w:iCs w:val="false"/>
+          <w:sz w:val="24"/>
+          <w:szCs w:val="24"/>
+        </w:rPr>
+        <w:t xml:space="preserve"> ≤ 0, since the gain from exploiting is then negative and its cost is positive.</w:t>
+      </w:r>
+    </w:p>
+    <w:p>
+      <w:pPr>
+        <w:spacing w:after="0" w:before="0" w:line="480" w:lineRule="auto"/>
+        <w:ind w:firstLine="720"/>
+        <w:jc w:val="left"/>
+      </w:pPr>
+      <w:r>
+        <w:rPr>
+          <w:rFonts w:ascii="Times New Roman" w:cs="Times New Roman" w:eastAsia="Times New Roman" w:hAnsi="Times New Roman"/>
+          <w:bCs w:val="false"/>
+          <w:i/>
+          <w:iCs w:val="false"/>
+          <w:sz w:val="24"/>
+          <w:szCs w:val="24"/>
+        </w:rPr>
+        <w:t>Step 2: a deterrence threshold.</w:t>
+      </w:r>
+      <w:r>
+        <w:rPr>
+          <w:rFonts w:ascii="Times New Roman" w:cs="Times New Roman" w:eastAsia="Times New Roman" w:hAnsi="Times New Roman"/>
+          <w:bCs w:val="false"/>
+          <w:iCs w:val="false"/>
+          <w:sz w:val="24"/>
+          <w:szCs w:val="24"/>
+        </w:rPr>
+        <w:t xml:space="preserve"> Consider the profile without exploitation, </w:t>
+      </w:r>
+      <w:r>
+        <w:rPr>
+          <w:rFonts w:ascii="Times New Roman" w:cs="Times New Roman" w:eastAsia="Times New Roman" w:hAnsi="Times New Roman"/>
+          <w:bCs w:val="false"/>
+          <w:i/>
+          <w:iCs w:val="false"/>
+          <w:sz w:val="24"/>
+          <w:szCs w:val="24"/>
+        </w:rPr>
+        <w:t>e</w:t>
+      </w:r>
+      <w:r>
+        <w:rPr>
+          <w:rFonts w:ascii="Times New Roman" w:cs="Times New Roman" w:eastAsia="Times New Roman" w:hAnsi="Times New Roman"/>
+          <w:bCs w:val="false"/>
+          <w:iCs w:val="false"/>
+          <w:sz w:val="24"/>
+          <w:szCs w:val="24"/>
+        </w:rPr>
+        <w:t xml:space="preserve"> = 0. Then </w:t>
+      </w:r>
+      <w:r>
+        <w:rPr>
+          <w:rFonts w:ascii="Times New Roman" w:cs="Times New Roman" w:eastAsia="Times New Roman" w:hAnsi="Times New Roman"/>
+          <w:bCs w:val="false"/>
+          <w:i/>
+          <w:iCs w:val="false"/>
+          <w:sz w:val="24"/>
+          <w:szCs w:val="24"/>
+        </w:rPr>
+        <w:t>Q</w:t>
+      </w:r>
+      <w:r>
+        <w:rPr>
+          <w:rFonts w:ascii="Times New Roman" w:cs="Times New Roman" w:eastAsia="Times New Roman" w:hAnsi="Times New Roman"/>
+          <w:bCs w:val="false"/>
+          <w:iCs w:val="false"/>
+          <w:sz w:val="24"/>
+          <w:szCs w:val="24"/>
+        </w:rPr>
+        <w:t xml:space="preserve"> = 0 and </w:t>
+      </w:r>
+      <w:r>
+        <w:rPr>
+          <w:rFonts w:ascii="Times New Roman" w:cs="Times New Roman" w:eastAsia="Times New Roman" w:hAnsi="Times New Roman"/>
+          <w:bCs w:val="false"/>
+          <w:i/>
+          <w:iCs w:val="false"/>
+          <w:sz w:val="24"/>
+          <w:szCs w:val="24"/>
+        </w:rPr>
+        <w:t>a</w:t>
+      </w:r>
+      <w:r>
+        <w:rPr>
+          <w:rFonts w:ascii="Times New Roman" w:cs="Times New Roman" w:eastAsia="Times New Roman" w:hAnsi="Times New Roman"/>
+          <w:bCs w:val="false"/>
+          <w:iCs w:val="false"/>
+          <w:sz w:val="24"/>
+          <w:szCs w:val="24"/>
+        </w:rPr>
+        <w:t xml:space="preserve"> = βθ/ψ by (F1), and (F2) gives </w:t>
+      </w:r>
+      <w:r>
+        <w:rPr>
+          <w:rFonts w:ascii="Times New Roman" w:cs="Times New Roman" w:eastAsia="Times New Roman" w:hAnsi="Times New Roman"/>
+          <w:bCs w:val="false"/>
+          <w:i/>
+          <w:iCs w:val="false"/>
+          <w:sz w:val="24"/>
+          <w:szCs w:val="24"/>
+        </w:rPr>
+        <w:t>G</w:t>
+      </w:r>
+      <w:r>
+        <w:rPr>
+          <w:rFonts w:ascii="Times New Roman" w:cs="Times New Roman" w:eastAsia="Times New Roman" w:hAnsi="Times New Roman"/>
+          <w:bCs w:val="false"/>
+          <w:iCs w:val="false"/>
+          <w:sz w:val="24"/>
+          <w:szCs w:val="24"/>
+        </w:rPr>
+        <w:t xml:space="preserve"> = </w:t>
+      </w:r>
+      <w:r>
+        <w:rPr>
+          <w:rFonts w:ascii="Times New Roman" w:cs="Times New Roman" w:eastAsia="Times New Roman" w:hAnsi="Times New Roman"/>
+          <w:bCs w:val="false"/>
+          <w:i/>
+          <w:iCs w:val="false"/>
+          <w:sz w:val="24"/>
+          <w:szCs w:val="24"/>
+        </w:rPr>
+        <w:t>G</w:t>
+      </w:r>
+      <w:r>
+        <w:rPr>
+          <w:rFonts w:ascii="Times New Roman" w:cs="Times New Roman" w:eastAsia="Times New Roman" w:hAnsi="Times New Roman"/>
+          <w:bCs w:val="false"/>
+          <w:i/>
+          <w:iCs w:val="false"/>
+          <w:sz w:val="24"/>
+          <w:szCs w:val="24"/>
+          <w:vertAlign w:val="subscript"/>
+        </w:rPr>
+        <w:t>0</w:t>
+      </w:r>
+      <w:r>
+        <w:rPr>
+          <w:rFonts w:ascii="Times New Roman" w:cs="Times New Roman" w:eastAsia="Times New Roman" w:hAnsi="Times New Roman"/>
+          <w:bCs w:val="false"/>
+          <w:iCs w:val="false"/>
+          <w:sz w:val="24"/>
+          <w:szCs w:val="24"/>
+        </w:rPr>
+        <w:t xml:space="preserve"> − βθ²φ/ψ, with </w:t>
+      </w:r>
+      <w:r>
+        <w:rPr>
+          <w:rFonts w:ascii="Times New Roman" w:cs="Times New Roman" w:eastAsia="Times New Roman" w:hAnsi="Times New Roman"/>
+          <w:bCs w:val="false"/>
+          <w:i/>
+          <w:iCs w:val="false"/>
+          <w:sz w:val="24"/>
+          <w:szCs w:val="24"/>
+        </w:rPr>
+        <w:t>G</w:t>
+      </w:r>
+      <w:r>
+        <w:rPr>
+          <w:rFonts w:ascii="Times New Roman" w:cs="Times New Roman" w:eastAsia="Times New Roman" w:hAnsi="Times New Roman"/>
+          <w:bCs w:val="false"/>
+          <w:i/>
+          <w:iCs w:val="false"/>
+          <w:sz w:val="24"/>
+          <w:szCs w:val="24"/>
+          <w:vertAlign w:val="subscript"/>
+        </w:rPr>
+        <w:t>0</w:t>
+      </w:r>
+      <w:r>
+        <w:rPr>
+          <w:rFonts w:ascii="Times New Roman" w:cs="Times New Roman" w:eastAsia="Times New Roman" w:hAnsi="Times New Roman"/>
+          <w:bCs w:val="false"/>
+          <w:iCs w:val="false"/>
+          <w:sz w:val="24"/>
+          <w:szCs w:val="24"/>
+        </w:rPr>
+        <w:t xml:space="preserve"> = (1 − φ)Δ − φσ</w:t>
+      </w:r>
+      <w:r>
+        <w:rPr>
+          <w:rFonts w:ascii="Times New Roman" w:cs="Times New Roman" w:eastAsia="Times New Roman" w:hAnsi="Times New Roman"/>
+          <w:bCs w:val="false"/>
+          <w:iCs w:val="false"/>
+          <w:sz w:val="24"/>
+          <w:szCs w:val="24"/>
+          <w:vertAlign w:val="subscript"/>
+        </w:rPr>
+        <w:t>J</w:t>
+      </w:r>
+      <w:r>
+        <w:rPr>
+          <w:rFonts w:ascii="Times New Roman" w:cs="Times New Roman" w:eastAsia="Times New Roman" w:hAnsi="Times New Roman"/>
+          <w:bCs w:val="false"/>
+          <w:i/>
+          <w:iCs w:val="false"/>
+          <w:sz w:val="24"/>
+          <w:szCs w:val="24"/>
+        </w:rPr>
+        <w:t>m</w:t>
+      </w:r>
+      <w:r>
+        <w:rPr>
+          <w:rFonts w:ascii="Times New Roman" w:cs="Times New Roman" w:eastAsia="Times New Roman" w:hAnsi="Times New Roman"/>
+          <w:bCs w:val="false"/>
+          <w:i/>
+          <w:iCs w:val="false"/>
+          <w:sz w:val="24"/>
+          <w:szCs w:val="24"/>
+          <w:vertAlign w:val="subscript"/>
+        </w:rPr>
+        <w:t>N</w:t>
+      </w:r>
+      <w:r>
+        <w:rPr>
+          <w:rFonts w:ascii="Times New Roman" w:cs="Times New Roman" w:eastAsia="Times New Roman" w:hAnsi="Times New Roman"/>
+          <w:bCs w:val="false"/>
+          <w:iCs w:val="false"/>
+          <w:sz w:val="24"/>
+          <w:szCs w:val="24"/>
+        </w:rPr>
+        <w:t xml:space="preserve">. Honest effort is a best response by construction, and exploitation is not worth starting if and only if </w:t>
+      </w:r>
+      <w:r>
+        <w:rPr>
+          <w:rFonts w:ascii="Times New Roman" w:cs="Times New Roman" w:eastAsia="Times New Roman" w:hAnsi="Times New Roman"/>
+          <w:bCs w:val="false"/>
+          <w:i/>
+          <w:iCs w:val="false"/>
+          <w:sz w:val="24"/>
+          <w:szCs w:val="24"/>
+        </w:rPr>
+        <w:t>G</w:t>
+      </w:r>
+      <w:r>
+        <w:rPr>
+          <w:rFonts w:ascii="Times New Roman" w:cs="Times New Roman" w:eastAsia="Times New Roman" w:hAnsi="Times New Roman"/>
+          <w:bCs w:val="false"/>
+          <w:iCs w:val="false"/>
+          <w:sz w:val="24"/>
+          <w:szCs w:val="24"/>
+        </w:rPr>
+        <w:t xml:space="preserve"> ≤ 0. The profile is therefore an equilibrium if and only if</w:t>
+      </w:r>
+    </w:p>
+    <w:p>
+      <w:pPr>
+        <w:tabs>
+          <w:tab w:val="right" w:pos="9360"/>
+        </w:tabs>
+        <w:spacing w:after="160" w:before="160" w:line="480" w:lineRule="auto"/>
+        <w:jc w:val="center"/>
+      </w:pPr>
+      <w:r>
+        <w:rPr>
+          <w:rFonts w:ascii="Times New Roman" w:cs="Times New Roman" w:eastAsia="Times New Roman" w:hAnsi="Times New Roman"/>
+          <w:bCs w:val="false"/>
+          <w:iCs/>
+          <w:sz w:val="24"/>
+          <w:szCs w:val="24"/>
+        </w:rPr>
+        <w:t>β  ≥  β</w:t>
+      </w:r>
+      <w:r>
+        <w:rPr>
+          <w:rFonts w:ascii="Times New Roman" w:cs="Times New Roman" w:eastAsia="Times New Roman" w:hAnsi="Times New Roman"/>
+          <w:bCs w:val="false"/>
+          <w:iCs/>
+          <w:sz w:val="24"/>
+          <w:szCs w:val="24"/>
+          <w:vertAlign w:val="subscript"/>
+        </w:rPr>
+        <w:t>d</w:t>
+      </w:r>
+      <w:r>
+        <w:rPr>
+          <w:rFonts w:ascii="Times New Roman" w:cs="Times New Roman" w:eastAsia="Times New Roman" w:hAnsi="Times New Roman"/>
+          <w:bCs w:val="false"/>
+          <w:iCs/>
+          <w:sz w:val="24"/>
+          <w:szCs w:val="24"/>
+        </w:rPr>
+        <w:t xml:space="preserve">  =  ψ</w:t>
+      </w:r>
+      <w:r>
+        <w:rPr>
+          <w:rFonts w:ascii="Times New Roman" w:cs="Times New Roman" w:eastAsia="Times New Roman" w:hAnsi="Times New Roman"/>
+          <w:bCs w:val="false"/>
+          <w:i/>
+          <w:iCs/>
+          <w:sz w:val="24"/>
+          <w:szCs w:val="24"/>
+        </w:rPr>
+        <w:t>G</w:t>
+      </w:r>
+      <w:r>
+        <w:rPr>
+          <w:rFonts w:ascii="Times New Roman" w:cs="Times New Roman" w:eastAsia="Times New Roman" w:hAnsi="Times New Roman"/>
+          <w:bCs w:val="false"/>
+          <w:i/>
+          <w:iCs/>
+          <w:sz w:val="24"/>
+          <w:szCs w:val="24"/>
+          <w:vertAlign w:val="subscript"/>
+        </w:rPr>
+        <w:t>0</w:t>
+      </w:r>
+      <w:r>
+        <w:rPr>
+          <w:rFonts w:ascii="Times New Roman" w:cs="Times New Roman" w:eastAsia="Times New Roman" w:hAnsi="Times New Roman"/>
+          <w:bCs w:val="false"/>
+          <w:iCs/>
+          <w:sz w:val="24"/>
+          <w:szCs w:val="24"/>
+        </w:rPr>
+        <w:t xml:space="preserve"> / (θ²φ)</w:t>
+        <w:tab/>
+        <w:t>(F3)</w:t>
+      </w:r>
+    </w:p>
+    <w:p>
+      <w:pPr>
+        <w:spacing w:after="0" w:before="0" w:line="480" w:lineRule="auto"/>
+        <w:ind w:firstLine="720"/>
+        <w:jc w:val="left"/>
+      </w:pPr>
+      <w:r>
+        <w:rPr>
+          <w:rFonts w:ascii="Times New Roman" w:cs="Times New Roman" w:eastAsia="Times New Roman" w:hAnsi="Times New Roman"/>
+          <w:bCs w:val="false"/>
+          <w:iCs w:val="false"/>
+          <w:sz w:val="24"/>
+          <w:szCs w:val="24"/>
+        </w:rPr>
+        <w:t xml:space="preserve">Pay that is intense enough therefore deters exploitation altogether, because it induces enough honest effort to make a blocked release costly. The threshold falls with </w:t>
+      </w:r>
+      <w:r>
+        <w:rPr>
+          <w:rFonts w:ascii="Times New Roman" w:cs="Times New Roman" w:eastAsia="Times New Roman" w:hAnsi="Times New Roman"/>
+          <w:bCs w:val="false"/>
+          <w:i/>
+          <w:iCs w:val="false"/>
+          <w:sz w:val="24"/>
+          <w:szCs w:val="24"/>
+        </w:rPr>
+        <w:t>N</w:t>
+      </w:r>
+      <w:r>
+        <w:rPr>
+          <w:rFonts w:ascii="Times New Roman" w:cs="Times New Roman" w:eastAsia="Times New Roman" w:hAnsi="Times New Roman"/>
+          <w:bCs w:val="false"/>
+          <w:iCs w:val="false"/>
+          <w:sz w:val="24"/>
+          <w:szCs w:val="24"/>
+        </w:rPr>
+        <w:t>, φ, and θ and rises with ψ and Δ. Without inspection (φ = 0), no finite β deters.</w:t>
+      </w:r>
+    </w:p>
+    <w:p>
+      <w:pPr>
+        <w:spacing w:after="0" w:before="0" w:line="480" w:lineRule="auto"/>
+        <w:ind w:firstLine="720"/>
+        <w:jc w:val="left"/>
+      </w:pPr>
+      <w:r>
+        <w:rPr>
+          <w:rFonts w:ascii="Times New Roman" w:cs="Times New Roman" w:eastAsia="Times New Roman" w:hAnsi="Times New Roman"/>
+          <w:bCs w:val="false"/>
+          <w:i/>
+          <w:iCs w:val="false"/>
+          <w:sz w:val="24"/>
+          <w:szCs w:val="24"/>
+        </w:rPr>
+        <w:t>Step 3: gaming effort as a function of pay.</w:t>
+      </w:r>
+      <w:r>
+        <w:rPr>
+          <w:rFonts w:ascii="Times New Roman" w:cs="Times New Roman" w:eastAsia="Times New Roman" w:hAnsi="Times New Roman"/>
+          <w:bCs w:val="false"/>
+          <w:iCs w:val="false"/>
+          <w:sz w:val="24"/>
+          <w:szCs w:val="24"/>
+        </w:rPr>
+        <w:t xml:space="preserve"> When β &lt; β</w:t>
+      </w:r>
+      <w:r>
+        <w:rPr>
+          <w:rFonts w:ascii="Times New Roman" w:cs="Times New Roman" w:eastAsia="Times New Roman" w:hAnsi="Times New Roman"/>
+          <w:bCs w:val="false"/>
+          <w:iCs w:val="false"/>
+          <w:sz w:val="24"/>
+          <w:szCs w:val="24"/>
+          <w:vertAlign w:val="subscript"/>
+        </w:rPr>
+        <w:t>d</w:t>
+      </w:r>
+      <w:r>
+        <w:rPr>
+          <w:rFonts w:ascii="Times New Roman" w:cs="Times New Roman" w:eastAsia="Times New Roman" w:hAnsi="Times New Roman"/>
+          <w:bCs w:val="false"/>
+          <w:iCs w:val="false"/>
+          <w:sz w:val="24"/>
+          <w:szCs w:val="24"/>
+        </w:rPr>
+        <w:t xml:space="preserve">, exploit effort solves (E2) with </w:t>
+      </w:r>
+      <w:r>
+        <w:rPr>
+          <w:rFonts w:ascii="Times New Roman" w:cs="Times New Roman" w:eastAsia="Times New Roman" w:hAnsi="Times New Roman"/>
+          <w:bCs w:val="false"/>
+          <w:i/>
+          <w:iCs w:val="false"/>
+          <w:sz w:val="24"/>
+          <w:szCs w:val="24"/>
+        </w:rPr>
+        <w:t>G</w:t>
+      </w:r>
+      <w:r>
+        <w:rPr>
+          <w:rFonts w:ascii="Times New Roman" w:cs="Times New Roman" w:eastAsia="Times New Roman" w:hAnsi="Times New Roman"/>
+          <w:bCs w:val="false"/>
+          <w:iCs w:val="false"/>
+          <w:sz w:val="24"/>
+          <w:szCs w:val="24"/>
+        </w:rPr>
+        <w:t xml:space="preserve"> from (F2) evaluated at the equilibrium honest effort. We have not established that this solution is unique, although it was unique in every numerical case examined. Without inspection, exploit effort increases with β throughout, the familiar multitask result that stronger pay on a gameable proxy invites more gaming. With inspection it is hump-shaped. In the illustration of Appendix E with ψ = 1, θ = 0.7, </w:t>
+      </w:r>
+      <w:r>
+        <w:rPr>
+          <w:rFonts w:ascii="Times New Roman" w:cs="Times New Roman" w:eastAsia="Times New Roman" w:hAnsi="Times New Roman"/>
+          <w:bCs w:val="false"/>
+          <w:i/>
+          <w:iCs w:val="false"/>
+          <w:sz w:val="24"/>
+          <w:szCs w:val="24"/>
+        </w:rPr>
+        <w:t>N</w:t>
+      </w:r>
+      <w:r>
+        <w:rPr>
+          <w:rFonts w:ascii="Times New Roman" w:cs="Times New Roman" w:eastAsia="Times New Roman" w:hAnsi="Times New Roman"/>
+          <w:bCs w:val="false"/>
+          <w:iCs w:val="false"/>
+          <w:sz w:val="24"/>
+          <w:szCs w:val="24"/>
+        </w:rPr>
+        <w:t xml:space="preserve"> = 4, and φ = 0.4, exploit effort rises from 0.004 at β = 0.1 to a maximum of 0.011 near β = 0.5 and falls to zero at β</w:t>
+      </w:r>
+      <w:r>
+        <w:rPr>
+          <w:rFonts w:ascii="Times New Roman" w:cs="Times New Roman" w:eastAsia="Times New Roman" w:hAnsi="Times New Roman"/>
+          <w:bCs w:val="false"/>
+          <w:iCs w:val="false"/>
+          <w:sz w:val="24"/>
+          <w:szCs w:val="24"/>
+          <w:vertAlign w:val="subscript"/>
+        </w:rPr>
+        <w:t>d</w:t>
+      </w:r>
+      <w:r>
+        <w:rPr>
+          <w:rFonts w:ascii="Times New Roman" w:cs="Times New Roman" w:eastAsia="Times New Roman" w:hAnsi="Times New Roman"/>
+          <w:bCs w:val="false"/>
+          <w:iCs w:val="false"/>
+          <w:sz w:val="24"/>
+          <w:szCs w:val="24"/>
+        </w:rPr>
+        <w:t xml:space="preserve"> = 0.96, while honest effort rises steadily from 0.07 to 0.67. Without inspection, exploit effort in the same example rises from 0.02 at β = 0.1 to 0.16 at β = 1.1.</w:t>
+      </w:r>
+    </w:p>
+    <w:p>
+      <w:pPr>
+        <w:spacing w:after="0" w:before="0" w:line="480" w:lineRule="auto"/>
+        <w:ind w:firstLine="720"/>
+        <w:jc w:val="left"/>
+      </w:pPr>
+      <w:r>
+        <w:rPr>
+          <w:rFonts w:ascii="Times New Roman" w:cs="Times New Roman" w:eastAsia="Times New Roman" w:hAnsi="Times New Roman"/>
+          <w:bCs w:val="false"/>
+          <w:i/>
+          <w:iCs w:val="false"/>
+          <w:sz w:val="24"/>
+          <w:szCs w:val="24"/>
+        </w:rPr>
+        <w:t>Implication.</w:t>
+      </w:r>
+      <w:r>
+        <w:rPr>
+          <w:rFonts w:ascii="Times New Roman" w:cs="Times New Roman" w:eastAsia="Times New Roman" w:hAnsi="Times New Roman"/>
+          <w:bCs w:val="false"/>
+          <w:iCs w:val="false"/>
+          <w:sz w:val="24"/>
+          <w:szCs w:val="24"/>
+        </w:rPr>
+        <w:t xml:space="preserve"> Where releases that fail inspection are blocked, intense judge-linked pay and inspection are complements rather than substitutes. Inspection makes gaming costly, and intense pay raises what a blocked release forfeits. The result depends on the forfeiture assumption. If a blocked release were replaced by the next-best honest candidate, the forfeiture would be small and most of the deterrence from pay would disappear.</w:t>
+      </w:r>
+    </w:p>
+    <w:p>
+      <w:pPr>
+        <w:spacing w:after="0" w:before="0" w:line="480" w:lineRule="auto"/>
+        <w:ind w:firstLine="720"/>
+        <w:jc w:val="left"/>
+      </w:pPr>
+      <w:r>
+        <w:rPr>
+          <w:rFonts w:ascii="Times New Roman" w:cs="Times New Roman" w:eastAsia="Times New Roman" w:hAnsi="Times New Roman"/>
+          <w:bCs w:val="false"/>
+          <w:i/>
+          <w:iCs w:val="false"/>
+          <w:sz w:val="24"/>
+          <w:szCs w:val="24"/>
+        </w:rPr>
+        <w:t>Scope.</w:t>
+      </w:r>
+      <w:r>
+        <w:rPr>
+          <w:rFonts w:ascii="Times New Roman" w:cs="Times New Roman" w:eastAsia="Times New Roman" w:hAnsi="Times New Roman"/>
+          <w:bCs w:val="false"/>
+          <w:iCs w:val="false"/>
+          <w:sz w:val="24"/>
+          <w:szCs w:val="24"/>
+        </w:rPr>
+        <w:t xml:space="preserve"> The organization’s choice of β is not derived. It depends on how pay is normalized, since paying on the full judge score also pays for the component that search alone delivers, and its analysis would need a participation constraint that is not modeled here. The equilibrium conditions were checked against unilateral deviations on a grid, and the expected judge score of what ships was checked by simulation (1.539 by simulation and 1.541 by formula in the case examined).</w:t>
       </w:r>
     </w:p>
     <w:sectPr>

</xml_diff>

<commit_message>
Add optimal judge-linked pay with participation constraint (Appendix G)
Co-Authored-By: Claude Sonnet 5.5 <noreply@anthropic.com>
Claude-Session: https://claude.ai/code/session_019zpN7r7iyrxAGMFgJVxuCB
</commit_message>
<xml_diff>
--- a/ISR_Staging_Commitment.docx
+++ b/ISR_Staging_Commitment.docx
@@ -9252,7 +9252,7 @@
           <w:sz w:val="24"/>
           <w:szCs w:val="24"/>
         </w:rPr>
-        <w:t>The propositions also bear on the literature on organizational control. A control that is cheap and used as an objective is a Goodhart instrument. Real options theory supplies the decision rule that control theory alone does not: when the instrument is compromised, the organization should raise F rather than automate harder. The extension in Appendix E adds that inspection is more than a statistical check: by lowering the payoff to gaming, it also deters gaming.</w:t>
+        <w:t>The propositions also bear on the literature on organizational control. A control that is cheap and used as an objective is a Goodhart instrument. Real options theory supplies the decision rule that control theory alone does not: when the instrument is compromised, the organization should raise F rather than automate harder. The extension in Appendix E adds that inspection is more than a statistical check: by lowering the payoff to gaming, it also deters gaming. Appendices F and G add that, where gaming can be deterred, inspection also lets the organization use judge-linked pay at full strength, whereas a gameable judge without inspection calls for weak or no such pay.</w:t>
       </w:r>
     </w:p>
     <w:p>
@@ -20916,7 +20916,3058 @@
           <w:sz w:val="24"/>
           <w:szCs w:val="24"/>
         </w:rPr>
-        <w:t xml:space="preserve"> The organization’s choice of β is not derived. It depends on how pay is normalized, since paying on the full judge score also pays for the component that search alone delivers, and its analysis would need a participation constraint that is not modeled here. The equilibrium conditions were checked against unilateral deviations on a grid, and the expected judge score of what ships was checked by simulation (1.539 by simulation and 1.541 by formula in the case examined).</w:t>
+        <w:t xml:space="preserve"> The organization’s choice of β is derived in Appendix G. The equilibrium conditions were checked against unilateral deviations on a grid, and the expected judge score of what ships was checked by simulation (1.539 by simulation and 1.541 by formula in the case examined).</w:t>
+      </w:r>
+    </w:p>
+    <w:p>
+      <w:pPr>
+        <w:pStyle w:val="Heading1"/>
+        <w:spacing w:after="240" w:before="360" w:line="480" w:lineRule="auto"/>
+        <w:jc w:val="center"/>
+      </w:pPr>
+      <w:r>
+        <w:rPr>
+          <w:rFonts w:ascii="Times New Roman" w:cs="Times New Roman" w:eastAsia="Times New Roman" w:hAnsi="Times New Roman"/>
+          <w:bCs/>
+          <w:iCs w:val="false"/>
+          <w:sz w:val="24"/>
+          <w:szCs w:val="24"/>
+        </w:rPr>
+        <w:t>APPENDIX G: OPTIMAL JUDGE-LINKED PAY WITH A PARTICIPATION CONSTRAINT</w:t>
+      </w:r>
+    </w:p>
+    <w:p>
+      <w:pPr>
+        <w:spacing w:after="0" w:before="0" w:line="480" w:lineRule="auto"/>
+        <w:ind w:firstLine="720"/>
+        <w:jc w:val="left"/>
+      </w:pPr>
+      <w:r>
+        <w:rPr>
+          <w:rFonts w:ascii="Times New Roman" w:cs="Times New Roman" w:eastAsia="Times New Roman" w:hAnsi="Times New Roman"/>
+          <w:bCs w:val="false"/>
+          <w:iCs w:val="false"/>
+          <w:sz w:val="24"/>
+          <w:szCs w:val="24"/>
+        </w:rPr>
+        <w:t xml:space="preserve">This appendix derives the organization’s choice of β in the model of Appendix F. The organization offers pay </w:t>
+      </w:r>
+      <w:r>
+        <w:rPr>
+          <w:rFonts w:ascii="Times New Roman" w:cs="Times New Roman" w:eastAsia="Times New Roman" w:hAnsi="Times New Roman"/>
+          <w:bCs w:val="false"/>
+          <w:i/>
+          <w:iCs w:val="false"/>
+          <w:sz w:val="24"/>
+          <w:szCs w:val="24"/>
+        </w:rPr>
+        <w:t>w</w:t>
+      </w:r>
+      <w:r>
+        <w:rPr>
+          <w:rFonts w:ascii="Times New Roman" w:cs="Times New Roman" w:eastAsia="Times New Roman" w:hAnsi="Times New Roman"/>
+          <w:bCs w:val="false"/>
+          <w:iCs w:val="false"/>
+          <w:sz w:val="24"/>
+          <w:szCs w:val="24"/>
+        </w:rPr>
+        <w:t xml:space="preserve"> = α + β</w:t>
+      </w:r>
+      <w:r>
+        <w:rPr>
+          <w:rFonts w:ascii="Times New Roman" w:cs="Times New Roman" w:eastAsia="Times New Roman" w:hAnsi="Times New Roman"/>
+          <w:bCs w:val="false"/>
+          <w:i/>
+          <w:iCs w:val="false"/>
+          <w:sz w:val="24"/>
+          <w:szCs w:val="24"/>
+        </w:rPr>
+        <w:t>J</w:t>
+      </w:r>
+      <w:r>
+        <w:rPr>
+          <w:rFonts w:ascii="Times New Roman" w:cs="Times New Roman" w:eastAsia="Times New Roman" w:hAnsi="Times New Roman"/>
+          <w:bCs w:val="false"/>
+          <w:i/>
+          <w:iCs w:val="false"/>
+          <w:sz w:val="24"/>
+          <w:szCs w:val="24"/>
+          <w:vertAlign w:val="subscript"/>
+        </w:rPr>
+        <w:t>ship</w:t>
+      </w:r>
+      <w:r>
+        <w:rPr>
+          <w:rFonts w:ascii="Times New Roman" w:cs="Times New Roman" w:eastAsia="Times New Roman" w:hAnsi="Times New Roman"/>
+          <w:bCs w:val="false"/>
+          <w:iCs w:val="false"/>
+          <w:sz w:val="24"/>
+          <w:szCs w:val="24"/>
+        </w:rPr>
+        <w:t xml:space="preserve">, where </w:t>
+      </w:r>
+      <w:r>
+        <w:rPr>
+          <w:rFonts w:ascii="Times New Roman" w:cs="Times New Roman" w:eastAsia="Times New Roman" w:hAnsi="Times New Roman"/>
+          <w:bCs w:val="false"/>
+          <w:i/>
+          <w:iCs w:val="false"/>
+          <w:sz w:val="24"/>
+          <w:szCs w:val="24"/>
+        </w:rPr>
+        <w:t>J</w:t>
+      </w:r>
+      <w:r>
+        <w:rPr>
+          <w:rFonts w:ascii="Times New Roman" w:cs="Times New Roman" w:eastAsia="Times New Roman" w:hAnsi="Times New Roman"/>
+          <w:bCs w:val="false"/>
+          <w:i/>
+          <w:iCs w:val="false"/>
+          <w:sz w:val="24"/>
+          <w:szCs w:val="24"/>
+          <w:vertAlign w:val="subscript"/>
+        </w:rPr>
+        <w:t>ship</w:t>
+      </w:r>
+      <w:r>
+        <w:rPr>
+          <w:rFonts w:ascii="Times New Roman" w:cs="Times New Roman" w:eastAsia="Times New Roman" w:hAnsi="Times New Roman"/>
+          <w:bCs w:val="false"/>
+          <w:iCs w:val="false"/>
+          <w:sz w:val="24"/>
+          <w:szCs w:val="24"/>
+        </w:rPr>
+        <w:t xml:space="preserve"> is the judge score of what ships. The team is risk neutral, has an outside option of zero, and faces no limited liability. The organization sets the fixed component α so that the participation constraint binds, which makes the transfer to the team exactly offset its expected cost of effort. The organization’s payoff is then total surplus,</w:t>
+      </w:r>
+    </w:p>
+    <w:p>
+      <w:pPr>
+        <w:tabs>
+          <w:tab w:val="right" w:pos="9360"/>
+        </w:tabs>
+        <w:spacing w:after="160" w:before="160" w:line="480" w:lineRule="auto"/>
+        <w:jc w:val="center"/>
+      </w:pPr>
+      <w:r>
+        <w:rPr>
+          <w:rFonts w:ascii="Times New Roman" w:cs="Times New Roman" w:eastAsia="Times New Roman" w:hAnsi="Times New Roman"/>
+          <w:bCs w:val="false"/>
+          <w:i/>
+          <w:iCs/>
+          <w:sz w:val="24"/>
+          <w:szCs w:val="24"/>
+        </w:rPr>
+        <w:t>S</w:t>
+      </w:r>
+      <w:r>
+        <w:rPr>
+          <w:rFonts w:ascii="Times New Roman" w:cs="Times New Roman" w:eastAsia="Times New Roman" w:hAnsi="Times New Roman"/>
+          <w:bCs w:val="false"/>
+          <w:iCs/>
+          <w:sz w:val="24"/>
+          <w:szCs w:val="24"/>
+        </w:rPr>
+        <w:t xml:space="preserve">(β)  =  (1 − </w:t>
+      </w:r>
+      <w:r>
+        <w:rPr>
+          <w:rFonts w:ascii="Times New Roman" w:cs="Times New Roman" w:eastAsia="Times New Roman" w:hAnsi="Times New Roman"/>
+          <w:bCs w:val="false"/>
+          <w:i/>
+          <w:iCs/>
+          <w:sz w:val="24"/>
+          <w:szCs w:val="24"/>
+        </w:rPr>
+        <w:t>Q</w:t>
+      </w:r>
+      <w:r>
+        <w:rPr>
+          <w:rFonts w:ascii="Times New Roman" w:cs="Times New Roman" w:eastAsia="Times New Roman" w:hAnsi="Times New Roman"/>
+          <w:bCs w:val="false"/>
+          <w:iCs/>
+          <w:sz w:val="24"/>
+          <w:szCs w:val="24"/>
+        </w:rPr>
+        <w:t>)(</w:t>
+      </w:r>
+      <w:r>
+        <w:rPr>
+          <w:rFonts w:ascii="Times New Roman" w:cs="Times New Roman" w:eastAsia="Times New Roman" w:hAnsi="Times New Roman"/>
+          <w:bCs w:val="false"/>
+          <w:i/>
+          <w:iCs/>
+          <w:sz w:val="24"/>
+          <w:szCs w:val="24"/>
+        </w:rPr>
+        <w:t>ga</w:t>
+      </w:r>
+      <w:r>
+        <w:rPr>
+          <w:rFonts w:ascii="Times New Roman" w:cs="Times New Roman" w:eastAsia="Times New Roman" w:hAnsi="Times New Roman"/>
+          <w:bCs w:val="false"/>
+          <w:iCs/>
+          <w:sz w:val="24"/>
+          <w:szCs w:val="24"/>
+        </w:rPr>
+        <w:t xml:space="preserve"> + ρ</w:t>
+      </w:r>
+      <w:r>
+        <w:rPr>
+          <w:rFonts w:ascii="Times New Roman" w:cs="Times New Roman" w:eastAsia="Times New Roman" w:hAnsi="Times New Roman"/>
+          <w:bCs w:val="false"/>
+          <w:i/>
+          <w:iCs/>
+          <w:sz w:val="24"/>
+          <w:szCs w:val="24"/>
+        </w:rPr>
+        <w:t>s</w:t>
+      </w:r>
+      <w:r>
+        <w:rPr>
+          <w:rFonts w:ascii="Times New Roman" w:cs="Times New Roman" w:eastAsia="Times New Roman" w:hAnsi="Times New Roman"/>
+          <w:bCs w:val="false"/>
+          <w:iCs/>
+          <w:sz w:val="24"/>
+          <w:szCs w:val="24"/>
+        </w:rPr>
+        <w:t xml:space="preserve"> </w:t>
+      </w:r>
+      <w:r>
+        <w:rPr>
+          <w:rFonts w:ascii="Times New Roman" w:cs="Times New Roman" w:eastAsia="Times New Roman" w:hAnsi="Times New Roman"/>
+          <w:bCs w:val="false"/>
+          <w:i/>
+          <w:iCs/>
+          <w:sz w:val="24"/>
+          <w:szCs w:val="24"/>
+        </w:rPr>
+        <w:t>m</w:t>
+      </w:r>
+      <w:r>
+        <w:rPr>
+          <w:rFonts w:ascii="Times New Roman" w:cs="Times New Roman" w:eastAsia="Times New Roman" w:hAnsi="Times New Roman"/>
+          <w:bCs w:val="false"/>
+          <w:i/>
+          <w:iCs/>
+          <w:sz w:val="24"/>
+          <w:szCs w:val="24"/>
+          <w:vertAlign w:val="subscript"/>
+        </w:rPr>
+        <w:t>N</w:t>
+      </w:r>
+      <w:r>
+        <w:rPr>
+          <w:rFonts w:ascii="Times New Roman" w:cs="Times New Roman" w:eastAsia="Times New Roman" w:hAnsi="Times New Roman"/>
+          <w:bCs w:val="false"/>
+          <w:iCs/>
+          <w:sz w:val="24"/>
+          <w:szCs w:val="24"/>
+        </w:rPr>
+        <w:t xml:space="preserve">)  −  </w:t>
+      </w:r>
+      <w:r>
+        <w:rPr>
+          <w:rFonts w:ascii="Times New Roman" w:cs="Times New Roman" w:eastAsia="Times New Roman" w:hAnsi="Times New Roman"/>
+          <w:bCs w:val="false"/>
+          <w:i/>
+          <w:iCs/>
+          <w:sz w:val="24"/>
+          <w:szCs w:val="24"/>
+        </w:rPr>
+        <w:t>Q</w:t>
+      </w:r>
+      <w:r>
+        <w:rPr>
+          <w:rFonts w:ascii="Times New Roman" w:cs="Times New Roman" w:eastAsia="Times New Roman" w:hAnsi="Times New Roman"/>
+          <w:bCs w:val="false"/>
+          <w:iCs/>
+          <w:sz w:val="24"/>
+          <w:szCs w:val="24"/>
+        </w:rPr>
+        <w:t>(1 − φ)</w:t>
+      </w:r>
+      <w:r>
+        <w:rPr>
+          <w:rFonts w:ascii="Times New Roman" w:cs="Times New Roman" w:eastAsia="Times New Roman" w:hAnsi="Times New Roman"/>
+          <w:bCs w:val="false"/>
+          <w:i/>
+          <w:iCs/>
+          <w:sz w:val="24"/>
+          <w:szCs w:val="24"/>
+        </w:rPr>
+        <w:t>d</w:t>
+      </w:r>
+      <w:r>
+        <w:rPr>
+          <w:rFonts w:ascii="Times New Roman" w:cs="Times New Roman" w:eastAsia="Times New Roman" w:hAnsi="Times New Roman"/>
+          <w:bCs w:val="false"/>
+          <w:iCs/>
+          <w:sz w:val="24"/>
+          <w:szCs w:val="24"/>
+        </w:rPr>
+        <w:t xml:space="preserve">  −  (ψ/2)</w:t>
+      </w:r>
+      <w:r>
+        <w:rPr>
+          <w:rFonts w:ascii="Times New Roman" w:cs="Times New Roman" w:eastAsia="Times New Roman" w:hAnsi="Times New Roman"/>
+          <w:bCs w:val="false"/>
+          <w:i/>
+          <w:iCs/>
+          <w:sz w:val="24"/>
+          <w:szCs w:val="24"/>
+        </w:rPr>
+        <w:t>a</w:t>
+      </w:r>
+      <w:r>
+        <w:rPr>
+          <w:rFonts w:ascii="Times New Roman" w:cs="Times New Roman" w:eastAsia="Times New Roman" w:hAnsi="Times New Roman"/>
+          <w:bCs w:val="false"/>
+          <w:iCs/>
+          <w:sz w:val="24"/>
+          <w:szCs w:val="24"/>
+        </w:rPr>
+        <w:t xml:space="preserve">²  −  </w:t>
+      </w:r>
+      <w:r>
+        <w:rPr>
+          <w:rFonts w:ascii="Times New Roman" w:cs="Times New Roman" w:eastAsia="Times New Roman" w:hAnsi="Times New Roman"/>
+          <w:bCs w:val="false"/>
+          <w:i/>
+          <w:iCs/>
+          <w:sz w:val="24"/>
+          <w:szCs w:val="24"/>
+        </w:rPr>
+        <w:t>N</w:t>
+      </w:r>
+      <w:r>
+        <w:rPr>
+          <w:rFonts w:ascii="Times New Roman" w:cs="Times New Roman" w:eastAsia="Times New Roman" w:hAnsi="Times New Roman"/>
+          <w:bCs w:val="false"/>
+          <w:iCs/>
+          <w:sz w:val="24"/>
+          <w:szCs w:val="24"/>
+        </w:rPr>
+        <w:t>(κ/2)</w:t>
+      </w:r>
+      <w:r>
+        <w:rPr>
+          <w:rFonts w:ascii="Times New Roman" w:cs="Times New Roman" w:eastAsia="Times New Roman" w:hAnsi="Times New Roman"/>
+          <w:bCs w:val="false"/>
+          <w:i/>
+          <w:iCs/>
+          <w:sz w:val="24"/>
+          <w:szCs w:val="24"/>
+        </w:rPr>
+        <w:t>e</w:t>
+      </w:r>
+      <w:r>
+        <w:rPr>
+          <w:rFonts w:ascii="Times New Roman" w:cs="Times New Roman" w:eastAsia="Times New Roman" w:hAnsi="Times New Roman"/>
+          <w:bCs w:val="false"/>
+          <w:iCs/>
+          <w:sz w:val="24"/>
+          <w:szCs w:val="24"/>
+        </w:rPr>
+        <w:t xml:space="preserve">²  −  </w:t>
+      </w:r>
+      <w:r>
+        <w:rPr>
+          <w:rFonts w:ascii="Times New Roman" w:cs="Times New Roman" w:eastAsia="Times New Roman" w:hAnsi="Times New Roman"/>
+          <w:bCs w:val="false"/>
+          <w:i/>
+          <w:iCs/>
+          <w:sz w:val="24"/>
+          <w:szCs w:val="24"/>
+        </w:rPr>
+        <w:t>c</w:t>
+      </w:r>
+      <w:r>
+        <w:rPr>
+          <w:rFonts w:ascii="Times New Roman" w:cs="Times New Roman" w:eastAsia="Times New Roman" w:hAnsi="Times New Roman"/>
+          <w:bCs w:val="false"/>
+          <w:i/>
+          <w:iCs/>
+          <w:sz w:val="24"/>
+          <w:szCs w:val="24"/>
+          <w:vertAlign w:val="subscript"/>
+        </w:rPr>
+        <w:t>s</w:t>
+      </w:r>
+      <w:r>
+        <w:rPr>
+          <w:rFonts w:ascii="Times New Roman" w:cs="Times New Roman" w:eastAsia="Times New Roman" w:hAnsi="Times New Roman"/>
+          <w:bCs w:val="false"/>
+          <w:i/>
+          <w:iCs/>
+          <w:sz w:val="24"/>
+          <w:szCs w:val="24"/>
+        </w:rPr>
+        <w:t>N</w:t>
+      </w:r>
+      <w:r>
+        <w:rPr>
+          <w:rFonts w:ascii="Times New Roman" w:cs="Times New Roman" w:eastAsia="Times New Roman" w:hAnsi="Times New Roman"/>
+          <w:bCs w:val="false"/>
+          <w:iCs/>
+          <w:sz w:val="24"/>
+          <w:szCs w:val="24"/>
+        </w:rPr>
+        <w:t xml:space="preserve">  −  </w:t>
+      </w:r>
+      <w:r>
+        <w:rPr>
+          <w:rFonts w:ascii="Times New Roman" w:cs="Times New Roman" w:eastAsia="Times New Roman" w:hAnsi="Times New Roman"/>
+          <w:bCs w:val="false"/>
+          <w:i/>
+          <w:iCs/>
+          <w:sz w:val="24"/>
+          <w:szCs w:val="24"/>
+        </w:rPr>
+        <w:t>c</w:t>
+      </w:r>
+      <w:r>
+        <w:rPr>
+          <w:rFonts w:ascii="Times New Roman" w:cs="Times New Roman" w:eastAsia="Times New Roman" w:hAnsi="Times New Roman"/>
+          <w:bCs w:val="false"/>
+          <w:i/>
+          <w:iCs/>
+          <w:sz w:val="24"/>
+          <w:szCs w:val="24"/>
+          <w:vertAlign w:val="subscript"/>
+        </w:rPr>
+        <w:t>G</w:t>
+      </w:r>
+      <w:r>
+        <w:rPr>
+          <w:rFonts w:ascii="Times New Roman" w:cs="Times New Roman" w:eastAsia="Times New Roman" w:hAnsi="Times New Roman"/>
+          <w:bCs w:val="false"/>
+          <w:iCs/>
+          <w:sz w:val="24"/>
+          <w:szCs w:val="24"/>
+        </w:rPr>
+        <w:t>·1[φ &gt; 0]</w:t>
+        <w:tab/>
+        <w:t>(G1)</w:t>
+      </w:r>
+    </w:p>
+    <w:p>
+      <w:pPr>
+        <w:spacing w:after="0" w:before="0" w:line="480" w:lineRule="auto"/>
+        <w:ind w:firstLine="720"/>
+        <w:jc w:val="left"/>
+      </w:pPr>
+      <w:r>
+        <w:rPr>
+          <w:rFonts w:ascii="Times New Roman" w:cs="Times New Roman" w:eastAsia="Times New Roman" w:hAnsi="Times New Roman"/>
+          <w:bCs w:val="false"/>
+          <w:iCs w:val="false"/>
+          <w:sz w:val="24"/>
+          <w:szCs w:val="24"/>
+        </w:rPr>
+        <w:t>evaluated at the team’s equilibrium (</w:t>
+      </w:r>
+      <w:r>
+        <w:rPr>
+          <w:rFonts w:ascii="Times New Roman" w:cs="Times New Roman" w:eastAsia="Times New Roman" w:hAnsi="Times New Roman"/>
+          <w:bCs w:val="false"/>
+          <w:i/>
+          <w:iCs w:val="false"/>
+          <w:sz w:val="24"/>
+          <w:szCs w:val="24"/>
+        </w:rPr>
+        <w:t>a</w:t>
+      </w:r>
+      <w:r>
+        <w:rPr>
+          <w:rFonts w:ascii="Times New Roman" w:cs="Times New Roman" w:eastAsia="Times New Roman" w:hAnsi="Times New Roman"/>
+          <w:bCs w:val="false"/>
+          <w:iCs w:val="false"/>
+          <w:sz w:val="24"/>
+          <w:szCs w:val="24"/>
+        </w:rPr>
+        <w:t xml:space="preserve">, </w:t>
+      </w:r>
+      <w:r>
+        <w:rPr>
+          <w:rFonts w:ascii="Times New Roman" w:cs="Times New Roman" w:eastAsia="Times New Roman" w:hAnsi="Times New Roman"/>
+          <w:bCs w:val="false"/>
+          <w:i/>
+          <w:iCs w:val="false"/>
+          <w:sz w:val="24"/>
+          <w:szCs w:val="24"/>
+        </w:rPr>
+        <w:t>e</w:t>
+      </w:r>
+      <w:r>
+        <w:rPr>
+          <w:rFonts w:ascii="Times New Roman" w:cs="Times New Roman" w:eastAsia="Times New Roman" w:hAnsi="Times New Roman"/>
+          <w:bCs w:val="false"/>
+          <w:iCs w:val="false"/>
+          <w:sz w:val="24"/>
+          <w:szCs w:val="24"/>
+        </w:rPr>
+        <w:t xml:space="preserve">) under β, where </w:t>
+      </w:r>
+      <w:r>
+        <w:rPr>
+          <w:rFonts w:ascii="Times New Roman" w:cs="Times New Roman" w:eastAsia="Times New Roman" w:hAnsi="Times New Roman"/>
+          <w:bCs w:val="false"/>
+          <w:i/>
+          <w:iCs w:val="false"/>
+          <w:sz w:val="24"/>
+          <w:szCs w:val="24"/>
+        </w:rPr>
+        <w:t>g</w:t>
+      </w:r>
+      <w:r>
+        <w:rPr>
+          <w:rFonts w:ascii="Times New Roman" w:cs="Times New Roman" w:eastAsia="Times New Roman" w:hAnsi="Times New Roman"/>
+          <w:bCs w:val="false"/>
+          <w:iCs w:val="false"/>
+          <w:sz w:val="24"/>
+          <w:szCs w:val="24"/>
+        </w:rPr>
+        <w:t xml:space="preserve"> is the gold value of one unit of honest effort.</w:t>
+      </w:r>
+    </w:p>
+    <w:p>
+      <w:pPr>
+        <w:spacing w:after="0" w:before="0" w:line="480" w:lineRule="auto"/>
+        <w:ind w:firstLine="720"/>
+        <w:jc w:val="left"/>
+      </w:pPr>
+      <w:r>
+        <w:rPr>
+          <w:rFonts w:ascii="Times New Roman" w:cs="Times New Roman" w:eastAsia="Times New Roman" w:hAnsi="Times New Roman"/>
+          <w:bCs w:val="false"/>
+          <w:i/>
+          <w:iCs w:val="false"/>
+          <w:sz w:val="24"/>
+          <w:szCs w:val="24"/>
+        </w:rPr>
+        <w:t>Step 1: the first best.</w:t>
+      </w:r>
+      <w:r>
+        <w:rPr>
+          <w:rFonts w:ascii="Times New Roman" w:cs="Times New Roman" w:eastAsia="Times New Roman" w:hAnsi="Times New Roman"/>
+          <w:bCs w:val="false"/>
+          <w:iCs w:val="false"/>
+          <w:sz w:val="24"/>
+          <w:szCs w:val="24"/>
+        </w:rPr>
+        <w:t xml:space="preserve"> For any </w:t>
+      </w:r>
+      <w:r>
+        <w:rPr>
+          <w:rFonts w:ascii="Times New Roman" w:cs="Times New Roman" w:eastAsia="Times New Roman" w:hAnsi="Times New Roman"/>
+          <w:bCs w:val="false"/>
+          <w:i/>
+          <w:iCs w:val="false"/>
+          <w:sz w:val="24"/>
+          <w:szCs w:val="24"/>
+        </w:rPr>
+        <w:t>a</w:t>
+      </w:r>
+      <w:r>
+        <w:rPr>
+          <w:rFonts w:ascii="Times New Roman" w:cs="Times New Roman" w:eastAsia="Times New Roman" w:hAnsi="Times New Roman"/>
+          <w:bCs w:val="false"/>
+          <w:iCs w:val="false"/>
+          <w:sz w:val="24"/>
+          <w:szCs w:val="24"/>
+        </w:rPr>
+        <w:t xml:space="preserve"> and </w:t>
+      </w:r>
+      <w:r>
+        <w:rPr>
+          <w:rFonts w:ascii="Times New Roman" w:cs="Times New Roman" w:eastAsia="Times New Roman" w:hAnsi="Times New Roman"/>
+          <w:bCs w:val="false"/>
+          <w:i/>
+          <w:iCs w:val="false"/>
+          <w:sz w:val="24"/>
+          <w:szCs w:val="24"/>
+        </w:rPr>
+        <w:t>e</w:t>
+      </w:r>
+      <w:r>
+        <w:rPr>
+          <w:rFonts w:ascii="Times New Roman" w:cs="Times New Roman" w:eastAsia="Times New Roman" w:hAnsi="Times New Roman"/>
+          <w:bCs w:val="false"/>
+          <w:iCs w:val="false"/>
+          <w:sz w:val="24"/>
+          <w:szCs w:val="24"/>
+        </w:rPr>
+        <w:t xml:space="preserve">, (1 − </w:t>
+      </w:r>
+      <w:r>
+        <w:rPr>
+          <w:rFonts w:ascii="Times New Roman" w:cs="Times New Roman" w:eastAsia="Times New Roman" w:hAnsi="Times New Roman"/>
+          <w:bCs w:val="false"/>
+          <w:i/>
+          <w:iCs w:val="false"/>
+          <w:sz w:val="24"/>
+          <w:szCs w:val="24"/>
+        </w:rPr>
+        <w:t>Q</w:t>
+      </w:r>
+      <w:r>
+        <w:rPr>
+          <w:rFonts w:ascii="Times New Roman" w:cs="Times New Roman" w:eastAsia="Times New Roman" w:hAnsi="Times New Roman"/>
+          <w:bCs w:val="false"/>
+          <w:iCs w:val="false"/>
+          <w:sz w:val="24"/>
+          <w:szCs w:val="24"/>
+        </w:rPr>
+        <w:t>)</w:t>
+      </w:r>
+      <w:r>
+        <w:rPr>
+          <w:rFonts w:ascii="Times New Roman" w:cs="Times New Roman" w:eastAsia="Times New Roman" w:hAnsi="Times New Roman"/>
+          <w:bCs w:val="false"/>
+          <w:i/>
+          <w:iCs w:val="false"/>
+          <w:sz w:val="24"/>
+          <w:szCs w:val="24"/>
+        </w:rPr>
+        <w:t>ga</w:t>
+      </w:r>
+      <w:r>
+        <w:rPr>
+          <w:rFonts w:ascii="Times New Roman" w:cs="Times New Roman" w:eastAsia="Times New Roman" w:hAnsi="Times New Roman"/>
+          <w:bCs w:val="false"/>
+          <w:iCs w:val="false"/>
+          <w:sz w:val="24"/>
+          <w:szCs w:val="24"/>
+        </w:rPr>
+        <w:t xml:space="preserve"> − (ψ/2)</w:t>
+      </w:r>
+      <w:r>
+        <w:rPr>
+          <w:rFonts w:ascii="Times New Roman" w:cs="Times New Roman" w:eastAsia="Times New Roman" w:hAnsi="Times New Roman"/>
+          <w:bCs w:val="false"/>
+          <w:i/>
+          <w:iCs w:val="false"/>
+          <w:sz w:val="24"/>
+          <w:szCs w:val="24"/>
+        </w:rPr>
+        <w:t>a</w:t>
+      </w:r>
+      <w:r>
+        <w:rPr>
+          <w:rFonts w:ascii="Times New Roman" w:cs="Times New Roman" w:eastAsia="Times New Roman" w:hAnsi="Times New Roman"/>
+          <w:bCs w:val="false"/>
+          <w:iCs w:val="false"/>
+          <w:sz w:val="24"/>
+          <w:szCs w:val="24"/>
+        </w:rPr>
+        <w:t xml:space="preserve">² ≤ </w:t>
+      </w:r>
+      <w:r>
+        <w:rPr>
+          <w:rFonts w:ascii="Times New Roman" w:cs="Times New Roman" w:eastAsia="Times New Roman" w:hAnsi="Times New Roman"/>
+          <w:bCs w:val="false"/>
+          <w:i/>
+          <w:iCs w:val="false"/>
+          <w:sz w:val="24"/>
+          <w:szCs w:val="24"/>
+        </w:rPr>
+        <w:t>g</w:t>
+      </w:r>
+      <w:r>
+        <w:rPr>
+          <w:rFonts w:ascii="Times New Roman" w:cs="Times New Roman" w:eastAsia="Times New Roman" w:hAnsi="Times New Roman"/>
+          <w:bCs w:val="false"/>
+          <w:iCs w:val="false"/>
+          <w:sz w:val="24"/>
+          <w:szCs w:val="24"/>
+        </w:rPr>
+        <w:t xml:space="preserve">²/(2ψ), with equality only if </w:t>
+      </w:r>
+      <w:r>
+        <w:rPr>
+          <w:rFonts w:ascii="Times New Roman" w:cs="Times New Roman" w:eastAsia="Times New Roman" w:hAnsi="Times New Roman"/>
+          <w:bCs w:val="false"/>
+          <w:i/>
+          <w:iCs w:val="false"/>
+          <w:sz w:val="24"/>
+          <w:szCs w:val="24"/>
+        </w:rPr>
+        <w:t>Q</w:t>
+      </w:r>
+      <w:r>
+        <w:rPr>
+          <w:rFonts w:ascii="Times New Roman" w:cs="Times New Roman" w:eastAsia="Times New Roman" w:hAnsi="Times New Roman"/>
+          <w:bCs w:val="false"/>
+          <w:iCs w:val="false"/>
+          <w:sz w:val="24"/>
+          <w:szCs w:val="24"/>
+        </w:rPr>
+        <w:t xml:space="preserve"> = 0 and </w:t>
+      </w:r>
+      <w:r>
+        <w:rPr>
+          <w:rFonts w:ascii="Times New Roman" w:cs="Times New Roman" w:eastAsia="Times New Roman" w:hAnsi="Times New Roman"/>
+          <w:bCs w:val="false"/>
+          <w:i/>
+          <w:iCs w:val="false"/>
+          <w:sz w:val="24"/>
+          <w:szCs w:val="24"/>
+        </w:rPr>
+        <w:t>a</w:t>
+      </w:r>
+      <w:r>
+        <w:rPr>
+          <w:rFonts w:ascii="Times New Roman" w:cs="Times New Roman" w:eastAsia="Times New Roman" w:hAnsi="Times New Roman"/>
+          <w:bCs w:val="false"/>
+          <w:iCs w:val="false"/>
+          <w:sz w:val="24"/>
+          <w:szCs w:val="24"/>
+        </w:rPr>
+        <w:t xml:space="preserve"> = </w:t>
+      </w:r>
+      <w:r>
+        <w:rPr>
+          <w:rFonts w:ascii="Times New Roman" w:cs="Times New Roman" w:eastAsia="Times New Roman" w:hAnsi="Times New Roman"/>
+          <w:bCs w:val="false"/>
+          <w:i/>
+          <w:iCs w:val="false"/>
+          <w:sz w:val="24"/>
+          <w:szCs w:val="24"/>
+        </w:rPr>
+        <w:t>g</w:t>
+      </w:r>
+      <w:r>
+        <w:rPr>
+          <w:rFonts w:ascii="Times New Roman" w:cs="Times New Roman" w:eastAsia="Times New Roman" w:hAnsi="Times New Roman"/>
+          <w:bCs w:val="false"/>
+          <w:iCs w:val="false"/>
+          <w:sz w:val="24"/>
+          <w:szCs w:val="24"/>
+        </w:rPr>
+        <w:t xml:space="preserve">/ψ, and (1 − </w:t>
+      </w:r>
+      <w:r>
+        <w:rPr>
+          <w:rFonts w:ascii="Times New Roman" w:cs="Times New Roman" w:eastAsia="Times New Roman" w:hAnsi="Times New Roman"/>
+          <w:bCs w:val="false"/>
+          <w:i/>
+          <w:iCs w:val="false"/>
+          <w:sz w:val="24"/>
+          <w:szCs w:val="24"/>
+        </w:rPr>
+        <w:t>Q</w:t>
+      </w:r>
+      <w:r>
+        <w:rPr>
+          <w:rFonts w:ascii="Times New Roman" w:cs="Times New Roman" w:eastAsia="Times New Roman" w:hAnsi="Times New Roman"/>
+          <w:bCs w:val="false"/>
+          <w:iCs w:val="false"/>
+          <w:sz w:val="24"/>
+          <w:szCs w:val="24"/>
+        </w:rPr>
+        <w:t>)ρ</w:t>
+      </w:r>
+      <w:r>
+        <w:rPr>
+          <w:rFonts w:ascii="Times New Roman" w:cs="Times New Roman" w:eastAsia="Times New Roman" w:hAnsi="Times New Roman"/>
+          <w:bCs w:val="false"/>
+          <w:i/>
+          <w:iCs w:val="false"/>
+          <w:sz w:val="24"/>
+          <w:szCs w:val="24"/>
+        </w:rPr>
+        <w:t>s</w:t>
+      </w:r>
+      <w:r>
+        <w:rPr>
+          <w:rFonts w:ascii="Times New Roman" w:cs="Times New Roman" w:eastAsia="Times New Roman" w:hAnsi="Times New Roman"/>
+          <w:bCs w:val="false"/>
+          <w:iCs w:val="false"/>
+          <w:sz w:val="24"/>
+          <w:szCs w:val="24"/>
+        </w:rPr>
+        <w:t xml:space="preserve"> </w:t>
+      </w:r>
+      <w:r>
+        <w:rPr>
+          <w:rFonts w:ascii="Times New Roman" w:cs="Times New Roman" w:eastAsia="Times New Roman" w:hAnsi="Times New Roman"/>
+          <w:bCs w:val="false"/>
+          <w:i/>
+          <w:iCs w:val="false"/>
+          <w:sz w:val="24"/>
+          <w:szCs w:val="24"/>
+        </w:rPr>
+        <w:t>m</w:t>
+      </w:r>
+      <w:r>
+        <w:rPr>
+          <w:rFonts w:ascii="Times New Roman" w:cs="Times New Roman" w:eastAsia="Times New Roman" w:hAnsi="Times New Roman"/>
+          <w:bCs w:val="false"/>
+          <w:i/>
+          <w:iCs w:val="false"/>
+          <w:sz w:val="24"/>
+          <w:szCs w:val="24"/>
+          <w:vertAlign w:val="subscript"/>
+        </w:rPr>
+        <w:t>N</w:t>
+      </w:r>
+      <w:r>
+        <w:rPr>
+          <w:rFonts w:ascii="Times New Roman" w:cs="Times New Roman" w:eastAsia="Times New Roman" w:hAnsi="Times New Roman"/>
+          <w:bCs w:val="false"/>
+          <w:iCs w:val="false"/>
+          <w:sz w:val="24"/>
+          <w:szCs w:val="24"/>
+        </w:rPr>
+        <w:t xml:space="preserve"> ≤ ρ</w:t>
+      </w:r>
+      <w:r>
+        <w:rPr>
+          <w:rFonts w:ascii="Times New Roman" w:cs="Times New Roman" w:eastAsia="Times New Roman" w:hAnsi="Times New Roman"/>
+          <w:bCs w:val="false"/>
+          <w:i/>
+          <w:iCs w:val="false"/>
+          <w:sz w:val="24"/>
+          <w:szCs w:val="24"/>
+        </w:rPr>
+        <w:t>s</w:t>
+      </w:r>
+      <w:r>
+        <w:rPr>
+          <w:rFonts w:ascii="Times New Roman" w:cs="Times New Roman" w:eastAsia="Times New Roman" w:hAnsi="Times New Roman"/>
+          <w:bCs w:val="false"/>
+          <w:iCs w:val="false"/>
+          <w:sz w:val="24"/>
+          <w:szCs w:val="24"/>
+        </w:rPr>
+        <w:t xml:space="preserve"> </w:t>
+      </w:r>
+      <w:r>
+        <w:rPr>
+          <w:rFonts w:ascii="Times New Roman" w:cs="Times New Roman" w:eastAsia="Times New Roman" w:hAnsi="Times New Roman"/>
+          <w:bCs w:val="false"/>
+          <w:i/>
+          <w:iCs w:val="false"/>
+          <w:sz w:val="24"/>
+          <w:szCs w:val="24"/>
+        </w:rPr>
+        <w:t>m</w:t>
+      </w:r>
+      <w:r>
+        <w:rPr>
+          <w:rFonts w:ascii="Times New Roman" w:cs="Times New Roman" w:eastAsia="Times New Roman" w:hAnsi="Times New Roman"/>
+          <w:bCs w:val="false"/>
+          <w:i/>
+          <w:iCs w:val="false"/>
+          <w:sz w:val="24"/>
+          <w:szCs w:val="24"/>
+          <w:vertAlign w:val="subscript"/>
+        </w:rPr>
+        <w:t>N</w:t>
+      </w:r>
+      <w:r>
+        <w:rPr>
+          <w:rFonts w:ascii="Times New Roman" w:cs="Times New Roman" w:eastAsia="Times New Roman" w:hAnsi="Times New Roman"/>
+          <w:bCs w:val="false"/>
+          <w:iCs w:val="false"/>
+          <w:sz w:val="24"/>
+          <w:szCs w:val="24"/>
+        </w:rPr>
+        <w:t>, while the remaining terms are nonpositive. Surplus therefore never exceeds</w:t>
+      </w:r>
+    </w:p>
+    <w:p>
+      <w:pPr>
+        <w:tabs>
+          <w:tab w:val="right" w:pos="9360"/>
+        </w:tabs>
+        <w:spacing w:after="160" w:before="160" w:line="480" w:lineRule="auto"/>
+        <w:jc w:val="center"/>
+      </w:pPr>
+      <w:r>
+        <w:rPr>
+          <w:rFonts w:ascii="Times New Roman" w:cs="Times New Roman" w:eastAsia="Times New Roman" w:hAnsi="Times New Roman"/>
+          <w:bCs w:val="false"/>
+          <w:i/>
+          <w:iCs/>
+          <w:sz w:val="24"/>
+          <w:szCs w:val="24"/>
+        </w:rPr>
+        <w:t>S</w:t>
+      </w:r>
+      <w:r>
+        <w:rPr>
+          <w:rFonts w:ascii="Times New Roman" w:cs="Times New Roman" w:eastAsia="Times New Roman" w:hAnsi="Times New Roman"/>
+          <w:bCs w:val="false"/>
+          <w:iCs/>
+          <w:sz w:val="24"/>
+          <w:szCs w:val="24"/>
+          <w:vertAlign w:val="superscript"/>
+        </w:rPr>
+        <w:t>FB</w:t>
+      </w:r>
+      <w:r>
+        <w:rPr>
+          <w:rFonts w:ascii="Times New Roman" w:cs="Times New Roman" w:eastAsia="Times New Roman" w:hAnsi="Times New Roman"/>
+          <w:bCs w:val="false"/>
+          <w:iCs/>
+          <w:sz w:val="24"/>
+          <w:szCs w:val="24"/>
+        </w:rPr>
+        <w:t xml:space="preserve">  =  </w:t>
+      </w:r>
+      <w:r>
+        <w:rPr>
+          <w:rFonts w:ascii="Times New Roman" w:cs="Times New Roman" w:eastAsia="Times New Roman" w:hAnsi="Times New Roman"/>
+          <w:bCs w:val="false"/>
+          <w:i/>
+          <w:iCs/>
+          <w:sz w:val="24"/>
+          <w:szCs w:val="24"/>
+        </w:rPr>
+        <w:t>g</w:t>
+      </w:r>
+      <w:r>
+        <w:rPr>
+          <w:rFonts w:ascii="Times New Roman" w:cs="Times New Roman" w:eastAsia="Times New Roman" w:hAnsi="Times New Roman"/>
+          <w:bCs w:val="false"/>
+          <w:iCs/>
+          <w:sz w:val="24"/>
+          <w:szCs w:val="24"/>
+        </w:rPr>
+        <w:t>²/(2ψ)  +  ρ</w:t>
+      </w:r>
+      <w:r>
+        <w:rPr>
+          <w:rFonts w:ascii="Times New Roman" w:cs="Times New Roman" w:eastAsia="Times New Roman" w:hAnsi="Times New Roman"/>
+          <w:bCs w:val="false"/>
+          <w:i/>
+          <w:iCs/>
+          <w:sz w:val="24"/>
+          <w:szCs w:val="24"/>
+        </w:rPr>
+        <w:t>s</w:t>
+      </w:r>
+      <w:r>
+        <w:rPr>
+          <w:rFonts w:ascii="Times New Roman" w:cs="Times New Roman" w:eastAsia="Times New Roman" w:hAnsi="Times New Roman"/>
+          <w:bCs w:val="false"/>
+          <w:iCs/>
+          <w:sz w:val="24"/>
+          <w:szCs w:val="24"/>
+        </w:rPr>
+        <w:t xml:space="preserve"> </w:t>
+      </w:r>
+      <w:r>
+        <w:rPr>
+          <w:rFonts w:ascii="Times New Roman" w:cs="Times New Roman" w:eastAsia="Times New Roman" w:hAnsi="Times New Roman"/>
+          <w:bCs w:val="false"/>
+          <w:i/>
+          <w:iCs/>
+          <w:sz w:val="24"/>
+          <w:szCs w:val="24"/>
+        </w:rPr>
+        <w:t>m</w:t>
+      </w:r>
+      <w:r>
+        <w:rPr>
+          <w:rFonts w:ascii="Times New Roman" w:cs="Times New Roman" w:eastAsia="Times New Roman" w:hAnsi="Times New Roman"/>
+          <w:bCs w:val="false"/>
+          <w:i/>
+          <w:iCs/>
+          <w:sz w:val="24"/>
+          <w:szCs w:val="24"/>
+          <w:vertAlign w:val="subscript"/>
+        </w:rPr>
+        <w:t>N</w:t>
+      </w:r>
+      <w:r>
+        <w:rPr>
+          <w:rFonts w:ascii="Times New Roman" w:cs="Times New Roman" w:eastAsia="Times New Roman" w:hAnsi="Times New Roman"/>
+          <w:bCs w:val="false"/>
+          <w:iCs/>
+          <w:sz w:val="24"/>
+          <w:szCs w:val="24"/>
+        </w:rPr>
+        <w:t xml:space="preserve">  −  </w:t>
+      </w:r>
+      <w:r>
+        <w:rPr>
+          <w:rFonts w:ascii="Times New Roman" w:cs="Times New Roman" w:eastAsia="Times New Roman" w:hAnsi="Times New Roman"/>
+          <w:bCs w:val="false"/>
+          <w:i/>
+          <w:iCs/>
+          <w:sz w:val="24"/>
+          <w:szCs w:val="24"/>
+        </w:rPr>
+        <w:t>c</w:t>
+      </w:r>
+      <w:r>
+        <w:rPr>
+          <w:rFonts w:ascii="Times New Roman" w:cs="Times New Roman" w:eastAsia="Times New Roman" w:hAnsi="Times New Roman"/>
+          <w:bCs w:val="false"/>
+          <w:i/>
+          <w:iCs/>
+          <w:sz w:val="24"/>
+          <w:szCs w:val="24"/>
+          <w:vertAlign w:val="subscript"/>
+        </w:rPr>
+        <w:t>s</w:t>
+      </w:r>
+      <w:r>
+        <w:rPr>
+          <w:rFonts w:ascii="Times New Roman" w:cs="Times New Roman" w:eastAsia="Times New Roman" w:hAnsi="Times New Roman"/>
+          <w:bCs w:val="false"/>
+          <w:i/>
+          <w:iCs/>
+          <w:sz w:val="24"/>
+          <w:szCs w:val="24"/>
+        </w:rPr>
+        <w:t>N</w:t>
+      </w:r>
+      <w:r>
+        <w:rPr>
+          <w:rFonts w:ascii="Times New Roman" w:cs="Times New Roman" w:eastAsia="Times New Roman" w:hAnsi="Times New Roman"/>
+          <w:bCs w:val="false"/>
+          <w:iCs/>
+          <w:sz w:val="24"/>
+          <w:szCs w:val="24"/>
+        </w:rPr>
+        <w:t xml:space="preserve">  −  </w:t>
+      </w:r>
+      <w:r>
+        <w:rPr>
+          <w:rFonts w:ascii="Times New Roman" w:cs="Times New Roman" w:eastAsia="Times New Roman" w:hAnsi="Times New Roman"/>
+          <w:bCs w:val="false"/>
+          <w:i/>
+          <w:iCs/>
+          <w:sz w:val="24"/>
+          <w:szCs w:val="24"/>
+        </w:rPr>
+        <w:t>c</w:t>
+      </w:r>
+      <w:r>
+        <w:rPr>
+          <w:rFonts w:ascii="Times New Roman" w:cs="Times New Roman" w:eastAsia="Times New Roman" w:hAnsi="Times New Roman"/>
+          <w:bCs w:val="false"/>
+          <w:i/>
+          <w:iCs/>
+          <w:sz w:val="24"/>
+          <w:szCs w:val="24"/>
+          <w:vertAlign w:val="subscript"/>
+        </w:rPr>
+        <w:t>G</w:t>
+      </w:r>
+      <w:r>
+        <w:rPr>
+          <w:rFonts w:ascii="Times New Roman" w:cs="Times New Roman" w:eastAsia="Times New Roman" w:hAnsi="Times New Roman"/>
+          <w:bCs w:val="false"/>
+          <w:iCs/>
+          <w:sz w:val="24"/>
+          <w:szCs w:val="24"/>
+        </w:rPr>
+        <w:t>·1[φ &gt; 0]</w:t>
+        <w:tab/>
+        <w:t>(G2)</w:t>
+      </w:r>
+    </w:p>
+    <w:p>
+      <w:pPr>
+        <w:spacing w:after="0" w:before="0" w:line="480" w:lineRule="auto"/>
+        <w:ind w:firstLine="720"/>
+        <w:jc w:val="left"/>
+      </w:pPr>
+      <w:r>
+        <w:rPr>
+          <w:rFonts w:ascii="Times New Roman" w:cs="Times New Roman" w:eastAsia="Times New Roman" w:hAnsi="Times New Roman"/>
+          <w:bCs w:val="false"/>
+          <w:iCs w:val="false"/>
+          <w:sz w:val="24"/>
+          <w:szCs w:val="24"/>
+        </w:rPr>
+        <w:t xml:space="preserve">with equality if and only if </w:t>
+      </w:r>
+      <w:r>
+        <w:rPr>
+          <w:rFonts w:ascii="Times New Roman" w:cs="Times New Roman" w:eastAsia="Times New Roman" w:hAnsi="Times New Roman"/>
+          <w:bCs w:val="false"/>
+          <w:i/>
+          <w:iCs w:val="false"/>
+          <w:sz w:val="24"/>
+          <w:szCs w:val="24"/>
+        </w:rPr>
+        <w:t>e</w:t>
+      </w:r>
+      <w:r>
+        <w:rPr>
+          <w:rFonts w:ascii="Times New Roman" w:cs="Times New Roman" w:eastAsia="Times New Roman" w:hAnsi="Times New Roman"/>
+          <w:bCs w:val="false"/>
+          <w:iCs w:val="false"/>
+          <w:sz w:val="24"/>
+          <w:szCs w:val="24"/>
+        </w:rPr>
+        <w:t xml:space="preserve"> = 0 and </w:t>
+      </w:r>
+      <w:r>
+        <w:rPr>
+          <w:rFonts w:ascii="Times New Roman" w:cs="Times New Roman" w:eastAsia="Times New Roman" w:hAnsi="Times New Roman"/>
+          <w:bCs w:val="false"/>
+          <w:i/>
+          <w:iCs w:val="false"/>
+          <w:sz w:val="24"/>
+          <w:szCs w:val="24"/>
+        </w:rPr>
+        <w:t>a</w:t>
+      </w:r>
+      <w:r>
+        <w:rPr>
+          <w:rFonts w:ascii="Times New Roman" w:cs="Times New Roman" w:eastAsia="Times New Roman" w:hAnsi="Times New Roman"/>
+          <w:bCs w:val="false"/>
+          <w:iCs w:val="false"/>
+          <w:sz w:val="24"/>
+          <w:szCs w:val="24"/>
+        </w:rPr>
+        <w:t xml:space="preserve"> = </w:t>
+      </w:r>
+      <w:r>
+        <w:rPr>
+          <w:rFonts w:ascii="Times New Roman" w:cs="Times New Roman" w:eastAsia="Times New Roman" w:hAnsi="Times New Roman"/>
+          <w:bCs w:val="false"/>
+          <w:i/>
+          <w:iCs w:val="false"/>
+          <w:sz w:val="24"/>
+          <w:szCs w:val="24"/>
+        </w:rPr>
+        <w:t>g</w:t>
+      </w:r>
+      <w:r>
+        <w:rPr>
+          <w:rFonts w:ascii="Times New Roman" w:cs="Times New Roman" w:eastAsia="Times New Roman" w:hAnsi="Times New Roman"/>
+          <w:bCs w:val="false"/>
+          <w:iCs w:val="false"/>
+          <w:sz w:val="24"/>
+          <w:szCs w:val="24"/>
+        </w:rPr>
+        <w:t xml:space="preserve">/ψ. Without exploitation, (F1) gives </w:t>
+      </w:r>
+      <w:r>
+        <w:rPr>
+          <w:rFonts w:ascii="Times New Roman" w:cs="Times New Roman" w:eastAsia="Times New Roman" w:hAnsi="Times New Roman"/>
+          <w:bCs w:val="false"/>
+          <w:i/>
+          <w:iCs w:val="false"/>
+          <w:sz w:val="24"/>
+          <w:szCs w:val="24"/>
+        </w:rPr>
+        <w:t>a</w:t>
+      </w:r>
+      <w:r>
+        <w:rPr>
+          <w:rFonts w:ascii="Times New Roman" w:cs="Times New Roman" w:eastAsia="Times New Roman" w:hAnsi="Times New Roman"/>
+          <w:bCs w:val="false"/>
+          <w:iCs w:val="false"/>
+          <w:sz w:val="24"/>
+          <w:szCs w:val="24"/>
+        </w:rPr>
+        <w:t xml:space="preserve"> = βθ/ψ, so the first-best intensity of pay is β</w:t>
+      </w:r>
+      <w:r>
+        <w:rPr>
+          <w:rFonts w:ascii="Times New Roman" w:cs="Times New Roman" w:eastAsia="Times New Roman" w:hAnsi="Times New Roman"/>
+          <w:bCs w:val="false"/>
+          <w:iCs w:val="false"/>
+          <w:sz w:val="24"/>
+          <w:szCs w:val="24"/>
+          <w:vertAlign w:val="superscript"/>
+        </w:rPr>
+        <w:t>FB</w:t>
+      </w:r>
+      <w:r>
+        <w:rPr>
+          <w:rFonts w:ascii="Times New Roman" w:cs="Times New Roman" w:eastAsia="Times New Roman" w:hAnsi="Times New Roman"/>
+          <w:bCs w:val="false"/>
+          <w:iCs w:val="false"/>
+          <w:sz w:val="24"/>
+          <w:szCs w:val="24"/>
+        </w:rPr>
+        <w:t xml:space="preserve"> = </w:t>
+      </w:r>
+      <w:r>
+        <w:rPr>
+          <w:rFonts w:ascii="Times New Roman" w:cs="Times New Roman" w:eastAsia="Times New Roman" w:hAnsi="Times New Roman"/>
+          <w:bCs w:val="false"/>
+          <w:i/>
+          <w:iCs w:val="false"/>
+          <w:sz w:val="24"/>
+          <w:szCs w:val="24"/>
+        </w:rPr>
+        <w:t>g</w:t>
+      </w:r>
+      <w:r>
+        <w:rPr>
+          <w:rFonts w:ascii="Times New Roman" w:cs="Times New Roman" w:eastAsia="Times New Roman" w:hAnsi="Times New Roman"/>
+          <w:bCs w:val="false"/>
+          <w:iCs w:val="false"/>
+          <w:sz w:val="24"/>
+          <w:szCs w:val="24"/>
+        </w:rPr>
+        <w:t>/θ.</w:t>
+      </w:r>
+    </w:p>
+    <w:p>
+      <w:pPr>
+        <w:spacing w:after="0" w:before="0" w:line="480" w:lineRule="auto"/>
+        <w:ind w:firstLine="720"/>
+        <w:jc w:val="left"/>
+      </w:pPr>
+      <w:r>
+        <w:rPr>
+          <w:rFonts w:ascii="Times New Roman" w:cs="Times New Roman" w:eastAsia="Times New Roman" w:hAnsi="Times New Roman"/>
+          <w:bCs w:val="false"/>
+          <w:i/>
+          <w:iCs w:val="false"/>
+          <w:sz w:val="24"/>
+          <w:szCs w:val="24"/>
+        </w:rPr>
+        <w:t>Step 2: inspection can restore the first best.</w:t>
+      </w:r>
+      <w:r>
+        <w:rPr>
+          <w:rFonts w:ascii="Times New Roman" w:cs="Times New Roman" w:eastAsia="Times New Roman" w:hAnsi="Times New Roman"/>
+          <w:bCs w:val="false"/>
+          <w:iCs w:val="false"/>
+          <w:sz w:val="24"/>
+          <w:szCs w:val="24"/>
+        </w:rPr>
+        <w:t xml:space="preserve"> If </w:t>
+      </w:r>
+      <w:r>
+        <w:rPr>
+          <w:rFonts w:ascii="Times New Roman" w:cs="Times New Roman" w:eastAsia="Times New Roman" w:hAnsi="Times New Roman"/>
+          <w:bCs w:val="false"/>
+          <w:i/>
+          <w:iCs w:val="false"/>
+          <w:sz w:val="24"/>
+          <w:szCs w:val="24"/>
+        </w:rPr>
+        <w:t>e</w:t>
+      </w:r>
+      <w:r>
+        <w:rPr>
+          <w:rFonts w:ascii="Times New Roman" w:cs="Times New Roman" w:eastAsia="Times New Roman" w:hAnsi="Times New Roman"/>
+          <w:bCs w:val="false"/>
+          <w:iCs w:val="false"/>
+          <w:sz w:val="24"/>
+          <w:szCs w:val="24"/>
+        </w:rPr>
+        <w:t xml:space="preserve"> = 0 is an equilibrium at β = </w:t>
+      </w:r>
+      <w:r>
+        <w:rPr>
+          <w:rFonts w:ascii="Times New Roman" w:cs="Times New Roman" w:eastAsia="Times New Roman" w:hAnsi="Times New Roman"/>
+          <w:bCs w:val="false"/>
+          <w:i/>
+          <w:iCs w:val="false"/>
+          <w:sz w:val="24"/>
+          <w:szCs w:val="24"/>
+        </w:rPr>
+        <w:t>g</w:t>
+      </w:r>
+      <w:r>
+        <w:rPr>
+          <w:rFonts w:ascii="Times New Roman" w:cs="Times New Roman" w:eastAsia="Times New Roman" w:hAnsi="Times New Roman"/>
+          <w:bCs w:val="false"/>
+          <w:iCs w:val="false"/>
+          <w:sz w:val="24"/>
+          <w:szCs w:val="24"/>
+        </w:rPr>
+        <w:t xml:space="preserve">/θ, surplus equals </w:t>
+      </w:r>
+      <w:r>
+        <w:rPr>
+          <w:rFonts w:ascii="Times New Roman" w:cs="Times New Roman" w:eastAsia="Times New Roman" w:hAnsi="Times New Roman"/>
+          <w:bCs w:val="false"/>
+          <w:i/>
+          <w:iCs w:val="false"/>
+          <w:sz w:val="24"/>
+          <w:szCs w:val="24"/>
+        </w:rPr>
+        <w:t>S</w:t>
+      </w:r>
+      <w:r>
+        <w:rPr>
+          <w:rFonts w:ascii="Times New Roman" w:cs="Times New Roman" w:eastAsia="Times New Roman" w:hAnsi="Times New Roman"/>
+          <w:bCs w:val="false"/>
+          <w:iCs w:val="false"/>
+          <w:sz w:val="24"/>
+          <w:szCs w:val="24"/>
+          <w:vertAlign w:val="superscript"/>
+        </w:rPr>
+        <w:t>FB</w:t>
+      </w:r>
+      <w:r>
+        <w:rPr>
+          <w:rFonts w:ascii="Times New Roman" w:cs="Times New Roman" w:eastAsia="Times New Roman" w:hAnsi="Times New Roman"/>
+          <w:bCs w:val="false"/>
+          <w:iCs w:val="false"/>
+          <w:sz w:val="24"/>
+          <w:szCs w:val="24"/>
+        </w:rPr>
+        <w:t>. By (F3) this holds if and only if β</w:t>
+      </w:r>
+      <w:r>
+        <w:rPr>
+          <w:rFonts w:ascii="Times New Roman" w:cs="Times New Roman" w:eastAsia="Times New Roman" w:hAnsi="Times New Roman"/>
+          <w:bCs w:val="false"/>
+          <w:iCs w:val="false"/>
+          <w:sz w:val="24"/>
+          <w:szCs w:val="24"/>
+          <w:vertAlign w:val="subscript"/>
+        </w:rPr>
+        <w:t>d</w:t>
+      </w:r>
+      <w:r>
+        <w:rPr>
+          <w:rFonts w:ascii="Times New Roman" w:cs="Times New Roman" w:eastAsia="Times New Roman" w:hAnsi="Times New Roman"/>
+          <w:bCs w:val="false"/>
+          <w:iCs w:val="false"/>
+          <w:sz w:val="24"/>
+          <w:szCs w:val="24"/>
+        </w:rPr>
+        <w:t xml:space="preserve"> ≤ </w:t>
+      </w:r>
+      <w:r>
+        <w:rPr>
+          <w:rFonts w:ascii="Times New Roman" w:cs="Times New Roman" w:eastAsia="Times New Roman" w:hAnsi="Times New Roman"/>
+          <w:bCs w:val="false"/>
+          <w:i/>
+          <w:iCs w:val="false"/>
+          <w:sz w:val="24"/>
+          <w:szCs w:val="24"/>
+        </w:rPr>
+        <w:t>g</w:t>
+      </w:r>
+      <w:r>
+        <w:rPr>
+          <w:rFonts w:ascii="Times New Roman" w:cs="Times New Roman" w:eastAsia="Times New Roman" w:hAnsi="Times New Roman"/>
+          <w:bCs w:val="false"/>
+          <w:iCs w:val="false"/>
+          <w:sz w:val="24"/>
+          <w:szCs w:val="24"/>
+        </w:rPr>
+        <w:t>/θ. Inspection thus allows the organization to use judge-linked pay at full strength whenever the deterrence threshold lies below the first-best intensity. Because β</w:t>
+      </w:r>
+      <w:r>
+        <w:rPr>
+          <w:rFonts w:ascii="Times New Roman" w:cs="Times New Roman" w:eastAsia="Times New Roman" w:hAnsi="Times New Roman"/>
+          <w:bCs w:val="false"/>
+          <w:iCs w:val="false"/>
+          <w:sz w:val="24"/>
+          <w:szCs w:val="24"/>
+          <w:vertAlign w:val="subscript"/>
+        </w:rPr>
+        <w:t>d</w:t>
+      </w:r>
+      <w:r>
+        <w:rPr>
+          <w:rFonts w:ascii="Times New Roman" w:cs="Times New Roman" w:eastAsia="Times New Roman" w:hAnsi="Times New Roman"/>
+          <w:bCs w:val="false"/>
+          <w:iCs w:val="false"/>
+          <w:sz w:val="24"/>
+          <w:szCs w:val="24"/>
+        </w:rPr>
+        <w:t xml:space="preserve"> falls with search depth, with φ, and with θ, either deeper search or a stronger inspection can bring it below </w:t>
+      </w:r>
+      <w:r>
+        <w:rPr>
+          <w:rFonts w:ascii="Times New Roman" w:cs="Times New Roman" w:eastAsia="Times New Roman" w:hAnsi="Times New Roman"/>
+          <w:bCs w:val="false"/>
+          <w:i/>
+          <w:iCs w:val="false"/>
+          <w:sz w:val="24"/>
+          <w:szCs w:val="24"/>
+        </w:rPr>
+        <w:t>g</w:t>
+      </w:r>
+      <w:r>
+        <w:rPr>
+          <w:rFonts w:ascii="Times New Roman" w:cs="Times New Roman" w:eastAsia="Times New Roman" w:hAnsi="Times New Roman"/>
+          <w:bCs w:val="false"/>
+          <w:iCs w:val="false"/>
+          <w:sz w:val="24"/>
+          <w:szCs w:val="24"/>
+        </w:rPr>
+        <w:t>/θ.</w:t>
+      </w:r>
+    </w:p>
+    <w:p>
+      <w:pPr>
+        <w:spacing w:after="0" w:before="0" w:line="480" w:lineRule="auto"/>
+        <w:ind w:firstLine="720"/>
+        <w:jc w:val="left"/>
+      </w:pPr>
+      <w:r>
+        <w:rPr>
+          <w:rFonts w:ascii="Times New Roman" w:cs="Times New Roman" w:eastAsia="Times New Roman" w:hAnsi="Times New Roman"/>
+          <w:bCs w:val="false"/>
+          <w:i/>
+          <w:iCs w:val="false"/>
+          <w:sz w:val="24"/>
+          <w:szCs w:val="24"/>
+        </w:rPr>
+        <w:t>Step 3: underincentivization when gaming is not deterred.</w:t>
+      </w:r>
+      <w:r>
+        <w:rPr>
+          <w:rFonts w:ascii="Times New Roman" w:cs="Times New Roman" w:eastAsia="Times New Roman" w:hAnsi="Times New Roman"/>
+          <w:bCs w:val="false"/>
+          <w:iCs w:val="false"/>
+          <w:sz w:val="24"/>
+          <w:szCs w:val="24"/>
+        </w:rPr>
+        <w:t xml:space="preserve"> Suppose φ = 0, so that </w:t>
+      </w:r>
+      <w:r>
+        <w:rPr>
+          <w:rFonts w:ascii="Times New Roman" w:cs="Times New Roman" w:eastAsia="Times New Roman" w:hAnsi="Times New Roman"/>
+          <w:bCs w:val="false"/>
+          <w:i/>
+          <w:iCs w:val="false"/>
+          <w:sz w:val="24"/>
+          <w:szCs w:val="24"/>
+        </w:rPr>
+        <w:t>a</w:t>
+      </w:r>
+      <w:r>
+        <w:rPr>
+          <w:rFonts w:ascii="Times New Roman" w:cs="Times New Roman" w:eastAsia="Times New Roman" w:hAnsi="Times New Roman"/>
+          <w:bCs w:val="false"/>
+          <w:iCs w:val="false"/>
+          <w:sz w:val="24"/>
+          <w:szCs w:val="24"/>
+        </w:rPr>
+        <w:t xml:space="preserve"> = βθ/ψ and </w:t>
+      </w:r>
+      <w:r>
+        <w:rPr>
+          <w:rFonts w:ascii="Times New Roman" w:cs="Times New Roman" w:eastAsia="Times New Roman" w:hAnsi="Times New Roman"/>
+          <w:bCs w:val="false"/>
+          <w:i/>
+          <w:iCs w:val="false"/>
+          <w:sz w:val="24"/>
+          <w:szCs w:val="24"/>
+        </w:rPr>
+        <w:t>e</w:t>
+      </w:r>
+      <w:r>
+        <w:rPr>
+          <w:rFonts w:ascii="Times New Roman" w:cs="Times New Roman" w:eastAsia="Times New Roman" w:hAnsi="Times New Roman"/>
+          <w:bCs w:val="false"/>
+          <w:iCs w:val="false"/>
+          <w:sz w:val="24"/>
+          <w:szCs w:val="24"/>
+        </w:rPr>
+        <w:t xml:space="preserve"> solves κ</w:t>
+      </w:r>
+      <w:r>
+        <w:rPr>
+          <w:rFonts w:ascii="Times New Roman" w:cs="Times New Roman" w:eastAsia="Times New Roman" w:hAnsi="Times New Roman"/>
+          <w:bCs w:val="false"/>
+          <w:i/>
+          <w:iCs w:val="false"/>
+          <w:sz w:val="24"/>
+          <w:szCs w:val="24"/>
+        </w:rPr>
+        <w:t>e</w:t>
+      </w:r>
+      <w:r>
+        <w:rPr>
+          <w:rFonts w:ascii="Times New Roman" w:cs="Times New Roman" w:eastAsia="Times New Roman" w:hAnsi="Times New Roman"/>
+          <w:bCs w:val="false"/>
+          <w:iCs w:val="false"/>
+          <w:sz w:val="24"/>
+          <w:szCs w:val="24"/>
+        </w:rPr>
+        <w:t xml:space="preserve"> = βΔ(1 − </w:t>
+      </w:r>
+      <w:r>
+        <w:rPr>
+          <w:rFonts w:ascii="Times New Roman" w:cs="Times New Roman" w:eastAsia="Times New Roman" w:hAnsi="Times New Roman"/>
+          <w:bCs w:val="false"/>
+          <w:i/>
+          <w:iCs w:val="false"/>
+          <w:sz w:val="24"/>
+          <w:szCs w:val="24"/>
+        </w:rPr>
+        <w:t>e</w:t>
+      </w:r>
+      <w:r>
+        <w:rPr>
+          <w:rFonts w:ascii="Times New Roman" w:cs="Times New Roman" w:eastAsia="Times New Roman" w:hAnsi="Times New Roman"/>
+          <w:bCs w:val="false"/>
+          <w:iCs w:val="false"/>
+          <w:sz w:val="24"/>
+          <w:szCs w:val="24"/>
+        </w:rPr>
+        <w:t>)</w:t>
+      </w:r>
+      <w:r>
+        <w:rPr>
+          <w:rFonts w:ascii="Times New Roman" w:cs="Times New Roman" w:eastAsia="Times New Roman" w:hAnsi="Times New Roman"/>
+          <w:bCs w:val="false"/>
+          <w:iCs w:val="false"/>
+          <w:sz w:val="24"/>
+          <w:szCs w:val="24"/>
+          <w:vertAlign w:val="superscript"/>
+        </w:rPr>
+        <w:t>N−1</w:t>
+      </w:r>
+      <w:r>
+        <w:rPr>
+          <w:rFonts w:ascii="Times New Roman" w:cs="Times New Roman" w:eastAsia="Times New Roman" w:hAnsi="Times New Roman"/>
+          <w:bCs w:val="false"/>
+          <w:iCs w:val="false"/>
+          <w:sz w:val="24"/>
+          <w:szCs w:val="24"/>
+        </w:rPr>
+        <w:t xml:space="preserve">, which makes </w:t>
+      </w:r>
+      <w:r>
+        <w:rPr>
+          <w:rFonts w:ascii="Times New Roman" w:cs="Times New Roman" w:eastAsia="Times New Roman" w:hAnsi="Times New Roman"/>
+          <w:bCs w:val="false"/>
+          <w:i/>
+          <w:iCs w:val="false"/>
+          <w:sz w:val="24"/>
+          <w:szCs w:val="24"/>
+        </w:rPr>
+        <w:t>e</w:t>
+      </w:r>
+      <w:r>
+        <w:rPr>
+          <w:rFonts w:ascii="Times New Roman" w:cs="Times New Roman" w:eastAsia="Times New Roman" w:hAnsi="Times New Roman"/>
+          <w:bCs w:val="false"/>
+          <w:iCs w:val="false"/>
+          <w:sz w:val="24"/>
+          <w:szCs w:val="24"/>
+        </w:rPr>
+        <w:t xml:space="preserve"> increasing in β. Writing </w:t>
+      </w:r>
+      <w:r>
+        <w:rPr>
+          <w:rFonts w:ascii="Times New Roman" w:cs="Times New Roman" w:eastAsia="Times New Roman" w:hAnsi="Times New Roman"/>
+          <w:bCs w:val="false"/>
+          <w:i/>
+          <w:iCs w:val="false"/>
+          <w:sz w:val="24"/>
+          <w:szCs w:val="24"/>
+        </w:rPr>
+        <w:t>Q</w:t>
+      </w:r>
+      <w:r>
+        <w:rPr>
+          <w:rFonts w:ascii="Times New Roman" w:cs="Times New Roman" w:eastAsia="Times New Roman" w:hAnsi="Times New Roman"/>
+          <w:bCs w:val="false"/>
+          <w:iCs w:val="false"/>
+          <w:sz w:val="24"/>
+          <w:szCs w:val="24"/>
+        </w:rPr>
+        <w:t xml:space="preserve">′ = </w:t>
+      </w:r>
+      <w:r>
+        <w:rPr>
+          <w:rFonts w:ascii="Times New Roman" w:cs="Times New Roman" w:eastAsia="Times New Roman" w:hAnsi="Times New Roman"/>
+          <w:bCs w:val="false"/>
+          <w:i/>
+          <w:iCs w:val="false"/>
+          <w:sz w:val="24"/>
+          <w:szCs w:val="24"/>
+        </w:rPr>
+        <w:t>N</w:t>
+      </w:r>
+      <w:r>
+        <w:rPr>
+          <w:rFonts w:ascii="Times New Roman" w:cs="Times New Roman" w:eastAsia="Times New Roman" w:hAnsi="Times New Roman"/>
+          <w:bCs w:val="false"/>
+          <w:iCs w:val="false"/>
+          <w:sz w:val="24"/>
+          <w:szCs w:val="24"/>
+        </w:rPr>
+        <w:t xml:space="preserve">(1 − </w:t>
+      </w:r>
+      <w:r>
+        <w:rPr>
+          <w:rFonts w:ascii="Times New Roman" w:cs="Times New Roman" w:eastAsia="Times New Roman" w:hAnsi="Times New Roman"/>
+          <w:bCs w:val="false"/>
+          <w:i/>
+          <w:iCs w:val="false"/>
+          <w:sz w:val="24"/>
+          <w:szCs w:val="24"/>
+        </w:rPr>
+        <w:t>e</w:t>
+      </w:r>
+      <w:r>
+        <w:rPr>
+          <w:rFonts w:ascii="Times New Roman" w:cs="Times New Roman" w:eastAsia="Times New Roman" w:hAnsi="Times New Roman"/>
+          <w:bCs w:val="false"/>
+          <w:iCs w:val="false"/>
+          <w:sz w:val="24"/>
+          <w:szCs w:val="24"/>
+        </w:rPr>
+        <w:t>)</w:t>
+      </w:r>
+      <w:r>
+        <w:rPr>
+          <w:rFonts w:ascii="Times New Roman" w:cs="Times New Roman" w:eastAsia="Times New Roman" w:hAnsi="Times New Roman"/>
+          <w:bCs w:val="false"/>
+          <w:iCs w:val="false"/>
+          <w:sz w:val="24"/>
+          <w:szCs w:val="24"/>
+          <w:vertAlign w:val="superscript"/>
+        </w:rPr>
+        <w:t>N−1</w:t>
+      </w:r>
+      <w:r>
+        <w:rPr>
+          <w:rFonts w:ascii="Times New Roman" w:cs="Times New Roman" w:eastAsia="Times New Roman" w:hAnsi="Times New Roman"/>
+          <w:bCs w:val="false"/>
+          <w:iCs w:val="false"/>
+          <w:sz w:val="24"/>
+          <w:szCs w:val="24"/>
+        </w:rPr>
+        <w:t>, differentiation of (G1) gives</w:t>
+      </w:r>
+    </w:p>
+    <w:p>
+      <w:pPr>
+        <w:tabs>
+          <w:tab w:val="right" w:pos="9360"/>
+        </w:tabs>
+        <w:spacing w:after="160" w:before="160" w:line="480" w:lineRule="auto"/>
+        <w:jc w:val="center"/>
+      </w:pPr>
+      <w:r>
+        <w:rPr>
+          <w:rFonts w:ascii="Times New Roman" w:cs="Times New Roman" w:eastAsia="Times New Roman" w:hAnsi="Times New Roman"/>
+          <w:bCs w:val="false"/>
+          <w:iCs/>
+          <w:sz w:val="24"/>
+          <w:szCs w:val="24"/>
+        </w:rPr>
+        <w:t>d</w:t>
+      </w:r>
+      <w:r>
+        <w:rPr>
+          <w:rFonts w:ascii="Times New Roman" w:cs="Times New Roman" w:eastAsia="Times New Roman" w:hAnsi="Times New Roman"/>
+          <w:bCs w:val="false"/>
+          <w:i/>
+          <w:iCs/>
+          <w:sz w:val="24"/>
+          <w:szCs w:val="24"/>
+        </w:rPr>
+        <w:t>S</w:t>
+      </w:r>
+      <w:r>
+        <w:rPr>
+          <w:rFonts w:ascii="Times New Roman" w:cs="Times New Roman" w:eastAsia="Times New Roman" w:hAnsi="Times New Roman"/>
+          <w:bCs w:val="false"/>
+          <w:iCs/>
+          <w:sz w:val="24"/>
+          <w:szCs w:val="24"/>
+        </w:rPr>
+        <w:t xml:space="preserve">/dβ  =  [(1 − </w:t>
+      </w:r>
+      <w:r>
+        <w:rPr>
+          <w:rFonts w:ascii="Times New Roman" w:cs="Times New Roman" w:eastAsia="Times New Roman" w:hAnsi="Times New Roman"/>
+          <w:bCs w:val="false"/>
+          <w:i/>
+          <w:iCs/>
+          <w:sz w:val="24"/>
+          <w:szCs w:val="24"/>
+        </w:rPr>
+        <w:t>Q</w:t>
+      </w:r>
+      <w:r>
+        <w:rPr>
+          <w:rFonts w:ascii="Times New Roman" w:cs="Times New Roman" w:eastAsia="Times New Roman" w:hAnsi="Times New Roman"/>
+          <w:bCs w:val="false"/>
+          <w:iCs/>
+          <w:sz w:val="24"/>
+          <w:szCs w:val="24"/>
+        </w:rPr>
+        <w:t>)</w:t>
+      </w:r>
+      <w:r>
+        <w:rPr>
+          <w:rFonts w:ascii="Times New Roman" w:cs="Times New Roman" w:eastAsia="Times New Roman" w:hAnsi="Times New Roman"/>
+          <w:bCs w:val="false"/>
+          <w:i/>
+          <w:iCs/>
+          <w:sz w:val="24"/>
+          <w:szCs w:val="24"/>
+        </w:rPr>
+        <w:t>g</w:t>
+      </w:r>
+      <w:r>
+        <w:rPr>
+          <w:rFonts w:ascii="Times New Roman" w:cs="Times New Roman" w:eastAsia="Times New Roman" w:hAnsi="Times New Roman"/>
+          <w:bCs w:val="false"/>
+          <w:iCs/>
+          <w:sz w:val="24"/>
+          <w:szCs w:val="24"/>
+        </w:rPr>
+        <w:t xml:space="preserve"> − ψ</w:t>
+      </w:r>
+      <w:r>
+        <w:rPr>
+          <w:rFonts w:ascii="Times New Roman" w:cs="Times New Roman" w:eastAsia="Times New Roman" w:hAnsi="Times New Roman"/>
+          <w:bCs w:val="false"/>
+          <w:i/>
+          <w:iCs/>
+          <w:sz w:val="24"/>
+          <w:szCs w:val="24"/>
+        </w:rPr>
+        <w:t>a</w:t>
+      </w:r>
+      <w:r>
+        <w:rPr>
+          <w:rFonts w:ascii="Times New Roman" w:cs="Times New Roman" w:eastAsia="Times New Roman" w:hAnsi="Times New Roman"/>
+          <w:bCs w:val="false"/>
+          <w:iCs/>
+          <w:sz w:val="24"/>
+          <w:szCs w:val="24"/>
+        </w:rPr>
+        <w:t>](θ/ψ)  −  {</w:t>
+      </w:r>
+      <w:r>
+        <w:rPr>
+          <w:rFonts w:ascii="Times New Roman" w:cs="Times New Roman" w:eastAsia="Times New Roman" w:hAnsi="Times New Roman"/>
+          <w:bCs w:val="false"/>
+          <w:i/>
+          <w:iCs/>
+          <w:sz w:val="24"/>
+          <w:szCs w:val="24"/>
+        </w:rPr>
+        <w:t>Q</w:t>
+      </w:r>
+      <w:r>
+        <w:rPr>
+          <w:rFonts w:ascii="Times New Roman" w:cs="Times New Roman" w:eastAsia="Times New Roman" w:hAnsi="Times New Roman"/>
+          <w:bCs w:val="false"/>
+          <w:iCs/>
+          <w:sz w:val="24"/>
+          <w:szCs w:val="24"/>
+        </w:rPr>
+        <w:t>′[</w:t>
+      </w:r>
+      <w:r>
+        <w:rPr>
+          <w:rFonts w:ascii="Times New Roman" w:cs="Times New Roman" w:eastAsia="Times New Roman" w:hAnsi="Times New Roman"/>
+          <w:bCs w:val="false"/>
+          <w:i/>
+          <w:iCs/>
+          <w:sz w:val="24"/>
+          <w:szCs w:val="24"/>
+        </w:rPr>
+        <w:t>ga</w:t>
+      </w:r>
+      <w:r>
+        <w:rPr>
+          <w:rFonts w:ascii="Times New Roman" w:cs="Times New Roman" w:eastAsia="Times New Roman" w:hAnsi="Times New Roman"/>
+          <w:bCs w:val="false"/>
+          <w:iCs/>
+          <w:sz w:val="24"/>
+          <w:szCs w:val="24"/>
+        </w:rPr>
+        <w:t xml:space="preserve"> + ρ</w:t>
+      </w:r>
+      <w:r>
+        <w:rPr>
+          <w:rFonts w:ascii="Times New Roman" w:cs="Times New Roman" w:eastAsia="Times New Roman" w:hAnsi="Times New Roman"/>
+          <w:bCs w:val="false"/>
+          <w:i/>
+          <w:iCs/>
+          <w:sz w:val="24"/>
+          <w:szCs w:val="24"/>
+        </w:rPr>
+        <w:t>s</w:t>
+      </w:r>
+      <w:r>
+        <w:rPr>
+          <w:rFonts w:ascii="Times New Roman" w:cs="Times New Roman" w:eastAsia="Times New Roman" w:hAnsi="Times New Roman"/>
+          <w:bCs w:val="false"/>
+          <w:iCs/>
+          <w:sz w:val="24"/>
+          <w:szCs w:val="24"/>
+        </w:rPr>
+        <w:t xml:space="preserve"> </w:t>
+      </w:r>
+      <w:r>
+        <w:rPr>
+          <w:rFonts w:ascii="Times New Roman" w:cs="Times New Roman" w:eastAsia="Times New Roman" w:hAnsi="Times New Roman"/>
+          <w:bCs w:val="false"/>
+          <w:i/>
+          <w:iCs/>
+          <w:sz w:val="24"/>
+          <w:szCs w:val="24"/>
+        </w:rPr>
+        <w:t>m</w:t>
+      </w:r>
+      <w:r>
+        <w:rPr>
+          <w:rFonts w:ascii="Times New Roman" w:cs="Times New Roman" w:eastAsia="Times New Roman" w:hAnsi="Times New Roman"/>
+          <w:bCs w:val="false"/>
+          <w:i/>
+          <w:iCs/>
+          <w:sz w:val="24"/>
+          <w:szCs w:val="24"/>
+          <w:vertAlign w:val="subscript"/>
+        </w:rPr>
+        <w:t>N</w:t>
+      </w:r>
+      <w:r>
+        <w:rPr>
+          <w:rFonts w:ascii="Times New Roman" w:cs="Times New Roman" w:eastAsia="Times New Roman" w:hAnsi="Times New Roman"/>
+          <w:bCs w:val="false"/>
+          <w:iCs/>
+          <w:sz w:val="24"/>
+          <w:szCs w:val="24"/>
+        </w:rPr>
+        <w:t xml:space="preserve"> + </w:t>
+      </w:r>
+      <w:r>
+        <w:rPr>
+          <w:rFonts w:ascii="Times New Roman" w:cs="Times New Roman" w:eastAsia="Times New Roman" w:hAnsi="Times New Roman"/>
+          <w:bCs w:val="false"/>
+          <w:i/>
+          <w:iCs/>
+          <w:sz w:val="24"/>
+          <w:szCs w:val="24"/>
+        </w:rPr>
+        <w:t>d</w:t>
+      </w:r>
+      <w:r>
+        <w:rPr>
+          <w:rFonts w:ascii="Times New Roman" w:cs="Times New Roman" w:eastAsia="Times New Roman" w:hAnsi="Times New Roman"/>
+          <w:bCs w:val="false"/>
+          <w:iCs/>
+          <w:sz w:val="24"/>
+          <w:szCs w:val="24"/>
+        </w:rPr>
+        <w:t xml:space="preserve">] + </w:t>
+      </w:r>
+      <w:r>
+        <w:rPr>
+          <w:rFonts w:ascii="Times New Roman" w:cs="Times New Roman" w:eastAsia="Times New Roman" w:hAnsi="Times New Roman"/>
+          <w:bCs w:val="false"/>
+          <w:i/>
+          <w:iCs/>
+          <w:sz w:val="24"/>
+          <w:szCs w:val="24"/>
+        </w:rPr>
+        <w:t>N</w:t>
+      </w:r>
+      <w:r>
+        <w:rPr>
+          <w:rFonts w:ascii="Times New Roman" w:cs="Times New Roman" w:eastAsia="Times New Roman" w:hAnsi="Times New Roman"/>
+          <w:bCs w:val="false"/>
+          <w:iCs/>
+          <w:sz w:val="24"/>
+          <w:szCs w:val="24"/>
+        </w:rPr>
+        <w:t>κ</w:t>
+      </w:r>
+      <w:r>
+        <w:rPr>
+          <w:rFonts w:ascii="Times New Roman" w:cs="Times New Roman" w:eastAsia="Times New Roman" w:hAnsi="Times New Roman"/>
+          <w:bCs w:val="false"/>
+          <w:i/>
+          <w:iCs/>
+          <w:sz w:val="24"/>
+          <w:szCs w:val="24"/>
+        </w:rPr>
+        <w:t>e</w:t>
+      </w:r>
+      <w:r>
+        <w:rPr>
+          <w:rFonts w:ascii="Times New Roman" w:cs="Times New Roman" w:eastAsia="Times New Roman" w:hAnsi="Times New Roman"/>
+          <w:bCs w:val="false"/>
+          <w:iCs/>
+          <w:sz w:val="24"/>
+          <w:szCs w:val="24"/>
+        </w:rPr>
+        <w:t xml:space="preserve">} </w:t>
+      </w:r>
+      <w:r>
+        <w:rPr>
+          <w:rFonts w:ascii="Times New Roman" w:cs="Times New Roman" w:eastAsia="Times New Roman" w:hAnsi="Times New Roman"/>
+          <w:bCs w:val="false"/>
+          <w:i/>
+          <w:iCs/>
+          <w:sz w:val="24"/>
+          <w:szCs w:val="24"/>
+        </w:rPr>
+        <w:t>e</w:t>
+      </w:r>
+      <w:r>
+        <w:rPr>
+          <w:rFonts w:ascii="Times New Roman" w:cs="Times New Roman" w:eastAsia="Times New Roman" w:hAnsi="Times New Roman"/>
+          <w:bCs w:val="false"/>
+          <w:iCs/>
+          <w:sz w:val="24"/>
+          <w:szCs w:val="24"/>
+        </w:rPr>
+        <w:t>′(β)</w:t>
+        <w:tab/>
+        <w:t>(G3)</w:t>
+      </w:r>
+    </w:p>
+    <w:p>
+      <w:pPr>
+        <w:spacing w:after="0" w:before="0" w:line="480" w:lineRule="auto"/>
+        <w:ind w:firstLine="720"/>
+        <w:jc w:val="left"/>
+      </w:pPr>
+      <w:r>
+        <w:rPr>
+          <w:rFonts w:ascii="Times New Roman" w:cs="Times New Roman" w:eastAsia="Times New Roman" w:hAnsi="Times New Roman"/>
+          <w:bCs w:val="false"/>
+          <w:iCs w:val="false"/>
+          <w:sz w:val="24"/>
+          <w:szCs w:val="24"/>
+        </w:rPr>
+        <w:t xml:space="preserve">with </w:t>
+      </w:r>
+      <w:r>
+        <w:rPr>
+          <w:rFonts w:ascii="Times New Roman" w:cs="Times New Roman" w:eastAsia="Times New Roman" w:hAnsi="Times New Roman"/>
+          <w:bCs w:val="false"/>
+          <w:i/>
+          <w:iCs w:val="false"/>
+          <w:sz w:val="24"/>
+          <w:szCs w:val="24"/>
+        </w:rPr>
+        <w:t>e</w:t>
+      </w:r>
+      <w:r>
+        <w:rPr>
+          <w:rFonts w:ascii="Times New Roman" w:cs="Times New Roman" w:eastAsia="Times New Roman" w:hAnsi="Times New Roman"/>
+          <w:bCs w:val="false"/>
+          <w:iCs w:val="false"/>
+          <w:sz w:val="24"/>
+          <w:szCs w:val="24"/>
+        </w:rPr>
+        <w:t xml:space="preserve">′(β) &gt; 0. At β = </w:t>
+      </w:r>
+      <w:r>
+        <w:rPr>
+          <w:rFonts w:ascii="Times New Roman" w:cs="Times New Roman" w:eastAsia="Times New Roman" w:hAnsi="Times New Roman"/>
+          <w:bCs w:val="false"/>
+          <w:i/>
+          <w:iCs w:val="false"/>
+          <w:sz w:val="24"/>
+          <w:szCs w:val="24"/>
+        </w:rPr>
+        <w:t>g</w:t>
+      </w:r>
+      <w:r>
+        <w:rPr>
+          <w:rFonts w:ascii="Times New Roman" w:cs="Times New Roman" w:eastAsia="Times New Roman" w:hAnsi="Times New Roman"/>
+          <w:bCs w:val="false"/>
+          <w:iCs w:val="false"/>
+          <w:sz w:val="24"/>
+          <w:szCs w:val="24"/>
+        </w:rPr>
+        <w:t xml:space="preserve">/θ we have </w:t>
+      </w:r>
+      <w:r>
+        <w:rPr>
+          <w:rFonts w:ascii="Times New Roman" w:cs="Times New Roman" w:eastAsia="Times New Roman" w:hAnsi="Times New Roman"/>
+          <w:bCs w:val="false"/>
+          <w:i/>
+          <w:iCs w:val="false"/>
+          <w:sz w:val="24"/>
+          <w:szCs w:val="24"/>
+        </w:rPr>
+        <w:t>a</w:t>
+      </w:r>
+      <w:r>
+        <w:rPr>
+          <w:rFonts w:ascii="Times New Roman" w:cs="Times New Roman" w:eastAsia="Times New Roman" w:hAnsi="Times New Roman"/>
+          <w:bCs w:val="false"/>
+          <w:iCs w:val="false"/>
+          <w:sz w:val="24"/>
+          <w:szCs w:val="24"/>
+        </w:rPr>
+        <w:t xml:space="preserve"> = </w:t>
+      </w:r>
+      <w:r>
+        <w:rPr>
+          <w:rFonts w:ascii="Times New Roman" w:cs="Times New Roman" w:eastAsia="Times New Roman" w:hAnsi="Times New Roman"/>
+          <w:bCs w:val="false"/>
+          <w:i/>
+          <w:iCs w:val="false"/>
+          <w:sz w:val="24"/>
+          <w:szCs w:val="24"/>
+        </w:rPr>
+        <w:t>g</w:t>
+      </w:r>
+      <w:r>
+        <w:rPr>
+          <w:rFonts w:ascii="Times New Roman" w:cs="Times New Roman" w:eastAsia="Times New Roman" w:hAnsi="Times New Roman"/>
+          <w:bCs w:val="false"/>
+          <w:iCs w:val="false"/>
+          <w:sz w:val="24"/>
+          <w:szCs w:val="24"/>
+        </w:rPr>
+        <w:t>/ψ, the first term equals −</w:t>
+      </w:r>
+      <w:r>
+        <w:rPr>
+          <w:rFonts w:ascii="Times New Roman" w:cs="Times New Roman" w:eastAsia="Times New Roman" w:hAnsi="Times New Roman"/>
+          <w:bCs w:val="false"/>
+          <w:i/>
+          <w:iCs w:val="false"/>
+          <w:sz w:val="24"/>
+          <w:szCs w:val="24"/>
+        </w:rPr>
+        <w:t>Qg</w:t>
+      </w:r>
+      <w:r>
+        <w:rPr>
+          <w:rFonts w:ascii="Times New Roman" w:cs="Times New Roman" w:eastAsia="Times New Roman" w:hAnsi="Times New Roman"/>
+          <w:bCs w:val="false"/>
+          <w:iCs w:val="false"/>
+          <w:sz w:val="24"/>
+          <w:szCs w:val="24"/>
+        </w:rPr>
+        <w:t xml:space="preserve">θ/ψ ≤ 0, and the second is negative whenever </w:t>
+      </w:r>
+      <w:r>
+        <w:rPr>
+          <w:rFonts w:ascii="Times New Roman" w:cs="Times New Roman" w:eastAsia="Times New Roman" w:hAnsi="Times New Roman"/>
+          <w:bCs w:val="false"/>
+          <w:i/>
+          <w:iCs w:val="false"/>
+          <w:sz w:val="24"/>
+          <w:szCs w:val="24"/>
+        </w:rPr>
+        <w:t>e</w:t>
+      </w:r>
+      <w:r>
+        <w:rPr>
+          <w:rFonts w:ascii="Times New Roman" w:cs="Times New Roman" w:eastAsia="Times New Roman" w:hAnsi="Times New Roman"/>
+          <w:bCs w:val="false"/>
+          <w:iCs w:val="false"/>
+          <w:sz w:val="24"/>
+          <w:szCs w:val="24"/>
+        </w:rPr>
+        <w:t xml:space="preserve"> &gt; 0. For larger β both terms are negative, so surplus is strictly decreasing on [</w:t>
+      </w:r>
+      <w:r>
+        <w:rPr>
+          <w:rFonts w:ascii="Times New Roman" w:cs="Times New Roman" w:eastAsia="Times New Roman" w:hAnsi="Times New Roman"/>
+          <w:bCs w:val="false"/>
+          <w:i/>
+          <w:iCs w:val="false"/>
+          <w:sz w:val="24"/>
+          <w:szCs w:val="24"/>
+        </w:rPr>
+        <w:t>g</w:t>
+      </w:r>
+      <w:r>
+        <w:rPr>
+          <w:rFonts w:ascii="Times New Roman" w:cs="Times New Roman" w:eastAsia="Times New Roman" w:hAnsi="Times New Roman"/>
+          <w:bCs w:val="false"/>
+          <w:iCs w:val="false"/>
+          <w:sz w:val="24"/>
+          <w:szCs w:val="24"/>
+        </w:rPr>
+        <w:t xml:space="preserve">/θ, ∞). Whenever the judge can be gamed (Δ &gt; 0), the optimal intensity therefore lies strictly below </w:t>
+      </w:r>
+      <w:r>
+        <w:rPr>
+          <w:rFonts w:ascii="Times New Roman" w:cs="Times New Roman" w:eastAsia="Times New Roman" w:hAnsi="Times New Roman"/>
+          <w:bCs w:val="false"/>
+          <w:i/>
+          <w:iCs w:val="false"/>
+          <w:sz w:val="24"/>
+          <w:szCs w:val="24"/>
+        </w:rPr>
+        <w:t>g</w:t>
+      </w:r>
+      <w:r>
+        <w:rPr>
+          <w:rFonts w:ascii="Times New Roman" w:cs="Times New Roman" w:eastAsia="Times New Roman" w:hAnsi="Times New Roman"/>
+          <w:bCs w:val="false"/>
+          <w:iCs w:val="false"/>
+          <w:sz w:val="24"/>
+          <w:szCs w:val="24"/>
+        </w:rPr>
+        <w:t xml:space="preserve">/θ: the organization underincentivizes honest effort in order to limit gaming. At β = 0 we have </w:t>
+      </w:r>
+      <w:r>
+        <w:rPr>
+          <w:rFonts w:ascii="Times New Roman" w:cs="Times New Roman" w:eastAsia="Times New Roman" w:hAnsi="Times New Roman"/>
+          <w:bCs w:val="false"/>
+          <w:i/>
+          <w:iCs w:val="false"/>
+          <w:sz w:val="24"/>
+          <w:szCs w:val="24"/>
+        </w:rPr>
+        <w:t>a</w:t>
+      </w:r>
+      <w:r>
+        <w:rPr>
+          <w:rFonts w:ascii="Times New Roman" w:cs="Times New Roman" w:eastAsia="Times New Roman" w:hAnsi="Times New Roman"/>
+          <w:bCs w:val="false"/>
+          <w:iCs w:val="false"/>
+          <w:sz w:val="24"/>
+          <w:szCs w:val="24"/>
+        </w:rPr>
+        <w:t xml:space="preserve"> = 0, </w:t>
+      </w:r>
+      <w:r>
+        <w:rPr>
+          <w:rFonts w:ascii="Times New Roman" w:cs="Times New Roman" w:eastAsia="Times New Roman" w:hAnsi="Times New Roman"/>
+          <w:bCs w:val="false"/>
+          <w:i/>
+          <w:iCs w:val="false"/>
+          <w:sz w:val="24"/>
+          <w:szCs w:val="24"/>
+        </w:rPr>
+        <w:t>e</w:t>
+      </w:r>
+      <w:r>
+        <w:rPr>
+          <w:rFonts w:ascii="Times New Roman" w:cs="Times New Roman" w:eastAsia="Times New Roman" w:hAnsi="Times New Roman"/>
+          <w:bCs w:val="false"/>
+          <w:iCs w:val="false"/>
+          <w:sz w:val="24"/>
+          <w:szCs w:val="24"/>
+        </w:rPr>
+        <w:t xml:space="preserve"> = 0, and </w:t>
+      </w:r>
+      <w:r>
+        <w:rPr>
+          <w:rFonts w:ascii="Times New Roman" w:cs="Times New Roman" w:eastAsia="Times New Roman" w:hAnsi="Times New Roman"/>
+          <w:bCs w:val="false"/>
+          <w:i/>
+          <w:iCs w:val="false"/>
+          <w:sz w:val="24"/>
+          <w:szCs w:val="24"/>
+        </w:rPr>
+        <w:t>e</w:t>
+      </w:r>
+      <w:r>
+        <w:rPr>
+          <w:rFonts w:ascii="Times New Roman" w:cs="Times New Roman" w:eastAsia="Times New Roman" w:hAnsi="Times New Roman"/>
+          <w:bCs w:val="false"/>
+          <w:iCs w:val="false"/>
+          <w:sz w:val="24"/>
+          <w:szCs w:val="24"/>
+        </w:rPr>
+        <w:t>′(0) = Δ/κ, so that d</w:t>
+      </w:r>
+      <w:r>
+        <w:rPr>
+          <w:rFonts w:ascii="Times New Roman" w:cs="Times New Roman" w:eastAsia="Times New Roman" w:hAnsi="Times New Roman"/>
+          <w:bCs w:val="false"/>
+          <w:i/>
+          <w:iCs w:val="false"/>
+          <w:sz w:val="24"/>
+          <w:szCs w:val="24"/>
+        </w:rPr>
+        <w:t>S</w:t>
+      </w:r>
+      <w:r>
+        <w:rPr>
+          <w:rFonts w:ascii="Times New Roman" w:cs="Times New Roman" w:eastAsia="Times New Roman" w:hAnsi="Times New Roman"/>
+          <w:bCs w:val="false"/>
+          <w:iCs w:val="false"/>
+          <w:sz w:val="24"/>
+          <w:szCs w:val="24"/>
+        </w:rPr>
+        <w:t xml:space="preserve">/dβ = </w:t>
+      </w:r>
+      <w:r>
+        <w:rPr>
+          <w:rFonts w:ascii="Times New Roman" w:cs="Times New Roman" w:eastAsia="Times New Roman" w:hAnsi="Times New Roman"/>
+          <w:bCs w:val="false"/>
+          <w:i/>
+          <w:iCs w:val="false"/>
+          <w:sz w:val="24"/>
+          <w:szCs w:val="24"/>
+        </w:rPr>
+        <w:t>g</w:t>
+      </w:r>
+      <w:r>
+        <w:rPr>
+          <w:rFonts w:ascii="Times New Roman" w:cs="Times New Roman" w:eastAsia="Times New Roman" w:hAnsi="Times New Roman"/>
+          <w:bCs w:val="false"/>
+          <w:iCs w:val="false"/>
+          <w:sz w:val="24"/>
+          <w:szCs w:val="24"/>
+        </w:rPr>
+        <w:t xml:space="preserve">θ/ψ − </w:t>
+      </w:r>
+      <w:r>
+        <w:rPr>
+          <w:rFonts w:ascii="Times New Roman" w:cs="Times New Roman" w:eastAsia="Times New Roman" w:hAnsi="Times New Roman"/>
+          <w:bCs w:val="false"/>
+          <w:i/>
+          <w:iCs w:val="false"/>
+          <w:sz w:val="24"/>
+          <w:szCs w:val="24"/>
+        </w:rPr>
+        <w:t>N</w:t>
+      </w:r>
+      <w:r>
+        <w:rPr>
+          <w:rFonts w:ascii="Times New Roman" w:cs="Times New Roman" w:eastAsia="Times New Roman" w:hAnsi="Times New Roman"/>
+          <w:bCs w:val="false"/>
+          <w:iCs w:val="false"/>
+          <w:sz w:val="24"/>
+          <w:szCs w:val="24"/>
+        </w:rPr>
+        <w:t>(ρ</w:t>
+      </w:r>
+      <w:r>
+        <w:rPr>
+          <w:rFonts w:ascii="Times New Roman" w:cs="Times New Roman" w:eastAsia="Times New Roman" w:hAnsi="Times New Roman"/>
+          <w:bCs w:val="false"/>
+          <w:i/>
+          <w:iCs w:val="false"/>
+          <w:sz w:val="24"/>
+          <w:szCs w:val="24"/>
+        </w:rPr>
+        <w:t>s</w:t>
+      </w:r>
+      <w:r>
+        <w:rPr>
+          <w:rFonts w:ascii="Times New Roman" w:cs="Times New Roman" w:eastAsia="Times New Roman" w:hAnsi="Times New Roman"/>
+          <w:bCs w:val="false"/>
+          <w:iCs w:val="false"/>
+          <w:sz w:val="24"/>
+          <w:szCs w:val="24"/>
+        </w:rPr>
+        <w:t xml:space="preserve"> </w:t>
+      </w:r>
+      <w:r>
+        <w:rPr>
+          <w:rFonts w:ascii="Times New Roman" w:cs="Times New Roman" w:eastAsia="Times New Roman" w:hAnsi="Times New Roman"/>
+          <w:bCs w:val="false"/>
+          <w:i/>
+          <w:iCs w:val="false"/>
+          <w:sz w:val="24"/>
+          <w:szCs w:val="24"/>
+        </w:rPr>
+        <w:t>m</w:t>
+      </w:r>
+      <w:r>
+        <w:rPr>
+          <w:rFonts w:ascii="Times New Roman" w:cs="Times New Roman" w:eastAsia="Times New Roman" w:hAnsi="Times New Roman"/>
+          <w:bCs w:val="false"/>
+          <w:i/>
+          <w:iCs w:val="false"/>
+          <w:sz w:val="24"/>
+          <w:szCs w:val="24"/>
+          <w:vertAlign w:val="subscript"/>
+        </w:rPr>
+        <w:t>N</w:t>
+      </w:r>
+      <w:r>
+        <w:rPr>
+          <w:rFonts w:ascii="Times New Roman" w:cs="Times New Roman" w:eastAsia="Times New Roman" w:hAnsi="Times New Roman"/>
+          <w:bCs w:val="false"/>
+          <w:iCs w:val="false"/>
+          <w:sz w:val="24"/>
+          <w:szCs w:val="24"/>
+        </w:rPr>
+        <w:t xml:space="preserve"> + </w:t>
+      </w:r>
+      <w:r>
+        <w:rPr>
+          <w:rFonts w:ascii="Times New Roman" w:cs="Times New Roman" w:eastAsia="Times New Roman" w:hAnsi="Times New Roman"/>
+          <w:bCs w:val="false"/>
+          <w:i/>
+          <w:iCs w:val="false"/>
+          <w:sz w:val="24"/>
+          <w:szCs w:val="24"/>
+        </w:rPr>
+        <w:t>d</w:t>
+      </w:r>
+      <w:r>
+        <w:rPr>
+          <w:rFonts w:ascii="Times New Roman" w:cs="Times New Roman" w:eastAsia="Times New Roman" w:hAnsi="Times New Roman"/>
+          <w:bCs w:val="false"/>
+          <w:iCs w:val="false"/>
+          <w:sz w:val="24"/>
+          <w:szCs w:val="24"/>
+        </w:rPr>
+        <w:t>)Δ/κ. Marginal pay on the judge score is worth introducing only if</w:t>
+      </w:r>
+    </w:p>
+    <w:p>
+      <w:pPr>
+        <w:tabs>
+          <w:tab w:val="right" w:pos="9360"/>
+        </w:tabs>
+        <w:spacing w:after="160" w:before="160" w:line="480" w:lineRule="auto"/>
+        <w:jc w:val="center"/>
+      </w:pPr>
+      <w:r>
+        <w:rPr>
+          <w:rFonts w:ascii="Times New Roman" w:cs="Times New Roman" w:eastAsia="Times New Roman" w:hAnsi="Times New Roman"/>
+          <w:bCs w:val="false"/>
+          <w:i/>
+          <w:iCs/>
+          <w:sz w:val="24"/>
+          <w:szCs w:val="24"/>
+        </w:rPr>
+        <w:t>g</w:t>
+      </w:r>
+      <w:r>
+        <w:rPr>
+          <w:rFonts w:ascii="Times New Roman" w:cs="Times New Roman" w:eastAsia="Times New Roman" w:hAnsi="Times New Roman"/>
+          <w:bCs w:val="false"/>
+          <w:iCs/>
+          <w:sz w:val="24"/>
+          <w:szCs w:val="24"/>
+        </w:rPr>
+        <w:t>θκ  &gt;  ψ</w:t>
+      </w:r>
+      <w:r>
+        <w:rPr>
+          <w:rFonts w:ascii="Times New Roman" w:cs="Times New Roman" w:eastAsia="Times New Roman" w:hAnsi="Times New Roman"/>
+          <w:bCs w:val="false"/>
+          <w:i/>
+          <w:iCs/>
+          <w:sz w:val="24"/>
+          <w:szCs w:val="24"/>
+        </w:rPr>
+        <w:t>N</w:t>
+      </w:r>
+      <w:r>
+        <w:rPr>
+          <w:rFonts w:ascii="Times New Roman" w:cs="Times New Roman" w:eastAsia="Times New Roman" w:hAnsi="Times New Roman"/>
+          <w:bCs w:val="false"/>
+          <w:iCs/>
+          <w:sz w:val="24"/>
+          <w:szCs w:val="24"/>
+        </w:rPr>
+        <w:t>Δ(ρ</w:t>
+      </w:r>
+      <w:r>
+        <w:rPr>
+          <w:rFonts w:ascii="Times New Roman" w:cs="Times New Roman" w:eastAsia="Times New Roman" w:hAnsi="Times New Roman"/>
+          <w:bCs w:val="false"/>
+          <w:i/>
+          <w:iCs/>
+          <w:sz w:val="24"/>
+          <w:szCs w:val="24"/>
+        </w:rPr>
+        <w:t>s</w:t>
+      </w:r>
+      <w:r>
+        <w:rPr>
+          <w:rFonts w:ascii="Times New Roman" w:cs="Times New Roman" w:eastAsia="Times New Roman" w:hAnsi="Times New Roman"/>
+          <w:bCs w:val="false"/>
+          <w:iCs/>
+          <w:sz w:val="24"/>
+          <w:szCs w:val="24"/>
+        </w:rPr>
+        <w:t xml:space="preserve"> </w:t>
+      </w:r>
+      <w:r>
+        <w:rPr>
+          <w:rFonts w:ascii="Times New Roman" w:cs="Times New Roman" w:eastAsia="Times New Roman" w:hAnsi="Times New Roman"/>
+          <w:bCs w:val="false"/>
+          <w:i/>
+          <w:iCs/>
+          <w:sz w:val="24"/>
+          <w:szCs w:val="24"/>
+        </w:rPr>
+        <w:t>m</w:t>
+      </w:r>
+      <w:r>
+        <w:rPr>
+          <w:rFonts w:ascii="Times New Roman" w:cs="Times New Roman" w:eastAsia="Times New Roman" w:hAnsi="Times New Roman"/>
+          <w:bCs w:val="false"/>
+          <w:i/>
+          <w:iCs/>
+          <w:sz w:val="24"/>
+          <w:szCs w:val="24"/>
+          <w:vertAlign w:val="subscript"/>
+        </w:rPr>
+        <w:t>N</w:t>
+      </w:r>
+      <w:r>
+        <w:rPr>
+          <w:rFonts w:ascii="Times New Roman" w:cs="Times New Roman" w:eastAsia="Times New Roman" w:hAnsi="Times New Roman"/>
+          <w:bCs w:val="false"/>
+          <w:iCs/>
+          <w:sz w:val="24"/>
+          <w:szCs w:val="24"/>
+        </w:rPr>
+        <w:t xml:space="preserve"> + </w:t>
+      </w:r>
+      <w:r>
+        <w:rPr>
+          <w:rFonts w:ascii="Times New Roman" w:cs="Times New Roman" w:eastAsia="Times New Roman" w:hAnsi="Times New Roman"/>
+          <w:bCs w:val="false"/>
+          <w:i/>
+          <w:iCs/>
+          <w:sz w:val="24"/>
+          <w:szCs w:val="24"/>
+        </w:rPr>
+        <w:t>d</w:t>
+      </w:r>
+      <w:r>
+        <w:rPr>
+          <w:rFonts w:ascii="Times New Roman" w:cs="Times New Roman" w:eastAsia="Times New Roman" w:hAnsi="Times New Roman"/>
+          <w:bCs w:val="false"/>
+          <w:iCs/>
+          <w:sz w:val="24"/>
+          <w:szCs w:val="24"/>
+        </w:rPr>
+        <w:t>)</w:t>
+        <w:tab/>
+        <w:t>(G4)</w:t>
+      </w:r>
+    </w:p>
+    <w:p>
+      <w:pPr>
+        <w:spacing w:after="0" w:before="0" w:line="480" w:lineRule="auto"/>
+        <w:ind w:firstLine="720"/>
+        <w:jc w:val="left"/>
+      </w:pPr>
+      <w:r>
+        <w:rPr>
+          <w:rFonts w:ascii="Times New Roman" w:cs="Times New Roman" w:eastAsia="Times New Roman" w:hAnsi="Times New Roman"/>
+          <w:bCs w:val="false"/>
+          <w:iCs w:val="false"/>
+          <w:sz w:val="24"/>
+          <w:szCs w:val="24"/>
+        </w:rPr>
+        <w:t>When (G4) fails, gaming is cheap enough relative to the value of honest effort that the first unit of judge-linked pay lowers surplus.</w:t>
+      </w:r>
+    </w:p>
+    <w:p>
+      <w:pPr>
+        <w:spacing w:after="0" w:before="0" w:line="480" w:lineRule="auto"/>
+        <w:ind w:firstLine="720"/>
+        <w:jc w:val="left"/>
+      </w:pPr>
+      <w:r>
+        <w:rPr>
+          <w:rFonts w:ascii="Times New Roman" w:cs="Times New Roman" w:eastAsia="Times New Roman" w:hAnsi="Times New Roman"/>
+          <w:bCs w:val="false"/>
+          <w:i/>
+          <w:iCs w:val="false"/>
+          <w:sz w:val="24"/>
+          <w:szCs w:val="24"/>
+        </w:rPr>
+        <w:t>Step 4: deterrence that requires over-incentivizing.</w:t>
+      </w:r>
+      <w:r>
+        <w:rPr>
+          <w:rFonts w:ascii="Times New Roman" w:cs="Times New Roman" w:eastAsia="Times New Roman" w:hAnsi="Times New Roman"/>
+          <w:bCs w:val="false"/>
+          <w:iCs w:val="false"/>
+          <w:sz w:val="24"/>
+          <w:szCs w:val="24"/>
+        </w:rPr>
+        <w:t xml:space="preserve"> If φ &gt; 0 but β</w:t>
+      </w:r>
+      <w:r>
+        <w:rPr>
+          <w:rFonts w:ascii="Times New Roman" w:cs="Times New Roman" w:eastAsia="Times New Roman" w:hAnsi="Times New Roman"/>
+          <w:bCs w:val="false"/>
+          <w:iCs w:val="false"/>
+          <w:sz w:val="24"/>
+          <w:szCs w:val="24"/>
+          <w:vertAlign w:val="subscript"/>
+        </w:rPr>
+        <w:t>d</w:t>
+      </w:r>
+      <w:r>
+        <w:rPr>
+          <w:rFonts w:ascii="Times New Roman" w:cs="Times New Roman" w:eastAsia="Times New Roman" w:hAnsi="Times New Roman"/>
+          <w:bCs w:val="false"/>
+          <w:iCs w:val="false"/>
+          <w:sz w:val="24"/>
+          <w:szCs w:val="24"/>
+        </w:rPr>
+        <w:t xml:space="preserve"> &gt; </w:t>
+      </w:r>
+      <w:r>
+        <w:rPr>
+          <w:rFonts w:ascii="Times New Roman" w:cs="Times New Roman" w:eastAsia="Times New Roman" w:hAnsi="Times New Roman"/>
+          <w:bCs w:val="false"/>
+          <w:i/>
+          <w:iCs w:val="false"/>
+          <w:sz w:val="24"/>
+          <w:szCs w:val="24"/>
+        </w:rPr>
+        <w:t>g</w:t>
+      </w:r>
+      <w:r>
+        <w:rPr>
+          <w:rFonts w:ascii="Times New Roman" w:cs="Times New Roman" w:eastAsia="Times New Roman" w:hAnsi="Times New Roman"/>
+          <w:bCs w:val="false"/>
+          <w:iCs w:val="false"/>
+          <w:sz w:val="24"/>
+          <w:szCs w:val="24"/>
+        </w:rPr>
+        <w:t>/θ, pay at the first-best intensity does not deter exploitation. The organization can raise β to β</w:t>
+      </w:r>
+      <w:r>
+        <w:rPr>
+          <w:rFonts w:ascii="Times New Roman" w:cs="Times New Roman" w:eastAsia="Times New Roman" w:hAnsi="Times New Roman"/>
+          <w:bCs w:val="false"/>
+          <w:iCs w:val="false"/>
+          <w:sz w:val="24"/>
+          <w:szCs w:val="24"/>
+          <w:vertAlign w:val="subscript"/>
+        </w:rPr>
+        <w:t>d</w:t>
+      </w:r>
+      <w:r>
+        <w:rPr>
+          <w:rFonts w:ascii="Times New Roman" w:cs="Times New Roman" w:eastAsia="Times New Roman" w:hAnsi="Times New Roman"/>
+          <w:bCs w:val="false"/>
+          <w:iCs w:val="false"/>
+          <w:sz w:val="24"/>
+          <w:szCs w:val="24"/>
+        </w:rPr>
+        <w:t xml:space="preserve">, which eliminates exploitation at the price of an honest effort </w:t>
+      </w:r>
+      <w:r>
+        <w:rPr>
+          <w:rFonts w:ascii="Times New Roman" w:cs="Times New Roman" w:eastAsia="Times New Roman" w:hAnsi="Times New Roman"/>
+          <w:bCs w:val="false"/>
+          <w:i/>
+          <w:iCs w:val="false"/>
+          <w:sz w:val="24"/>
+          <w:szCs w:val="24"/>
+        </w:rPr>
+        <w:t>a</w:t>
+      </w:r>
+      <w:r>
+        <w:rPr>
+          <w:rFonts w:ascii="Times New Roman" w:cs="Times New Roman" w:eastAsia="Times New Roman" w:hAnsi="Times New Roman"/>
+          <w:bCs w:val="false"/>
+          <w:iCs w:val="false"/>
+          <w:sz w:val="24"/>
+          <w:szCs w:val="24"/>
+        </w:rPr>
+        <w:t xml:space="preserve"> = β</w:t>
+      </w:r>
+      <w:r>
+        <w:rPr>
+          <w:rFonts w:ascii="Times New Roman" w:cs="Times New Roman" w:eastAsia="Times New Roman" w:hAnsi="Times New Roman"/>
+          <w:bCs w:val="false"/>
+          <w:iCs w:val="false"/>
+          <w:sz w:val="24"/>
+          <w:szCs w:val="24"/>
+          <w:vertAlign w:val="subscript"/>
+        </w:rPr>
+        <w:t>d</w:t>
+      </w:r>
+      <w:r>
+        <w:rPr>
+          <w:rFonts w:ascii="Times New Roman" w:cs="Times New Roman" w:eastAsia="Times New Roman" w:hAnsi="Times New Roman"/>
+          <w:bCs w:val="false"/>
+          <w:iCs w:val="false"/>
+          <w:sz w:val="24"/>
+          <w:szCs w:val="24"/>
+        </w:rPr>
+        <w:t xml:space="preserve">θ/ψ above </w:t>
+      </w:r>
+      <w:r>
+        <w:rPr>
+          <w:rFonts w:ascii="Times New Roman" w:cs="Times New Roman" w:eastAsia="Times New Roman" w:hAnsi="Times New Roman"/>
+          <w:bCs w:val="false"/>
+          <w:i/>
+          <w:iCs w:val="false"/>
+          <w:sz w:val="24"/>
+          <w:szCs w:val="24"/>
+        </w:rPr>
+        <w:t>g</w:t>
+      </w:r>
+      <w:r>
+        <w:rPr>
+          <w:rFonts w:ascii="Times New Roman" w:cs="Times New Roman" w:eastAsia="Times New Roman" w:hAnsi="Times New Roman"/>
+          <w:bCs w:val="false"/>
+          <w:iCs w:val="false"/>
+          <w:sz w:val="24"/>
+          <w:szCs w:val="24"/>
+        </w:rPr>
+        <w:t>/ψ and a loss of ψ(</w:t>
+      </w:r>
+      <w:r>
+        <w:rPr>
+          <w:rFonts w:ascii="Times New Roman" w:cs="Times New Roman" w:eastAsia="Times New Roman" w:hAnsi="Times New Roman"/>
+          <w:bCs w:val="false"/>
+          <w:i/>
+          <w:iCs w:val="false"/>
+          <w:sz w:val="24"/>
+          <w:szCs w:val="24"/>
+        </w:rPr>
+        <w:t>a</w:t>
+      </w:r>
+      <w:r>
+        <w:rPr>
+          <w:rFonts w:ascii="Times New Roman" w:cs="Times New Roman" w:eastAsia="Times New Roman" w:hAnsi="Times New Roman"/>
+          <w:bCs w:val="false"/>
+          <w:iCs w:val="false"/>
+          <w:sz w:val="24"/>
+          <w:szCs w:val="24"/>
+        </w:rPr>
+        <w:t xml:space="preserve"> − </w:t>
+      </w:r>
+      <w:r>
+        <w:rPr>
+          <w:rFonts w:ascii="Times New Roman" w:cs="Times New Roman" w:eastAsia="Times New Roman" w:hAnsi="Times New Roman"/>
+          <w:bCs w:val="false"/>
+          <w:i/>
+          <w:iCs w:val="false"/>
+          <w:sz w:val="24"/>
+          <w:szCs w:val="24"/>
+        </w:rPr>
+        <w:t>g</w:t>
+      </w:r>
+      <w:r>
+        <w:rPr>
+          <w:rFonts w:ascii="Times New Roman" w:cs="Times New Roman" w:eastAsia="Times New Roman" w:hAnsi="Times New Roman"/>
+          <w:bCs w:val="false"/>
+          <w:iCs w:val="false"/>
+          <w:sz w:val="24"/>
+          <w:szCs w:val="24"/>
+        </w:rPr>
+        <w:t>/ψ)²/2, or it can accept some exploitation at a lower β. Which is better depends on the parameters.</w:t>
+      </w:r>
+    </w:p>
+    <w:p>
+      <w:pPr>
+        <w:spacing w:after="0" w:before="0" w:line="480" w:lineRule="auto"/>
+        <w:ind w:firstLine="720"/>
+        <w:jc w:val="left"/>
+      </w:pPr>
+      <w:r>
+        <w:rPr>
+          <w:rFonts w:ascii="Times New Roman" w:cs="Times New Roman" w:eastAsia="Times New Roman" w:hAnsi="Times New Roman"/>
+          <w:bCs w:val="false"/>
+          <w:i/>
+          <w:iCs w:val="false"/>
+          <w:sz w:val="24"/>
+          <w:szCs w:val="24"/>
+        </w:rPr>
+        <w:t>Illustration.</w:t>
+      </w:r>
+      <w:r>
+        <w:rPr>
+          <w:rFonts w:ascii="Times New Roman" w:cs="Times New Roman" w:eastAsia="Times New Roman" w:hAnsi="Times New Roman"/>
+          <w:bCs w:val="false"/>
+          <w:iCs w:val="false"/>
+          <w:sz w:val="24"/>
+          <w:szCs w:val="24"/>
+        </w:rPr>
+        <w:t xml:space="preserve"> Take </w:t>
+      </w:r>
+      <w:r>
+        <w:rPr>
+          <w:rFonts w:ascii="Times New Roman" w:cs="Times New Roman" w:eastAsia="Times New Roman" w:hAnsi="Times New Roman"/>
+          <w:bCs w:val="false"/>
+          <w:i/>
+          <w:iCs w:val="false"/>
+          <w:sz w:val="24"/>
+          <w:szCs w:val="24"/>
+        </w:rPr>
+        <w:t>g</w:t>
+      </w:r>
+      <w:r>
+        <w:rPr>
+          <w:rFonts w:ascii="Times New Roman" w:cs="Times New Roman" w:eastAsia="Times New Roman" w:hAnsi="Times New Roman"/>
+          <w:bCs w:val="false"/>
+          <w:iCs w:val="false"/>
+          <w:sz w:val="24"/>
+          <w:szCs w:val="24"/>
+        </w:rPr>
+        <w:t xml:space="preserve"> = 1, ψ = 1, θ = 0.7, σ</w:t>
+      </w:r>
+      <w:r>
+        <w:rPr>
+          <w:rFonts w:ascii="Times New Roman" w:cs="Times New Roman" w:eastAsia="Times New Roman" w:hAnsi="Times New Roman"/>
+          <w:bCs w:val="false"/>
+          <w:iCs w:val="false"/>
+          <w:sz w:val="24"/>
+          <w:szCs w:val="24"/>
+          <w:vertAlign w:val="subscript"/>
+        </w:rPr>
+        <w:t>J</w:t>
+      </w:r>
+      <w:r>
+        <w:rPr>
+          <w:rFonts w:ascii="Times New Roman" w:cs="Times New Roman" w:eastAsia="Times New Roman" w:hAnsi="Times New Roman"/>
+          <w:bCs w:val="false"/>
+          <w:iCs w:val="false"/>
+          <w:sz w:val="24"/>
+          <w:szCs w:val="24"/>
+        </w:rPr>
+        <w:t xml:space="preserve"> = 1, ρ</w:t>
+      </w:r>
+      <w:r>
+        <w:rPr>
+          <w:rFonts w:ascii="Times New Roman" w:cs="Times New Roman" w:eastAsia="Times New Roman" w:hAnsi="Times New Roman"/>
+          <w:bCs w:val="false"/>
+          <w:i/>
+          <w:iCs w:val="false"/>
+          <w:sz w:val="24"/>
+          <w:szCs w:val="24"/>
+        </w:rPr>
+        <w:t>s</w:t>
+      </w:r>
+      <w:r>
+        <w:rPr>
+          <w:rFonts w:ascii="Times New Roman" w:cs="Times New Roman" w:eastAsia="Times New Roman" w:hAnsi="Times New Roman"/>
+          <w:bCs w:val="false"/>
+          <w:iCs w:val="false"/>
+          <w:sz w:val="24"/>
+          <w:szCs w:val="24"/>
+        </w:rPr>
+        <w:t xml:space="preserve"> = 0.6, Δ = 1, </w:t>
+      </w:r>
+      <w:r>
+        <w:rPr>
+          <w:rFonts w:ascii="Times New Roman" w:cs="Times New Roman" w:eastAsia="Times New Roman" w:hAnsi="Times New Roman"/>
+          <w:bCs w:val="false"/>
+          <w:i/>
+          <w:iCs w:val="false"/>
+          <w:sz w:val="24"/>
+          <w:szCs w:val="24"/>
+        </w:rPr>
+        <w:t>d</w:t>
+      </w:r>
+      <w:r>
+        <w:rPr>
+          <w:rFonts w:ascii="Times New Roman" w:cs="Times New Roman" w:eastAsia="Times New Roman" w:hAnsi="Times New Roman"/>
+          <w:bCs w:val="false"/>
+          <w:iCs w:val="false"/>
+          <w:sz w:val="24"/>
+          <w:szCs w:val="24"/>
+        </w:rPr>
+        <w:t xml:space="preserve"> = 2, κ = 4, </w:t>
+      </w:r>
+      <w:r>
+        <w:rPr>
+          <w:rFonts w:ascii="Times New Roman" w:cs="Times New Roman" w:eastAsia="Times New Roman" w:hAnsi="Times New Roman"/>
+          <w:bCs w:val="false"/>
+          <w:i/>
+          <w:iCs w:val="false"/>
+          <w:sz w:val="24"/>
+          <w:szCs w:val="24"/>
+        </w:rPr>
+        <w:t>c</w:t>
+      </w:r>
+      <w:r>
+        <w:rPr>
+          <w:rFonts w:ascii="Times New Roman" w:cs="Times New Roman" w:eastAsia="Times New Roman" w:hAnsi="Times New Roman"/>
+          <w:bCs w:val="false"/>
+          <w:i/>
+          <w:iCs w:val="false"/>
+          <w:sz w:val="24"/>
+          <w:szCs w:val="24"/>
+          <w:vertAlign w:val="subscript"/>
+        </w:rPr>
+        <w:t>s</w:t>
+      </w:r>
+      <w:r>
+        <w:rPr>
+          <w:rFonts w:ascii="Times New Roman" w:cs="Times New Roman" w:eastAsia="Times New Roman" w:hAnsi="Times New Roman"/>
+          <w:bCs w:val="false"/>
+          <w:iCs w:val="false"/>
+          <w:sz w:val="24"/>
+          <w:szCs w:val="24"/>
+        </w:rPr>
+        <w:t xml:space="preserve"> = 0.01, </w:t>
+      </w:r>
+      <w:r>
+        <w:rPr>
+          <w:rFonts w:ascii="Times New Roman" w:cs="Times New Roman" w:eastAsia="Times New Roman" w:hAnsi="Times New Roman"/>
+          <w:bCs w:val="false"/>
+          <w:i/>
+          <w:iCs w:val="false"/>
+          <w:sz w:val="24"/>
+          <w:szCs w:val="24"/>
+        </w:rPr>
+        <w:t>c</w:t>
+      </w:r>
+      <w:r>
+        <w:rPr>
+          <w:rFonts w:ascii="Times New Roman" w:cs="Times New Roman" w:eastAsia="Times New Roman" w:hAnsi="Times New Roman"/>
+          <w:bCs w:val="false"/>
+          <w:i/>
+          <w:iCs w:val="false"/>
+          <w:sz w:val="24"/>
+          <w:szCs w:val="24"/>
+          <w:vertAlign w:val="subscript"/>
+        </w:rPr>
+        <w:t>G</w:t>
+      </w:r>
+      <w:r>
+        <w:rPr>
+          <w:rFonts w:ascii="Times New Roman" w:cs="Times New Roman" w:eastAsia="Times New Roman" w:hAnsi="Times New Roman"/>
+          <w:bCs w:val="false"/>
+          <w:iCs w:val="false"/>
+          <w:sz w:val="24"/>
+          <w:szCs w:val="24"/>
+        </w:rPr>
+        <w:t xml:space="preserve"> = 0.05, and </w:t>
+      </w:r>
+      <w:r>
+        <w:rPr>
+          <w:rFonts w:ascii="Times New Roman" w:cs="Times New Roman" w:eastAsia="Times New Roman" w:hAnsi="Times New Roman"/>
+          <w:bCs w:val="false"/>
+          <w:i/>
+          <w:iCs w:val="false"/>
+          <w:sz w:val="24"/>
+          <w:szCs w:val="24"/>
+        </w:rPr>
+        <w:t>N</w:t>
+      </w:r>
+      <w:r>
+        <w:rPr>
+          <w:rFonts w:ascii="Times New Roman" w:cs="Times New Roman" w:eastAsia="Times New Roman" w:hAnsi="Times New Roman"/>
+          <w:bCs w:val="false"/>
+          <w:iCs w:val="false"/>
+          <w:sz w:val="24"/>
+          <w:szCs w:val="24"/>
+        </w:rPr>
+        <w:t xml:space="preserve"> = 4, so that </w:t>
+      </w:r>
+      <w:r>
+        <w:rPr>
+          <w:rFonts w:ascii="Times New Roman" w:cs="Times New Roman" w:eastAsia="Times New Roman" w:hAnsi="Times New Roman"/>
+          <w:bCs w:val="false"/>
+          <w:i/>
+          <w:iCs w:val="false"/>
+          <w:sz w:val="24"/>
+          <w:szCs w:val="24"/>
+        </w:rPr>
+        <w:t>m</w:t>
+      </w:r>
+      <w:r>
+        <w:rPr>
+          <w:rFonts w:ascii="Times New Roman" w:cs="Times New Roman" w:eastAsia="Times New Roman" w:hAnsi="Times New Roman"/>
+          <w:bCs w:val="false"/>
+          <w:i/>
+          <w:iCs w:val="false"/>
+          <w:sz w:val="24"/>
+          <w:szCs w:val="24"/>
+          <w:vertAlign w:val="subscript"/>
+        </w:rPr>
+        <w:t>N</w:t>
+      </w:r>
+      <w:r>
+        <w:rPr>
+          <w:rFonts w:ascii="Times New Roman" w:cs="Times New Roman" w:eastAsia="Times New Roman" w:hAnsi="Times New Roman"/>
+          <w:bCs w:val="false"/>
+          <w:iCs w:val="false"/>
+          <w:sz w:val="24"/>
+          <w:szCs w:val="24"/>
+        </w:rPr>
+        <w:t xml:space="preserve"> = 1.03 and β</w:t>
+      </w:r>
+      <w:r>
+        <w:rPr>
+          <w:rFonts w:ascii="Times New Roman" w:cs="Times New Roman" w:eastAsia="Times New Roman" w:hAnsi="Times New Roman"/>
+          <w:bCs w:val="false"/>
+          <w:iCs w:val="false"/>
+          <w:sz w:val="24"/>
+          <w:szCs w:val="24"/>
+          <w:vertAlign w:val="superscript"/>
+        </w:rPr>
+        <w:t>FB</w:t>
+      </w:r>
+      <w:r>
+        <w:rPr>
+          <w:rFonts w:ascii="Times New Roman" w:cs="Times New Roman" w:eastAsia="Times New Roman" w:hAnsi="Times New Roman"/>
+          <w:bCs w:val="false"/>
+          <w:iCs w:val="false"/>
+          <w:sz w:val="24"/>
+          <w:szCs w:val="24"/>
+        </w:rPr>
+        <w:t xml:space="preserve"> = 1.43. Without inspection, (G4) fails (2.8 against 10.5), and the optimal pay is zero, with surplus 0.578. With inspection of power φ = 0.4, β</w:t>
+      </w:r>
+      <w:r>
+        <w:rPr>
+          <w:rFonts w:ascii="Times New Roman" w:cs="Times New Roman" w:eastAsia="Times New Roman" w:hAnsi="Times New Roman"/>
+          <w:bCs w:val="false"/>
+          <w:iCs w:val="false"/>
+          <w:sz w:val="24"/>
+          <w:szCs w:val="24"/>
+          <w:vertAlign w:val="subscript"/>
+        </w:rPr>
+        <w:t>d</w:t>
+      </w:r>
+      <w:r>
+        <w:rPr>
+          <w:rFonts w:ascii="Times New Roman" w:cs="Times New Roman" w:eastAsia="Times New Roman" w:hAnsi="Times New Roman"/>
+          <w:bCs w:val="false"/>
+          <w:iCs w:val="false"/>
+          <w:sz w:val="24"/>
+          <w:szCs w:val="24"/>
+        </w:rPr>
+        <w:t xml:space="preserve"> = 0.96 lies below 1.43, so full-strength pay is optimal and surplus equals </w:t>
+      </w:r>
+      <w:r>
+        <w:rPr>
+          <w:rFonts w:ascii="Times New Roman" w:cs="Times New Roman" w:eastAsia="Times New Roman" w:hAnsi="Times New Roman"/>
+          <w:bCs w:val="false"/>
+          <w:i/>
+          <w:iCs w:val="false"/>
+          <w:sz w:val="24"/>
+          <w:szCs w:val="24"/>
+        </w:rPr>
+        <w:t>S</w:t>
+      </w:r>
+      <w:r>
+        <w:rPr>
+          <w:rFonts w:ascii="Times New Roman" w:cs="Times New Roman" w:eastAsia="Times New Roman" w:hAnsi="Times New Roman"/>
+          <w:bCs w:val="false"/>
+          <w:iCs w:val="false"/>
+          <w:sz w:val="24"/>
+          <w:szCs w:val="24"/>
+          <w:vertAlign w:val="superscript"/>
+        </w:rPr>
+        <w:t>FB</w:t>
+      </w:r>
+      <w:r>
+        <w:rPr>
+          <w:rFonts w:ascii="Times New Roman" w:cs="Times New Roman" w:eastAsia="Times New Roman" w:hAnsi="Times New Roman"/>
+          <w:bCs w:val="false"/>
+          <w:iCs w:val="false"/>
+          <w:sz w:val="24"/>
+          <w:szCs w:val="24"/>
+        </w:rPr>
+        <w:t xml:space="preserve"> = 1.028. Inspection raises surplus by 0.45 net of its cost. With φ = 0.2, β</w:t>
+      </w:r>
+      <w:r>
+        <w:rPr>
+          <w:rFonts w:ascii="Times New Roman" w:cs="Times New Roman" w:eastAsia="Times New Roman" w:hAnsi="Times New Roman"/>
+          <w:bCs w:val="false"/>
+          <w:iCs w:val="false"/>
+          <w:sz w:val="24"/>
+          <w:szCs w:val="24"/>
+          <w:vertAlign w:val="subscript"/>
+        </w:rPr>
+        <w:t>d</w:t>
+      </w:r>
+      <w:r>
+        <w:rPr>
+          <w:rFonts w:ascii="Times New Roman" w:cs="Times New Roman" w:eastAsia="Times New Roman" w:hAnsi="Times New Roman"/>
+          <w:bCs w:val="false"/>
+          <w:iCs w:val="false"/>
+          <w:sz w:val="24"/>
+          <w:szCs w:val="24"/>
+        </w:rPr>
+        <w:t xml:space="preserve"> = 6.06 exceeds 1.43, pay at the first-best intensity induces exploitation (</w:t>
+      </w:r>
+      <w:r>
+        <w:rPr>
+          <w:rFonts w:ascii="Times New Roman" w:cs="Times New Roman" w:eastAsia="Times New Roman" w:hAnsi="Times New Roman"/>
+          <w:bCs w:val="false"/>
+          <w:i/>
+          <w:iCs w:val="false"/>
+          <w:sz w:val="24"/>
+          <w:szCs w:val="24"/>
+        </w:rPr>
+        <w:t>e</w:t>
+      </w:r>
+      <w:r>
+        <w:rPr>
+          <w:rFonts w:ascii="Times New Roman" w:cs="Times New Roman" w:eastAsia="Times New Roman" w:hAnsi="Times New Roman"/>
+          <w:bCs w:val="false"/>
+          <w:iCs w:val="false"/>
+          <w:sz w:val="24"/>
+          <w:szCs w:val="24"/>
+        </w:rPr>
+        <w:t xml:space="preserve"> = 0.12) and a surplus of −0.30, and inspection adds nothing beyond its cost. Raising κ to 20 makes (G4) hold (1.34 times the threshold), and the optimal pay without inspection becomes positive but small (β</w:t>
+      </w:r>
+      <w:r>
+        <w:rPr>
+          <w:rFonts w:ascii="Times New Roman" w:cs="Times New Roman" w:eastAsia="Times New Roman" w:hAnsi="Times New Roman"/>
+          <w:bCs w:val="false"/>
+          <w:i/>
+          <w:iCs w:val="false"/>
+          <w:sz w:val="24"/>
+          <w:szCs w:val="24"/>
+        </w:rPr>
+        <w:t xml:space="preserve"> = 0.25, surplus 0.599 against 0.578 at zero pay). A highly gameable judge (Δ = 3) with φ = 0.4 has β</w:t>
+      </w:r>
+      <w:r>
+        <w:rPr>
+          <w:rFonts w:ascii="Times New Roman" w:cs="Times New Roman" w:eastAsia="Times New Roman" w:hAnsi="Times New Roman"/>
+          <w:bCs w:val="false"/>
+          <w:i/>
+          <w:iCs w:val="false"/>
+          <w:sz w:val="24"/>
+          <w:szCs w:val="24"/>
+          <w:vertAlign w:val="subscript"/>
+        </w:rPr>
+        <w:t>d</w:t>
+      </w:r>
+      <w:r>
+        <w:rPr>
+          <w:rFonts w:ascii="Times New Roman" w:cs="Times New Roman" w:eastAsia="Times New Roman" w:hAnsi="Times New Roman"/>
+          <w:bCs w:val="false"/>
+          <w:i/>
+          <w:iCs w:val="false"/>
+          <w:sz w:val="24"/>
+          <w:szCs w:val="24"/>
+        </w:rPr>
+        <w:t xml:space="preserve"> = 7.08, and the organization again sets β</w:t>
+      </w:r>
+      <w:r>
+        <w:rPr>
+          <w:rFonts w:ascii="Times New Roman" w:cs="Times New Roman" w:eastAsia="Times New Roman" w:hAnsi="Times New Roman"/>
+          <w:bCs w:val="false"/>
+          <w:iCs w:val="false"/>
+          <w:sz w:val="24"/>
+          <w:szCs w:val="24"/>
+        </w:rPr>
+        <w:t xml:space="preserve"> = 0. In 400 random parameter draws, surplus never exceeded the first best (G2).</w:t>
+      </w:r>
+    </w:p>
+    <w:p>
+      <w:pPr>
+        <w:spacing w:after="0" w:before="0" w:line="480" w:lineRule="auto"/>
+        <w:ind w:firstLine="720"/>
+        <w:jc w:val="left"/>
+      </w:pPr>
+      <w:r>
+        <w:rPr>
+          <w:rFonts w:ascii="Times New Roman" w:cs="Times New Roman" w:eastAsia="Times New Roman" w:hAnsi="Times New Roman"/>
+          <w:bCs w:val="false"/>
+          <w:i/>
+          <w:iCs w:val="false"/>
+          <w:sz w:val="24"/>
+          <w:szCs w:val="24"/>
+        </w:rPr>
+        <w:t>Scope.</w:t>
+      </w:r>
+      <w:r>
+        <w:rPr>
+          <w:rFonts w:ascii="Times New Roman" w:cs="Times New Roman" w:eastAsia="Times New Roman" w:hAnsi="Times New Roman"/>
+          <w:bCs w:val="false"/>
+          <w:iCs w:val="false"/>
+          <w:sz w:val="24"/>
+          <w:szCs w:val="24"/>
+        </w:rPr>
+        <w:t xml:space="preserve"> The model assumes risk neutrality, no limited liability, and a unique team equilibrium, which held in all numerical examples but is not proven. Search depth and inspection power are taken as given, and their joint choice with β is not analyzed. With limited liability the team would earn rents and the results would change. The comparison with Section 4 holds in direction only: a judge that is harder to game and more informative supports stronger pay, and a gameable one does not, but the experiments did not observe gaming or estimate any of the parameters.</w:t>
       </w:r>
     </w:p>
     <w:sectPr>

</xml_diff>

<commit_message>
Final pass: fix lost asterisks, notation collision, replication wording, align scripts with text
Co-Authored-By: Claude Sonnet 5.5 <noreply@anthropic.com>
Claude-Session: https://claude.ai/code/session_019zpN7r7iyrxAGMFgJVxuCB
</commit_message>
<xml_diff>
--- a/ISR_Staging_Commitment.docx
+++ b/ISR_Staging_Commitment.docx
@@ -3412,7 +3412,7 @@
           <w:sz w:val="24"/>
           <w:szCs w:val="24"/>
         </w:rPr>
-        <w:t xml:space="preserve"> increase. In a numerical example with ρ</w:t>
+        <w:t xml:space="preserve"> increase. In a numerical example without search cost and with ρ</w:t>
       </w:r>
       <w:r>
         <w:rPr>
@@ -6291,7 +6291,7 @@
           <w:sz w:val="24"/>
           <w:szCs w:val="24"/>
         </w:rPr>
-        <w:t xml:space="preserve"> = 0.05, and ζ = 0.4, the gold value is 0.0713 by formula and 0.0712 by simulation), and identity (8) was verified numerically.</w:t>
+        <w:t xml:space="preserve"> = 0.05, and ζ = 0.4, the gold value is 0.071 by formula and 0.070 by simulation with two million draws), and identity (8) was verified numerically.</w:t>
       </w:r>
     </w:p>
     <w:p>
@@ -10872,24 +10872,12 @@
           <w:sz w:val="24"/>
           <w:szCs w:val="24"/>
         </w:rPr>
-        <w:t xml:space="preserve"> = 0.12) and a surplus of −0.30, and inspection adds nothing beyond its cost. Raising κ to 20 makes (17) hold (1.34 times the threshold), and the optimal pay without inspection becomes positive but small (β</w:t>
-      </w:r>
-      <w:r>
-        <w:rPr>
-          <w:rFonts w:ascii="Times New Roman" w:cs="Times New Roman" w:eastAsia="Times New Roman" w:hAnsi="Times New Roman"/>
-          <w:bCs w:val="false"/>
-          <w:i/>
-          <w:iCs w:val="false"/>
-          <w:sz w:val="24"/>
-          <w:szCs w:val="24"/>
-        </w:rPr>
-        <w:t xml:space="preserve"> = 0.25, surplus 0.599 against 0.578 at zero pay). A highly gameable judge (Δ = 3) with ζ = 0.4 has β</w:t>
-      </w:r>
-      <w:r>
-        <w:rPr>
-          <w:rFonts w:ascii="Times New Roman" w:cs="Times New Roman" w:eastAsia="Times New Roman" w:hAnsi="Times New Roman"/>
-          <w:bCs w:val="false"/>
-          <w:i/>
+        <w:t xml:space="preserve"> = 0.12) and a surplus of −0.30, and inspection adds nothing beyond its cost. Raising κ to 20 makes (17) hold (1.34 times the threshold), and the optimal pay without inspection becomes positive but small (β* = 0.25, surplus 0.599 against 0.578 at zero pay). A highly gameable judge (Δ = 3) with ζ = 0.4 has β</w:t>
+      </w:r>
+      <w:r>
+        <w:rPr>
+          <w:rFonts w:ascii="Times New Roman" w:cs="Times New Roman" w:eastAsia="Times New Roman" w:hAnsi="Times New Roman"/>
+          <w:bCs w:val="false"/>
           <w:iCs w:val="false"/>
           <w:sz w:val="24"/>
           <w:szCs w:val="24"/>
@@ -10901,22 +10889,11 @@
         <w:rPr>
           <w:rFonts w:ascii="Times New Roman" w:cs="Times New Roman" w:eastAsia="Times New Roman" w:hAnsi="Times New Roman"/>
           <w:bCs w:val="false"/>
-          <w:i/>
-          <w:iCs w:val="false"/>
-          <w:sz w:val="24"/>
-          <w:szCs w:val="24"/>
-        </w:rPr>
-        <w:t xml:space="preserve"> = 7.08, and the organization again sets β</w:t>
-      </w:r>
-      <w:r>
-        <w:rPr>
-          <w:rFonts w:ascii="Times New Roman" w:cs="Times New Roman" w:eastAsia="Times New Roman" w:hAnsi="Times New Roman"/>
-          <w:bCs w:val="false"/>
-          <w:iCs w:val="false"/>
-          <w:sz w:val="24"/>
-          <w:szCs w:val="24"/>
-        </w:rPr>
-        <w:t xml:space="preserve"> = 0. In 400 random parameter draws, surplus never exceeded the first best (15).</w:t>
+          <w:iCs w:val="false"/>
+          <w:sz w:val="24"/>
+          <w:szCs w:val="24"/>
+        </w:rPr>
+        <w:t xml:space="preserve"> = 7.08, and the organization again sets β* = 0. In 400 random parameter draws, surplus never exceeded the first best (15).</w:t>
       </w:r>
     </w:p>
     <w:p>
@@ -12102,7 +12079,7 @@
           <w:sz w:val="24"/>
           <w:szCs w:val="24"/>
         </w:rPr>
-        <w:t>The design is deliberately small, so that every ticket, policy, and score can be printed. Readers can run the companion repository on a laptop CPU.</w:t>
+        <w:t>The design is deliberately small, so that every ticket, policy, and score can be printed. Replication materials that run on a laptop CPU will be provided.</w:t>
       </w:r>
     </w:p>
     <w:p>
@@ -14763,7 +14740,7 @@
           <w:sz w:val="24"/>
           <w:szCs w:val="24"/>
         </w:rPr>
-        <w:t>Three conclusions follow. First, search against a judge is not uniformly dangerous: with a strong judge on verifiable problems it improved correctness, and no divergence between judge score and gold was detectable. Second, the effect of search depends on the judge. The same procedure produced improvement under the strong judge and none under the weak judge, together with more cases in which judge score and correctness moved in opposite directions. Third, the judge approached its ceiling quickly under both designs, which limits what further search can reveal.</w:t>
+        <w:t>Three conclusions follow. First, search against a judge is not uniformly dangerous: with a strong judge on verifiable problems it improved correctness, and no divergence between judge score and gold was detectable. Second, the effect of search depends on the judge. The same procedure produced improvement under the strong judge and none under the weak judge, together with more cases in which judge score and correctness moved in opposite directions. Third, the strong judge approached its ceiling quickly under both designs, which limits what further search can reveal.</w:t>
       </w:r>
     </w:p>
     <w:p>
@@ -14780,7 +14757,7 @@
           <w:sz w:val="24"/>
           <w:szCs w:val="24"/>
         </w:rPr>
-        <w:t>Three conclusions do not follow. The experiments do not show that judges are generally gameable, because no deliberate gaming was observed in either design. They do not show that accuracy falls under a weak judge, because the interval for that difference includes zero. And they do not speak to open-ended tasks without a deterministic gold, to other models, or to organizations. The evidence is thus consistent with the mechanism of Section 3 as a conditional claim, in which the premium for waiting rises as the judge becomes less informative (Proposition 4), but it does not support the stronger claim that search against a judge selects cheats in general. The conditional pattern resembles the finding from studies of learned reward models, where optimization against a proxy first helps and later hurts as pressure grows (Gao et al. 2023). In the present experiments the strong judge stays in the region where search helps, and the weak judge shows no gain.</w:t>
+        <w:t>Three conclusions do not follow. The experiments do not show that judges are generally gameable, because no gaming was detected in either design. They do not show that accuracy falls under a weak judge, because the interval for that difference includes zero. And they do not speak to open-ended tasks without a deterministic gold, to other models, or to organizations. The evidence is thus consistent with the mechanism of Section 3 as a conditional claim, in which the premium for waiting rises as the judge becomes less informative (Proposition 4), but it does not support the stronger claim that search against a judge selects cheats in general. The conditional pattern resembles the finding from studies of learned reward models, where optimization against a proxy first helps and later hurts as pressure grows (Gao et al. 2023). In the present experiments the strong judge stays in the region where search helps, and the weak judge shows no gain.</w:t>
       </w:r>
     </w:p>
     <w:p>
@@ -17354,7 +17331,7 @@
           <w:sz w:val="24"/>
           <w:szCs w:val="24"/>
         </w:rPr>
-        <w:t>For this reason the paper is offered as a conceptual contribution rather than as a design-science artifact with a single instantiated gate. The gate in the companion repository demonstrates that the ledger can be written in code, but the theoretical claim concerns the menu of options organizations should keep and a risk class that the prior menu did not name.</w:t>
+        <w:t>For this reason the paper is offered as a conceptual contribution rather than as a design-science artifact with a single instantiated gate. The gate in the replication materials demonstrates that the ledger can be written in code, but the theoretical claim concerns the menu of options organizations should keep and a risk class that the prior menu did not name.</w:t>
       </w:r>
     </w:p>
     <w:p>
@@ -17566,7 +17543,7 @@
           <w:sz w:val="24"/>
           <w:szCs w:val="24"/>
         </w:rPr>
-        <w:t>The computational evidence is limited. The designed illustration is small and contains the cheat by construction. The empirical check covers one benchmark with verifiable answers, one policy model, two judges, and one optimizer. It cannot estimate option prices, recover β/(β − 1) thresholds, or speak to traffic at organizational scale, and the model versions it used will change. The field design above is the empirical companion, but it has not been executed. Until it is, the propositions are theoretically motivated and only computationally explored, which limits what the paper can say about how organizations behave.</w:t>
+        <w:t>The computational evidence is limited. The designed illustration is small and contains the cheat by construction. The empirical check covers one benchmark with verifiable answers, one policy model, two judges, and one optimizer. It cannot estimate option prices, recover closed-form investment thresholds, or speak to traffic at organizational scale, and the model versions it used will change. The field design above is the empirical companion, but it has not been executed. Until it is, the propositions are theoretically motivated and only computationally explored, which limits what the paper can say about how organizations behave.</w:t>
       </w:r>
     </w:p>
     <w:p>
@@ -23182,7 +23159,7 @@
           <w:sz w:val="24"/>
           <w:szCs w:val="24"/>
         </w:rPr>
-        <w:t xml:space="preserve"> The derivation is one-shot, Gaussian, and allows a single inspection. A continuous-time version with a geometric Brownian motion state would replace (C3) with the familiar multiple β/(β − 1) on </w:t>
+        <w:t xml:space="preserve"> The derivation is one-shot, Gaussian, and allows a single inspection. A continuous-time version with a geometric Brownian motion state would replace (C3) with the familiar closed-form multiple of the investment cost </w:t>
       </w:r>
       <w:r>
         <w:rPr>

</xml_diff>

<commit_message>
Compress designed illustration and Appendix C; restore Figure 1
Co-Authored-By: Claude Sonnet 5.5 <noreply@anthropic.com>
Claude-Session: https://claude.ai/code/session_019zpN7r7iyrxAGMFgJVxuCB
</commit_message>
<xml_diff>
--- a/ISR_Staging_Commitment.docx
+++ b/ISR_Staging_Commitment.docx
@@ -10301,7 +10301,28 @@
           <w:sz w:val="24"/>
           <w:szCs w:val="24"/>
         </w:rPr>
-        <w:t>The laboratory is a store support desk. Each ticket carries an order identifier and a correct act: refund, replace, refuse, or track. Gold quality G is a deterministic program that awards credit for taking the legal act, for naming the order, and for not inventing a tracking token. It makes no call to any model.</w:t>
+        <w:t xml:space="preserve">The laboratory is a store support desk. Each ticket has an order identifier and a correct act (refund, replace, refuse, or track), and gold quality </w:t>
+      </w:r>
+      <w:r>
+        <w:rPr>
+          <w:rFonts w:ascii="Times New Roman" w:cs="Times New Roman" w:eastAsia="Times New Roman" w:hAnsi="Times New Roman"/>
+          <w:bCs w:val="false"/>
+          <w:i/>
+          <w:iCs w:val="false"/>
+          <w:sz w:val="24"/>
+          <w:szCs w:val="24"/>
+        </w:rPr>
+        <w:t>G</w:t>
+      </w:r>
+      <w:r>
+        <w:rPr>
+          <w:rFonts w:ascii="Times New Roman" w:cs="Times New Roman" w:eastAsia="Times New Roman" w:hAnsi="Times New Roman"/>
+          <w:bCs w:val="false"/>
+          <w:iCs w:val="false"/>
+          <w:sz w:val="24"/>
+          <w:szCs w:val="24"/>
+        </w:rPr>
+        <w:t xml:space="preserve"> is a deterministic program that credits the legal act, naming the order, and not inventing a tracking token, with no call to any model. The twenty-two tickets comprise twelve development items that the search may see, eight frozen holdout items, and two refuse-class canaries written so that a rubric rewarding delight will favor an illegal grant of money. Eight named policies map onto four reply programs: redirect, plain legal, warm legal, and always refund, which is the cheat.</w:t>
       </w:r>
     </w:p>
     <w:p>
@@ -10318,7 +10339,47 @@
           <w:sz w:val="24"/>
           <w:szCs w:val="24"/>
         </w:rPr>
-        <w:t>The twenty-two tickets are divided into twelve development items that the search may see, eight frozen holdout items, and two canaries. The canaries are refuse-class requests written so that a rubric rewarding delight will favor an illegal grant of money. Eight named policies map onto four reply programs: redirect, plain legal, warm legal, and always refund. The last of these is the cheat.</w:t>
+        <w:t xml:space="preserve">Two judges implement </w:t>
+      </w:r>
+      <w:r>
+        <w:rPr>
+          <w:rFonts w:ascii="Times New Roman" w:cs="Times New Roman" w:eastAsia="Times New Roman" w:hAnsi="Times New Roman"/>
+          <w:bCs w:val="false"/>
+          <w:i/>
+          <w:iCs w:val="false"/>
+          <w:sz w:val="24"/>
+          <w:szCs w:val="24"/>
+        </w:rPr>
+        <w:t>J</w:t>
+      </w:r>
+      <w:r>
+        <w:rPr>
+          <w:rFonts w:ascii="Times New Roman" w:cs="Times New Roman" w:eastAsia="Times New Roman" w:hAnsi="Times New Roman"/>
+          <w:bCs w:val="false"/>
+          <w:iCs w:val="false"/>
+          <w:sz w:val="24"/>
+          <w:szCs w:val="24"/>
+        </w:rPr>
+        <w:t>: an inspectable lexicon-and-length rubric, with a drifted variant that leans toward yes, and SmolLM2-135M-Instruct, scored by the log-likelihood of Yes versus No under the same rubric text. The small model serves only as a judge, since it is not a competent policy generator for this task. The design is deliberately small so that every ticket, policy, and score can be printed, and replication materials that run on a laptop CPU will be provided.</w:t>
+      </w:r>
+    </w:p>
+    <w:p>
+      <w:pPr>
+        <w:pStyle w:val="Heading2"/>
+        <w:spacing w:after="200" w:before="280" w:line="480" w:lineRule="auto"/>
+        <w:jc w:val="center"/>
+      </w:pPr>
+      <w:r>
+        <w:rPr>
+          <w:rFonts w:ascii="Times New Roman" w:cs="Times New Roman" w:eastAsia="Times New Roman" w:hAnsi="Times New Roman"/>
+          <w:b/>
+          <w:bCs/>
+          <w:i w:val="false"/>
+          <w:iCs w:val="false"/>
+          <w:sz w:val="24"/>
+          <w:szCs w:val="24"/>
+        </w:rPr>
+        <w:t>5.2  A Designed Illustration: What the Ledger Shows</w:t>
       </w:r>
     </w:p>
     <w:p>
@@ -10335,7 +10396,7 @@
           <w:sz w:val="24"/>
           <w:szCs w:val="24"/>
         </w:rPr>
-        <w:t>Two judges implement J. The first is an inspectable lexicon-and-length rubric, accompanied by a drifted variant that leans toward yes. The second is SmolLM2-135M-Instruct, scored by the log-likelihood of Yes versus No under the same rubric text. The small model is used only as a judge. It is not a competent policy generator for this task, which is itself a finding about employing undersized open models as workers rather than as scorers.</w:t>
+        <w:t>Table 1 reports the objects named by the model.</w:t>
       </w:r>
     </w:p>
     <w:p>
@@ -10352,26 +10413,112 @@
           <w:sz w:val="24"/>
           <w:szCs w:val="24"/>
         </w:rPr>
-        <w:t>The design is deliberately small, so that every ticket, policy, and score can be printed. Replication materials that run on a laptop CPU will be provided.</w:t>
-      </w:r>
-    </w:p>
-    <w:p>
-      <w:pPr>
-        <w:pStyle w:val="Heading2"/>
-        <w:spacing w:after="200" w:before="280" w:line="480" w:lineRule="auto"/>
-        <w:jc w:val="center"/>
-      </w:pPr>
-      <w:r>
-        <w:rPr>
-          <w:rFonts w:ascii="Times New Roman" w:cs="Times New Roman" w:eastAsia="Times New Roman" w:hAnsi="Times New Roman"/>
-          <w:b/>
-          <w:bCs/>
-          <w:i w:val="false"/>
-          <w:iCs w:val="false"/>
-          <w:sz w:val="24"/>
-          <w:szCs w:val="24"/>
-        </w:rPr>
-        <w:t>5.2  A Designed Illustration: What the Ledger Shows</w:t>
+        <w:t xml:space="preserve">Applying Equation 2 to the development rubric selects always-refund, with </w:t>
+      </w:r>
+      <w:r>
+        <w:rPr>
+          <w:rFonts w:ascii="Times New Roman" w:cs="Times New Roman" w:eastAsia="Times New Roman" w:hAnsi="Times New Roman"/>
+          <w:bCs w:val="false"/>
+          <w:i/>
+          <w:iCs w:val="false"/>
+          <w:sz w:val="24"/>
+          <w:szCs w:val="24"/>
+        </w:rPr>
+        <w:t>J</w:t>
+      </w:r>
+      <w:r>
+        <w:rPr>
+          <w:rFonts w:ascii="Times New Roman" w:cs="Times New Roman" w:eastAsia="Times New Roman" w:hAnsi="Times New Roman"/>
+          <w:bCs w:val="false"/>
+          <w:iCs w:val="false"/>
+          <w:sz w:val="24"/>
+          <w:szCs w:val="24"/>
+        </w:rPr>
+        <w:t xml:space="preserve"> rising from 0.08 for redirect to 0.92, and its holdout </w:t>
+      </w:r>
+      <w:r>
+        <w:rPr>
+          <w:rFonts w:ascii="Times New Roman" w:cs="Times New Roman" w:eastAsia="Times New Roman" w:hAnsi="Times New Roman"/>
+          <w:bCs w:val="false"/>
+          <w:i/>
+          <w:iCs w:val="false"/>
+          <w:sz w:val="24"/>
+          <w:szCs w:val="24"/>
+        </w:rPr>
+        <w:t>G</w:t>
+      </w:r>
+      <w:r>
+        <w:rPr>
+          <w:rFonts w:ascii="Times New Roman" w:cs="Times New Roman" w:eastAsia="Times New Roman" w:hAnsi="Times New Roman"/>
+          <w:bCs w:val="false"/>
+          <w:iCs w:val="false"/>
+          <w:sz w:val="24"/>
+          <w:szCs w:val="24"/>
+        </w:rPr>
+        <w:t xml:space="preserve"> of 0.78 beats redirect, so Propositions 1 and 2 are visible in the same row: the cheat is the NPV winner, and the mixed holdout does not protect the organization. On the canaries, </w:t>
+      </w:r>
+      <w:r>
+        <w:rPr>
+          <w:rFonts w:ascii="Times New Roman" w:cs="Times New Roman" w:eastAsia="Times New Roman" w:hAnsi="Times New Roman"/>
+          <w:bCs w:val="false"/>
+          <w:i/>
+          <w:iCs w:val="false"/>
+          <w:sz w:val="24"/>
+          <w:szCs w:val="24"/>
+        </w:rPr>
+        <w:t>G</w:t>
+      </w:r>
+      <w:r>
+        <w:rPr>
+          <w:rFonts w:ascii="Times New Roman" w:cs="Times New Roman" w:eastAsia="Times New Roman" w:hAnsi="Times New Roman"/>
+          <w:bCs w:val="false"/>
+          <w:iCs w:val="false"/>
+          <w:sz w:val="24"/>
+          <w:szCs w:val="24"/>
+        </w:rPr>
+        <w:t xml:space="preserve"> is 0.55 for the cheat and 1.00 for the legal programs, whereas the rubric </w:t>
+      </w:r>
+      <w:r>
+        <w:rPr>
+          <w:rFonts w:ascii="Times New Roman" w:cs="Times New Roman" w:eastAsia="Times New Roman" w:hAnsi="Times New Roman"/>
+          <w:bCs w:val="false"/>
+          <w:i/>
+          <w:iCs w:val="false"/>
+          <w:sz w:val="24"/>
+          <w:szCs w:val="24"/>
+        </w:rPr>
+        <w:t>J</w:t>
+      </w:r>
+      <w:r>
+        <w:rPr>
+          <w:rFonts w:ascii="Times New Roman" w:cs="Times New Roman" w:eastAsia="Times New Roman" w:hAnsi="Times New Roman"/>
+          <w:bCs w:val="false"/>
+          <w:iCs w:val="false"/>
+          <w:sz w:val="24"/>
+          <w:szCs w:val="24"/>
+        </w:rPr>
+        <w:t xml:space="preserve"> is 0.92 for the cheat, so a canary floor of 0.70, together with a rule that a very high </w:t>
+      </w:r>
+      <w:r>
+        <w:rPr>
+          <w:rFonts w:ascii="Times New Roman" w:cs="Times New Roman" w:eastAsia="Times New Roman" w:hAnsi="Times New Roman"/>
+          <w:bCs w:val="false"/>
+          <w:i/>
+          <w:iCs w:val="false"/>
+          <w:sz w:val="24"/>
+          <w:szCs w:val="24"/>
+        </w:rPr>
+        <w:t>J</w:t>
+      </w:r>
+      <w:r>
+        <w:rPr>
+          <w:rFonts w:ascii="Times New Roman" w:cs="Times New Roman" w:eastAsia="Times New Roman" w:hAnsi="Times New Roman"/>
+          <w:bCs w:val="false"/>
+          <w:iCs w:val="false"/>
+          <w:sz w:val="24"/>
+          <w:szCs w:val="24"/>
+        </w:rPr>
+        <w:t xml:space="preserve"> on a refuse canary counts as evidence of cheating, exercises the put (Proposition 3).</w:t>
       </w:r>
     </w:p>
     <w:p>
@@ -10388,7 +10535,128 @@
           <w:sz w:val="24"/>
           <w:szCs w:val="24"/>
         </w:rPr>
-        <w:t>Table 1 reports the objects named by the model.</w:t>
+        <w:t xml:space="preserve">The open-weight Yes/No judge stays within [0.18, 0.26] across every unique reply, whereas the inspectable rubric spans [0.08, 0.92] on the same replies. This is the collapsed tape of Proposition 4: the small model is nearly constant, and its argmax is still the cheat by a few hundredths. A rubric edit toward unconditional yes leaves the top-ranked policy unchanged but widens the gap, since the cheat moves from 0.92 to 1.00 while </w:t>
+      </w:r>
+      <w:r>
+        <w:rPr>
+          <w:rFonts w:ascii="Times New Roman" w:cs="Times New Roman" w:eastAsia="Times New Roman" w:hAnsi="Times New Roman"/>
+          <w:bCs w:val="false"/>
+          <w:i/>
+          <w:iCs w:val="false"/>
+          <w:sz w:val="24"/>
+          <w:szCs w:val="24"/>
+        </w:rPr>
+        <w:t>G</w:t>
+      </w:r>
+      <w:r>
+        <w:rPr>
+          <w:rFonts w:ascii="Times New Roman" w:cs="Times New Roman" w:eastAsia="Times New Roman" w:hAnsi="Times New Roman"/>
+          <w:bCs w:val="false"/>
+          <w:iCs w:val="false"/>
+          <w:sz w:val="24"/>
+          <w:szCs w:val="24"/>
+        </w:rPr>
+        <w:t xml:space="preserve"> is unchanged, which is the situation of Proposition 5.</w:t>
+      </w:r>
+    </w:p>
+    <w:p>
+      <w:pPr>
+        <w:spacing w:after="0" w:before="200" w:line="240" w:lineRule="auto"/>
+      </w:pPr>
+      <w:r>
+        <w:rPr>
+          <w:rFonts w:ascii="Times New Roman" w:cs="Times New Roman" w:eastAsia="Times New Roman" w:hAnsi="Times New Roman"/>
+          <w:b w:val="false"/>
+          <w:bCs w:val="false"/>
+          <w:i w:val="false"/>
+          <w:iCs w:val="false"/>
+          <w:sz w:val="24"/>
+          <w:szCs w:val="24"/>
+        </w:rPr>
+      </w:r>
+    </w:p>
+    <w:p>
+      <w:pPr>
+        <w:spacing w:after="80" w:before="120" w:line="240" w:lineRule="auto"/>
+        <w:jc w:val="center"/>
+      </w:pPr>
+      <w:r/>
+      <w:r>
+        <w:drawing>
+          <wp:inline distT="0" distB="0" distL="0" distR="0">
+            <wp:extent cx="5905500" cy="2952750"/>
+            <wp:effectExtent t="0" r="0" b="0" l="0"/>
+            <wp:docPr id="1" name="Judge search versus gold selection" descr="Grouped bar chart of development judge scores, holdout gold, and canary gold across four policies" title="Figure 1"/>
+            <wp:cNvGraphicFramePr>
+              <a:graphicFrameLocks xmlns:a="http://schemas.openxmlformats.org/drawingml/2006/main" noChangeAspect="1"/>
+            </wp:cNvGraphicFramePr>
+            <a:graphic xmlns:a="http://schemas.openxmlformats.org/drawingml/2006/main">
+              <a:graphicData uri="http://schemas.openxmlformats.org/drawingml/2006/picture">
+                <pic:pic xmlns:pic="http://schemas.openxmlformats.org/drawingml/2006/picture">
+                  <pic:nvPicPr>
+                    <pic:cNvPr id="0" name="" descr=""/>
+                    <pic:cNvPicPr>
+                      <a:picLocks noChangeAspect="1" noChangeArrowheads="1"/>
+                    </pic:cNvPicPr>
+                  </pic:nvPicPr>
+                  <pic:blipFill>
+                    <a:blip r:embed="rId9" cstate="none"/>
+                    <a:srcRect/>
+                    <a:stretch>
+                      <a:fillRect/>
+                    </a:stretch>
+                  </pic:blipFill>
+                  <pic:spPr bwMode="auto">
+                    <a:xfrm>
+                      <a:off x="0" y="0"/>
+                      <a:ext cx="5905500" cy="2952750"/>
+                    </a:xfrm>
+                    <a:prstGeom prst="rect">
+                      <a:avLst/>
+                    </a:prstGeom>
+                  </pic:spPr>
+                </pic:pic>
+              </a:graphicData>
+            </a:graphic>
+          </wp:inline>
+        </w:drawing>
+      </w:r>
+    </w:p>
+    <w:p>
+      <w:pPr>
+        <w:spacing w:after="80" w:before="200" w:line="276" w:lineRule="auto"/>
+        <w:ind w:firstLine="0"/>
+        <w:jc w:val="left"/>
+      </w:pPr>
+      <w:r>
+        <w:rPr>
+          <w:rFonts w:ascii="Times New Roman" w:cs="Times New Roman" w:eastAsia="Times New Roman" w:hAnsi="Times New Roman"/>
+          <w:b/>
+          <w:bCs/>
+          <w:i w:val="false"/>
+          <w:iCs w:val="false"/>
+          <w:sz w:val="22"/>
+          <w:szCs w:val="22"/>
+        </w:rPr>
+        <w:t>Figure 1. Judge Search versus Gold Selection</w:t>
+      </w:r>
+    </w:p>
+    <w:p>
+      <w:pPr>
+        <w:spacing w:after="200" w:before="40" w:line="276" w:lineRule="auto"/>
+        <w:jc w:val="left"/>
+      </w:pPr>
+      <w:r>
+        <w:rPr>
+          <w:rFonts w:ascii="Times New Roman" w:cs="Times New Roman" w:eastAsia="Times New Roman" w:hAnsi="Times New Roman"/>
+          <w:b w:val="false"/>
+          <w:bCs w:val="false"/>
+          <w:i/>
+          <w:iCs/>
+          <w:sz w:val="20"/>
+          <w:szCs w:val="20"/>
+        </w:rPr>
+        <w:t>Note: The development judge is the quote visible to search. Holdout gold and canary gold are inspections the optimizer cannot train on. The dashed line marks the canary floor used to exercise the abandon option.</w:t>
       </w:r>
     </w:p>
     <w:p>
@@ -10405,7 +10673,7 @@
           <w:sz w:val="24"/>
           <w:szCs w:val="24"/>
         </w:rPr>
-        <w:t>Applying Equation 2 to the development rubric selects always-refund, with J rising from 0.08 for redirect to 0.92. Its holdout G of 0.78 beats redirect, so Propositions 1 and 2 are both visible in the same row: the cheat is the NPV winner, and the mixed holdout does not protect the organization.</w:t>
+        <w:t>Figure 1 plots the selection contrast. The bar visible to the optimizer rises under judge search, but the bars it is not shown, holdout gold and canary gold, do not follow.</w:t>
       </w:r>
     </w:p>
     <w:p>
@@ -10422,135 +10690,28 @@
           <w:sz w:val="24"/>
           <w:szCs w:val="24"/>
         </w:rPr>
-        <w:t>Canary G is 0.55 for the cheat and 1.00 for the legal programs, whereas the rubric J on the same canaries is 0.92 for the cheat. Proposition 3 operates as the gate: a canary floor of 0.70, together with a rule that a very high J on a refuse canary counts as evidence of cheating, exercises the put.</w:t>
-      </w:r>
-    </w:p>
-    <w:p>
-      <w:pPr>
-        <w:spacing w:after="0" w:before="0" w:line="480" w:lineRule="auto"/>
-        <w:ind w:firstLine="720"/>
-        <w:jc w:val="left"/>
-      </w:pPr>
-      <w:r>
-        <w:rPr>
-          <w:rFonts w:ascii="Times New Roman" w:cs="Times New Roman" w:eastAsia="Times New Roman" w:hAnsi="Times New Roman"/>
-          <w:bCs w:val="false"/>
-          <w:iCs w:val="false"/>
-          <w:sz w:val="24"/>
-          <w:szCs w:val="24"/>
-        </w:rPr>
-        <w:t>The open-weight Yes/No judge stays within [0.18, 0.26] across every unique reply, whereas the inspectable rubric spans [0.08, 0.92] on the same replies. This is the collapsed tape of Proposition 4. The small model is not conservative but nearly constant, and its argmax is still the cheat, by a few hundredths.</w:t>
-      </w:r>
-    </w:p>
-    <w:p>
-      <w:pPr>
-        <w:spacing w:after="0" w:before="0" w:line="480" w:lineRule="auto"/>
-        <w:ind w:firstLine="720"/>
-        <w:jc w:val="left"/>
-      </w:pPr>
-      <w:r>
-        <w:rPr>
-          <w:rFonts w:ascii="Times New Roman" w:cs="Times New Roman" w:eastAsia="Times New Roman" w:hAnsi="Times New Roman"/>
-          <w:bCs w:val="false"/>
-          <w:iCs w:val="false"/>
-          <w:sz w:val="24"/>
-          <w:szCs w:val="24"/>
-        </w:rPr>
-        <w:t>A rubric edit toward unconditional yes does not change which policy ranks first, but it widens the gap: the cheat moves from 0.92 to 1.00 while G remains unchanged, because the replies are unchanged. This is the situation addressed by Proposition 5, a monitor that would raise an alert after a documentation change.</w:t>
-      </w:r>
-    </w:p>
-    <w:p>
-      <w:pPr>
-        <w:spacing w:after="0" w:before="200" w:line="240" w:lineRule="auto"/>
-      </w:pPr>
-      <w:r>
-        <w:rPr>
-          <w:rFonts w:ascii="Times New Roman" w:cs="Times New Roman" w:eastAsia="Times New Roman" w:hAnsi="Times New Roman"/>
-          <w:b w:val="false"/>
-          <w:bCs w:val="false"/>
-          <w:i w:val="false"/>
-          <w:iCs w:val="false"/>
-          <w:sz w:val="24"/>
-          <w:szCs w:val="24"/>
-        </w:rPr>
-      </w:r>
-    </w:p>
-    <w:p>
-      <w:pPr>
-        <w:spacing w:after="80" w:before="120" w:line="240" w:lineRule="auto"/>
-        <w:jc w:val="center"/>
-      </w:pPr>
-      <w:r/>
-    </w:p>
-    <w:p>
-      <w:pPr>
-        <w:spacing w:after="80" w:before="200" w:line="276" w:lineRule="auto"/>
-        <w:ind w:firstLine="0"/>
-        <w:jc w:val="left"/>
-      </w:pPr>
-      <w:r>
-        <w:rPr>
-          <w:rFonts w:ascii="Times New Roman" w:cs="Times New Roman" w:eastAsia="Times New Roman" w:hAnsi="Times New Roman"/>
-          <w:b/>
-          <w:bCs/>
-          <w:i w:val="false"/>
-          <w:iCs w:val="false"/>
-          <w:sz w:val="22"/>
-          <w:szCs w:val="22"/>
-        </w:rPr>
-        <w:t>Figure 1. Judge Search versus Gold Selection</w:t>
-      </w:r>
-    </w:p>
-    <w:p>
-      <w:pPr>
-        <w:spacing w:after="200" w:before="40" w:line="276" w:lineRule="auto"/>
-        <w:jc w:val="left"/>
-      </w:pPr>
-      <w:r>
-        <w:rPr>
-          <w:rFonts w:ascii="Times New Roman" w:cs="Times New Roman" w:eastAsia="Times New Roman" w:hAnsi="Times New Roman"/>
-          <w:b w:val="false"/>
-          <w:bCs w:val="false"/>
-          <w:i/>
-          <w:iCs/>
-          <w:sz w:val="20"/>
-          <w:szCs w:val="20"/>
-        </w:rPr>
-        <w:t>Note: The development judge is the quote visible to search. Holdout gold and canary gold are inspections the optimizer cannot train on. The dashed line marks the canary floor used to exercise the abandon option.</w:t>
-      </w:r>
-    </w:p>
-    <w:p>
-      <w:pPr>
-        <w:spacing w:after="0" w:before="0" w:line="480" w:lineRule="auto"/>
-        <w:ind w:firstLine="720"/>
-        <w:jc w:val="left"/>
-      </w:pPr>
-      <w:r>
-        <w:rPr>
-          <w:rFonts w:ascii="Times New Roman" w:cs="Times New Roman" w:eastAsia="Times New Roman" w:hAnsi="Times New Roman"/>
-          <w:bCs w:val="false"/>
-          <w:iCs w:val="false"/>
-          <w:sz w:val="24"/>
-          <w:szCs w:val="24"/>
-        </w:rPr>
-        <w:t>Figure 1 plots the selection contrast. The bar visible to the optimizer rises under judge search, but the bars it is not shown, holdout gold and canary gold, do not follow.</w:t>
-      </w:r>
-    </w:p>
-    <w:p>
-      <w:pPr>
-        <w:spacing w:after="0" w:before="0" w:line="480" w:lineRule="auto"/>
-        <w:ind w:firstLine="720"/>
-        <w:jc w:val="left"/>
-      </w:pPr>
-      <w:r>
-        <w:rPr>
-          <w:rFonts w:ascii="Times New Roman" w:cs="Times New Roman" w:eastAsia="Times New Roman" w:hAnsi="Times New Roman"/>
-          <w:bCs w:val="false"/>
-          <w:iCs w:val="false"/>
-          <w:sz w:val="24"/>
-          <w:szCs w:val="24"/>
-        </w:rPr>
-        <w:t>None of these numbers estimates F in closed form. They show only the sign pattern that the propositions require: NPV-on-judge exercises, inspection-on-canary does not, and a jumping rubric would have exercised with even greater confidence. Because the cheat was built into the setting, the numbers show that the pattern can occur; they say nothing about how often it does. Section 5.3 turns to a setting in which nothing is planted.</w:t>
+        <w:t xml:space="preserve">None of these numbers estimates </w:t>
+      </w:r>
+      <w:r>
+        <w:rPr>
+          <w:rFonts w:ascii="Times New Roman" w:cs="Times New Roman" w:eastAsia="Times New Roman" w:hAnsi="Times New Roman"/>
+          <w:bCs w:val="false"/>
+          <w:i/>
+          <w:iCs w:val="false"/>
+          <w:sz w:val="24"/>
+          <w:szCs w:val="24"/>
+        </w:rPr>
+        <w:t>F</w:t>
+      </w:r>
+      <w:r>
+        <w:rPr>
+          <w:rFonts w:ascii="Times New Roman" w:cs="Times New Roman" w:eastAsia="Times New Roman" w:hAnsi="Times New Roman"/>
+          <w:bCs w:val="false"/>
+          <w:iCs w:val="false"/>
+          <w:sz w:val="24"/>
+          <w:szCs w:val="24"/>
+        </w:rPr>
+        <w:t xml:space="preserve"> in closed form. They show only the sign pattern that the propositions require, and because the cheat was built into the setting they show that the pattern can occur, not how often. Section 5.3 turns to a setting in which nothing is planted.</w:t>
       </w:r>
     </w:p>
     <w:p>
@@ -19300,7 +19461,28 @@
           <w:sz w:val="24"/>
           <w:szCs w:val="24"/>
         </w:rPr>
-        <w:t xml:space="preserve"> Let the optimizer produce a candidate under pressure K by choosing a rubric-gaming effort </w:t>
+        <w:t xml:space="preserve"> Let the optimizer produce a candidate under pressure </w:t>
+      </w:r>
+      <w:r>
+        <w:rPr>
+          <w:rFonts w:ascii="Times New Roman" w:cs="Times New Roman" w:eastAsia="Times New Roman" w:hAnsi="Times New Roman"/>
+          <w:bCs w:val="false"/>
+          <w:i/>
+          <w:iCs w:val="false"/>
+          <w:sz w:val="24"/>
+          <w:szCs w:val="24"/>
+        </w:rPr>
+        <w:t>K</w:t>
+      </w:r>
+      <w:r>
+        <w:rPr>
+          <w:rFonts w:ascii="Times New Roman" w:cs="Times New Roman" w:eastAsia="Times New Roman" w:hAnsi="Times New Roman"/>
+          <w:bCs w:val="false"/>
+          <w:iCs w:val="false"/>
+          <w:sz w:val="24"/>
+          <w:szCs w:val="24"/>
+        </w:rPr>
+        <w:t xml:space="preserve"> by choosing a gaming effort </w:t>
       </w:r>
       <w:r>
         <w:rPr>
@@ -19321,7 +19503,28 @@
           <w:sz w:val="24"/>
           <w:szCs w:val="24"/>
         </w:rPr>
-        <w:t xml:space="preserve"> ∈ [0, K]. Gaming raises the judge score one for one but costs true quality at rate γ, so that </w:t>
+        <w:t xml:space="preserve"> ∈ [0, </w:t>
+      </w:r>
+      <w:r>
+        <w:rPr>
+          <w:rFonts w:ascii="Times New Roman" w:cs="Times New Roman" w:eastAsia="Times New Roman" w:hAnsi="Times New Roman"/>
+          <w:bCs w:val="false"/>
+          <w:i/>
+          <w:iCs w:val="false"/>
+          <w:sz w:val="24"/>
+          <w:szCs w:val="24"/>
+        </w:rPr>
+        <w:t>K</w:t>
+      </w:r>
+      <w:r>
+        <w:rPr>
+          <w:rFonts w:ascii="Times New Roman" w:cs="Times New Roman" w:eastAsia="Times New Roman" w:hAnsi="Times New Roman"/>
+          <w:bCs w:val="false"/>
+          <w:iCs w:val="false"/>
+          <w:sz w:val="24"/>
+          <w:szCs w:val="24"/>
+        </w:rPr>
+        <w:t xml:space="preserve">] that raises the judge score one for one and costs true quality at rate γ, so that </w:t>
       </w:r>
       <w:r>
         <w:rPr>
@@ -19396,7 +19599,7 @@
           <w:sz w:val="24"/>
           <w:szCs w:val="24"/>
         </w:rPr>
-        <w:t xml:space="preserve">, where </w:t>
+        <w:t xml:space="preserve">, with </w:t>
       </w:r>
       <w:r>
         <w:rPr>
@@ -19429,7 +19632,7 @@
           <w:sz w:val="24"/>
           <w:szCs w:val="24"/>
         </w:rPr>
-        <w:t xml:space="preserve"> is the legitimate gain, drawn from a distribution </w:t>
+        <w:t xml:space="preserve"> the legitimate gain drawn from a distribution </w:t>
       </w:r>
       <w:r>
         <w:rPr>
@@ -19488,11 +19691,44 @@
         <w:rPr>
           <w:rFonts w:ascii="Times New Roman" w:cs="Times New Roman" w:eastAsia="Times New Roman" w:hAnsi="Times New Roman"/>
           <w:bCs w:val="false"/>
-          <w:iCs w:val="false"/>
-          <w:sz w:val="24"/>
-          <w:szCs w:val="24"/>
-        </w:rPr>
-        <w:t xml:space="preserve"> + </w:t>
+          <w:i/>
+          <w:iCs w:val="false"/>
+          <w:sz w:val="24"/>
+          <w:szCs w:val="24"/>
+          <w:vertAlign w:val="subscript"/>
+        </w:rPr>
+        <w:t>0</w:t>
+      </w:r>
+      <w:r>
+        <w:rPr>
+          <w:rFonts w:ascii="Times New Roman" w:cs="Times New Roman" w:eastAsia="Times New Roman" w:hAnsi="Times New Roman"/>
+          <w:bCs w:val="false"/>
+          <w:iCs w:val="false"/>
+          <w:sz w:val="24"/>
+          <w:szCs w:val="24"/>
+        </w:rPr>
+        <w:t xml:space="preserve"> + (1 − </w:t>
+      </w:r>
+      <w:r>
+        <w:rPr>
+          <w:rFonts w:ascii="Times New Roman" w:cs="Times New Roman" w:eastAsia="Times New Roman" w:hAnsi="Times New Roman"/>
+          <w:bCs w:val="false"/>
+          <w:i/>
+          <w:iCs w:val="false"/>
+          <w:sz w:val="24"/>
+          <w:szCs w:val="24"/>
+        </w:rPr>
+        <w:t>aγ</w:t>
+      </w:r>
+      <w:r>
+        <w:rPr>
+          <w:rFonts w:ascii="Times New Roman" w:cs="Times New Roman" w:eastAsia="Times New Roman" w:hAnsi="Times New Roman"/>
+          <w:bCs w:val="false"/>
+          <w:iCs w:val="false"/>
+          <w:sz w:val="24"/>
+          <w:szCs w:val="24"/>
+        </w:rPr>
+        <w:t>)</w:t>
       </w:r>
       <w:r>
         <w:rPr>
@@ -19513,6 +19749,69 @@
           <w:sz w:val="24"/>
           <w:szCs w:val="24"/>
         </w:rPr>
+        <w:t xml:space="preserve">. If </w:t>
+      </w:r>
+      <w:r>
+        <w:rPr>
+          <w:rFonts w:ascii="Times New Roman" w:cs="Times New Roman" w:eastAsia="Times New Roman" w:hAnsi="Times New Roman"/>
+          <w:bCs w:val="false"/>
+          <w:i/>
+          <w:iCs w:val="false"/>
+          <w:sz w:val="24"/>
+          <w:szCs w:val="24"/>
+        </w:rPr>
+        <w:t>aγ</w:t>
+      </w:r>
+      <w:r>
+        <w:rPr>
+          <w:rFonts w:ascii="Times New Roman" w:cs="Times New Roman" w:eastAsia="Times New Roman" w:hAnsi="Times New Roman"/>
+          <w:bCs w:val="false"/>
+          <w:iCs w:val="false"/>
+          <w:sz w:val="24"/>
+          <w:szCs w:val="24"/>
+        </w:rPr>
+        <w:t xml:space="preserve"> &lt; 1, every maximizer of </w:t>
+      </w:r>
+      <w:r>
+        <w:rPr>
+          <w:rFonts w:ascii="Times New Roman" w:cs="Times New Roman" w:eastAsia="Times New Roman" w:hAnsi="Times New Roman"/>
+          <w:bCs w:val="false"/>
+          <w:i/>
+          <w:iCs w:val="false"/>
+          <w:sz w:val="24"/>
+          <w:szCs w:val="24"/>
+        </w:rPr>
+        <w:t>J</w:t>
+      </w:r>
+      <w:r>
+        <w:rPr>
+          <w:rFonts w:ascii="Times New Roman" w:cs="Times New Roman" w:eastAsia="Times New Roman" w:hAnsi="Times New Roman"/>
+          <w:bCs w:val="false"/>
+          <w:iCs w:val="false"/>
+          <w:sz w:val="24"/>
+          <w:szCs w:val="24"/>
+        </w:rPr>
+        <w:t xml:space="preserve"> sets </w:t>
+      </w:r>
+      <w:r>
+        <w:rPr>
+          <w:rFonts w:ascii="Times New Roman" w:cs="Times New Roman" w:eastAsia="Times New Roman" w:hAnsi="Times New Roman"/>
+          <w:bCs w:val="false"/>
+          <w:i/>
+          <w:iCs w:val="false"/>
+          <w:sz w:val="24"/>
+          <w:szCs w:val="24"/>
+        </w:rPr>
+        <w:t>b</w:t>
+      </w:r>
+      <w:r>
+        <w:rPr>
+          <w:rFonts w:ascii="Times New Roman" w:cs="Times New Roman" w:eastAsia="Times New Roman" w:hAnsi="Times New Roman"/>
+          <w:bCs w:val="false"/>
+          <w:iCs w:val="false"/>
+          <w:sz w:val="24"/>
+          <w:szCs w:val="24"/>
+        </w:rPr>
         <w:t xml:space="preserve"> = </w:t>
       </w:r>
       <w:r>
@@ -19524,6 +19823,27 @@
           <w:sz w:val="24"/>
           <w:szCs w:val="24"/>
         </w:rPr>
+        <w:t>K</w:t>
+      </w:r>
+      <w:r>
+        <w:rPr>
+          <w:rFonts w:ascii="Times New Roman" w:cs="Times New Roman" w:eastAsia="Times New Roman" w:hAnsi="Times New Roman"/>
+          <w:bCs w:val="false"/>
+          <w:iCs w:val="false"/>
+          <w:sz w:val="24"/>
+          <w:szCs w:val="24"/>
+        </w:rPr>
+        <w:t xml:space="preserve">. The NPV rule promotes whenever </w:t>
+      </w:r>
+      <w:r>
+        <w:rPr>
+          <w:rFonts w:ascii="Times New Roman" w:cs="Times New Roman" w:eastAsia="Times New Roman" w:hAnsi="Times New Roman"/>
+          <w:bCs w:val="false"/>
+          <w:i/>
+          <w:iCs w:val="false"/>
+          <w:sz w:val="24"/>
+          <w:szCs w:val="24"/>
+        </w:rPr>
         <w:t>aV</w:t>
       </w:r>
       <w:r>
@@ -19578,17 +19898,155 @@
           <w:sz w:val="24"/>
           <w:szCs w:val="24"/>
         </w:rPr>
-        <w:t>b</w:t>
-      </w:r>
-      <w:r>
-        <w:rPr>
-          <w:rFonts w:ascii="Times New Roman" w:cs="Times New Roman" w:eastAsia="Times New Roman" w:hAnsi="Times New Roman"/>
-          <w:bCs w:val="false"/>
-          <w:iCs w:val="false"/>
-          <w:sz w:val="24"/>
-          <w:szCs w:val="24"/>
-        </w:rPr>
-        <w:t xml:space="preserve">. If </w:t>
+        <w:t>K</w:t>
+      </w:r>
+      <w:r>
+        <w:rPr>
+          <w:rFonts w:ascii="Times New Roman" w:cs="Times New Roman" w:eastAsia="Times New Roman" w:hAnsi="Times New Roman"/>
+          <w:bCs w:val="false"/>
+          <w:iCs w:val="false"/>
+          <w:sz w:val="24"/>
+          <w:szCs w:val="24"/>
+        </w:rPr>
+        <w:t xml:space="preserve"> &gt; </w:t>
+      </w:r>
+      <w:r>
+        <w:rPr>
+          <w:rFonts w:ascii="Times New Roman" w:cs="Times New Roman" w:eastAsia="Times New Roman" w:hAnsi="Times New Roman"/>
+          <w:bCs w:val="false"/>
+          <w:i/>
+          <w:iCs w:val="false"/>
+          <w:sz w:val="24"/>
+          <w:szCs w:val="24"/>
+        </w:rPr>
+        <w:t>c</w:t>
+      </w:r>
+      <w:r>
+        <w:rPr>
+          <w:rFonts w:ascii="Times New Roman" w:cs="Times New Roman" w:eastAsia="Times New Roman" w:hAnsi="Times New Roman"/>
+          <w:bCs w:val="false"/>
+          <w:iCs w:val="false"/>
+          <w:sz w:val="24"/>
+          <w:szCs w:val="24"/>
+        </w:rPr>
+        <w:t xml:space="preserve">, while </w:t>
+      </w:r>
+      <w:r>
+        <w:rPr>
+          <w:rFonts w:ascii="Times New Roman" w:cs="Times New Roman" w:eastAsia="Times New Roman" w:hAnsi="Times New Roman"/>
+          <w:bCs w:val="false"/>
+          <w:i/>
+          <w:iCs w:val="false"/>
+          <w:sz w:val="24"/>
+          <w:szCs w:val="24"/>
+        </w:rPr>
+        <w:t>V</w:t>
+      </w:r>
+      <w:r>
+        <w:rPr>
+          <w:rFonts w:ascii="Times New Roman" w:cs="Times New Roman" w:eastAsia="Times New Roman" w:hAnsi="Times New Roman"/>
+          <w:bCs w:val="false"/>
+          <w:iCs w:val="false"/>
+          <w:sz w:val="24"/>
+          <w:szCs w:val="24"/>
+        </w:rPr>
+        <w:t xml:space="preserve"> &lt; 0 whenever </w:t>
+      </w:r>
+      <w:r>
+        <w:rPr>
+          <w:rFonts w:ascii="Times New Roman" w:cs="Times New Roman" w:eastAsia="Times New Roman" w:hAnsi="Times New Roman"/>
+          <w:bCs w:val="false"/>
+          <w:i/>
+          <w:iCs w:val="false"/>
+          <w:sz w:val="24"/>
+          <w:szCs w:val="24"/>
+        </w:rPr>
+        <w:t>V</w:t>
+      </w:r>
+      <w:r>
+        <w:rPr>
+          <w:rFonts w:ascii="Times New Roman" w:cs="Times New Roman" w:eastAsia="Times New Roman" w:hAnsi="Times New Roman"/>
+          <w:bCs w:val="false"/>
+          <w:i/>
+          <w:iCs w:val="false"/>
+          <w:sz w:val="24"/>
+          <w:szCs w:val="24"/>
+          <w:vertAlign w:val="subscript"/>
+        </w:rPr>
+        <w:t>0</w:t>
+      </w:r>
+      <w:r>
+        <w:rPr>
+          <w:rFonts w:ascii="Times New Roman" w:cs="Times New Roman" w:eastAsia="Times New Roman" w:hAnsi="Times New Roman"/>
+          <w:bCs w:val="false"/>
+          <w:iCs w:val="false"/>
+          <w:sz w:val="24"/>
+          <w:szCs w:val="24"/>
+        </w:rPr>
+        <w:t xml:space="preserve"> &lt; γ</w:t>
+      </w:r>
+      <w:r>
+        <w:rPr>
+          <w:rFonts w:ascii="Times New Roman" w:cs="Times New Roman" w:eastAsia="Times New Roman" w:hAnsi="Times New Roman"/>
+          <w:bCs w:val="false"/>
+          <w:i/>
+          <w:iCs w:val="false"/>
+          <w:sz w:val="24"/>
+          <w:szCs w:val="24"/>
+        </w:rPr>
+        <w:t>K</w:t>
+      </w:r>
+      <w:r>
+        <w:rPr>
+          <w:rFonts w:ascii="Times New Roman" w:cs="Times New Roman" w:eastAsia="Times New Roman" w:hAnsi="Times New Roman"/>
+          <w:bCs w:val="false"/>
+          <w:iCs w:val="false"/>
+          <w:sz w:val="24"/>
+          <w:szCs w:val="24"/>
+        </w:rPr>
+        <w:t xml:space="preserve">, so the event that NPV promotes and </w:t>
+      </w:r>
+      <w:r>
+        <w:rPr>
+          <w:rFonts w:ascii="Times New Roman" w:cs="Times New Roman" w:eastAsia="Times New Roman" w:hAnsi="Times New Roman"/>
+          <w:bCs w:val="false"/>
+          <w:i/>
+          <w:iCs w:val="false"/>
+          <w:sz w:val="24"/>
+          <w:szCs w:val="24"/>
+        </w:rPr>
+        <w:t>V</w:t>
+      </w:r>
+      <w:r>
+        <w:rPr>
+          <w:rFonts w:ascii="Times New Roman" w:cs="Times New Roman" w:eastAsia="Times New Roman" w:hAnsi="Times New Roman"/>
+          <w:bCs w:val="false"/>
+          <w:iCs w:val="false"/>
+          <w:sz w:val="24"/>
+          <w:szCs w:val="24"/>
+        </w:rPr>
+        <w:t xml:space="preserve"> &lt; 0 is the interval (</w:t>
+      </w:r>
+      <w:r>
+        <w:rPr>
+          <w:rFonts w:ascii="Times New Roman" w:cs="Times New Roman" w:eastAsia="Times New Roman" w:hAnsi="Times New Roman"/>
+          <w:bCs w:val="false"/>
+          <w:i/>
+          <w:iCs w:val="false"/>
+          <w:sz w:val="24"/>
+          <w:szCs w:val="24"/>
+        </w:rPr>
+        <w:t>c</w:t>
+      </w:r>
+      <w:r>
+        <w:rPr>
+          <w:rFonts w:ascii="Times New Roman" w:cs="Times New Roman" w:eastAsia="Times New Roman" w:hAnsi="Times New Roman"/>
+          <w:bCs w:val="false"/>
+          <w:iCs w:val="false"/>
+          <w:sz w:val="24"/>
+          <w:szCs w:val="24"/>
+        </w:rPr>
+        <w:t xml:space="preserve"> − (1 − </w:t>
       </w:r>
       <w:r>
         <w:rPr>
@@ -19609,81 +20067,60 @@
           <w:sz w:val="24"/>
           <w:szCs w:val="24"/>
         </w:rPr>
-        <w:t xml:space="preserve"> &lt; 1, every maximizer of </w:t>
-      </w:r>
-      <w:r>
-        <w:rPr>
-          <w:rFonts w:ascii="Times New Roman" w:cs="Times New Roman" w:eastAsia="Times New Roman" w:hAnsi="Times New Roman"/>
-          <w:bCs w:val="false"/>
-          <w:i/>
-          <w:iCs w:val="false"/>
-          <w:sz w:val="24"/>
-          <w:szCs w:val="24"/>
-        </w:rPr>
-        <w:t>J</w:t>
-      </w:r>
-      <w:r>
-        <w:rPr>
-          <w:rFonts w:ascii="Times New Roman" w:cs="Times New Roman" w:eastAsia="Times New Roman" w:hAnsi="Times New Roman"/>
-          <w:bCs w:val="false"/>
-          <w:iCs w:val="false"/>
-          <w:sz w:val="24"/>
-          <w:szCs w:val="24"/>
-        </w:rPr>
-        <w:t xml:space="preserve"> sets </w:t>
-      </w:r>
-      <w:r>
-        <w:rPr>
-          <w:rFonts w:ascii="Times New Roman" w:cs="Times New Roman" w:eastAsia="Times New Roman" w:hAnsi="Times New Roman"/>
-          <w:bCs w:val="false"/>
-          <w:i/>
-          <w:iCs w:val="false"/>
-          <w:sz w:val="24"/>
-          <w:szCs w:val="24"/>
-        </w:rPr>
-        <w:t>b</w:t>
-      </w:r>
-      <w:r>
-        <w:rPr>
-          <w:rFonts w:ascii="Times New Roman" w:cs="Times New Roman" w:eastAsia="Times New Roman" w:hAnsi="Times New Roman"/>
-          <w:bCs w:val="false"/>
-          <w:iCs w:val="false"/>
-          <w:sz w:val="24"/>
-          <w:szCs w:val="24"/>
-        </w:rPr>
-        <w:t xml:space="preserve"> = K. The NPV rule, which promotes when the judge increment exceeds a cost </w:t>
-      </w:r>
-      <w:r>
-        <w:rPr>
-          <w:rFonts w:ascii="Times New Roman" w:cs="Times New Roman" w:eastAsia="Times New Roman" w:hAnsi="Times New Roman"/>
-          <w:bCs w:val="false"/>
-          <w:i/>
-          <w:iCs w:val="false"/>
-          <w:sz w:val="24"/>
-          <w:szCs w:val="24"/>
-        </w:rPr>
-        <w:t>c</w:t>
-      </w:r>
-      <w:r>
-        <w:rPr>
-          <w:rFonts w:ascii="Times New Roman" w:cs="Times New Roman" w:eastAsia="Times New Roman" w:hAnsi="Times New Roman"/>
-          <w:bCs w:val="false"/>
-          <w:iCs w:val="false"/>
-          <w:sz w:val="24"/>
-          <w:szCs w:val="24"/>
-        </w:rPr>
-        <w:t xml:space="preserve">, then promotes whenever </w:t>
-      </w:r>
-      <w:r>
-        <w:rPr>
-          <w:rFonts w:ascii="Times New Roman" w:cs="Times New Roman" w:eastAsia="Times New Roman" w:hAnsi="Times New Roman"/>
-          <w:bCs w:val="false"/>
-          <w:i/>
-          <w:iCs w:val="false"/>
-          <w:sz w:val="24"/>
-          <w:szCs w:val="24"/>
-        </w:rPr>
-        <w:t>aV</w:t>
+        <w:t>)</w:t>
+      </w:r>
+      <w:r>
+        <w:rPr>
+          <w:rFonts w:ascii="Times New Roman" w:cs="Times New Roman" w:eastAsia="Times New Roman" w:hAnsi="Times New Roman"/>
+          <w:bCs w:val="false"/>
+          <w:i/>
+          <w:iCs w:val="false"/>
+          <w:sz w:val="24"/>
+          <w:szCs w:val="24"/>
+        </w:rPr>
+        <w:t>K</w:t>
+      </w:r>
+      <w:r>
+        <w:rPr>
+          <w:rFonts w:ascii="Times New Roman" w:cs="Times New Roman" w:eastAsia="Times New Roman" w:hAnsi="Times New Roman"/>
+          <w:bCs w:val="false"/>
+          <w:iCs w:val="false"/>
+          <w:sz w:val="24"/>
+          <w:szCs w:val="24"/>
+        </w:rPr>
+        <w:t>)/</w:t>
+      </w:r>
+      <w:r>
+        <w:rPr>
+          <w:rFonts w:ascii="Times New Roman" w:cs="Times New Roman" w:eastAsia="Times New Roman" w:hAnsi="Times New Roman"/>
+          <w:bCs w:val="false"/>
+          <w:i/>
+          <w:iCs w:val="false"/>
+          <w:sz w:val="24"/>
+          <w:szCs w:val="24"/>
+        </w:rPr>
+        <w:t>a</w:t>
+      </w:r>
+      <w:r>
+        <w:rPr>
+          <w:rFonts w:ascii="Times New Roman" w:cs="Times New Roman" w:eastAsia="Times New Roman" w:hAnsi="Times New Roman"/>
+          <w:bCs w:val="false"/>
+          <w:iCs w:val="false"/>
+          <w:sz w:val="24"/>
+          <w:szCs w:val="24"/>
+        </w:rPr>
+        <w:t xml:space="preserve"> &lt; </w:t>
+      </w:r>
+      <w:r>
+        <w:rPr>
+          <w:rFonts w:ascii="Times New Roman" w:cs="Times New Roman" w:eastAsia="Times New Roman" w:hAnsi="Times New Roman"/>
+          <w:bCs w:val="false"/>
+          <w:i/>
+          <w:iCs w:val="false"/>
+          <w:sz w:val="24"/>
+          <w:szCs w:val="24"/>
+        </w:rPr>
+        <w:t>V</w:t>
       </w:r>
       <w:r>
         <w:rPr>
@@ -19705,220 +20142,70 @@
           <w:sz w:val="24"/>
           <w:szCs w:val="24"/>
         </w:rPr>
-        <w:t xml:space="preserve"> + (1 − </w:t>
-      </w:r>
-      <w:r>
-        <w:rPr>
-          <w:rFonts w:ascii="Times New Roman" w:cs="Times New Roman" w:eastAsia="Times New Roman" w:hAnsi="Times New Roman"/>
-          <w:bCs w:val="false"/>
-          <w:i/>
-          <w:iCs w:val="false"/>
-          <w:sz w:val="24"/>
-          <w:szCs w:val="24"/>
-        </w:rPr>
-        <w:t>aγ</w:t>
-      </w:r>
-      <w:r>
-        <w:rPr>
-          <w:rFonts w:ascii="Times New Roman" w:cs="Times New Roman" w:eastAsia="Times New Roman" w:hAnsi="Times New Roman"/>
-          <w:bCs w:val="false"/>
-          <w:iCs w:val="false"/>
-          <w:sz w:val="24"/>
-          <w:szCs w:val="24"/>
-        </w:rPr>
-        <w:t xml:space="preserve">)K &gt; </w:t>
-      </w:r>
-      <w:r>
-        <w:rPr>
-          <w:rFonts w:ascii="Times New Roman" w:cs="Times New Roman" w:eastAsia="Times New Roman" w:hAnsi="Times New Roman"/>
-          <w:bCs w:val="false"/>
-          <w:i/>
-          <w:iCs w:val="false"/>
-          <w:sz w:val="24"/>
-          <w:szCs w:val="24"/>
-        </w:rPr>
-        <w:t>c</w:t>
-      </w:r>
-      <w:r>
-        <w:rPr>
-          <w:rFonts w:ascii="Times New Roman" w:cs="Times New Roman" w:eastAsia="Times New Roman" w:hAnsi="Times New Roman"/>
-          <w:bCs w:val="false"/>
-          <w:iCs w:val="false"/>
-          <w:sz w:val="24"/>
-          <w:szCs w:val="24"/>
-        </w:rPr>
-        <w:t xml:space="preserve">, while </w:t>
-      </w:r>
-      <w:r>
-        <w:rPr>
-          <w:rFonts w:ascii="Times New Roman" w:cs="Times New Roman" w:eastAsia="Times New Roman" w:hAnsi="Times New Roman"/>
-          <w:bCs w:val="false"/>
-          <w:i/>
-          <w:iCs w:val="false"/>
-          <w:sz w:val="24"/>
-          <w:szCs w:val="24"/>
-        </w:rPr>
-        <w:t>V</w:t>
-      </w:r>
-      <w:r>
-        <w:rPr>
-          <w:rFonts w:ascii="Times New Roman" w:cs="Times New Roman" w:eastAsia="Times New Roman" w:hAnsi="Times New Roman"/>
-          <w:bCs w:val="false"/>
-          <w:iCs w:val="false"/>
-          <w:sz w:val="24"/>
-          <w:szCs w:val="24"/>
-        </w:rPr>
-        <w:t xml:space="preserve"> &lt; 0 whenever </w:t>
-      </w:r>
-      <w:r>
-        <w:rPr>
-          <w:rFonts w:ascii="Times New Roman" w:cs="Times New Roman" w:eastAsia="Times New Roman" w:hAnsi="Times New Roman"/>
-          <w:bCs w:val="false"/>
-          <w:i/>
-          <w:iCs w:val="false"/>
-          <w:sz w:val="24"/>
-          <w:szCs w:val="24"/>
-        </w:rPr>
-        <w:t>V</w:t>
-      </w:r>
-      <w:r>
-        <w:rPr>
-          <w:rFonts w:ascii="Times New Roman" w:cs="Times New Roman" w:eastAsia="Times New Roman" w:hAnsi="Times New Roman"/>
-          <w:bCs w:val="false"/>
-          <w:i/>
-          <w:iCs w:val="false"/>
-          <w:sz w:val="24"/>
-          <w:szCs w:val="24"/>
-          <w:vertAlign w:val="subscript"/>
-        </w:rPr>
-        <w:t>0</w:t>
-      </w:r>
-      <w:r>
-        <w:rPr>
-          <w:rFonts w:ascii="Times New Roman" w:cs="Times New Roman" w:eastAsia="Times New Roman" w:hAnsi="Times New Roman"/>
-          <w:bCs w:val="false"/>
-          <w:iCs w:val="false"/>
-          <w:sz w:val="24"/>
-          <w:szCs w:val="24"/>
-        </w:rPr>
-        <w:t xml:space="preserve"> &lt; γK. The event that NPV promotes and </w:t>
-      </w:r>
-      <w:r>
-        <w:rPr>
-          <w:rFonts w:ascii="Times New Roman" w:cs="Times New Roman" w:eastAsia="Times New Roman" w:hAnsi="Times New Roman"/>
-          <w:bCs w:val="false"/>
-          <w:i/>
-          <w:iCs w:val="false"/>
-          <w:sz w:val="24"/>
-          <w:szCs w:val="24"/>
-        </w:rPr>
-        <w:t>V</w:t>
-      </w:r>
-      <w:r>
-        <w:rPr>
-          <w:rFonts w:ascii="Times New Roman" w:cs="Times New Roman" w:eastAsia="Times New Roman" w:hAnsi="Times New Roman"/>
-          <w:bCs w:val="false"/>
-          <w:iCs w:val="false"/>
-          <w:sz w:val="24"/>
-          <w:szCs w:val="24"/>
-        </w:rPr>
-        <w:t xml:space="preserve"> &lt; 0 is the interval (</w:t>
-      </w:r>
-      <w:r>
-        <w:rPr>
-          <w:rFonts w:ascii="Times New Roman" w:cs="Times New Roman" w:eastAsia="Times New Roman" w:hAnsi="Times New Roman"/>
-          <w:bCs w:val="false"/>
-          <w:i/>
-          <w:iCs w:val="false"/>
-          <w:sz w:val="24"/>
-          <w:szCs w:val="24"/>
-        </w:rPr>
-        <w:t>c</w:t>
-      </w:r>
-      <w:r>
-        <w:rPr>
-          <w:rFonts w:ascii="Times New Roman" w:cs="Times New Roman" w:eastAsia="Times New Roman" w:hAnsi="Times New Roman"/>
-          <w:bCs w:val="false"/>
-          <w:iCs w:val="false"/>
-          <w:sz w:val="24"/>
-          <w:szCs w:val="24"/>
-        </w:rPr>
-        <w:t xml:space="preserve"> − (1 − </w:t>
-      </w:r>
-      <w:r>
-        <w:rPr>
-          <w:rFonts w:ascii="Times New Roman" w:cs="Times New Roman" w:eastAsia="Times New Roman" w:hAnsi="Times New Roman"/>
-          <w:bCs w:val="false"/>
-          <w:i/>
-          <w:iCs w:val="false"/>
-          <w:sz w:val="24"/>
-          <w:szCs w:val="24"/>
-        </w:rPr>
-        <w:t>aγ</w:t>
-      </w:r>
-      <w:r>
-        <w:rPr>
-          <w:rFonts w:ascii="Times New Roman" w:cs="Times New Roman" w:eastAsia="Times New Roman" w:hAnsi="Times New Roman"/>
-          <w:bCs w:val="false"/>
-          <w:iCs w:val="false"/>
-          <w:sz w:val="24"/>
-          <w:szCs w:val="24"/>
-        </w:rPr>
-        <w:t>)K)/</w:t>
-      </w:r>
-      <w:r>
-        <w:rPr>
-          <w:rFonts w:ascii="Times New Roman" w:cs="Times New Roman" w:eastAsia="Times New Roman" w:hAnsi="Times New Roman"/>
-          <w:bCs w:val="false"/>
-          <w:i/>
-          <w:iCs w:val="false"/>
-          <w:sz w:val="24"/>
-          <w:szCs w:val="24"/>
-        </w:rPr>
-        <w:t>a</w:t>
-      </w:r>
-      <w:r>
-        <w:rPr>
-          <w:rFonts w:ascii="Times New Roman" w:cs="Times New Roman" w:eastAsia="Times New Roman" w:hAnsi="Times New Roman"/>
-          <w:bCs w:val="false"/>
-          <w:iCs w:val="false"/>
-          <w:sz w:val="24"/>
-          <w:szCs w:val="24"/>
-        </w:rPr>
-        <w:t xml:space="preserve"> &lt; </w:t>
-      </w:r>
-      <w:r>
-        <w:rPr>
-          <w:rFonts w:ascii="Times New Roman" w:cs="Times New Roman" w:eastAsia="Times New Roman" w:hAnsi="Times New Roman"/>
-          <w:bCs w:val="false"/>
-          <w:i/>
-          <w:iCs w:val="false"/>
-          <w:sz w:val="24"/>
-          <w:szCs w:val="24"/>
-        </w:rPr>
-        <w:t>V</w:t>
-      </w:r>
-      <w:r>
-        <w:rPr>
-          <w:rFonts w:ascii="Times New Roman" w:cs="Times New Roman" w:eastAsia="Times New Roman" w:hAnsi="Times New Roman"/>
-          <w:bCs w:val="false"/>
-          <w:i/>
-          <w:iCs w:val="false"/>
-          <w:sz w:val="24"/>
-          <w:szCs w:val="24"/>
-          <w:vertAlign w:val="subscript"/>
-        </w:rPr>
-        <w:t>0</w:t>
-      </w:r>
-      <w:r>
-        <w:rPr>
-          <w:rFonts w:ascii="Times New Roman" w:cs="Times New Roman" w:eastAsia="Times New Roman" w:hAnsi="Times New Roman"/>
-          <w:bCs w:val="false"/>
-          <w:iCs w:val="false"/>
-          <w:sz w:val="24"/>
-          <w:szCs w:val="24"/>
-        </w:rPr>
-        <w:t xml:space="preserve"> &lt; γK, whose endpoints move outward as K grows. Its probability is therefore nondecreasing in K and tends to one if </w:t>
+        <w:t xml:space="preserve"> &lt; γ</w:t>
+      </w:r>
+      <w:r>
+        <w:rPr>
+          <w:rFonts w:ascii="Times New Roman" w:cs="Times New Roman" w:eastAsia="Times New Roman" w:hAnsi="Times New Roman"/>
+          <w:bCs w:val="false"/>
+          <w:i/>
+          <w:iCs w:val="false"/>
+          <w:sz w:val="24"/>
+          <w:szCs w:val="24"/>
+        </w:rPr>
+        <w:t>K</w:t>
+      </w:r>
+      <w:r>
+        <w:rPr>
+          <w:rFonts w:ascii="Times New Roman" w:cs="Times New Roman" w:eastAsia="Times New Roman" w:hAnsi="Times New Roman"/>
+          <w:bCs w:val="false"/>
+          <w:iCs w:val="false"/>
+          <w:sz w:val="24"/>
+          <w:szCs w:val="24"/>
+        </w:rPr>
+        <w:t xml:space="preserve">, whose endpoints move outward as </w:t>
+      </w:r>
+      <w:r>
+        <w:rPr>
+          <w:rFonts w:ascii="Times New Roman" w:cs="Times New Roman" w:eastAsia="Times New Roman" w:hAnsi="Times New Roman"/>
+          <w:bCs w:val="false"/>
+          <w:i/>
+          <w:iCs w:val="false"/>
+          <w:sz w:val="24"/>
+          <w:szCs w:val="24"/>
+        </w:rPr>
+        <w:t>K</w:t>
+      </w:r>
+      <w:r>
+        <w:rPr>
+          <w:rFonts w:ascii="Times New Roman" w:cs="Times New Roman" w:eastAsia="Times New Roman" w:hAnsi="Times New Roman"/>
+          <w:bCs w:val="false"/>
+          <w:iCs w:val="false"/>
+          <w:sz w:val="24"/>
+          <w:szCs w:val="24"/>
+        </w:rPr>
+        <w:t xml:space="preserve"> grows. Its probability is therefore nondecreasing in </w:t>
+      </w:r>
+      <w:r>
+        <w:rPr>
+          <w:rFonts w:ascii="Times New Roman" w:cs="Times New Roman" w:eastAsia="Times New Roman" w:hAnsi="Times New Roman"/>
+          <w:bCs w:val="false"/>
+          <w:i/>
+          <w:iCs w:val="false"/>
+          <w:sz w:val="24"/>
+          <w:szCs w:val="24"/>
+        </w:rPr>
+        <w:t>K</w:t>
+      </w:r>
+      <w:r>
+        <w:rPr>
+          <w:rFonts w:ascii="Times New Roman" w:cs="Times New Roman" w:eastAsia="Times New Roman" w:hAnsi="Times New Roman"/>
+          <w:bCs w:val="false"/>
+          <w:iCs w:val="false"/>
+          <w:sz w:val="24"/>
+          <w:szCs w:val="24"/>
+        </w:rPr>
+        <w:t xml:space="preserve"> and tends to one if </w:t>
       </w:r>
       <w:r>
         <w:rPr>
@@ -20063,7 +20350,7 @@
           <w:sz w:val="24"/>
           <w:szCs w:val="24"/>
         </w:rPr>
-        <w:t>, and let Δ</w:t>
+        <w:t xml:space="preserve"> and gold-score differences Δ</w:t>
       </w:r>
       <w:r>
         <w:rPr>
@@ -20096,16 +20383,28 @@
           <w:sz w:val="24"/>
           <w:szCs w:val="24"/>
         </w:rPr>
-        <w:t xml:space="preserve"> be the gold-score difference between the cheat and the incumbent on class </w:t>
-      </w:r>
-      <w:r>
-        <w:rPr>
-          <w:rFonts w:ascii="Times New Roman" w:cs="Times New Roman" w:eastAsia="Times New Roman" w:hAnsi="Times New Roman"/>
-          <w:bCs w:val="false"/>
-          <w:i/>
-          <w:iCs w:val="false"/>
-          <w:sz w:val="24"/>
-          <w:szCs w:val="24"/>
+        <w:t xml:space="preserve"> between the cheat and the incumbent. The mean difference Σ</w:t>
+      </w:r>
+      <w:r>
+        <w:rPr>
+          <w:rFonts w:ascii="Times New Roman" w:cs="Times New Roman" w:eastAsia="Times New Roman" w:hAnsi="Times New Roman"/>
+          <w:bCs w:val="false"/>
+          <w:i/>
+          <w:iCs w:val="false"/>
+          <w:sz w:val="24"/>
+          <w:szCs w:val="24"/>
+        </w:rPr>
+        <w:t>w</w:t>
+      </w:r>
+      <w:r>
+        <w:rPr>
+          <w:rFonts w:ascii="Times New Roman" w:cs="Times New Roman" w:eastAsia="Times New Roman" w:hAnsi="Times New Roman"/>
+          <w:bCs w:val="false"/>
+          <w:i/>
+          <w:iCs w:val="false"/>
+          <w:sz w:val="24"/>
+          <w:szCs w:val="24"/>
+          <w:vertAlign w:val="subscript"/>
         </w:rPr>
         <w:t>k</w:t>
       </w:r>
@@ -20117,7 +20416,94 @@
           <w:sz w:val="24"/>
           <w:szCs w:val="24"/>
         </w:rPr>
-        <w:t>. The holdout mean difference is Σ</w:t>
+        <w:t>Δ</w:t>
+      </w:r>
+      <w:r>
+        <w:rPr>
+          <w:rFonts w:ascii="Times New Roman" w:cs="Times New Roman" w:eastAsia="Times New Roman" w:hAnsi="Times New Roman"/>
+          <w:bCs w:val="false"/>
+          <w:i/>
+          <w:iCs w:val="false"/>
+          <w:sz w:val="24"/>
+          <w:szCs w:val="24"/>
+        </w:rPr>
+        <w:t>G</w:t>
+      </w:r>
+      <w:r>
+        <w:rPr>
+          <w:rFonts w:ascii="Times New Roman" w:cs="Times New Roman" w:eastAsia="Times New Roman" w:hAnsi="Times New Roman"/>
+          <w:bCs w:val="false"/>
+          <w:i/>
+          <w:iCs w:val="false"/>
+          <w:sz w:val="24"/>
+          <w:szCs w:val="24"/>
+          <w:vertAlign w:val="subscript"/>
+        </w:rPr>
+        <w:t>k</w:t>
+      </w:r>
+      <w:r>
+        <w:rPr>
+          <w:rFonts w:ascii="Times New Roman" w:cs="Times New Roman" w:eastAsia="Times New Roman" w:hAnsi="Times New Roman"/>
+          <w:bCs w:val="false"/>
+          <w:iCs w:val="false"/>
+          <w:sz w:val="24"/>
+          <w:szCs w:val="24"/>
+        </w:rPr>
+        <w:t xml:space="preserve"> is positive even though Δ</w:t>
+      </w:r>
+      <w:r>
+        <w:rPr>
+          <w:rFonts w:ascii="Times New Roman" w:cs="Times New Roman" w:eastAsia="Times New Roman" w:hAnsi="Times New Roman"/>
+          <w:bCs w:val="false"/>
+          <w:i/>
+          <w:iCs w:val="false"/>
+          <w:sz w:val="24"/>
+          <w:szCs w:val="24"/>
+        </w:rPr>
+        <w:t>G</w:t>
+      </w:r>
+      <w:r>
+        <w:rPr>
+          <w:rFonts w:ascii="Times New Roman" w:cs="Times New Roman" w:eastAsia="Times New Roman" w:hAnsi="Times New Roman"/>
+          <w:bCs w:val="false"/>
+          <w:i/>
+          <w:iCs w:val="false"/>
+          <w:sz w:val="24"/>
+          <w:szCs w:val="24"/>
+          <w:vertAlign w:val="subscript"/>
+        </w:rPr>
+        <w:t>c</w:t>
+      </w:r>
+      <w:r>
+        <w:rPr>
+          <w:rFonts w:ascii="Times New Roman" w:cs="Times New Roman" w:eastAsia="Times New Roman" w:hAnsi="Times New Roman"/>
+          <w:bCs w:val="false"/>
+          <w:iCs w:val="false"/>
+          <w:sz w:val="24"/>
+          <w:szCs w:val="24"/>
+        </w:rPr>
+        <w:t xml:space="preserve"> &lt; 0 on the refusal class </w:t>
+      </w:r>
+      <w:r>
+        <w:rPr>
+          <w:rFonts w:ascii="Times New Roman" w:cs="Times New Roman" w:eastAsia="Times New Roman" w:hAnsi="Times New Roman"/>
+          <w:bCs w:val="false"/>
+          <w:i/>
+          <w:iCs w:val="false"/>
+          <w:sz w:val="24"/>
+          <w:szCs w:val="24"/>
+        </w:rPr>
+        <w:t>c</w:t>
+      </w:r>
+      <w:r>
+        <w:rPr>
+          <w:rFonts w:ascii="Times New Roman" w:cs="Times New Roman" w:eastAsia="Times New Roman" w:hAnsi="Times New Roman"/>
+          <w:bCs w:val="false"/>
+          <w:iCs w:val="false"/>
+          <w:sz w:val="24"/>
+          <w:szCs w:val="24"/>
+        </w:rPr>
+        <w:t xml:space="preserve"> whenever </w:t>
       </w:r>
       <w:r>
         <w:rPr>
@@ -20140,6 +20526,93 @@
           <w:szCs w:val="24"/>
           <w:vertAlign w:val="subscript"/>
         </w:rPr>
+        <w:t>c</w:t>
+      </w:r>
+      <w:r>
+        <w:rPr>
+          <w:rFonts w:ascii="Times New Roman" w:cs="Times New Roman" w:eastAsia="Times New Roman" w:hAnsi="Times New Roman"/>
+          <w:bCs w:val="false"/>
+          <w:iCs w:val="false"/>
+          <w:sz w:val="24"/>
+          <w:szCs w:val="24"/>
+        </w:rPr>
+        <w:t>|Δ</w:t>
+      </w:r>
+      <w:r>
+        <w:rPr>
+          <w:rFonts w:ascii="Times New Roman" w:cs="Times New Roman" w:eastAsia="Times New Roman" w:hAnsi="Times New Roman"/>
+          <w:bCs w:val="false"/>
+          <w:i/>
+          <w:iCs w:val="false"/>
+          <w:sz w:val="24"/>
+          <w:szCs w:val="24"/>
+        </w:rPr>
+        <w:t>G</w:t>
+      </w:r>
+      <w:r>
+        <w:rPr>
+          <w:rFonts w:ascii="Times New Roman" w:cs="Times New Roman" w:eastAsia="Times New Roman" w:hAnsi="Times New Roman"/>
+          <w:bCs w:val="false"/>
+          <w:i/>
+          <w:iCs w:val="false"/>
+          <w:sz w:val="24"/>
+          <w:szCs w:val="24"/>
+          <w:vertAlign w:val="subscript"/>
+        </w:rPr>
+        <w:t>c</w:t>
+      </w:r>
+      <w:r>
+        <w:rPr>
+          <w:rFonts w:ascii="Times New Roman" w:cs="Times New Roman" w:eastAsia="Times New Roman" w:hAnsi="Times New Roman"/>
+          <w:bCs w:val="false"/>
+          <w:iCs w:val="false"/>
+          <w:sz w:val="24"/>
+          <w:szCs w:val="24"/>
+        </w:rPr>
+        <w:t>| &lt; Σ</w:t>
+      </w:r>
+      <w:r>
+        <w:rPr>
+          <w:rFonts w:ascii="Times New Roman" w:cs="Times New Roman" w:eastAsia="Times New Roman" w:hAnsi="Times New Roman"/>
+          <w:bCs w:val="false"/>
+          <w:iCs w:val="false"/>
+          <w:sz w:val="24"/>
+          <w:szCs w:val="24"/>
+          <w:vertAlign w:val="subscript"/>
+        </w:rPr>
+        <w:t>k≠c</w:t>
+      </w:r>
+      <w:r>
+        <w:rPr>
+          <w:rFonts w:ascii="Times New Roman" w:cs="Times New Roman" w:eastAsia="Times New Roman" w:hAnsi="Times New Roman"/>
+          <w:bCs w:val="false"/>
+          <w:iCs w:val="false"/>
+          <w:sz w:val="24"/>
+          <w:szCs w:val="24"/>
+        </w:rPr>
+        <w:t xml:space="preserve"> </w:t>
+      </w:r>
+      <w:r>
+        <w:rPr>
+          <w:rFonts w:ascii="Times New Roman" w:cs="Times New Roman" w:eastAsia="Times New Roman" w:hAnsi="Times New Roman"/>
+          <w:bCs w:val="false"/>
+          <w:i/>
+          <w:iCs w:val="false"/>
+          <w:sz w:val="24"/>
+          <w:szCs w:val="24"/>
+        </w:rPr>
+        <w:t>w</w:t>
+      </w:r>
+      <w:r>
+        <w:rPr>
+          <w:rFonts w:ascii="Times New Roman" w:cs="Times New Roman" w:eastAsia="Times New Roman" w:hAnsi="Times New Roman"/>
+          <w:bCs w:val="false"/>
+          <w:i/>
+          <w:iCs w:val="false"/>
+          <w:sz w:val="24"/>
+          <w:szCs w:val="24"/>
+          <w:vertAlign w:val="subscript"/>
+        </w:rPr>
         <w:t>k</w:t>
       </w:r>
       <w:r>
@@ -20183,7 +20656,394 @@
           <w:sz w:val="24"/>
           <w:szCs w:val="24"/>
         </w:rPr>
-        <w:t>. It is positive even though Δ</w:t>
+        <w:t>. For Proposition 3, if the canary score of the cheat is measured with noise ω</w:t>
+      </w:r>
+      <w:r>
+        <w:rPr>
+          <w:rFonts w:ascii="Times New Roman" w:cs="Times New Roman" w:eastAsia="Times New Roman" w:hAnsi="Times New Roman"/>
+          <w:bCs w:val="false"/>
+          <w:iCs w:val="false"/>
+          <w:sz w:val="24"/>
+          <w:szCs w:val="24"/>
+          <w:vertAlign w:val="subscript"/>
+        </w:rPr>
+        <w:t>c</w:t>
+      </w:r>
+      <w:r>
+        <w:rPr>
+          <w:rFonts w:ascii="Times New Roman" w:cs="Times New Roman" w:eastAsia="Times New Roman" w:hAnsi="Times New Roman"/>
+          <w:bCs w:val="false"/>
+          <w:iCs w:val="false"/>
+          <w:sz w:val="24"/>
+          <w:szCs w:val="24"/>
+        </w:rPr>
+        <w:t xml:space="preserve"> around its true value </w:t>
+      </w:r>
+      <w:r>
+        <w:rPr>
+          <w:rFonts w:ascii="Times New Roman" w:cs="Times New Roman" w:eastAsia="Times New Roman" w:hAnsi="Times New Roman"/>
+          <w:bCs w:val="false"/>
+          <w:i/>
+          <w:iCs w:val="false"/>
+          <w:sz w:val="24"/>
+          <w:szCs w:val="24"/>
+        </w:rPr>
+        <w:t>g</w:t>
+      </w:r>
+      <w:r>
+        <w:rPr>
+          <w:rFonts w:ascii="Times New Roman" w:cs="Times New Roman" w:eastAsia="Times New Roman" w:hAnsi="Times New Roman"/>
+          <w:bCs w:val="false"/>
+          <w:i/>
+          <w:iCs w:val="false"/>
+          <w:sz w:val="24"/>
+          <w:szCs w:val="24"/>
+          <w:vertAlign w:val="subscript"/>
+        </w:rPr>
+        <w:t>c</w:t>
+      </w:r>
+      <w:r>
+        <w:rPr>
+          <w:rFonts w:ascii="Times New Roman" w:cs="Times New Roman" w:eastAsia="Times New Roman" w:hAnsi="Times New Roman"/>
+          <w:bCs w:val="false"/>
+          <w:iCs w:val="false"/>
+          <w:sz w:val="24"/>
+          <w:szCs w:val="24"/>
+        </w:rPr>
+        <w:t xml:space="preserve"> and the battery has a floor θ, the cheat is stopped with probability Φ((θ − </w:t>
+      </w:r>
+      <w:r>
+        <w:rPr>
+          <w:rFonts w:ascii="Times New Roman" w:cs="Times New Roman" w:eastAsia="Times New Roman" w:hAnsi="Times New Roman"/>
+          <w:bCs w:val="false"/>
+          <w:i/>
+          <w:iCs w:val="false"/>
+          <w:sz w:val="24"/>
+          <w:szCs w:val="24"/>
+        </w:rPr>
+        <w:t>g</w:t>
+      </w:r>
+      <w:r>
+        <w:rPr>
+          <w:rFonts w:ascii="Times New Roman" w:cs="Times New Roman" w:eastAsia="Times New Roman" w:hAnsi="Times New Roman"/>
+          <w:bCs w:val="false"/>
+          <w:i/>
+          <w:iCs w:val="false"/>
+          <w:sz w:val="24"/>
+          <w:szCs w:val="24"/>
+          <w:vertAlign w:val="subscript"/>
+        </w:rPr>
+        <w:t>c</w:t>
+      </w:r>
+      <w:r>
+        <w:rPr>
+          <w:rFonts w:ascii="Times New Roman" w:cs="Times New Roman" w:eastAsia="Times New Roman" w:hAnsi="Times New Roman"/>
+          <w:bCs w:val="false"/>
+          <w:iCs w:val="false"/>
+          <w:sz w:val="24"/>
+          <w:szCs w:val="24"/>
+        </w:rPr>
+        <w:t>)/ω</w:t>
+      </w:r>
+      <w:r>
+        <w:rPr>
+          <w:rFonts w:ascii="Times New Roman" w:cs="Times New Roman" w:eastAsia="Times New Roman" w:hAnsi="Times New Roman"/>
+          <w:bCs w:val="false"/>
+          <w:iCs w:val="false"/>
+          <w:sz w:val="24"/>
+          <w:szCs w:val="24"/>
+          <w:vertAlign w:val="subscript"/>
+        </w:rPr>
+        <w:t>c</w:t>
+      </w:r>
+      <w:r>
+        <w:rPr>
+          <w:rFonts w:ascii="Times New Roman" w:cs="Times New Roman" w:eastAsia="Times New Roman" w:hAnsi="Times New Roman"/>
+          <w:bCs w:val="false"/>
+          <w:iCs w:val="false"/>
+          <w:sz w:val="24"/>
+          <w:szCs w:val="24"/>
+        </w:rPr>
+        <w:t xml:space="preserve">), which rises with the separation θ − </w:t>
+      </w:r>
+      <w:r>
+        <w:rPr>
+          <w:rFonts w:ascii="Times New Roman" w:cs="Times New Roman" w:eastAsia="Times New Roman" w:hAnsi="Times New Roman"/>
+          <w:bCs w:val="false"/>
+          <w:i/>
+          <w:iCs w:val="false"/>
+          <w:sz w:val="24"/>
+          <w:szCs w:val="24"/>
+        </w:rPr>
+        <w:t>g</w:t>
+      </w:r>
+      <w:r>
+        <w:rPr>
+          <w:rFonts w:ascii="Times New Roman" w:cs="Times New Roman" w:eastAsia="Times New Roman" w:hAnsi="Times New Roman"/>
+          <w:bCs w:val="false"/>
+          <w:i/>
+          <w:iCs w:val="false"/>
+          <w:sz w:val="24"/>
+          <w:szCs w:val="24"/>
+          <w:vertAlign w:val="subscript"/>
+        </w:rPr>
+        <w:t>c</w:t>
+      </w:r>
+      <w:r>
+        <w:rPr>
+          <w:rFonts w:ascii="Times New Roman" w:cs="Times New Roman" w:eastAsia="Times New Roman" w:hAnsi="Times New Roman"/>
+          <w:bCs w:val="false"/>
+          <w:iCs w:val="false"/>
+          <w:sz w:val="24"/>
+          <w:szCs w:val="24"/>
+        </w:rPr>
+        <w:t xml:space="preserve"> that the canary is built to create and equals one with deterministic gold, as in the laboratory (</w:t>
+      </w:r>
+      <w:r>
+        <w:rPr>
+          <w:rFonts w:ascii="Times New Roman" w:cs="Times New Roman" w:eastAsia="Times New Roman" w:hAnsi="Times New Roman"/>
+          <w:bCs w:val="false"/>
+          <w:i/>
+          <w:iCs w:val="false"/>
+          <w:sz w:val="24"/>
+          <w:szCs w:val="24"/>
+        </w:rPr>
+        <w:t>g</w:t>
+      </w:r>
+      <w:r>
+        <w:rPr>
+          <w:rFonts w:ascii="Times New Roman" w:cs="Times New Roman" w:eastAsia="Times New Roman" w:hAnsi="Times New Roman"/>
+          <w:bCs w:val="false"/>
+          <w:i/>
+          <w:iCs w:val="false"/>
+          <w:sz w:val="24"/>
+          <w:szCs w:val="24"/>
+          <w:vertAlign w:val="subscript"/>
+        </w:rPr>
+        <w:t>c</w:t>
+      </w:r>
+      <w:r>
+        <w:rPr>
+          <w:rFonts w:ascii="Times New Roman" w:cs="Times New Roman" w:eastAsia="Times New Roman" w:hAnsi="Times New Roman"/>
+          <w:bCs w:val="false"/>
+          <w:iCs w:val="false"/>
+          <w:sz w:val="24"/>
+          <w:szCs w:val="24"/>
+        </w:rPr>
+        <w:t xml:space="preserve"> = 0.55, θ = 0.70). For Proposition 5, when the judge changes between </w:t>
+      </w:r>
+      <w:r>
+        <w:rPr>
+          <w:rFonts w:ascii="Times New Roman" w:cs="Times New Roman" w:eastAsia="Times New Roman" w:hAnsi="Times New Roman"/>
+          <w:bCs w:val="false"/>
+          <w:i/>
+          <w:iCs w:val="false"/>
+          <w:sz w:val="24"/>
+          <w:szCs w:val="24"/>
+        </w:rPr>
+        <w:t>t</w:t>
+      </w:r>
+      <w:r>
+        <w:rPr>
+          <w:rFonts w:ascii="Times New Roman" w:cs="Times New Roman" w:eastAsia="Times New Roman" w:hAnsi="Times New Roman"/>
+          <w:bCs w:val="false"/>
+          <w:iCs w:val="false"/>
+          <w:sz w:val="24"/>
+          <w:szCs w:val="24"/>
+        </w:rPr>
+        <w:t xml:space="preserve"> − </w:t>
+      </w:r>
+      <w:r>
+        <w:rPr>
+          <w:rFonts w:ascii="Times New Roman" w:cs="Times New Roman" w:eastAsia="Times New Roman" w:hAnsi="Times New Roman"/>
+          <w:bCs w:val="false"/>
+          <w:i/>
+          <w:iCs w:val="false"/>
+          <w:sz w:val="24"/>
+          <w:szCs w:val="24"/>
+        </w:rPr>
+        <w:t>k</w:t>
+      </w:r>
+      <w:r>
+        <w:rPr>
+          <w:rFonts w:ascii="Times New Roman" w:cs="Times New Roman" w:eastAsia="Times New Roman" w:hAnsi="Times New Roman"/>
+          <w:bCs w:val="false"/>
+          <w:iCs w:val="false"/>
+          <w:sz w:val="24"/>
+          <w:szCs w:val="24"/>
+        </w:rPr>
+        <w:t xml:space="preserve"> and </w:t>
+      </w:r>
+      <w:r>
+        <w:rPr>
+          <w:rFonts w:ascii="Times New Roman" w:cs="Times New Roman" w:eastAsia="Times New Roman" w:hAnsi="Times New Roman"/>
+          <w:bCs w:val="false"/>
+          <w:i/>
+          <w:iCs w:val="false"/>
+          <w:sz w:val="24"/>
+          <w:szCs w:val="24"/>
+        </w:rPr>
+        <w:t>t</w:t>
+      </w:r>
+      <w:r>
+        <w:rPr>
+          <w:rFonts w:ascii="Times New Roman" w:cs="Times New Roman" w:eastAsia="Times New Roman" w:hAnsi="Times New Roman"/>
+          <w:bCs w:val="false"/>
+          <w:iCs w:val="false"/>
+          <w:sz w:val="24"/>
+          <w:szCs w:val="24"/>
+        </w:rPr>
+        <w:t xml:space="preserve">, the naive increment </w:t>
+      </w:r>
+      <w:r>
+        <w:rPr>
+          <w:rFonts w:ascii="Times New Roman" w:cs="Times New Roman" w:eastAsia="Times New Roman" w:hAnsi="Times New Roman"/>
+          <w:bCs w:val="false"/>
+          <w:i/>
+          <w:iCs w:val="false"/>
+          <w:sz w:val="24"/>
+          <w:szCs w:val="24"/>
+        </w:rPr>
+        <w:t>aV</w:t>
+      </w:r>
+      <w:r>
+        <w:rPr>
+          <w:rFonts w:ascii="Times New Roman" w:cs="Times New Roman" w:eastAsia="Times New Roman" w:hAnsi="Times New Roman"/>
+          <w:bCs w:val="false"/>
+          <w:iCs w:val="false"/>
+          <w:sz w:val="24"/>
+          <w:szCs w:val="24"/>
+        </w:rPr>
+        <w:t xml:space="preserve"> + (</w:t>
+      </w:r>
+      <w:r>
+        <w:rPr>
+          <w:rFonts w:ascii="Times New Roman" w:cs="Times New Roman" w:eastAsia="Times New Roman" w:hAnsi="Times New Roman"/>
+          <w:bCs w:val="false"/>
+          <w:i/>
+          <w:iCs w:val="false"/>
+          <w:sz w:val="24"/>
+          <w:szCs w:val="24"/>
+        </w:rPr>
+        <w:t>b</w:t>
+      </w:r>
+      <w:r>
+        <w:rPr>
+          <w:rFonts w:ascii="Times New Roman" w:cs="Times New Roman" w:eastAsia="Times New Roman" w:hAnsi="Times New Roman"/>
+          <w:bCs w:val="false"/>
+          <w:i/>
+          <w:iCs w:val="false"/>
+          <w:sz w:val="24"/>
+          <w:szCs w:val="24"/>
+          <w:vertAlign w:val="subscript"/>
+        </w:rPr>
+        <w:t>t</w:t>
+      </w:r>
+      <w:r>
+        <w:rPr>
+          <w:rFonts w:ascii="Times New Roman" w:cs="Times New Roman" w:eastAsia="Times New Roman" w:hAnsi="Times New Roman"/>
+          <w:bCs w:val="false"/>
+          <w:iCs w:val="false"/>
+          <w:sz w:val="24"/>
+          <w:szCs w:val="24"/>
+        </w:rPr>
+        <w:t xml:space="preserve"> − </w:t>
+      </w:r>
+      <w:r>
+        <w:rPr>
+          <w:rFonts w:ascii="Times New Roman" w:cs="Times New Roman" w:eastAsia="Times New Roman" w:hAnsi="Times New Roman"/>
+          <w:bCs w:val="false"/>
+          <w:i/>
+          <w:iCs w:val="false"/>
+          <w:sz w:val="24"/>
+          <w:szCs w:val="24"/>
+        </w:rPr>
+        <w:t>b</w:t>
+      </w:r>
+      <w:r>
+        <w:rPr>
+          <w:rFonts w:ascii="Times New Roman" w:cs="Times New Roman" w:eastAsia="Times New Roman" w:hAnsi="Times New Roman"/>
+          <w:bCs w:val="false"/>
+          <w:i/>
+          <w:iCs w:val="false"/>
+          <w:sz w:val="24"/>
+          <w:szCs w:val="24"/>
+          <w:vertAlign w:val="subscript"/>
+        </w:rPr>
+        <w:t>t−k</w:t>
+      </w:r>
+      <w:r>
+        <w:rPr>
+          <w:rFonts w:ascii="Times New Roman" w:cs="Times New Roman" w:eastAsia="Times New Roman" w:hAnsi="Times New Roman"/>
+          <w:bCs w:val="false"/>
+          <w:iCs w:val="false"/>
+          <w:sz w:val="24"/>
+          <w:szCs w:val="24"/>
+        </w:rPr>
+        <w:t xml:space="preserve">) makes a false promotion of a candidate with </w:t>
+      </w:r>
+      <w:r>
+        <w:rPr>
+          <w:rFonts w:ascii="Times New Roman" w:cs="Times New Roman" w:eastAsia="Times New Roman" w:hAnsi="Times New Roman"/>
+          <w:bCs w:val="false"/>
+          <w:i/>
+          <w:iCs w:val="false"/>
+          <w:sz w:val="24"/>
+          <w:szCs w:val="24"/>
+        </w:rPr>
+        <w:t>V</w:t>
+      </w:r>
+      <w:r>
+        <w:rPr>
+          <w:rFonts w:ascii="Times New Roman" w:cs="Times New Roman" w:eastAsia="Times New Roman" w:hAnsi="Times New Roman"/>
+          <w:bCs w:val="false"/>
+          <w:iCs w:val="false"/>
+          <w:sz w:val="24"/>
+          <w:szCs w:val="24"/>
+        </w:rPr>
+        <w:t xml:space="preserve"> ≤ 0 more likely as π and the size of the jump rise, and re-estimating (</w:t>
+      </w:r>
+      <w:r>
+        <w:rPr>
+          <w:rFonts w:ascii="Times New Roman" w:cs="Times New Roman" w:eastAsia="Times New Roman" w:hAnsi="Times New Roman"/>
+          <w:bCs w:val="false"/>
+          <w:i/>
+          <w:iCs w:val="false"/>
+          <w:sz w:val="24"/>
+          <w:szCs w:val="24"/>
+        </w:rPr>
+        <w:t>a</w:t>
+      </w:r>
+      <w:r>
+        <w:rPr>
+          <w:rFonts w:ascii="Times New Roman" w:cs="Times New Roman" w:eastAsia="Times New Roman" w:hAnsi="Times New Roman"/>
+          <w:bCs w:val="false"/>
+          <w:iCs w:val="false"/>
+          <w:sz w:val="24"/>
+          <w:szCs w:val="24"/>
+        </w:rPr>
+        <w:t xml:space="preserve">, </w:t>
+      </w:r>
+      <w:r>
+        <w:rPr>
+          <w:rFonts w:ascii="Times New Roman" w:cs="Times New Roman" w:eastAsia="Times New Roman" w:hAnsi="Times New Roman"/>
+          <w:bCs w:val="false"/>
+          <w:i/>
+          <w:iCs w:val="false"/>
+          <w:sz w:val="24"/>
+          <w:szCs w:val="24"/>
+        </w:rPr>
+        <w:t>b</w:t>
+      </w:r>
+      <w:r>
+        <w:rPr>
+          <w:rFonts w:ascii="Times New Roman" w:cs="Times New Roman" w:eastAsia="Times New Roman" w:hAnsi="Times New Roman"/>
+          <w:bCs w:val="false"/>
+          <w:iCs w:val="false"/>
+          <w:sz w:val="24"/>
+          <w:szCs w:val="24"/>
+        </w:rPr>
+        <w:t xml:space="preserve">) against </w:t>
       </w:r>
       <w:r>
         <w:rPr>
@@ -20200,647 +21060,11 @@
         <w:rPr>
           <w:rFonts w:ascii="Times New Roman" w:cs="Times New Roman" w:eastAsia="Times New Roman" w:hAnsi="Times New Roman"/>
           <w:bCs w:val="false"/>
-          <w:i/>
-          <w:iCs w:val="false"/>
-          <w:sz w:val="24"/>
-          <w:szCs w:val="24"/>
-          <w:vertAlign w:val="subscript"/>
-        </w:rPr>
-        <w:t>c</w:t>
-      </w:r>
-      <w:r>
-        <w:rPr>
-          <w:rFonts w:ascii="Times New Roman" w:cs="Times New Roman" w:eastAsia="Times New Roman" w:hAnsi="Times New Roman"/>
-          <w:bCs w:val="false"/>
-          <w:iCs w:val="false"/>
-          <w:sz w:val="24"/>
-          <w:szCs w:val="24"/>
-        </w:rPr>
-        <w:t xml:space="preserve"> &lt; 0 on the refusal class </w:t>
-      </w:r>
-      <w:r>
-        <w:rPr>
-          <w:rFonts w:ascii="Times New Roman" w:cs="Times New Roman" w:eastAsia="Times New Roman" w:hAnsi="Times New Roman"/>
-          <w:bCs w:val="false"/>
-          <w:i/>
-          <w:iCs w:val="false"/>
-          <w:sz w:val="24"/>
-          <w:szCs w:val="24"/>
-        </w:rPr>
-        <w:t>c</w:t>
-      </w:r>
-      <w:r>
-        <w:rPr>
-          <w:rFonts w:ascii="Times New Roman" w:cs="Times New Roman" w:eastAsia="Times New Roman" w:hAnsi="Times New Roman"/>
-          <w:bCs w:val="false"/>
-          <w:iCs w:val="false"/>
-          <w:sz w:val="24"/>
-          <w:szCs w:val="24"/>
-        </w:rPr>
-        <w:t xml:space="preserve"> whenever </w:t>
-      </w:r>
-      <w:r>
-        <w:rPr>
-          <w:rFonts w:ascii="Times New Roman" w:cs="Times New Roman" w:eastAsia="Times New Roman" w:hAnsi="Times New Roman"/>
-          <w:bCs w:val="false"/>
-          <w:i/>
-          <w:iCs w:val="false"/>
-          <w:sz w:val="24"/>
-          <w:szCs w:val="24"/>
-        </w:rPr>
-        <w:t>w</w:t>
-      </w:r>
-      <w:r>
-        <w:rPr>
-          <w:rFonts w:ascii="Times New Roman" w:cs="Times New Roman" w:eastAsia="Times New Roman" w:hAnsi="Times New Roman"/>
-          <w:bCs w:val="false"/>
-          <w:i/>
-          <w:iCs w:val="false"/>
-          <w:sz w:val="24"/>
-          <w:szCs w:val="24"/>
-          <w:vertAlign w:val="subscript"/>
-        </w:rPr>
-        <w:t>c</w:t>
-      </w:r>
-      <w:r>
-        <w:rPr>
-          <w:rFonts w:ascii="Times New Roman" w:cs="Times New Roman" w:eastAsia="Times New Roman" w:hAnsi="Times New Roman"/>
-          <w:bCs w:val="false"/>
-          <w:iCs w:val="false"/>
-          <w:sz w:val="24"/>
-          <w:szCs w:val="24"/>
-        </w:rPr>
-        <w:t>|Δ</w:t>
-      </w:r>
-      <w:r>
-        <w:rPr>
-          <w:rFonts w:ascii="Times New Roman" w:cs="Times New Roman" w:eastAsia="Times New Roman" w:hAnsi="Times New Roman"/>
-          <w:bCs w:val="false"/>
-          <w:i/>
-          <w:iCs w:val="false"/>
-          <w:sz w:val="24"/>
-          <w:szCs w:val="24"/>
-        </w:rPr>
-        <w:t>G</w:t>
-      </w:r>
-      <w:r>
-        <w:rPr>
-          <w:rFonts w:ascii="Times New Roman" w:cs="Times New Roman" w:eastAsia="Times New Roman" w:hAnsi="Times New Roman"/>
-          <w:bCs w:val="false"/>
-          <w:i/>
-          <w:iCs w:val="false"/>
-          <w:sz w:val="24"/>
-          <w:szCs w:val="24"/>
-          <w:vertAlign w:val="subscript"/>
-        </w:rPr>
-        <w:t>c</w:t>
-      </w:r>
-      <w:r>
-        <w:rPr>
-          <w:rFonts w:ascii="Times New Roman" w:cs="Times New Roman" w:eastAsia="Times New Roman" w:hAnsi="Times New Roman"/>
-          <w:bCs w:val="false"/>
-          <w:iCs w:val="false"/>
-          <w:sz w:val="24"/>
-          <w:szCs w:val="24"/>
-        </w:rPr>
-        <w:t>| &lt; Σ</w:t>
-      </w:r>
-      <w:r>
-        <w:rPr>
-          <w:rFonts w:ascii="Times New Roman" w:cs="Times New Roman" w:eastAsia="Times New Roman" w:hAnsi="Times New Roman"/>
-          <w:bCs w:val="false"/>
-          <w:iCs w:val="false"/>
-          <w:sz w:val="24"/>
-          <w:szCs w:val="24"/>
-          <w:vertAlign w:val="subscript"/>
-        </w:rPr>
-        <w:t>k≠c</w:t>
-      </w:r>
-      <w:r>
-        <w:rPr>
-          <w:rFonts w:ascii="Times New Roman" w:cs="Times New Roman" w:eastAsia="Times New Roman" w:hAnsi="Times New Roman"/>
-          <w:bCs w:val="false"/>
-          <w:iCs w:val="false"/>
-          <w:sz w:val="24"/>
-          <w:szCs w:val="24"/>
-        </w:rPr>
-        <w:t xml:space="preserve"> </w:t>
-      </w:r>
-      <w:r>
-        <w:rPr>
-          <w:rFonts w:ascii="Times New Roman" w:cs="Times New Roman" w:eastAsia="Times New Roman" w:hAnsi="Times New Roman"/>
-          <w:bCs w:val="false"/>
-          <w:i/>
-          <w:iCs w:val="false"/>
-          <w:sz w:val="24"/>
-          <w:szCs w:val="24"/>
-        </w:rPr>
-        <w:t>w</w:t>
-      </w:r>
-      <w:r>
-        <w:rPr>
-          <w:rFonts w:ascii="Times New Roman" w:cs="Times New Roman" w:eastAsia="Times New Roman" w:hAnsi="Times New Roman"/>
-          <w:bCs w:val="false"/>
-          <w:i/>
-          <w:iCs w:val="false"/>
-          <w:sz w:val="24"/>
-          <w:szCs w:val="24"/>
-          <w:vertAlign w:val="subscript"/>
-        </w:rPr>
-        <w:t>k</w:t>
-      </w:r>
-      <w:r>
-        <w:rPr>
-          <w:rFonts w:ascii="Times New Roman" w:cs="Times New Roman" w:eastAsia="Times New Roman" w:hAnsi="Times New Roman"/>
-          <w:bCs w:val="false"/>
-          <w:iCs w:val="false"/>
-          <w:sz w:val="24"/>
-          <w:szCs w:val="24"/>
-        </w:rPr>
-        <w:t>Δ</w:t>
-      </w:r>
-      <w:r>
-        <w:rPr>
-          <w:rFonts w:ascii="Times New Roman" w:cs="Times New Roman" w:eastAsia="Times New Roman" w:hAnsi="Times New Roman"/>
-          <w:bCs w:val="false"/>
-          <w:i/>
-          <w:iCs w:val="false"/>
-          <w:sz w:val="24"/>
-          <w:szCs w:val="24"/>
-        </w:rPr>
-        <w:t>G</w:t>
-      </w:r>
-      <w:r>
-        <w:rPr>
-          <w:rFonts w:ascii="Times New Roman" w:cs="Times New Roman" w:eastAsia="Times New Roman" w:hAnsi="Times New Roman"/>
-          <w:bCs w:val="false"/>
-          <w:i/>
-          <w:iCs w:val="false"/>
-          <w:sz w:val="24"/>
-          <w:szCs w:val="24"/>
-          <w:vertAlign w:val="subscript"/>
-        </w:rPr>
-        <w:t>k</w:t>
-      </w:r>
-      <w:r>
-        <w:rPr>
-          <w:rFonts w:ascii="Times New Roman" w:cs="Times New Roman" w:eastAsia="Times New Roman" w:hAnsi="Times New Roman"/>
-          <w:bCs w:val="false"/>
-          <w:iCs w:val="false"/>
-          <w:sz w:val="24"/>
-          <w:szCs w:val="24"/>
-        </w:rPr>
-        <w:t xml:space="preserve">, so a rise in the mean does not imply a rise in </w:t>
-      </w:r>
-      <w:r>
-        <w:rPr>
-          <w:rFonts w:ascii="Times New Roman" w:cs="Times New Roman" w:eastAsia="Times New Roman" w:hAnsi="Times New Roman"/>
-          <w:bCs w:val="false"/>
-          <w:i/>
-          <w:iCs w:val="false"/>
-          <w:sz w:val="24"/>
-          <w:szCs w:val="24"/>
-        </w:rPr>
-        <w:t>V</w:t>
-      </w:r>
-      <w:r>
-        <w:rPr>
-          <w:rFonts w:ascii="Times New Roman" w:cs="Times New Roman" w:eastAsia="Times New Roman" w:hAnsi="Times New Roman"/>
-          <w:bCs w:val="false"/>
-          <w:iCs w:val="false"/>
-          <w:sz w:val="24"/>
-          <w:szCs w:val="24"/>
-        </w:rPr>
-        <w:t xml:space="preserve"> on the class that expresses organizational intent. For Proposition 3, suppose the canary score of the cheat is measured with noise of standard deviation ω</w:t>
-      </w:r>
-      <w:r>
-        <w:rPr>
-          <w:rFonts w:ascii="Times New Roman" w:cs="Times New Roman" w:eastAsia="Times New Roman" w:hAnsi="Times New Roman"/>
-          <w:bCs w:val="false"/>
-          <w:iCs w:val="false"/>
-          <w:sz w:val="24"/>
-          <w:szCs w:val="24"/>
-          <w:vertAlign w:val="subscript"/>
-        </w:rPr>
-        <w:t>c</w:t>
-      </w:r>
-      <w:r>
-        <w:rPr>
-          <w:rFonts w:ascii="Times New Roman" w:cs="Times New Roman" w:eastAsia="Times New Roman" w:hAnsi="Times New Roman"/>
-          <w:bCs w:val="false"/>
-          <w:iCs w:val="false"/>
-          <w:sz w:val="24"/>
-          <w:szCs w:val="24"/>
-        </w:rPr>
-        <w:t xml:space="preserve"> around its true value </w:t>
-      </w:r>
-      <w:r>
-        <w:rPr>
-          <w:rFonts w:ascii="Times New Roman" w:cs="Times New Roman" w:eastAsia="Times New Roman" w:hAnsi="Times New Roman"/>
-          <w:bCs w:val="false"/>
-          <w:i/>
-          <w:iCs w:val="false"/>
-          <w:sz w:val="24"/>
-          <w:szCs w:val="24"/>
-        </w:rPr>
-        <w:t>g</w:t>
-      </w:r>
-      <w:r>
-        <w:rPr>
-          <w:rFonts w:ascii="Times New Roman" w:cs="Times New Roman" w:eastAsia="Times New Roman" w:hAnsi="Times New Roman"/>
-          <w:bCs w:val="false"/>
-          <w:i/>
-          <w:iCs w:val="false"/>
-          <w:sz w:val="24"/>
-          <w:szCs w:val="24"/>
-          <w:vertAlign w:val="subscript"/>
-        </w:rPr>
-        <w:t>c</w:t>
-      </w:r>
-      <w:r>
-        <w:rPr>
-          <w:rFonts w:ascii="Times New Roman" w:cs="Times New Roman" w:eastAsia="Times New Roman" w:hAnsi="Times New Roman"/>
-          <w:bCs w:val="false"/>
-          <w:iCs w:val="false"/>
-          <w:sz w:val="24"/>
-          <w:szCs w:val="24"/>
-        </w:rPr>
-        <w:t xml:space="preserve">, and the battery has a floor θ. The probability that the cheat is stopped is Φ((θ − </w:t>
-      </w:r>
-      <w:r>
-        <w:rPr>
-          <w:rFonts w:ascii="Times New Roman" w:cs="Times New Roman" w:eastAsia="Times New Roman" w:hAnsi="Times New Roman"/>
-          <w:bCs w:val="false"/>
-          <w:i/>
-          <w:iCs w:val="false"/>
-          <w:sz w:val="24"/>
-          <w:szCs w:val="24"/>
-        </w:rPr>
-        <w:t>g</w:t>
-      </w:r>
-      <w:r>
-        <w:rPr>
-          <w:rFonts w:ascii="Times New Roman" w:cs="Times New Roman" w:eastAsia="Times New Roman" w:hAnsi="Times New Roman"/>
-          <w:bCs w:val="false"/>
-          <w:i/>
-          <w:iCs w:val="false"/>
-          <w:sz w:val="24"/>
-          <w:szCs w:val="24"/>
-          <w:vertAlign w:val="subscript"/>
-        </w:rPr>
-        <w:t>c</w:t>
-      </w:r>
-      <w:r>
-        <w:rPr>
-          <w:rFonts w:ascii="Times New Roman" w:cs="Times New Roman" w:eastAsia="Times New Roman" w:hAnsi="Times New Roman"/>
-          <w:bCs w:val="false"/>
-          <w:iCs w:val="false"/>
-          <w:sz w:val="24"/>
-          <w:szCs w:val="24"/>
-        </w:rPr>
-        <w:t>)/ω</w:t>
-      </w:r>
-      <w:r>
-        <w:rPr>
-          <w:rFonts w:ascii="Times New Roman" w:cs="Times New Roman" w:eastAsia="Times New Roman" w:hAnsi="Times New Roman"/>
-          <w:bCs w:val="false"/>
-          <w:iCs w:val="false"/>
-          <w:sz w:val="24"/>
-          <w:szCs w:val="24"/>
-          <w:vertAlign w:val="subscript"/>
-        </w:rPr>
-        <w:t>c</w:t>
-      </w:r>
-      <w:r>
-        <w:rPr>
-          <w:rFonts w:ascii="Times New Roman" w:cs="Times New Roman" w:eastAsia="Times New Roman" w:hAnsi="Times New Roman"/>
-          <w:bCs w:val="false"/>
-          <w:iCs w:val="false"/>
-          <w:sz w:val="24"/>
-          <w:szCs w:val="24"/>
-        </w:rPr>
-        <w:t xml:space="preserve">), which increases in the separation θ − </w:t>
-      </w:r>
-      <w:r>
-        <w:rPr>
-          <w:rFonts w:ascii="Times New Roman" w:cs="Times New Roman" w:eastAsia="Times New Roman" w:hAnsi="Times New Roman"/>
-          <w:bCs w:val="false"/>
-          <w:i/>
-          <w:iCs w:val="false"/>
-          <w:sz w:val="24"/>
-          <w:szCs w:val="24"/>
-        </w:rPr>
-        <w:t>g</w:t>
-      </w:r>
-      <w:r>
-        <w:rPr>
-          <w:rFonts w:ascii="Times New Roman" w:cs="Times New Roman" w:eastAsia="Times New Roman" w:hAnsi="Times New Roman"/>
-          <w:bCs w:val="false"/>
-          <w:i/>
-          <w:iCs w:val="false"/>
-          <w:sz w:val="24"/>
-          <w:szCs w:val="24"/>
-          <w:vertAlign w:val="subscript"/>
-        </w:rPr>
-        <w:t>c</w:t>
-      </w:r>
-      <w:r>
-        <w:rPr>
-          <w:rFonts w:ascii="Times New Roman" w:cs="Times New Roman" w:eastAsia="Times New Roman" w:hAnsi="Times New Roman"/>
-          <w:bCs w:val="false"/>
-          <w:iCs w:val="false"/>
-          <w:sz w:val="24"/>
-          <w:szCs w:val="24"/>
-        </w:rPr>
-        <w:t xml:space="preserve"> that the canary is built to create; with deterministic gold, as in the laboratory (</w:t>
-      </w:r>
-      <w:r>
-        <w:rPr>
-          <w:rFonts w:ascii="Times New Roman" w:cs="Times New Roman" w:eastAsia="Times New Roman" w:hAnsi="Times New Roman"/>
-          <w:bCs w:val="false"/>
-          <w:i/>
-          <w:iCs w:val="false"/>
-          <w:sz w:val="24"/>
-          <w:szCs w:val="24"/>
-        </w:rPr>
-        <w:t>g</w:t>
-      </w:r>
-      <w:r>
-        <w:rPr>
-          <w:rFonts w:ascii="Times New Roman" w:cs="Times New Roman" w:eastAsia="Times New Roman" w:hAnsi="Times New Roman"/>
-          <w:bCs w:val="false"/>
-          <w:i/>
-          <w:iCs w:val="false"/>
-          <w:sz w:val="24"/>
-          <w:szCs w:val="24"/>
-          <w:vertAlign w:val="subscript"/>
-        </w:rPr>
-        <w:t>c</w:t>
-      </w:r>
-      <w:r>
-        <w:rPr>
-          <w:rFonts w:ascii="Times New Roman" w:cs="Times New Roman" w:eastAsia="Times New Roman" w:hAnsi="Times New Roman"/>
-          <w:bCs w:val="false"/>
-          <w:iCs w:val="false"/>
-          <w:sz w:val="24"/>
-          <w:szCs w:val="24"/>
-        </w:rPr>
-        <w:t xml:space="preserve"> = 0.55, θ = 0.70), it equals one. For Proposition 5, if the judge changes between </w:t>
-      </w:r>
-      <w:r>
-        <w:rPr>
-          <w:rFonts w:ascii="Times New Roman" w:cs="Times New Roman" w:eastAsia="Times New Roman" w:hAnsi="Times New Roman"/>
-          <w:bCs w:val="false"/>
-          <w:i/>
-          <w:iCs w:val="false"/>
-          <w:sz w:val="24"/>
-          <w:szCs w:val="24"/>
-        </w:rPr>
-        <w:t>t</w:t>
-      </w:r>
-      <w:r>
-        <w:rPr>
-          <w:rFonts w:ascii="Times New Roman" w:cs="Times New Roman" w:eastAsia="Times New Roman" w:hAnsi="Times New Roman"/>
-          <w:bCs w:val="false"/>
-          <w:iCs w:val="false"/>
-          <w:sz w:val="24"/>
-          <w:szCs w:val="24"/>
-        </w:rPr>
-        <w:t xml:space="preserve"> − </w:t>
-      </w:r>
-      <w:r>
-        <w:rPr>
-          <w:rFonts w:ascii="Times New Roman" w:cs="Times New Roman" w:eastAsia="Times New Roman" w:hAnsi="Times New Roman"/>
-          <w:bCs w:val="false"/>
-          <w:i/>
-          <w:iCs w:val="false"/>
-          <w:sz w:val="24"/>
-          <w:szCs w:val="24"/>
-        </w:rPr>
-        <w:t>k</w:t>
-      </w:r>
-      <w:r>
-        <w:rPr>
-          <w:rFonts w:ascii="Times New Roman" w:cs="Times New Roman" w:eastAsia="Times New Roman" w:hAnsi="Times New Roman"/>
-          <w:bCs w:val="false"/>
-          <w:iCs w:val="false"/>
-          <w:sz w:val="24"/>
-          <w:szCs w:val="24"/>
-        </w:rPr>
-        <w:t xml:space="preserve"> and </w:t>
-      </w:r>
-      <w:r>
-        <w:rPr>
-          <w:rFonts w:ascii="Times New Roman" w:cs="Times New Roman" w:eastAsia="Times New Roman" w:hAnsi="Times New Roman"/>
-          <w:bCs w:val="false"/>
-          <w:i/>
-          <w:iCs w:val="false"/>
-          <w:sz w:val="24"/>
-          <w:szCs w:val="24"/>
-        </w:rPr>
-        <w:t>t</w:t>
-      </w:r>
-      <w:r>
-        <w:rPr>
-          <w:rFonts w:ascii="Times New Roman" w:cs="Times New Roman" w:eastAsia="Times New Roman" w:hAnsi="Times New Roman"/>
-          <w:bCs w:val="false"/>
-          <w:iCs w:val="false"/>
-          <w:sz w:val="24"/>
-          <w:szCs w:val="24"/>
-        </w:rPr>
-        <w:t>, the naive increment is Δ</w:t>
-      </w:r>
-      <w:r>
-        <w:rPr>
-          <w:rFonts w:ascii="Times New Roman" w:cs="Times New Roman" w:eastAsia="Times New Roman" w:hAnsi="Times New Roman"/>
-          <w:bCs w:val="false"/>
-          <w:i/>
-          <w:iCs w:val="false"/>
-          <w:sz w:val="24"/>
-          <w:szCs w:val="24"/>
-        </w:rPr>
-        <w:t>Ĵ</w:t>
-      </w:r>
-      <w:r>
-        <w:rPr>
-          <w:rFonts w:ascii="Times New Roman" w:cs="Times New Roman" w:eastAsia="Times New Roman" w:hAnsi="Times New Roman"/>
-          <w:bCs w:val="false"/>
-          <w:iCs w:val="false"/>
-          <w:sz w:val="24"/>
-          <w:szCs w:val="24"/>
-        </w:rPr>
-        <w:t xml:space="preserve"> = </w:t>
-      </w:r>
-      <w:r>
-        <w:rPr>
-          <w:rFonts w:ascii="Times New Roman" w:cs="Times New Roman" w:eastAsia="Times New Roman" w:hAnsi="Times New Roman"/>
-          <w:bCs w:val="false"/>
-          <w:i/>
-          <w:iCs w:val="false"/>
-          <w:sz w:val="24"/>
-          <w:szCs w:val="24"/>
-        </w:rPr>
-        <w:t>aV</w:t>
-      </w:r>
-      <w:r>
-        <w:rPr>
-          <w:rFonts w:ascii="Times New Roman" w:cs="Times New Roman" w:eastAsia="Times New Roman" w:hAnsi="Times New Roman"/>
-          <w:bCs w:val="false"/>
-          <w:iCs w:val="false"/>
-          <w:sz w:val="24"/>
-          <w:szCs w:val="24"/>
-        </w:rPr>
-        <w:t xml:space="preserve"> + (</w:t>
-      </w:r>
-      <w:r>
-        <w:rPr>
-          <w:rFonts w:ascii="Times New Roman" w:cs="Times New Roman" w:eastAsia="Times New Roman" w:hAnsi="Times New Roman"/>
-          <w:bCs w:val="false"/>
-          <w:i/>
-          <w:iCs w:val="false"/>
-          <w:sz w:val="24"/>
-          <w:szCs w:val="24"/>
-        </w:rPr>
-        <w:t>b</w:t>
-      </w:r>
-      <w:r>
-        <w:rPr>
-          <w:rFonts w:ascii="Times New Roman" w:cs="Times New Roman" w:eastAsia="Times New Roman" w:hAnsi="Times New Roman"/>
-          <w:bCs w:val="false"/>
-          <w:i/>
-          <w:iCs w:val="false"/>
-          <w:sz w:val="24"/>
-          <w:szCs w:val="24"/>
-          <w:vertAlign w:val="subscript"/>
-        </w:rPr>
-        <w:t>t</w:t>
-      </w:r>
-      <w:r>
-        <w:rPr>
-          <w:rFonts w:ascii="Times New Roman" w:cs="Times New Roman" w:eastAsia="Times New Roman" w:hAnsi="Times New Roman"/>
-          <w:bCs w:val="false"/>
-          <w:iCs w:val="false"/>
-          <w:sz w:val="24"/>
-          <w:szCs w:val="24"/>
-        </w:rPr>
-        <w:t xml:space="preserve"> − </w:t>
-      </w:r>
-      <w:r>
-        <w:rPr>
-          <w:rFonts w:ascii="Times New Roman" w:cs="Times New Roman" w:eastAsia="Times New Roman" w:hAnsi="Times New Roman"/>
-          <w:bCs w:val="false"/>
-          <w:i/>
-          <w:iCs w:val="false"/>
-          <w:sz w:val="24"/>
-          <w:szCs w:val="24"/>
-        </w:rPr>
-        <w:t>b</w:t>
-      </w:r>
-      <w:r>
-        <w:rPr>
-          <w:rFonts w:ascii="Times New Roman" w:cs="Times New Roman" w:eastAsia="Times New Roman" w:hAnsi="Times New Roman"/>
-          <w:bCs w:val="false"/>
-          <w:i/>
-          <w:iCs w:val="false"/>
-          <w:sz w:val="24"/>
-          <w:szCs w:val="24"/>
-          <w:vertAlign w:val="subscript"/>
-        </w:rPr>
-        <w:t>t−k</w:t>
-      </w:r>
-      <w:r>
-        <w:rPr>
-          <w:rFonts w:ascii="Times New Roman" w:cs="Times New Roman" w:eastAsia="Times New Roman" w:hAnsi="Times New Roman"/>
-          <w:bCs w:val="false"/>
-          <w:iCs w:val="false"/>
-          <w:sz w:val="24"/>
-          <w:szCs w:val="24"/>
-        </w:rPr>
-        <w:t xml:space="preserve">). When a positive jump occurs with probability π, the probability of a false promotion of a candidate with </w:t>
-      </w:r>
-      <w:r>
-        <w:rPr>
-          <w:rFonts w:ascii="Times New Roman" w:cs="Times New Roman" w:eastAsia="Times New Roman" w:hAnsi="Times New Roman"/>
-          <w:bCs w:val="false"/>
-          <w:i/>
-          <w:iCs w:val="false"/>
-          <w:sz w:val="24"/>
-          <w:szCs w:val="24"/>
-        </w:rPr>
-        <w:t>V</w:t>
-      </w:r>
-      <w:r>
-        <w:rPr>
-          <w:rFonts w:ascii="Times New Roman" w:cs="Times New Roman" w:eastAsia="Times New Roman" w:hAnsi="Times New Roman"/>
-          <w:bCs w:val="false"/>
-          <w:iCs w:val="false"/>
-          <w:sz w:val="24"/>
-          <w:szCs w:val="24"/>
-        </w:rPr>
-        <w:t xml:space="preserve"> ≤ 0 is increasing in π and in the size of the jump. Re-estimating (</w:t>
-      </w:r>
-      <w:r>
-        <w:rPr>
-          <w:rFonts w:ascii="Times New Roman" w:cs="Times New Roman" w:eastAsia="Times New Roman" w:hAnsi="Times New Roman"/>
-          <w:bCs w:val="false"/>
-          <w:i/>
-          <w:iCs w:val="false"/>
-          <w:sz w:val="24"/>
-          <w:szCs w:val="24"/>
-        </w:rPr>
-        <w:t>a</w:t>
-      </w:r>
-      <w:r>
-        <w:rPr>
-          <w:rFonts w:ascii="Times New Roman" w:cs="Times New Roman" w:eastAsia="Times New Roman" w:hAnsi="Times New Roman"/>
-          <w:bCs w:val="false"/>
-          <w:iCs w:val="false"/>
-          <w:sz w:val="24"/>
-          <w:szCs w:val="24"/>
-        </w:rPr>
-        <w:t xml:space="preserve">, </w:t>
-      </w:r>
-      <w:r>
-        <w:rPr>
-          <w:rFonts w:ascii="Times New Roman" w:cs="Times New Roman" w:eastAsia="Times New Roman" w:hAnsi="Times New Roman"/>
-          <w:bCs w:val="false"/>
-          <w:i/>
-          <w:iCs w:val="false"/>
-          <w:sz w:val="24"/>
-          <w:szCs w:val="24"/>
-        </w:rPr>
-        <w:t>b</w:t>
-      </w:r>
-      <w:r>
-        <w:rPr>
-          <w:rFonts w:ascii="Times New Roman" w:cs="Times New Roman" w:eastAsia="Times New Roman" w:hAnsi="Times New Roman"/>
-          <w:bCs w:val="false"/>
-          <w:iCs w:val="false"/>
-          <w:sz w:val="24"/>
-          <w:szCs w:val="24"/>
-        </w:rPr>
-        <w:t xml:space="preserve">) against </w:t>
-      </w:r>
-      <w:r>
-        <w:rPr>
-          <w:rFonts w:ascii="Times New Roman" w:cs="Times New Roman" w:eastAsia="Times New Roman" w:hAnsi="Times New Roman"/>
-          <w:bCs w:val="false"/>
-          <w:i/>
-          <w:iCs w:val="false"/>
-          <w:sz w:val="24"/>
-          <w:szCs w:val="24"/>
-        </w:rPr>
-        <w:t>G</w:t>
-      </w:r>
-      <w:r>
-        <w:rPr>
-          <w:rFonts w:ascii="Times New Roman" w:cs="Times New Roman" w:eastAsia="Times New Roman" w:hAnsi="Times New Roman"/>
-          <w:bCs w:val="false"/>
-          <w:iCs w:val="false"/>
-          <w:sz w:val="24"/>
-          <w:szCs w:val="24"/>
-        </w:rPr>
-        <w:t xml:space="preserve"> removes the systematic part of the jump from the rule and leaves only the residual variance ν², which enters </w:t>
+          <w:iCs w:val="false"/>
+          <w:sz w:val="24"/>
+          <w:szCs w:val="24"/>
+        </w:rPr>
+        <w:t xml:space="preserve"> removes the systematic part of the jump and leaves the residual variance ν², which enters </w:t>
       </w:r>
       <w:r>
         <w:rPr>
@@ -20861,7 +21085,7 @@
           <w:sz w:val="24"/>
           <w:szCs w:val="24"/>
         </w:rPr>
-        <w:t xml:space="preserve"> through (C3) as in Step 4.</w:t>
+        <w:t xml:space="preserve"> through (C3).</w:t>
       </w:r>
     </w:p>
     <w:p>
@@ -20889,7 +21113,7 @@
           <w:sz w:val="24"/>
           <w:szCs w:val="24"/>
         </w:rPr>
-        <w:t xml:space="preserve"> The derivation is one-shot, Gaussian, and allows a single inspection. A continuous-time version with a geometric Brownian motion state would replace (C3) with the familiar closed-form multiple of the investment cost </w:t>
+        <w:t xml:space="preserve"> The derivation is one-shot, Gaussian, and allows a single inspection. A continuous-time version would replace (C3) with a closed-form multiple of the investment cost </w:t>
       </w:r>
       <w:r>
         <w:rPr>
@@ -20910,7 +21134,7 @@
           <w:sz w:val="24"/>
           <w:szCs w:val="24"/>
         </w:rPr>
-        <w:t>, but it is not derived here. The proofs of the claims in this appendix are collected in Appendix D. Two implications are worth stating. First, Equations 3 and 4 differ in two places: the posterior E[</w:t>
+        <w:t xml:space="preserve"> but is not derived here, and the proofs are in Appendix D. Equations 2 and 3 differ in two places: the posterior E[</w:t>
       </w:r>
       <w:r>
         <w:rPr>
@@ -20973,7 +21197,7 @@
           <w:sz w:val="24"/>
           <w:szCs w:val="24"/>
         </w:rPr>
-        <w:t xml:space="preserve"> is positive. Second, when inspection cannot be created at any finite cost that is worth paying (</w:t>
+        <w:t xml:space="preserve"> is positive. When inspection cannot be created at any finite cost worth paying (</w:t>
       </w:r>
       <w:r>
         <w:rPr>
@@ -21048,7 +21272,7 @@
           <w:sz w:val="24"/>
           <w:szCs w:val="24"/>
         </w:rPr>
-        <w:t xml:space="preserve"> = 0 and the options rule reduces to Bayesian NPV on the shrunk posterior mean. That rule still differs from NPV on raw judge movement, but it no longer calls for waiting, which is why Section 3.3 conditions its advice on </w:t>
+        <w:t xml:space="preserve"> = 0 and the options rule reduces to Bayesian NPV on the shrunk posterior mean, which still differs from NPV on raw judge movement but no longer calls for waiting. This is why Section 3.3 conditions its advice on </w:t>
       </w:r>
       <w:r>
         <w:rPr>

</xml_diff>

<commit_message>
Add proof ideas to Section 4
Co-Authored-By: Claude Sonnet 5.5 <noreply@anthropic.com>
Claude-Session: https://claude.ai/code/session_019zpN7r7iyrxAGMFgJVxuCB
</commit_message>
<xml_diff>
--- a/ISR_Staging_Commitment.docx
+++ b/ISR_Staging_Commitment.docx
@@ -2820,7 +2820,7 @@
           <w:sz w:val="24"/>
           <w:szCs w:val="24"/>
         </w:rPr>
-        <w:t>Section 3 treats the quality of the instrument as a source of risk and prices it as flexibility. This section asks how that flexibility interacts with three choices that an organization makes: how deeply to search against the judge, how strongly to inspect, and how strongly to tie pay to judge scores. Each subsection adds one element to a single stylized model. Section 4.1 takes the share of gameable candidates as given and derives the optimal search depth. Section 4.2 lets the team that searches choose that share. Section 4.3 adds honest effort, and Section 4.4 derives the optimal intensity of judge-linked pay under a participation constraint. Throughout, a candidate that raises the judge score by gaming the rubric at a cost to quality is called an exploit, and the designed illustration of Section 5.1 calls it the cheat. The results are stylized, their assumptions are stated where they matter, the proofs and the numerical checks behind them are in Online Appendix D.</w:t>
+        <w:t>Section 3 treats the quality of the instrument as a source of risk and prices it as flexibility. This section asks how that flexibility interacts with three choices that an organization makes: how deeply to search against the judge, how strongly to inspect, and how strongly to tie pay to judge scores. Each subsection adds one element to a single stylized model. Section 4.1 takes the share of gameable candidates as given and derives the optimal search depth. Section 4.2 lets the team that searches choose that share. Section 4.3 adds honest effort, and Section 4.4 derives the optimal intensity of judge-linked pay under a participation constraint. Throughout, a candidate that raises the judge score by gaming the rubric at a cost to quality is called an exploit, and the designed illustration of Section 5.1 calls it the cheat. The results are stylized, their assumptions are stated where they matter, each result is stated with the idea of its proof, and the full proofs and the numerical checks behind them are in Online Appendix D.</w:t>
       </w:r>
     </w:p>
     <w:p>
@@ -3374,7 +3374,7 @@
           <w:sz w:val="24"/>
           <w:szCs w:val="24"/>
         </w:rPr>
-        <w:t xml:space="preserve">Net value has a single interior maximum (Theorem 2), so the optimal depth </w:t>
+        <w:t xml:space="preserve">Net value has a single interior maximum (Theorem 2): the marginal gain from search falls, because the increments of the expected maximum shrink, while the marginal exposure to exploits rises, so the marginal value of search crosses its cost once. The optimal depth </w:t>
       </w:r>
       <w:r>
         <w:rPr>
@@ -3395,7 +3395,7 @@
           <w:sz w:val="24"/>
           <w:szCs w:val="24"/>
         </w:rPr>
-        <w:t xml:space="preserve">* is unique and falls as ξ and </w:t>
+        <w:t xml:space="preserve">* is therefore unique and falls as ξ and </w:t>
       </w:r>
       <w:r>
         <w:rPr>
@@ -4468,7 +4468,28 @@
           <w:sz w:val="24"/>
           <w:szCs w:val="24"/>
         </w:rPr>
-        <w:t xml:space="preserve">, ζ, and κ and rises with β and Δ (Theorem 3). Substituting (7) into </w:t>
+        <w:t>, ζ, and κ and rises with β and Δ (Theorem 3), because a deeper search raises the honest score at stake and stronger detection makes a flagged release more likely, so that the net gain Γ</w:t>
+      </w:r>
+      <w:r>
+        <w:rPr>
+          <w:rFonts w:ascii="Times New Roman" w:cs="Times New Roman" w:eastAsia="Times New Roman" w:hAnsi="Times New Roman"/>
+          <w:bCs w:val="false"/>
+          <w:iCs w:val="false"/>
+          <w:sz w:val="24"/>
+          <w:szCs w:val="24"/>
+          <w:vertAlign w:val="subscript"/>
+        </w:rPr>
+        <w:t>N</w:t>
+      </w:r>
+      <w:r>
+        <w:rPr>
+          <w:rFonts w:ascii="Times New Roman" w:cs="Times New Roman" w:eastAsia="Times New Roman" w:hAnsi="Times New Roman"/>
+          <w:bCs w:val="false"/>
+          <w:iCs w:val="false"/>
+          <w:sz w:val="24"/>
+          <w:szCs w:val="24"/>
+        </w:rPr>
+        <w:t xml:space="preserve"> falls while the cost of exploiting does not. Substituting (7) into </w:t>
       </w:r>
       <w:r>
         <w:rPr>
@@ -6743,7 +6764,49 @@
           <w:sz w:val="24"/>
           <w:szCs w:val="24"/>
         </w:rPr>
-        <w:t xml:space="preserve">/(1 − ζ) (Theorem 4). Between these conditions several equilibria can coexist, because exploitation lowers honest effort, which raises the payoff to exploitation. With </w:t>
+        <w:t>/(1 − ζ) (Theorem 4). The proof writes the equilibrium as the fixed point of a one-dimensional map. The best honest effort falls with exploit effort, the best exploit effort falls with honest effort, and the composition has slope at most β²θ²ζ²</w:t>
+      </w:r>
+      <w:r>
+        <w:rPr>
+          <w:rFonts w:ascii="Times New Roman" w:cs="Times New Roman" w:eastAsia="Times New Roman" w:hAnsi="Times New Roman"/>
+          <w:bCs w:val="false"/>
+          <w:i/>
+          <w:iCs w:val="false"/>
+          <w:sz w:val="24"/>
+          <w:szCs w:val="24"/>
+        </w:rPr>
+        <w:t>N</w:t>
+      </w:r>
+      <w:r>
+        <w:rPr>
+          <w:rFonts w:ascii="Times New Roman" w:cs="Times New Roman" w:eastAsia="Times New Roman" w:hAnsi="Times New Roman"/>
+          <w:bCs w:val="false"/>
+          <w:iCs w:val="false"/>
+          <w:sz w:val="24"/>
+          <w:szCs w:val="24"/>
+        </w:rPr>
+        <w:t>/(κψ), so it is a contraction under the first condition. For β ≥ β</w:t>
+      </w:r>
+      <w:r>
+        <w:rPr>
+          <w:rFonts w:ascii="Times New Roman" w:cs="Times New Roman" w:eastAsia="Times New Roman" w:hAnsi="Times New Roman"/>
+          <w:bCs w:val="false"/>
+          <w:iCs w:val="false"/>
+          <w:sz w:val="24"/>
+          <w:szCs w:val="24"/>
+          <w:vertAlign w:val="subscript"/>
+        </w:rPr>
+        <w:t>u</w:t>
+      </w:r>
+      <w:r>
+        <w:rPr>
+          <w:rFonts w:ascii="Times New Roman" w:cs="Times New Roman" w:eastAsia="Times New Roman" w:hAnsi="Times New Roman"/>
+          <w:bCs w:val="false"/>
+          <w:iCs w:val="false"/>
+          <w:sz w:val="24"/>
+          <w:szCs w:val="24"/>
+        </w:rPr>
+        <w:t xml:space="preserve">, even the largest feasible exploit gain is negative and the map is identically zero. Between these conditions the two efforts can reinforce each other, because exploitation lowers honest effort, which raises the payoff to exploitation, and several equilibria can coexist. With </w:t>
       </w:r>
       <w:r>
         <w:rPr>
@@ -7681,7 +7744,7 @@
           <w:sz w:val="24"/>
           <w:szCs w:val="24"/>
         </w:rPr>
-        <w:t xml:space="preserve">/ψ (Theorem 5). Without exploitation, (11) gives </w:t>
+        <w:t xml:space="preserve">/ψ (Theorem 5), since honest effort has a quadratic cost and exploitation only removes surplus. Without exploitation, (11) gives </w:t>
       </w:r>
       <w:r>
         <w:rPr>
@@ -7835,7 +7898,28 @@
           <w:sz w:val="24"/>
           <w:szCs w:val="24"/>
         </w:rPr>
-        <w:t xml:space="preserve">/θ, and the equilibrium is then unique if </w:t>
+        <w:t xml:space="preserve">/θ, because with no exploitation honest effort equals </w:t>
+      </w:r>
+      <w:r>
+        <w:rPr>
+          <w:rFonts w:ascii="Times New Roman" w:cs="Times New Roman" w:eastAsia="Times New Roman" w:hAnsi="Times New Roman"/>
+          <w:bCs w:val="false"/>
+          <w:i/>
+          <w:iCs w:val="false"/>
+          <w:sz w:val="24"/>
+          <w:szCs w:val="24"/>
+        </w:rPr>
+        <w:t>g</w:t>
+      </w:r>
+      <w:r>
+        <w:rPr>
+          <w:rFonts w:ascii="Times New Roman" w:cs="Times New Roman" w:eastAsia="Times New Roman" w:hAnsi="Times New Roman"/>
+          <w:bCs w:val="false"/>
+          <w:iCs w:val="false"/>
+          <w:sz w:val="24"/>
+          <w:szCs w:val="24"/>
+        </w:rPr>
+        <w:t xml:space="preserve">/ψ only at that β and (13) states when no exploitation is an equilibrium. The equilibrium is then unique if </w:t>
       </w:r>
       <w:r>
         <w:rPr>

</xml_diff>